<commit_message>
0.5.6: faster parts list and uploads, fixes; user guide for 0.5.6 (Kind shows to start with)
Co-Authored-By: Claude Opus 5.5 <noreply@anthropic.com>
</commit_message>
<xml_diff>
--- a/docs/Litterbox_User_Guide.docx
+++ b/docs/Litterbox_User_Guide.docx
@@ -46,7 +46,7 @@
         <w:rPr>
           <w:color w:val="666666"/>
         </w:rPr>
-        <w:t>For Litterbox 0.5.5  ·  October 2026</w:t>
+        <w:t>For Litterbox 0.5.6  ·  October 2026</w:t>
       </w:r>
     </w:p>
     <w:p>
@@ -87,7 +87,7 @@
       <w:r>
         <w:fldChar w:fldCharType="separate"/>
       </w:r>
-      <w:hyperlink w:anchor="_Toc243613966" w:history="1">
+      <w:hyperlink w:anchor="_Toc243643153" w:history="1">
         <w:r>
           <w:rPr>
             <w:rStyle w:val="Hyperlink"/>
@@ -114,7 +114,7 @@
             <w:noProof/>
             <w:webHidden/>
           </w:rPr>
-          <w:instrText xml:space="preserve"> PAGEREF _Toc243613966 \h </w:instrText>
+          <w:instrText xml:space="preserve"> PAGEREF _Toc243643153 \h </w:instrText>
         </w:r>
         <w:r>
           <w:rPr>
@@ -155,7 +155,7 @@
           <w:noProof/>
         </w:rPr>
       </w:pPr>
-      <w:hyperlink w:anchor="_Toc243613967" w:history="1">
+      <w:hyperlink w:anchor="_Toc243643154" w:history="1">
         <w:r>
           <w:rPr>
             <w:rStyle w:val="Hyperlink"/>
@@ -182,7 +182,7 @@
             <w:noProof/>
             <w:webHidden/>
           </w:rPr>
-          <w:instrText xml:space="preserve"> PAGEREF _Toc243613967 \h </w:instrText>
+          <w:instrText xml:space="preserve"> PAGEREF _Toc243643154 \h </w:instrText>
         </w:r>
         <w:r>
           <w:rPr>
@@ -223,7 +223,7 @@
           <w:noProof/>
         </w:rPr>
       </w:pPr>
-      <w:hyperlink w:anchor="_Toc243613968" w:history="1">
+      <w:hyperlink w:anchor="_Toc243643155" w:history="1">
         <w:r>
           <w:rPr>
             <w:rStyle w:val="Hyperlink"/>
@@ -250,7 +250,7 @@
             <w:noProof/>
             <w:webHidden/>
           </w:rPr>
-          <w:instrText xml:space="preserve"> PAGEREF _Toc243613968 \h </w:instrText>
+          <w:instrText xml:space="preserve"> PAGEREF _Toc243643155 \h </w:instrText>
         </w:r>
         <w:r>
           <w:rPr>
@@ -291,7 +291,7 @@
           <w:noProof/>
         </w:rPr>
       </w:pPr>
-      <w:hyperlink w:anchor="_Toc243613969" w:history="1">
+      <w:hyperlink w:anchor="_Toc243643156" w:history="1">
         <w:r>
           <w:rPr>
             <w:rStyle w:val="Hyperlink"/>
@@ -318,7 +318,7 @@
             <w:noProof/>
             <w:webHidden/>
           </w:rPr>
-          <w:instrText xml:space="preserve"> PAGEREF _Toc243613969 \h </w:instrText>
+          <w:instrText xml:space="preserve"> PAGEREF _Toc243643156 \h </w:instrText>
         </w:r>
         <w:r>
           <w:rPr>
@@ -359,7 +359,7 @@
           <w:noProof/>
         </w:rPr>
       </w:pPr>
-      <w:hyperlink w:anchor="_Toc243613970" w:history="1">
+      <w:hyperlink w:anchor="_Toc243643157" w:history="1">
         <w:r>
           <w:rPr>
             <w:rStyle w:val="Hyperlink"/>
@@ -386,7 +386,7 @@
             <w:noProof/>
             <w:webHidden/>
           </w:rPr>
-          <w:instrText xml:space="preserve"> PAGEREF _Toc243613970 \h </w:instrText>
+          <w:instrText xml:space="preserve"> PAGEREF _Toc243643157 \h </w:instrText>
         </w:r>
         <w:r>
           <w:rPr>
@@ -427,7 +427,7 @@
           <w:noProof/>
         </w:rPr>
       </w:pPr>
-      <w:hyperlink w:anchor="_Toc243613971" w:history="1">
+      <w:hyperlink w:anchor="_Toc243643158" w:history="1">
         <w:r>
           <w:rPr>
             <w:rStyle w:val="Hyperlink"/>
@@ -454,7 +454,7 @@
             <w:noProof/>
             <w:webHidden/>
           </w:rPr>
-          <w:instrText xml:space="preserve"> PAGEREF _Toc243613971 \h </w:instrText>
+          <w:instrText xml:space="preserve"> PAGEREF _Toc243643158 \h </w:instrText>
         </w:r>
         <w:r>
           <w:rPr>
@@ -495,7 +495,7 @@
           <w:noProof/>
         </w:rPr>
       </w:pPr>
-      <w:hyperlink w:anchor="_Toc243613972" w:history="1">
+      <w:hyperlink w:anchor="_Toc243643159" w:history="1">
         <w:r>
           <w:rPr>
             <w:rStyle w:val="Hyperlink"/>
@@ -522,7 +522,7 @@
             <w:noProof/>
             <w:webHidden/>
           </w:rPr>
-          <w:instrText xml:space="preserve"> PAGEREF _Toc243613972 \h </w:instrText>
+          <w:instrText xml:space="preserve"> PAGEREF _Toc243643159 \h </w:instrText>
         </w:r>
         <w:r>
           <w:rPr>
@@ -563,7 +563,7 @@
           <w:noProof/>
         </w:rPr>
       </w:pPr>
-      <w:hyperlink w:anchor="_Toc243613973" w:history="1">
+      <w:hyperlink w:anchor="_Toc243643160" w:history="1">
         <w:r>
           <w:rPr>
             <w:rStyle w:val="Hyperlink"/>
@@ -590,7 +590,7 @@
             <w:noProof/>
             <w:webHidden/>
           </w:rPr>
-          <w:instrText xml:space="preserve"> PAGEREF _Toc243613973 \h </w:instrText>
+          <w:instrText xml:space="preserve"> PAGEREF _Toc243643160 \h </w:instrText>
         </w:r>
         <w:r>
           <w:rPr>
@@ -631,7 +631,7 @@
           <w:noProof/>
         </w:rPr>
       </w:pPr>
-      <w:hyperlink w:anchor="_Toc243613974" w:history="1">
+      <w:hyperlink w:anchor="_Toc243643161" w:history="1">
         <w:r>
           <w:rPr>
             <w:rStyle w:val="Hyperlink"/>
@@ -658,7 +658,7 @@
             <w:noProof/>
             <w:webHidden/>
           </w:rPr>
-          <w:instrText xml:space="preserve"> PAGEREF _Toc243613974 \h </w:instrText>
+          <w:instrText xml:space="preserve"> PAGEREF _Toc243643161 \h </w:instrText>
         </w:r>
         <w:r>
           <w:rPr>
@@ -699,7 +699,7 @@
           <w:noProof/>
         </w:rPr>
       </w:pPr>
-      <w:hyperlink w:anchor="_Toc243613975" w:history="1">
+      <w:hyperlink w:anchor="_Toc243643162" w:history="1">
         <w:r>
           <w:rPr>
             <w:rStyle w:val="Hyperlink"/>
@@ -726,7 +726,7 @@
             <w:noProof/>
             <w:webHidden/>
           </w:rPr>
-          <w:instrText xml:space="preserve"> PAGEREF _Toc243613975 \h </w:instrText>
+          <w:instrText xml:space="preserve"> PAGEREF _Toc243643162 \h </w:instrText>
         </w:r>
         <w:r>
           <w:rPr>
@@ -767,7 +767,7 @@
           <w:noProof/>
         </w:rPr>
       </w:pPr>
-      <w:hyperlink w:anchor="_Toc243613976" w:history="1">
+      <w:hyperlink w:anchor="_Toc243643163" w:history="1">
         <w:r>
           <w:rPr>
             <w:rStyle w:val="Hyperlink"/>
@@ -794,7 +794,7 @@
             <w:noProof/>
             <w:webHidden/>
           </w:rPr>
-          <w:instrText xml:space="preserve"> PAGEREF _Toc243613976 \h </w:instrText>
+          <w:instrText xml:space="preserve"> PAGEREF _Toc243643163 \h </w:instrText>
         </w:r>
         <w:r>
           <w:rPr>
@@ -835,7 +835,7 @@
           <w:noProof/>
         </w:rPr>
       </w:pPr>
-      <w:hyperlink w:anchor="_Toc243613977" w:history="1">
+      <w:hyperlink w:anchor="_Toc243643164" w:history="1">
         <w:r>
           <w:rPr>
             <w:rStyle w:val="Hyperlink"/>
@@ -862,7 +862,7 @@
             <w:noProof/>
             <w:webHidden/>
           </w:rPr>
-          <w:instrText xml:space="preserve"> PAGEREF _Toc243613977 \h </w:instrText>
+          <w:instrText xml:space="preserve"> PAGEREF _Toc243643164 \h </w:instrText>
         </w:r>
         <w:r>
           <w:rPr>
@@ -903,7 +903,7 @@
           <w:noProof/>
         </w:rPr>
       </w:pPr>
-      <w:hyperlink w:anchor="_Toc243613978" w:history="1">
+      <w:hyperlink w:anchor="_Toc243643165" w:history="1">
         <w:r>
           <w:rPr>
             <w:rStyle w:val="Hyperlink"/>
@@ -930,7 +930,7 @@
             <w:noProof/>
             <w:webHidden/>
           </w:rPr>
-          <w:instrText xml:space="preserve"> PAGEREF _Toc243613978 \h </w:instrText>
+          <w:instrText xml:space="preserve"> PAGEREF _Toc243643165 \h </w:instrText>
         </w:r>
         <w:r>
           <w:rPr>
@@ -971,7 +971,7 @@
           <w:noProof/>
         </w:rPr>
       </w:pPr>
-      <w:hyperlink w:anchor="_Toc243613979" w:history="1">
+      <w:hyperlink w:anchor="_Toc243643166" w:history="1">
         <w:r>
           <w:rPr>
             <w:rStyle w:val="Hyperlink"/>
@@ -998,7 +998,7 @@
             <w:noProof/>
             <w:webHidden/>
           </w:rPr>
-          <w:instrText xml:space="preserve"> PAGEREF _Toc243613979 \h </w:instrText>
+          <w:instrText xml:space="preserve"> PAGEREF _Toc243643166 \h </w:instrText>
         </w:r>
         <w:r>
           <w:rPr>
@@ -1039,7 +1039,7 @@
           <w:noProof/>
         </w:rPr>
       </w:pPr>
-      <w:hyperlink w:anchor="_Toc243613980" w:history="1">
+      <w:hyperlink w:anchor="_Toc243643167" w:history="1">
         <w:r>
           <w:rPr>
             <w:rStyle w:val="Hyperlink"/>
@@ -1066,7 +1066,7 @@
             <w:noProof/>
             <w:webHidden/>
           </w:rPr>
-          <w:instrText xml:space="preserve"> PAGEREF _Toc243613980 \h </w:instrText>
+          <w:instrText xml:space="preserve"> PAGEREF _Toc243643167 \h </w:instrText>
         </w:r>
         <w:r>
           <w:rPr>
@@ -1107,7 +1107,7 @@
           <w:noProof/>
         </w:rPr>
       </w:pPr>
-      <w:hyperlink w:anchor="_Toc243613981" w:history="1">
+      <w:hyperlink w:anchor="_Toc243643168" w:history="1">
         <w:r>
           <w:rPr>
             <w:rStyle w:val="Hyperlink"/>
@@ -1134,7 +1134,7 @@
             <w:noProof/>
             <w:webHidden/>
           </w:rPr>
-          <w:instrText xml:space="preserve"> PAGEREF _Toc243613981 \h </w:instrText>
+          <w:instrText xml:space="preserve"> PAGEREF _Toc243643168 \h </w:instrText>
         </w:r>
         <w:r>
           <w:rPr>
@@ -1175,7 +1175,7 @@
           <w:noProof/>
         </w:rPr>
       </w:pPr>
-      <w:hyperlink w:anchor="_Toc243613982" w:history="1">
+      <w:hyperlink w:anchor="_Toc243643169" w:history="1">
         <w:r>
           <w:rPr>
             <w:rStyle w:val="Hyperlink"/>
@@ -1202,7 +1202,7 @@
             <w:noProof/>
             <w:webHidden/>
           </w:rPr>
-          <w:instrText xml:space="preserve"> PAGEREF _Toc243613982 \h </w:instrText>
+          <w:instrText xml:space="preserve"> PAGEREF _Toc243643169 \h </w:instrText>
         </w:r>
         <w:r>
           <w:rPr>
@@ -1243,7 +1243,7 @@
           <w:noProof/>
         </w:rPr>
       </w:pPr>
-      <w:hyperlink w:anchor="_Toc243613983" w:history="1">
+      <w:hyperlink w:anchor="_Toc243643170" w:history="1">
         <w:r>
           <w:rPr>
             <w:rStyle w:val="Hyperlink"/>
@@ -1270,7 +1270,7 @@
             <w:noProof/>
             <w:webHidden/>
           </w:rPr>
-          <w:instrText xml:space="preserve"> PAGEREF _Toc243613983 \h </w:instrText>
+          <w:instrText xml:space="preserve"> PAGEREF _Toc243643170 \h </w:instrText>
         </w:r>
         <w:r>
           <w:rPr>
@@ -1311,7 +1311,7 @@
           <w:noProof/>
         </w:rPr>
       </w:pPr>
-      <w:hyperlink w:anchor="_Toc243613984" w:history="1">
+      <w:hyperlink w:anchor="_Toc243643171" w:history="1">
         <w:r>
           <w:rPr>
             <w:rStyle w:val="Hyperlink"/>
@@ -1338,7 +1338,7 @@
             <w:noProof/>
             <w:webHidden/>
           </w:rPr>
-          <w:instrText xml:space="preserve"> PAGEREF _Toc243613984 \h </w:instrText>
+          <w:instrText xml:space="preserve"> PAGEREF _Toc243643171 \h </w:instrText>
         </w:r>
         <w:r>
           <w:rPr>
@@ -1379,7 +1379,7 @@
           <w:noProof/>
         </w:rPr>
       </w:pPr>
-      <w:hyperlink w:anchor="_Toc243613985" w:history="1">
+      <w:hyperlink w:anchor="_Toc243643172" w:history="1">
         <w:r>
           <w:rPr>
             <w:rStyle w:val="Hyperlink"/>
@@ -1406,7 +1406,7 @@
             <w:noProof/>
             <w:webHidden/>
           </w:rPr>
-          <w:instrText xml:space="preserve"> PAGEREF _Toc243613985 \h </w:instrText>
+          <w:instrText xml:space="preserve"> PAGEREF _Toc243643172 \h </w:instrText>
         </w:r>
         <w:r>
           <w:rPr>
@@ -1447,7 +1447,7 @@
           <w:noProof/>
         </w:rPr>
       </w:pPr>
-      <w:hyperlink w:anchor="_Toc243613986" w:history="1">
+      <w:hyperlink w:anchor="_Toc243643173" w:history="1">
         <w:r>
           <w:rPr>
             <w:rStyle w:val="Hyperlink"/>
@@ -1474,7 +1474,7 @@
             <w:noProof/>
             <w:webHidden/>
           </w:rPr>
-          <w:instrText xml:space="preserve"> PAGEREF _Toc243613986 \h </w:instrText>
+          <w:instrText xml:space="preserve"> PAGEREF _Toc243643173 \h </w:instrText>
         </w:r>
         <w:r>
           <w:rPr>
@@ -1515,7 +1515,7 @@
           <w:noProof/>
         </w:rPr>
       </w:pPr>
-      <w:hyperlink w:anchor="_Toc243613987" w:history="1">
+      <w:hyperlink w:anchor="_Toc243643174" w:history="1">
         <w:r>
           <w:rPr>
             <w:rStyle w:val="Hyperlink"/>
@@ -1542,7 +1542,7 @@
             <w:noProof/>
             <w:webHidden/>
           </w:rPr>
-          <w:instrText xml:space="preserve"> PAGEREF _Toc243613987 \h </w:instrText>
+          <w:instrText xml:space="preserve"> PAGEREF _Toc243643174 \h </w:instrText>
         </w:r>
         <w:r>
           <w:rPr>
@@ -1583,7 +1583,7 @@
           <w:noProof/>
         </w:rPr>
       </w:pPr>
-      <w:hyperlink w:anchor="_Toc243613988" w:history="1">
+      <w:hyperlink w:anchor="_Toc243643175" w:history="1">
         <w:r>
           <w:rPr>
             <w:rStyle w:val="Hyperlink"/>
@@ -1610,7 +1610,7 @@
             <w:noProof/>
             <w:webHidden/>
           </w:rPr>
-          <w:instrText xml:space="preserve"> PAGEREF _Toc243613988 \h </w:instrText>
+          <w:instrText xml:space="preserve"> PAGEREF _Toc243643175 \h </w:instrText>
         </w:r>
         <w:r>
           <w:rPr>
@@ -1651,7 +1651,7 @@
           <w:noProof/>
         </w:rPr>
       </w:pPr>
-      <w:hyperlink w:anchor="_Toc243613989" w:history="1">
+      <w:hyperlink w:anchor="_Toc243643176" w:history="1">
         <w:r>
           <w:rPr>
             <w:rStyle w:val="Hyperlink"/>
@@ -1678,7 +1678,7 @@
             <w:noProof/>
             <w:webHidden/>
           </w:rPr>
-          <w:instrText xml:space="preserve"> PAGEREF _Toc243613989 \h </w:instrText>
+          <w:instrText xml:space="preserve"> PAGEREF _Toc243643176 \h </w:instrText>
         </w:r>
         <w:r>
           <w:rPr>
@@ -1719,7 +1719,7 @@
           <w:noProof/>
         </w:rPr>
       </w:pPr>
-      <w:hyperlink w:anchor="_Toc243613990" w:history="1">
+      <w:hyperlink w:anchor="_Toc243643177" w:history="1">
         <w:r>
           <w:rPr>
             <w:rStyle w:val="Hyperlink"/>
@@ -1746,7 +1746,7 @@
             <w:noProof/>
             <w:webHidden/>
           </w:rPr>
-          <w:instrText xml:space="preserve"> PAGEREF _Toc243613990 \h </w:instrText>
+          <w:instrText xml:space="preserve"> PAGEREF _Toc243643177 \h </w:instrText>
         </w:r>
         <w:r>
           <w:rPr>
@@ -1787,7 +1787,7 @@
           <w:noProof/>
         </w:rPr>
       </w:pPr>
-      <w:hyperlink w:anchor="_Toc243613991" w:history="1">
+      <w:hyperlink w:anchor="_Toc243643178" w:history="1">
         <w:r>
           <w:rPr>
             <w:rStyle w:val="Hyperlink"/>
@@ -1814,7 +1814,7 @@
             <w:noProof/>
             <w:webHidden/>
           </w:rPr>
-          <w:instrText xml:space="preserve"> PAGEREF _Toc243613991 \h </w:instrText>
+          <w:instrText xml:space="preserve"> PAGEREF _Toc243643178 \h </w:instrText>
         </w:r>
         <w:r>
           <w:rPr>
@@ -1855,7 +1855,7 @@
           <w:noProof/>
         </w:rPr>
       </w:pPr>
-      <w:hyperlink w:anchor="_Toc243613992" w:history="1">
+      <w:hyperlink w:anchor="_Toc243643179" w:history="1">
         <w:r>
           <w:rPr>
             <w:rStyle w:val="Hyperlink"/>
@@ -1882,7 +1882,7 @@
             <w:noProof/>
             <w:webHidden/>
           </w:rPr>
-          <w:instrText xml:space="preserve"> PAGEREF _Toc243613992 \h </w:instrText>
+          <w:instrText xml:space="preserve"> PAGEREF _Toc243643179 \h </w:instrText>
         </w:r>
         <w:r>
           <w:rPr>
@@ -1923,7 +1923,7 @@
           <w:noProof/>
         </w:rPr>
       </w:pPr>
-      <w:hyperlink w:anchor="_Toc243613993" w:history="1">
+      <w:hyperlink w:anchor="_Toc243643180" w:history="1">
         <w:r>
           <w:rPr>
             <w:rStyle w:val="Hyperlink"/>
@@ -1950,7 +1950,7 @@
             <w:noProof/>
             <w:webHidden/>
           </w:rPr>
-          <w:instrText xml:space="preserve"> PAGEREF _Toc243613993 \h </w:instrText>
+          <w:instrText xml:space="preserve"> PAGEREF _Toc243643180 \h </w:instrText>
         </w:r>
         <w:r>
           <w:rPr>
@@ -1991,7 +1991,7 @@
           <w:noProof/>
         </w:rPr>
       </w:pPr>
-      <w:hyperlink w:anchor="_Toc243613994" w:history="1">
+      <w:hyperlink w:anchor="_Toc243643181" w:history="1">
         <w:r>
           <w:rPr>
             <w:rStyle w:val="Hyperlink"/>
@@ -2018,7 +2018,7 @@
             <w:noProof/>
             <w:webHidden/>
           </w:rPr>
-          <w:instrText xml:space="preserve"> PAGEREF _Toc243613994 \h </w:instrText>
+          <w:instrText xml:space="preserve"> PAGEREF _Toc243643181 \h </w:instrText>
         </w:r>
         <w:r>
           <w:rPr>
@@ -2059,7 +2059,7 @@
           <w:noProof/>
         </w:rPr>
       </w:pPr>
-      <w:hyperlink w:anchor="_Toc243613995" w:history="1">
+      <w:hyperlink w:anchor="_Toc243643182" w:history="1">
         <w:r>
           <w:rPr>
             <w:rStyle w:val="Hyperlink"/>
@@ -2086,7 +2086,7 @@
             <w:noProof/>
             <w:webHidden/>
           </w:rPr>
-          <w:instrText xml:space="preserve"> PAGEREF _Toc243613995 \h </w:instrText>
+          <w:instrText xml:space="preserve"> PAGEREF _Toc243643182 \h </w:instrText>
         </w:r>
         <w:r>
           <w:rPr>
@@ -2127,7 +2127,7 @@
           <w:noProof/>
         </w:rPr>
       </w:pPr>
-      <w:hyperlink w:anchor="_Toc243613996" w:history="1">
+      <w:hyperlink w:anchor="_Toc243643183" w:history="1">
         <w:r>
           <w:rPr>
             <w:rStyle w:val="Hyperlink"/>
@@ -2154,7 +2154,7 @@
             <w:noProof/>
             <w:webHidden/>
           </w:rPr>
-          <w:instrText xml:space="preserve"> PAGEREF _Toc243613996 \h </w:instrText>
+          <w:instrText xml:space="preserve"> PAGEREF _Toc243643183 \h </w:instrText>
         </w:r>
         <w:r>
           <w:rPr>
@@ -2195,7 +2195,7 @@
           <w:noProof/>
         </w:rPr>
       </w:pPr>
-      <w:hyperlink w:anchor="_Toc243613997" w:history="1">
+      <w:hyperlink w:anchor="_Toc243643184" w:history="1">
         <w:r>
           <w:rPr>
             <w:rStyle w:val="Hyperlink"/>
@@ -2222,7 +2222,7 @@
             <w:noProof/>
             <w:webHidden/>
           </w:rPr>
-          <w:instrText xml:space="preserve"> PAGEREF _Toc243613997 \h </w:instrText>
+          <w:instrText xml:space="preserve"> PAGEREF _Toc243643184 \h </w:instrText>
         </w:r>
         <w:r>
           <w:rPr>
@@ -2263,7 +2263,7 @@
           <w:noProof/>
         </w:rPr>
       </w:pPr>
-      <w:hyperlink w:anchor="_Toc243613998" w:history="1">
+      <w:hyperlink w:anchor="_Toc243643185" w:history="1">
         <w:r>
           <w:rPr>
             <w:rStyle w:val="Hyperlink"/>
@@ -2290,7 +2290,7 @@
             <w:noProof/>
             <w:webHidden/>
           </w:rPr>
-          <w:instrText xml:space="preserve"> PAGEREF _Toc243613998 \h </w:instrText>
+          <w:instrText xml:space="preserve"> PAGEREF _Toc243643185 \h </w:instrText>
         </w:r>
         <w:r>
           <w:rPr>
@@ -2331,7 +2331,7 @@
           <w:noProof/>
         </w:rPr>
       </w:pPr>
-      <w:hyperlink w:anchor="_Toc243613999" w:history="1">
+      <w:hyperlink w:anchor="_Toc243643186" w:history="1">
         <w:r>
           <w:rPr>
             <w:rStyle w:val="Hyperlink"/>
@@ -2358,7 +2358,7 @@
             <w:noProof/>
             <w:webHidden/>
           </w:rPr>
-          <w:instrText xml:space="preserve"> PAGEREF _Toc243613999 \h </w:instrText>
+          <w:instrText xml:space="preserve"> PAGEREF _Toc243643186 \h </w:instrText>
         </w:r>
         <w:r>
           <w:rPr>
@@ -2399,7 +2399,7 @@
           <w:noProof/>
         </w:rPr>
       </w:pPr>
-      <w:hyperlink w:anchor="_Toc243614000" w:history="1">
+      <w:hyperlink w:anchor="_Toc243643187" w:history="1">
         <w:r>
           <w:rPr>
             <w:rStyle w:val="Hyperlink"/>
@@ -2426,7 +2426,7 @@
             <w:noProof/>
             <w:webHidden/>
           </w:rPr>
-          <w:instrText xml:space="preserve"> PAGEREF _Toc243614000 \h </w:instrText>
+          <w:instrText xml:space="preserve"> PAGEREF _Toc243643187 \h </w:instrText>
         </w:r>
         <w:r>
           <w:rPr>
@@ -2467,7 +2467,7 @@
           <w:noProof/>
         </w:rPr>
       </w:pPr>
-      <w:hyperlink w:anchor="_Toc243614001" w:history="1">
+      <w:hyperlink w:anchor="_Toc243643188" w:history="1">
         <w:r>
           <w:rPr>
             <w:rStyle w:val="Hyperlink"/>
@@ -2494,7 +2494,7 @@
             <w:noProof/>
             <w:webHidden/>
           </w:rPr>
-          <w:instrText xml:space="preserve"> PAGEREF _Toc243614001 \h </w:instrText>
+          <w:instrText xml:space="preserve"> PAGEREF _Toc243643188 \h </w:instrText>
         </w:r>
         <w:r>
           <w:rPr>
@@ -2535,7 +2535,7 @@
           <w:noProof/>
         </w:rPr>
       </w:pPr>
-      <w:hyperlink w:anchor="_Toc243614002" w:history="1">
+      <w:hyperlink w:anchor="_Toc243643189" w:history="1">
         <w:r>
           <w:rPr>
             <w:rStyle w:val="Hyperlink"/>
@@ -2562,7 +2562,7 @@
             <w:noProof/>
             <w:webHidden/>
           </w:rPr>
-          <w:instrText xml:space="preserve"> PAGEREF _Toc243614002 \h </w:instrText>
+          <w:instrText xml:space="preserve"> PAGEREF _Toc243643189 \h </w:instrText>
         </w:r>
         <w:r>
           <w:rPr>
@@ -2603,7 +2603,7 @@
           <w:noProof/>
         </w:rPr>
       </w:pPr>
-      <w:hyperlink w:anchor="_Toc243614003" w:history="1">
+      <w:hyperlink w:anchor="_Toc243643190" w:history="1">
         <w:r>
           <w:rPr>
             <w:rStyle w:val="Hyperlink"/>
@@ -2630,7 +2630,7 @@
             <w:noProof/>
             <w:webHidden/>
           </w:rPr>
-          <w:instrText xml:space="preserve"> PAGEREF _Toc243614003 \h </w:instrText>
+          <w:instrText xml:space="preserve"> PAGEREF _Toc243643190 \h </w:instrText>
         </w:r>
         <w:r>
           <w:rPr>
@@ -2671,7 +2671,7 @@
           <w:noProof/>
         </w:rPr>
       </w:pPr>
-      <w:hyperlink w:anchor="_Toc243614004" w:history="1">
+      <w:hyperlink w:anchor="_Toc243643191" w:history="1">
         <w:r>
           <w:rPr>
             <w:rStyle w:val="Hyperlink"/>
@@ -2698,7 +2698,7 @@
             <w:noProof/>
             <w:webHidden/>
           </w:rPr>
-          <w:instrText xml:space="preserve"> PAGEREF _Toc243614004 \h </w:instrText>
+          <w:instrText xml:space="preserve"> PAGEREF _Toc243643191 \h </w:instrText>
         </w:r>
         <w:r>
           <w:rPr>
@@ -2739,7 +2739,7 @@
           <w:noProof/>
         </w:rPr>
       </w:pPr>
-      <w:hyperlink w:anchor="_Toc243614005" w:history="1">
+      <w:hyperlink w:anchor="_Toc243643192" w:history="1">
         <w:r>
           <w:rPr>
             <w:rStyle w:val="Hyperlink"/>
@@ -2766,7 +2766,7 @@
             <w:noProof/>
             <w:webHidden/>
           </w:rPr>
-          <w:instrText xml:space="preserve"> PAGEREF _Toc243614005 \h </w:instrText>
+          <w:instrText xml:space="preserve"> PAGEREF _Toc243643192 \h </w:instrText>
         </w:r>
         <w:r>
           <w:rPr>
@@ -2807,7 +2807,7 @@
           <w:noProof/>
         </w:rPr>
       </w:pPr>
-      <w:hyperlink w:anchor="_Toc243614006" w:history="1">
+      <w:hyperlink w:anchor="_Toc243643193" w:history="1">
         <w:r>
           <w:rPr>
             <w:rStyle w:val="Hyperlink"/>
@@ -2834,7 +2834,7 @@
             <w:noProof/>
             <w:webHidden/>
           </w:rPr>
-          <w:instrText xml:space="preserve"> PAGEREF _Toc243614006 \h </w:instrText>
+          <w:instrText xml:space="preserve"> PAGEREF _Toc243643193 \h </w:instrText>
         </w:r>
         <w:r>
           <w:rPr>
@@ -2875,7 +2875,7 @@
           <w:noProof/>
         </w:rPr>
       </w:pPr>
-      <w:hyperlink w:anchor="_Toc243614007" w:history="1">
+      <w:hyperlink w:anchor="_Toc243643194" w:history="1">
         <w:r>
           <w:rPr>
             <w:rStyle w:val="Hyperlink"/>
@@ -2902,7 +2902,7 @@
             <w:noProof/>
             <w:webHidden/>
           </w:rPr>
-          <w:instrText xml:space="preserve"> PAGEREF _Toc243614007 \h </w:instrText>
+          <w:instrText xml:space="preserve"> PAGEREF _Toc243643194 \h </w:instrText>
         </w:r>
         <w:r>
           <w:rPr>
@@ -2943,7 +2943,7 @@
           <w:noProof/>
         </w:rPr>
       </w:pPr>
-      <w:hyperlink w:anchor="_Toc243614008" w:history="1">
+      <w:hyperlink w:anchor="_Toc243643195" w:history="1">
         <w:r>
           <w:rPr>
             <w:rStyle w:val="Hyperlink"/>
@@ -2970,7 +2970,7 @@
             <w:noProof/>
             <w:webHidden/>
           </w:rPr>
-          <w:instrText xml:space="preserve"> PAGEREF _Toc243614008 \h </w:instrText>
+          <w:instrText xml:space="preserve"> PAGEREF _Toc243643195 \h </w:instrText>
         </w:r>
         <w:r>
           <w:rPr>
@@ -3011,7 +3011,7 @@
           <w:noProof/>
         </w:rPr>
       </w:pPr>
-      <w:hyperlink w:anchor="_Toc243614009" w:history="1">
+      <w:hyperlink w:anchor="_Toc243643196" w:history="1">
         <w:r>
           <w:rPr>
             <w:rStyle w:val="Hyperlink"/>
@@ -3038,7 +3038,7 @@
             <w:noProof/>
             <w:webHidden/>
           </w:rPr>
-          <w:instrText xml:space="preserve"> PAGEREF _Toc243614009 \h </w:instrText>
+          <w:instrText xml:space="preserve"> PAGEREF _Toc243643196 \h </w:instrText>
         </w:r>
         <w:r>
           <w:rPr>
@@ -3079,7 +3079,7 @@
           <w:noProof/>
         </w:rPr>
       </w:pPr>
-      <w:hyperlink w:anchor="_Toc243614010" w:history="1">
+      <w:hyperlink w:anchor="_Toc243643197" w:history="1">
         <w:r>
           <w:rPr>
             <w:rStyle w:val="Hyperlink"/>
@@ -3106,7 +3106,7 @@
             <w:noProof/>
             <w:webHidden/>
           </w:rPr>
-          <w:instrText xml:space="preserve"> PAGEREF _Toc243614010 \h </w:instrText>
+          <w:instrText xml:space="preserve"> PAGEREF _Toc243643197 \h </w:instrText>
         </w:r>
         <w:r>
           <w:rPr>
@@ -3147,7 +3147,7 @@
           <w:noProof/>
         </w:rPr>
       </w:pPr>
-      <w:hyperlink w:anchor="_Toc243614011" w:history="1">
+      <w:hyperlink w:anchor="_Toc243643198" w:history="1">
         <w:r>
           <w:rPr>
             <w:rStyle w:val="Hyperlink"/>
@@ -3174,7 +3174,7 @@
             <w:noProof/>
             <w:webHidden/>
           </w:rPr>
-          <w:instrText xml:space="preserve"> PAGEREF _Toc243614011 \h </w:instrText>
+          <w:instrText xml:space="preserve"> PAGEREF _Toc243643198 \h </w:instrText>
         </w:r>
         <w:r>
           <w:rPr>
@@ -3215,7 +3215,7 @@
           <w:noProof/>
         </w:rPr>
       </w:pPr>
-      <w:hyperlink w:anchor="_Toc243614012" w:history="1">
+      <w:hyperlink w:anchor="_Toc243643199" w:history="1">
         <w:r>
           <w:rPr>
             <w:rStyle w:val="Hyperlink"/>
@@ -3242,7 +3242,7 @@
             <w:noProof/>
             <w:webHidden/>
           </w:rPr>
-          <w:instrText xml:space="preserve"> PAGEREF _Toc243614012 \h </w:instrText>
+          <w:instrText xml:space="preserve"> PAGEREF _Toc243643199 \h </w:instrText>
         </w:r>
         <w:r>
           <w:rPr>
@@ -3287,7 +3287,7 @@
       <w:pPr>
         <w:pStyle w:val="Heading1"/>
       </w:pPr>
-      <w:bookmarkStart w:id="0" w:name="_Toc243613966"/>
+      <w:bookmarkStart w:id="0" w:name="_Toc243643153"/>
       <w:r>
         <w:lastRenderedPageBreak/>
         <w:t>What Litterbox is</w:t>
@@ -3383,7 +3383,7 @@
       <w:pPr>
         <w:pStyle w:val="Heading2"/>
       </w:pPr>
-      <w:bookmarkStart w:id="1" w:name="_Toc243613967"/>
+      <w:bookmarkStart w:id="1" w:name="_Toc243643154"/>
       <w:r>
         <w:t>Terms</w:t>
       </w:r>
@@ -3811,7 +3811,7 @@
       <w:pPr>
         <w:pStyle w:val="Heading1"/>
       </w:pPr>
-      <w:bookmarkStart w:id="2" w:name="_Toc243613968"/>
+      <w:bookmarkStart w:id="2" w:name="_Toc243643155"/>
       <w:r>
         <w:lastRenderedPageBreak/>
         <w:t>Getting started</w:t>
@@ -3827,7 +3827,7 @@
       <w:pPr>
         <w:pStyle w:val="Heading2"/>
       </w:pPr>
-      <w:bookmarkStart w:id="3" w:name="_Toc243613969"/>
+      <w:bookmarkStart w:id="3" w:name="_Toc243643156"/>
       <w:r>
         <w:t>What you need</w:t>
       </w:r>
@@ -3912,7 +3912,7 @@
       <w:pPr>
         <w:pStyle w:val="Heading2"/>
       </w:pPr>
-      <w:bookmarkStart w:id="4" w:name="_Toc243613970"/>
+      <w:bookmarkStart w:id="4" w:name="_Toc243643157"/>
       <w:r>
         <w:t>Installing Litterbox</w:t>
       </w:r>
@@ -3991,7 +3991,7 @@
       <w:pPr>
         <w:pStyle w:val="Heading2"/>
       </w:pPr>
-      <w:bookmarkStart w:id="5" w:name="_Toc243613971"/>
+      <w:bookmarkStart w:id="5" w:name="_Toc243643158"/>
       <w:r>
         <w:t>Joining your team's vault</w:t>
       </w:r>
@@ -4097,7 +4097,7 @@
       <w:pPr>
         <w:pStyle w:val="Heading2"/>
       </w:pPr>
-      <w:bookmarkStart w:id="6" w:name="_Toc243613972"/>
+      <w:bookmarkStart w:id="6" w:name="_Toc243643159"/>
       <w:r>
         <w:lastRenderedPageBreak/>
         <w:t>Setting up a new team</w:t>
@@ -4358,7 +4358,7 @@
       <w:pPr>
         <w:pStyle w:val="Heading2"/>
       </w:pPr>
-      <w:bookmarkStart w:id="7" w:name="_Toc243613973"/>
+      <w:bookmarkStart w:id="7" w:name="_Toc243643160"/>
       <w:r>
         <w:t>The main window</w:t>
       </w:r>
@@ -4729,7 +4729,7 @@
       <w:pPr>
         <w:pStyle w:val="Heading2"/>
       </w:pPr>
-      <w:bookmarkStart w:id="8" w:name="_Toc243613974"/>
+      <w:bookmarkStart w:id="8" w:name="_Toc243643161"/>
       <w:r>
         <w:t>Your first part</w:t>
       </w:r>
@@ -4824,7 +4824,7 @@
       <w:pPr>
         <w:pStyle w:val="Heading1"/>
       </w:pPr>
-      <w:bookmarkStart w:id="9" w:name="_Toc243613975"/>
+      <w:bookmarkStart w:id="9" w:name="_Toc243643162"/>
       <w:r>
         <w:lastRenderedPageBreak/>
         <w:t>Everyday work</w:t>
@@ -4835,7 +4835,7 @@
       <w:pPr>
         <w:pStyle w:val="Heading2"/>
       </w:pPr>
-      <w:bookmarkStart w:id="10" w:name="_Toc243613976"/>
+      <w:bookmarkStart w:id="10" w:name="_Toc243643163"/>
       <w:r>
         <w:t>Part numbers and file names</w:t>
       </w:r>
@@ -4864,7 +4864,7 @@
       <w:pPr>
         <w:pStyle w:val="Heading2"/>
       </w:pPr>
-      <w:bookmarkStart w:id="11" w:name="_Toc243613977"/>
+      <w:bookmarkStart w:id="11" w:name="_Toc243643164"/>
       <w:r>
         <w:t>Projects</w:t>
       </w:r>
@@ -5102,7 +5102,7 @@
       <w:pPr>
         <w:pStyle w:val="Heading2"/>
       </w:pPr>
-      <w:bookmarkStart w:id="12" w:name="_Toc243613978"/>
+      <w:bookmarkStart w:id="12" w:name="_Toc243643165"/>
       <w:r>
         <w:t>Finding parts</w:t>
       </w:r>
@@ -5149,16 +5149,16 @@
         <w:pStyle w:val="ListBullet"/>
       </w:pPr>
       <w:r>
-        <w:t>Click a column heading to sort. View &gt; Columns adds Project, Kind, COTS, Status, Checked out by, Released rev, Imported from, and Material.</w:t>
+        <w:lastRenderedPageBreak/>
+        <w:t>Click a column heading to sort. Part number, Rev, Name, Description, Files, and Kind show to start with. View &gt; Columns adds Project, COTS, Status, Checked out by, Released rev, Imported from, and Material.</w:t>
       </w:r>
     </w:p>
     <w:p>
       <w:pPr>
         <w:pStyle w:val="Heading2"/>
       </w:pPr>
-      <w:bookmarkStart w:id="13" w:name="_Toc243613979"/>
-      <w:r>
-        <w:lastRenderedPageBreak/>
+      <w:bookmarkStart w:id="13" w:name="_Toc243643166"/>
+      <w:r>
         <w:t>Checking out and checking in</w:t>
       </w:r>
       <w:bookmarkEnd w:id="13"/>
@@ -5273,7 +5273,7 @@
       <w:pPr>
         <w:pStyle w:val="Heading2"/>
       </w:pPr>
-      <w:bookmarkStart w:id="14" w:name="_Toc243613980"/>
+      <w:bookmarkStart w:id="14" w:name="_Toc243643167"/>
       <w:r>
         <w:t>Getting other people's changes</w:t>
       </w:r>
@@ -5303,7 +5303,7 @@
       <w:pPr>
         <w:pStyle w:val="Heading2"/>
       </w:pPr>
-      <w:bookmarkStart w:id="15" w:name="_Toc243613981"/>
+      <w:bookmarkStart w:id="15" w:name="_Toc243643168"/>
       <w:r>
         <w:t>Opening files</w:t>
       </w:r>
@@ -5362,7 +5362,7 @@
       <w:pPr>
         <w:pStyle w:val="Heading2"/>
       </w:pPr>
-      <w:bookmarkStart w:id="16" w:name="_Toc243613982"/>
+      <w:bookmarkStart w:id="16" w:name="_Toc243643169"/>
       <w:r>
         <w:t>The details pane</w:t>
       </w:r>
@@ -5442,6 +5442,7 @@
               <w:rPr>
                 <w:sz w:val="20"/>
               </w:rPr>
+              <w:lastRenderedPageBreak/>
               <w:t>Details</w:t>
             </w:r>
           </w:p>
@@ -5520,7 +5521,6 @@
               <w:rPr>
                 <w:sz w:val="20"/>
               </w:rPr>
-              <w:lastRenderedPageBreak/>
               <w:t>Uses / Where used</w:t>
             </w:r>
           </w:p>
@@ -5635,7 +5635,7 @@
       <w:pPr>
         <w:pStyle w:val="Heading1"/>
       </w:pPr>
-      <w:bookmarkStart w:id="17" w:name="_Toc243613983"/>
+      <w:bookmarkStart w:id="17" w:name="_Toc243643170"/>
       <w:r>
         <w:lastRenderedPageBreak/>
         <w:t>Revisions and the lifecycle</w:t>
@@ -6005,7 +6005,7 @@
       <w:pPr>
         <w:pStyle w:val="Heading2"/>
       </w:pPr>
-      <w:bookmarkStart w:id="18" w:name="_Toc243613984"/>
+      <w:bookmarkStart w:id="18" w:name="_Toc243643171"/>
       <w:r>
         <w:t>Form, Fit, Function, and Dispo</w:t>
       </w:r>
@@ -6099,7 +6099,7 @@
       <w:pPr>
         <w:pStyle w:val="Heading1"/>
       </w:pPr>
-      <w:bookmarkStart w:id="19" w:name="_Toc243613985"/>
+      <w:bookmarkStart w:id="19" w:name="_Toc243643172"/>
       <w:r>
         <w:lastRenderedPageBreak/>
         <w:t>Assemblies, references, and BOMs</w:t>
@@ -6110,7 +6110,7 @@
       <w:pPr>
         <w:pStyle w:val="Heading2"/>
       </w:pPr>
-      <w:bookmarkStart w:id="20" w:name="_Toc243613986"/>
+      <w:bookmarkStart w:id="20" w:name="_Toc243643173"/>
       <w:r>
         <w:t>Uses and where used</w:t>
       </w:r>
@@ -6163,7 +6163,7 @@
       <w:pPr>
         <w:pStyle w:val="Heading2"/>
       </w:pPr>
-      <w:bookmarkStart w:id="21" w:name="_Toc243613987"/>
+      <w:bookmarkStart w:id="21" w:name="_Toc243643174"/>
       <w:r>
         <w:t>The BOM tab</w:t>
       </w:r>
@@ -6262,7 +6262,7 @@
       <w:pPr>
         <w:pStyle w:val="Heading2"/>
       </w:pPr>
-      <w:bookmarkStart w:id="22" w:name="_Toc243613988"/>
+      <w:bookmarkStart w:id="22" w:name="_Toc243643175"/>
       <w:r>
         <w:t>Non-CAD parts and kits</w:t>
       </w:r>
@@ -6332,7 +6332,7 @@
       <w:pPr>
         <w:pStyle w:val="Heading1"/>
       </w:pPr>
-      <w:bookmarkStart w:id="23" w:name="_Toc243613989"/>
+      <w:bookmarkStart w:id="23" w:name="_Toc243643176"/>
       <w:r>
         <w:lastRenderedPageBreak/>
         <w:t>Purchasing, costs, and materials</w:t>
@@ -6343,7 +6343,7 @@
       <w:pPr>
         <w:pStyle w:val="Heading2"/>
       </w:pPr>
-      <w:bookmarkStart w:id="24" w:name="_Toc243613990"/>
+      <w:bookmarkStart w:id="24" w:name="_Toc243643177"/>
       <w:r>
         <w:t>Purchasing info</w:t>
       </w:r>
@@ -6381,7 +6381,7 @@
       <w:pPr>
         <w:pStyle w:val="Heading2"/>
       </w:pPr>
-      <w:bookmarkStart w:id="25" w:name="_Toc243613991"/>
+      <w:bookmarkStart w:id="25" w:name="_Toc243643178"/>
       <w:r>
         <w:t>Materials</w:t>
       </w:r>
@@ -6419,7 +6419,7 @@
       <w:pPr>
         <w:pStyle w:val="Heading1"/>
       </w:pPr>
-      <w:bookmarkStart w:id="26" w:name="_Toc243613992"/>
+      <w:bookmarkStart w:id="26" w:name="_Toc243643179"/>
       <w:r>
         <w:lastRenderedPageBreak/>
         <w:t>Release outputs and exports</w:t>
@@ -6430,7 +6430,7 @@
       <w:pPr>
         <w:pStyle w:val="Heading2"/>
       </w:pPr>
-      <w:bookmarkStart w:id="27" w:name="_Toc243613993"/>
+      <w:bookmarkStart w:id="27" w:name="_Toc243643180"/>
       <w:r>
         <w:t>STEP and PDF files</w:t>
       </w:r>
@@ -6491,7 +6491,7 @@
       <w:pPr>
         <w:pStyle w:val="Heading2"/>
       </w:pPr>
-      <w:bookmarkStart w:id="28" w:name="_Toc243613994"/>
+      <w:bookmarkStart w:id="28" w:name="_Toc243643181"/>
       <w:r>
         <w:t>Exporting</w:t>
       </w:r>
@@ -6520,7 +6520,7 @@
       <w:pPr>
         <w:pStyle w:val="Heading1"/>
       </w:pPr>
-      <w:bookmarkStart w:id="29" w:name="_Toc243613995"/>
+      <w:bookmarkStart w:id="29" w:name="_Toc243643182"/>
       <w:r>
         <w:lastRenderedPageBreak/>
         <w:t>Documents</w:t>
@@ -6625,7 +6625,7 @@
       <w:pPr>
         <w:pStyle w:val="Heading1"/>
       </w:pPr>
-      <w:bookmarkStart w:id="30" w:name="_Toc243613996"/>
+      <w:bookmarkStart w:id="30" w:name="_Toc243643183"/>
       <w:r>
         <w:lastRenderedPageBreak/>
         <w:t>Sign-off workflows and ECOs</w:t>
@@ -6636,7 +6636,7 @@
       <w:pPr>
         <w:pStyle w:val="Heading2"/>
       </w:pPr>
-      <w:bookmarkStart w:id="31" w:name="_Toc243613997"/>
+      <w:bookmarkStart w:id="31" w:name="_Toc243643184"/>
       <w:r>
         <w:t>How workflows work</w:t>
       </w:r>
@@ -6692,7 +6692,7 @@
       <w:pPr>
         <w:pStyle w:val="Heading2"/>
       </w:pPr>
-      <w:bookmarkStart w:id="32" w:name="_Toc243613998"/>
+      <w:bookmarkStart w:id="32" w:name="_Toc243643185"/>
       <w:r>
         <w:t>Asking for sign-off</w:t>
       </w:r>
@@ -6853,7 +6853,7 @@
       <w:pPr>
         <w:pStyle w:val="Heading2"/>
       </w:pPr>
-      <w:bookmarkStart w:id="33" w:name="_Toc243613999"/>
+      <w:bookmarkStart w:id="33" w:name="_Toc243643186"/>
       <w:r>
         <w:t>Reviewing a request</w:t>
       </w:r>
@@ -7155,7 +7155,7 @@
       <w:pPr>
         <w:pStyle w:val="Heading2"/>
       </w:pPr>
-      <w:bookmarkStart w:id="34" w:name="_Toc243614000"/>
+      <w:bookmarkStart w:id="34" w:name="_Toc243643187"/>
       <w:r>
         <w:t>Rejected requests</w:t>
       </w:r>
@@ -7228,7 +7228,7 @@
       <w:pPr>
         <w:pStyle w:val="Heading2"/>
       </w:pPr>
-      <w:bookmarkStart w:id="35" w:name="_Toc243614001"/>
+      <w:bookmarkStart w:id="35" w:name="_Toc243643188"/>
       <w:r>
         <w:t>Engineering change orders</w:t>
       </w:r>
@@ -7280,7 +7280,7 @@
       <w:pPr>
         <w:pStyle w:val="Heading1"/>
       </w:pPr>
-      <w:bookmarkStart w:id="36" w:name="_Toc243614002"/>
+      <w:bookmarkStart w:id="36" w:name="_Toc243643189"/>
       <w:r>
         <w:lastRenderedPageBreak/>
         <w:t>Running the team</w:t>
@@ -7305,7 +7305,7 @@
       <w:pPr>
         <w:pStyle w:val="Heading2"/>
       </w:pPr>
-      <w:bookmarkStart w:id="37" w:name="_Toc243614003"/>
+      <w:bookmarkStart w:id="37" w:name="_Toc243643190"/>
       <w:r>
         <w:t>People and access</w:t>
       </w:r>
@@ -7571,7 +7571,7 @@
       <w:pPr>
         <w:pStyle w:val="Heading2"/>
       </w:pPr>
-      <w:bookmarkStart w:id="38" w:name="_Toc243614004"/>
+      <w:bookmarkStart w:id="38" w:name="_Toc243643191"/>
       <w:r>
         <w:t>Vault settings</w:t>
       </w:r>
@@ -7916,7 +7916,7 @@
       <w:pPr>
         <w:pStyle w:val="Heading2"/>
       </w:pPr>
-      <w:bookmarkStart w:id="39" w:name="_Toc243614005"/>
+      <w:bookmarkStart w:id="39" w:name="_Toc243643192"/>
       <w:r>
         <w:t>Vault maintenance</w:t>
       </w:r>
@@ -7968,7 +7968,7 @@
       <w:pPr>
         <w:pStyle w:val="Heading1"/>
       </w:pPr>
-      <w:bookmarkStart w:id="40" w:name="_Toc243614006"/>
+      <w:bookmarkStart w:id="40" w:name="_Toc243643193"/>
       <w:r>
         <w:lastRenderedPageBreak/>
         <w:t>Importing existing CAD</w:t>
@@ -8064,7 +8064,7 @@
       <w:pPr>
         <w:pStyle w:val="Heading1"/>
       </w:pPr>
-      <w:bookmarkStart w:id="41" w:name="_Toc243614007"/>
+      <w:bookmarkStart w:id="41" w:name="_Toc243643194"/>
       <w:r>
         <w:lastRenderedPageBreak/>
         <w:t>Working with SolidWorks</w:t>
@@ -8145,7 +8145,7 @@
       <w:pPr>
         <w:pStyle w:val="Heading1"/>
       </w:pPr>
-      <w:bookmarkStart w:id="42" w:name="_Toc243614008"/>
+      <w:bookmarkStart w:id="42" w:name="_Toc243643195"/>
       <w:r>
         <w:lastRenderedPageBreak/>
         <w:t>Settings and troubleshooting</w:t>
@@ -8156,7 +8156,7 @@
       <w:pPr>
         <w:pStyle w:val="Heading2"/>
       </w:pPr>
-      <w:bookmarkStart w:id="43" w:name="_Toc243614009"/>
+      <w:bookmarkStart w:id="43" w:name="_Toc243643196"/>
       <w:r>
         <w:t>Your settings</w:t>
       </w:r>
@@ -8482,7 +8482,7 @@
       <w:pPr>
         <w:pStyle w:val="Heading2"/>
       </w:pPr>
-      <w:bookmarkStart w:id="44" w:name="_Toc243614010"/>
+      <w:bookmarkStart w:id="44" w:name="_Toc243643197"/>
       <w:r>
         <w:t>Problems</w:t>
       </w:r>
@@ -8550,7 +8550,7 @@
       <w:pPr>
         <w:pStyle w:val="Heading2"/>
       </w:pPr>
-      <w:bookmarkStart w:id="45" w:name="_Toc243614011"/>
+      <w:bookmarkStart w:id="45" w:name="_Toc243643198"/>
       <w:r>
         <w:t>The command line</w:t>
       </w:r>
@@ -8590,7 +8590,7 @@
       <w:pPr>
         <w:pStyle w:val="Heading1"/>
       </w:pPr>
-      <w:bookmarkStart w:id="46" w:name="_Toc243614012"/>
+      <w:bookmarkStart w:id="46" w:name="_Toc243643199"/>
       <w:r>
         <w:lastRenderedPageBreak/>
         <w:t>Quick reference</w:t>
@@ -9216,70 +9216,70 @@
       </w:rPr>
     </w:lvl>
   </w:abstractNum>
-  <w:num w:numId="1" w16cid:durableId="1815557799">
+  <w:num w:numId="1" w16cid:durableId="479034542">
     <w:abstractNumId w:val="8"/>
   </w:num>
-  <w:num w:numId="2" w16cid:durableId="1544556743">
+  <w:num w:numId="2" w16cid:durableId="2020738595">
     <w:abstractNumId w:val="6"/>
   </w:num>
-  <w:num w:numId="3" w16cid:durableId="1594360582">
+  <w:num w:numId="3" w16cid:durableId="610430742">
     <w:abstractNumId w:val="5"/>
   </w:num>
-  <w:num w:numId="4" w16cid:durableId="506216146">
+  <w:num w:numId="4" w16cid:durableId="2086879443">
     <w:abstractNumId w:val="4"/>
   </w:num>
-  <w:num w:numId="5" w16cid:durableId="51079562">
+  <w:num w:numId="5" w16cid:durableId="735208508">
     <w:abstractNumId w:val="7"/>
   </w:num>
-  <w:num w:numId="6" w16cid:durableId="1252084673">
+  <w:num w:numId="6" w16cid:durableId="2088068269">
     <w:abstractNumId w:val="3"/>
   </w:num>
-  <w:num w:numId="7" w16cid:durableId="1444610985">
+  <w:num w:numId="7" w16cid:durableId="436340498">
     <w:abstractNumId w:val="2"/>
   </w:num>
-  <w:num w:numId="8" w16cid:durableId="1440370242">
+  <w:num w:numId="8" w16cid:durableId="107311846">
     <w:abstractNumId w:val="1"/>
   </w:num>
-  <w:num w:numId="9" w16cid:durableId="1489129220">
+  <w:num w:numId="9" w16cid:durableId="252974979">
     <w:abstractNumId w:val="0"/>
   </w:num>
-  <w:num w:numId="10" w16cid:durableId="2090617020">
+  <w:num w:numId="10" w16cid:durableId="2081369673">
     <w:abstractNumId w:val="7"/>
     <w:lvlOverride w:ilvl="0">
       <w:startOverride w:val="1"/>
     </w:lvlOverride>
   </w:num>
-  <w:num w:numId="11" w16cid:durableId="1587568177">
+  <w:num w:numId="11" w16cid:durableId="785857104">
     <w:abstractNumId w:val="7"/>
     <w:lvlOverride w:ilvl="0">
       <w:startOverride w:val="1"/>
     </w:lvlOverride>
   </w:num>
-  <w:num w:numId="12" w16cid:durableId="1970165971">
+  <w:num w:numId="12" w16cid:durableId="1298876271">
     <w:abstractNumId w:val="7"/>
     <w:lvlOverride w:ilvl="0">
       <w:startOverride w:val="1"/>
     </w:lvlOverride>
   </w:num>
-  <w:num w:numId="13" w16cid:durableId="2112117395">
+  <w:num w:numId="13" w16cid:durableId="1244485214">
     <w:abstractNumId w:val="7"/>
     <w:lvlOverride w:ilvl="0">
       <w:startOverride w:val="1"/>
     </w:lvlOverride>
   </w:num>
-  <w:num w:numId="14" w16cid:durableId="688875843">
+  <w:num w:numId="14" w16cid:durableId="853302617">
     <w:abstractNumId w:val="7"/>
     <w:lvlOverride w:ilvl="0">
       <w:startOverride w:val="1"/>
     </w:lvlOverride>
   </w:num>
-  <w:num w:numId="15" w16cid:durableId="575438725">
+  <w:num w:numId="15" w16cid:durableId="1416394170">
     <w:abstractNumId w:val="7"/>
     <w:lvlOverride w:ilvl="0">
       <w:startOverride w:val="1"/>
     </w:lvlOverride>
   </w:num>
-  <w:num w:numId="16" w16cid:durableId="1800143315">
+  <w:num w:numId="16" w16cid:durableId="2015455994">
     <w:abstractNumId w:val="7"/>
     <w:lvlOverride w:ilvl="0">
       <w:startOverride w:val="1"/>
@@ -20649,7 +20649,7 @@
     <w:autoRedefine/>
     <w:uiPriority w:val="39"/>
     <w:unhideWhenUsed/>
-    <w:rsid w:val="005D0D9C"/>
+    <w:rsid w:val="00AF57BE"/>
     <w:pPr>
       <w:spacing w:after="100"/>
     </w:pPr>
@@ -20661,7 +20661,7 @@
     <w:autoRedefine/>
     <w:uiPriority w:val="39"/>
     <w:unhideWhenUsed/>
-    <w:rsid w:val="005D0D9C"/>
+    <w:rsid w:val="00AF57BE"/>
     <w:pPr>
       <w:spacing w:after="100"/>
       <w:ind w:left="210"/>
@@ -20672,7 +20672,7 @@
     <w:basedOn w:val="DefaultParagraphFont"/>
     <w:uiPriority w:val="99"/>
     <w:unhideWhenUsed/>
-    <w:rsid w:val="005D0D9C"/>
+    <w:rsid w:val="00AF57BE"/>
     <w:rPr>
       <w:color w:val="0000FF" w:themeColor="hyperlink"/>
       <w:u w:val="single"/>

</xml_diff>

<commit_message>
0.5.7: upgrading records to a new format (Vault > Upgrade records...); guide: Decisions to make first
Records are upgraded as they are read (records/record_migrations.py, no steps yet), written only once the vault
requires a Litterbox that reads their format, and rewritten for everyone by an Admin (vault/record_upgrade.py).
Old records to test every step on are in tests/records/fixtures/.

Co-Authored-By: Claude Opus 5.5 <noreply@anthropic.com>
</commit_message>
<xml_diff>
--- a/docs/Litterbox_User_Guide.docx
+++ b/docs/Litterbox_User_Guide.docx
@@ -46,7 +46,7 @@
         <w:rPr>
           <w:color w:val="666666"/>
         </w:rPr>
-        <w:t>For Litterbox 0.5.6  ·  October 2026</w:t>
+        <w:t>For Litterbox 0.5.7  ·  October 2026</w:t>
       </w:r>
     </w:p>
     <w:p>
@@ -87,7 +87,7 @@
       <w:r>
         <w:fldChar w:fldCharType="separate"/>
       </w:r>
-      <w:hyperlink w:anchor="_Toc243643153" w:history="1">
+      <w:hyperlink w:anchor="_Toc243647327" w:history="1">
         <w:r>
           <w:rPr>
             <w:rStyle w:val="Hyperlink"/>
@@ -114,7 +114,7 @@
             <w:noProof/>
             <w:webHidden/>
           </w:rPr>
-          <w:instrText xml:space="preserve"> PAGEREF _Toc243643153 \h </w:instrText>
+          <w:instrText xml:space="preserve"> PAGEREF _Toc243647327 \h </w:instrText>
         </w:r>
         <w:r>
           <w:rPr>
@@ -155,7 +155,7 @@
           <w:noProof/>
         </w:rPr>
       </w:pPr>
-      <w:hyperlink w:anchor="_Toc243643154" w:history="1">
+      <w:hyperlink w:anchor="_Toc243647328" w:history="1">
         <w:r>
           <w:rPr>
             <w:rStyle w:val="Hyperlink"/>
@@ -182,7 +182,7 @@
             <w:noProof/>
             <w:webHidden/>
           </w:rPr>
-          <w:instrText xml:space="preserve"> PAGEREF _Toc243643154 \h </w:instrText>
+          <w:instrText xml:space="preserve"> PAGEREF _Toc243647328 \h </w:instrText>
         </w:r>
         <w:r>
           <w:rPr>
@@ -223,7 +223,7 @@
           <w:noProof/>
         </w:rPr>
       </w:pPr>
-      <w:hyperlink w:anchor="_Toc243643155" w:history="1">
+      <w:hyperlink w:anchor="_Toc243647329" w:history="1">
         <w:r>
           <w:rPr>
             <w:rStyle w:val="Hyperlink"/>
@@ -250,7 +250,7 @@
             <w:noProof/>
             <w:webHidden/>
           </w:rPr>
-          <w:instrText xml:space="preserve"> PAGEREF _Toc243643155 \h </w:instrText>
+          <w:instrText xml:space="preserve"> PAGEREF _Toc243647329 \h </w:instrText>
         </w:r>
         <w:r>
           <w:rPr>
@@ -291,7 +291,7 @@
           <w:noProof/>
         </w:rPr>
       </w:pPr>
-      <w:hyperlink w:anchor="_Toc243643156" w:history="1">
+      <w:hyperlink w:anchor="_Toc243647330" w:history="1">
         <w:r>
           <w:rPr>
             <w:rStyle w:val="Hyperlink"/>
@@ -318,7 +318,7 @@
             <w:noProof/>
             <w:webHidden/>
           </w:rPr>
-          <w:instrText xml:space="preserve"> PAGEREF _Toc243643156 \h </w:instrText>
+          <w:instrText xml:space="preserve"> PAGEREF _Toc243647330 \h </w:instrText>
         </w:r>
         <w:r>
           <w:rPr>
@@ -359,7 +359,7 @@
           <w:noProof/>
         </w:rPr>
       </w:pPr>
-      <w:hyperlink w:anchor="_Toc243643157" w:history="1">
+      <w:hyperlink w:anchor="_Toc243647331" w:history="1">
         <w:r>
           <w:rPr>
             <w:rStyle w:val="Hyperlink"/>
@@ -386,7 +386,7 @@
             <w:noProof/>
             <w:webHidden/>
           </w:rPr>
-          <w:instrText xml:space="preserve"> PAGEREF _Toc243643157 \h </w:instrText>
+          <w:instrText xml:space="preserve"> PAGEREF _Toc243647331 \h </w:instrText>
         </w:r>
         <w:r>
           <w:rPr>
@@ -427,7 +427,7 @@
           <w:noProof/>
         </w:rPr>
       </w:pPr>
-      <w:hyperlink w:anchor="_Toc243643158" w:history="1">
+      <w:hyperlink w:anchor="_Toc243647332" w:history="1">
         <w:r>
           <w:rPr>
             <w:rStyle w:val="Hyperlink"/>
@@ -454,7 +454,7 @@
             <w:noProof/>
             <w:webHidden/>
           </w:rPr>
-          <w:instrText xml:space="preserve"> PAGEREF _Toc243643158 \h </w:instrText>
+          <w:instrText xml:space="preserve"> PAGEREF _Toc243647332 \h </w:instrText>
         </w:r>
         <w:r>
           <w:rPr>
@@ -495,13 +495,13 @@
           <w:noProof/>
         </w:rPr>
       </w:pPr>
-      <w:hyperlink w:anchor="_Toc243643159" w:history="1">
+      <w:hyperlink w:anchor="_Toc243647333" w:history="1">
         <w:r>
           <w:rPr>
             <w:rStyle w:val="Hyperlink"/>
             <w:noProof/>
           </w:rPr>
-          <w:t>Setting up a new team</w:t>
+          <w:t>Decisions to make first</w:t>
         </w:r>
         <w:r>
           <w:rPr>
@@ -522,7 +522,7 @@
             <w:noProof/>
             <w:webHidden/>
           </w:rPr>
-          <w:instrText xml:space="preserve"> PAGEREF _Toc243643159 \h </w:instrText>
+          <w:instrText xml:space="preserve"> PAGEREF _Toc243647333 \h </w:instrText>
         </w:r>
         <w:r>
           <w:rPr>
@@ -563,13 +563,13 @@
           <w:noProof/>
         </w:rPr>
       </w:pPr>
-      <w:hyperlink w:anchor="_Toc243643160" w:history="1">
+      <w:hyperlink w:anchor="_Toc243647334" w:history="1">
         <w:r>
           <w:rPr>
             <w:rStyle w:val="Hyperlink"/>
             <w:noProof/>
           </w:rPr>
-          <w:t>The main window</w:t>
+          <w:t>Setting up a new team</w:t>
         </w:r>
         <w:r>
           <w:rPr>
@@ -590,7 +590,7 @@
             <w:noProof/>
             <w:webHidden/>
           </w:rPr>
-          <w:instrText xml:space="preserve"> PAGEREF _Toc243643160 \h </w:instrText>
+          <w:instrText xml:space="preserve"> PAGEREF _Toc243647334 \h </w:instrText>
         </w:r>
         <w:r>
           <w:rPr>
@@ -631,12 +631,80 @@
           <w:noProof/>
         </w:rPr>
       </w:pPr>
-      <w:hyperlink w:anchor="_Toc243643161" w:history="1">
+      <w:hyperlink w:anchor="_Toc243647335" w:history="1">
         <w:r>
           <w:rPr>
             <w:rStyle w:val="Hyperlink"/>
             <w:noProof/>
           </w:rPr>
+          <w:t>The main window</w:t>
+        </w:r>
+        <w:r>
+          <w:rPr>
+            <w:noProof/>
+            <w:webHidden/>
+          </w:rPr>
+          <w:tab/>
+        </w:r>
+        <w:r>
+          <w:rPr>
+            <w:noProof/>
+            <w:webHidden/>
+          </w:rPr>
+          <w:fldChar w:fldCharType="begin"/>
+        </w:r>
+        <w:r>
+          <w:rPr>
+            <w:noProof/>
+            <w:webHidden/>
+          </w:rPr>
+          <w:instrText xml:space="preserve"> PAGEREF _Toc243647335 \h </w:instrText>
+        </w:r>
+        <w:r>
+          <w:rPr>
+            <w:noProof/>
+            <w:webHidden/>
+          </w:rPr>
+        </w:r>
+        <w:r>
+          <w:rPr>
+            <w:noProof/>
+            <w:webHidden/>
+          </w:rPr>
+          <w:fldChar w:fldCharType="separate"/>
+        </w:r>
+        <w:r>
+          <w:rPr>
+            <w:noProof/>
+            <w:webHidden/>
+          </w:rPr>
+          <w:t>7</w:t>
+        </w:r>
+        <w:r>
+          <w:rPr>
+            <w:noProof/>
+            <w:webHidden/>
+          </w:rPr>
+          <w:fldChar w:fldCharType="end"/>
+        </w:r>
+      </w:hyperlink>
+    </w:p>
+    <w:p>
+      <w:pPr>
+        <w:pStyle w:val="TOC2"/>
+        <w:tabs>
+          <w:tab w:val="right" w:leader="dot" w:pos="9350"/>
+        </w:tabs>
+        <w:rPr>
+          <w:noProof/>
+        </w:rPr>
+      </w:pPr>
+      <w:hyperlink w:anchor="_Toc243647336" w:history="1">
+        <w:r>
+          <w:rPr>
+            <w:rStyle w:val="Hyperlink"/>
+            <w:noProof/>
+          </w:rPr>
           <w:t>Your first part</w:t>
         </w:r>
         <w:r>
@@ -658,7 +726,7 @@
             <w:noProof/>
             <w:webHidden/>
           </w:rPr>
-          <w:instrText xml:space="preserve"> PAGEREF _Toc243643161 \h </w:instrText>
+          <w:instrText xml:space="preserve"> PAGEREF _Toc243647336 \h </w:instrText>
         </w:r>
         <w:r>
           <w:rPr>
@@ -699,7 +767,7 @@
           <w:noProof/>
         </w:rPr>
       </w:pPr>
-      <w:hyperlink w:anchor="_Toc243643162" w:history="1">
+      <w:hyperlink w:anchor="_Toc243647337" w:history="1">
         <w:r>
           <w:rPr>
             <w:rStyle w:val="Hyperlink"/>
@@ -726,7 +794,7 @@
             <w:noProof/>
             <w:webHidden/>
           </w:rPr>
-          <w:instrText xml:space="preserve"> PAGEREF _Toc243643162 \h </w:instrText>
+          <w:instrText xml:space="preserve"> PAGEREF _Toc243647337 \h </w:instrText>
         </w:r>
         <w:r>
           <w:rPr>
@@ -746,7 +814,7 @@
             <w:noProof/>
             <w:webHidden/>
           </w:rPr>
-          <w:t>8</w:t>
+          <w:t>9</w:t>
         </w:r>
         <w:r>
           <w:rPr>
@@ -767,7 +835,7 @@
           <w:noProof/>
         </w:rPr>
       </w:pPr>
-      <w:hyperlink w:anchor="_Toc243643163" w:history="1">
+      <w:hyperlink w:anchor="_Toc243647338" w:history="1">
         <w:r>
           <w:rPr>
             <w:rStyle w:val="Hyperlink"/>
@@ -794,7 +862,7 @@
             <w:noProof/>
             <w:webHidden/>
           </w:rPr>
-          <w:instrText xml:space="preserve"> PAGEREF _Toc243643163 \h </w:instrText>
+          <w:instrText xml:space="preserve"> PAGEREF _Toc243647338 \h </w:instrText>
         </w:r>
         <w:r>
           <w:rPr>
@@ -814,7 +882,7 @@
             <w:noProof/>
             <w:webHidden/>
           </w:rPr>
-          <w:t>8</w:t>
+          <w:t>9</w:t>
         </w:r>
         <w:r>
           <w:rPr>
@@ -835,7 +903,7 @@
           <w:noProof/>
         </w:rPr>
       </w:pPr>
-      <w:hyperlink w:anchor="_Toc243643164" w:history="1">
+      <w:hyperlink w:anchor="_Toc243647339" w:history="1">
         <w:r>
           <w:rPr>
             <w:rStyle w:val="Hyperlink"/>
@@ -862,7 +930,7 @@
             <w:noProof/>
             <w:webHidden/>
           </w:rPr>
-          <w:instrText xml:space="preserve"> PAGEREF _Toc243643164 \h </w:instrText>
+          <w:instrText xml:space="preserve"> PAGEREF _Toc243647339 \h </w:instrText>
         </w:r>
         <w:r>
           <w:rPr>
@@ -882,7 +950,7 @@
             <w:noProof/>
             <w:webHidden/>
           </w:rPr>
-          <w:t>8</w:t>
+          <w:t>9</w:t>
         </w:r>
         <w:r>
           <w:rPr>
@@ -903,7 +971,7 @@
           <w:noProof/>
         </w:rPr>
       </w:pPr>
-      <w:hyperlink w:anchor="_Toc243643165" w:history="1">
+      <w:hyperlink w:anchor="_Toc243647340" w:history="1">
         <w:r>
           <w:rPr>
             <w:rStyle w:val="Hyperlink"/>
@@ -930,7 +998,7 @@
             <w:noProof/>
             <w:webHidden/>
           </w:rPr>
-          <w:instrText xml:space="preserve"> PAGEREF _Toc243643165 \h </w:instrText>
+          <w:instrText xml:space="preserve"> PAGEREF _Toc243647340 \h </w:instrText>
         </w:r>
         <w:r>
           <w:rPr>
@@ -950,7 +1018,7 @@
             <w:noProof/>
             <w:webHidden/>
           </w:rPr>
-          <w:t>8</w:t>
+          <w:t>9</w:t>
         </w:r>
         <w:r>
           <w:rPr>
@@ -971,7 +1039,7 @@
           <w:noProof/>
         </w:rPr>
       </w:pPr>
-      <w:hyperlink w:anchor="_Toc243643166" w:history="1">
+      <w:hyperlink w:anchor="_Toc243647341" w:history="1">
         <w:r>
           <w:rPr>
             <w:rStyle w:val="Hyperlink"/>
@@ -998,7 +1066,7 @@
             <w:noProof/>
             <w:webHidden/>
           </w:rPr>
-          <w:instrText xml:space="preserve"> PAGEREF _Toc243643166 \h </w:instrText>
+          <w:instrText xml:space="preserve"> PAGEREF _Toc243647341 \h </w:instrText>
         </w:r>
         <w:r>
           <w:rPr>
@@ -1018,7 +1086,7 @@
             <w:noProof/>
             <w:webHidden/>
           </w:rPr>
-          <w:t>9</w:t>
+          <w:t>10</w:t>
         </w:r>
         <w:r>
           <w:rPr>
@@ -1039,7 +1107,7 @@
           <w:noProof/>
         </w:rPr>
       </w:pPr>
-      <w:hyperlink w:anchor="_Toc243643167" w:history="1">
+      <w:hyperlink w:anchor="_Toc243647342" w:history="1">
         <w:r>
           <w:rPr>
             <w:rStyle w:val="Hyperlink"/>
@@ -1066,7 +1134,7 @@
             <w:noProof/>
             <w:webHidden/>
           </w:rPr>
-          <w:instrText xml:space="preserve"> PAGEREF _Toc243643167 \h </w:instrText>
+          <w:instrText xml:space="preserve"> PAGEREF _Toc243647342 \h </w:instrText>
         </w:r>
         <w:r>
           <w:rPr>
@@ -1086,7 +1154,7 @@
             <w:noProof/>
             <w:webHidden/>
           </w:rPr>
-          <w:t>9</w:t>
+          <w:t>10</w:t>
         </w:r>
         <w:r>
           <w:rPr>
@@ -1107,7 +1175,7 @@
           <w:noProof/>
         </w:rPr>
       </w:pPr>
-      <w:hyperlink w:anchor="_Toc243643168" w:history="1">
+      <w:hyperlink w:anchor="_Toc243647343" w:history="1">
         <w:r>
           <w:rPr>
             <w:rStyle w:val="Hyperlink"/>
@@ -1134,7 +1202,7 @@
             <w:noProof/>
             <w:webHidden/>
           </w:rPr>
-          <w:instrText xml:space="preserve"> PAGEREF _Toc243643168 \h </w:instrText>
+          <w:instrText xml:space="preserve"> PAGEREF _Toc243647343 \h </w:instrText>
         </w:r>
         <w:r>
           <w:rPr>
@@ -1154,7 +1222,7 @@
             <w:noProof/>
             <w:webHidden/>
           </w:rPr>
-          <w:t>9</w:t>
+          <w:t>10</w:t>
         </w:r>
         <w:r>
           <w:rPr>
@@ -1175,7 +1243,7 @@
           <w:noProof/>
         </w:rPr>
       </w:pPr>
-      <w:hyperlink w:anchor="_Toc243643169" w:history="1">
+      <w:hyperlink w:anchor="_Toc243647344" w:history="1">
         <w:r>
           <w:rPr>
             <w:rStyle w:val="Hyperlink"/>
@@ -1202,7 +1270,7 @@
             <w:noProof/>
             <w:webHidden/>
           </w:rPr>
-          <w:instrText xml:space="preserve"> PAGEREF _Toc243643169 \h </w:instrText>
+          <w:instrText xml:space="preserve"> PAGEREF _Toc243647344 \h </w:instrText>
         </w:r>
         <w:r>
           <w:rPr>
@@ -1222,7 +1290,7 @@
             <w:noProof/>
             <w:webHidden/>
           </w:rPr>
-          <w:t>9</w:t>
+          <w:t>10</w:t>
         </w:r>
         <w:r>
           <w:rPr>
@@ -1243,7 +1311,7 @@
           <w:noProof/>
         </w:rPr>
       </w:pPr>
-      <w:hyperlink w:anchor="_Toc243643170" w:history="1">
+      <w:hyperlink w:anchor="_Toc243647345" w:history="1">
         <w:r>
           <w:rPr>
             <w:rStyle w:val="Hyperlink"/>
@@ -1270,7 +1338,7 @@
             <w:noProof/>
             <w:webHidden/>
           </w:rPr>
-          <w:instrText xml:space="preserve"> PAGEREF _Toc243643170 \h </w:instrText>
+          <w:instrText xml:space="preserve"> PAGEREF _Toc243647345 \h </w:instrText>
         </w:r>
         <w:r>
           <w:rPr>
@@ -1290,7 +1358,7 @@
             <w:noProof/>
             <w:webHidden/>
           </w:rPr>
-          <w:t>11</w:t>
+          <w:t>12</w:t>
         </w:r>
         <w:r>
           <w:rPr>
@@ -1311,7 +1379,7 @@
           <w:noProof/>
         </w:rPr>
       </w:pPr>
-      <w:hyperlink w:anchor="_Toc243643171" w:history="1">
+      <w:hyperlink w:anchor="_Toc243647346" w:history="1">
         <w:r>
           <w:rPr>
             <w:rStyle w:val="Hyperlink"/>
@@ -1338,7 +1406,7 @@
             <w:noProof/>
             <w:webHidden/>
           </w:rPr>
-          <w:instrText xml:space="preserve"> PAGEREF _Toc243643171 \h </w:instrText>
+          <w:instrText xml:space="preserve"> PAGEREF _Toc243647346 \h </w:instrText>
         </w:r>
         <w:r>
           <w:rPr>
@@ -1358,7 +1426,7 @@
             <w:noProof/>
             <w:webHidden/>
           </w:rPr>
-          <w:t>11</w:t>
+          <w:t>12</w:t>
         </w:r>
         <w:r>
           <w:rPr>
@@ -1379,7 +1447,7 @@
           <w:noProof/>
         </w:rPr>
       </w:pPr>
-      <w:hyperlink w:anchor="_Toc243643172" w:history="1">
+      <w:hyperlink w:anchor="_Toc243647347" w:history="1">
         <w:r>
           <w:rPr>
             <w:rStyle w:val="Hyperlink"/>
@@ -1406,7 +1474,7 @@
             <w:noProof/>
             <w:webHidden/>
           </w:rPr>
-          <w:instrText xml:space="preserve"> PAGEREF _Toc243643172 \h </w:instrText>
+          <w:instrText xml:space="preserve"> PAGEREF _Toc243647347 \h </w:instrText>
         </w:r>
         <w:r>
           <w:rPr>
@@ -1426,7 +1494,7 @@
             <w:noProof/>
             <w:webHidden/>
           </w:rPr>
-          <w:t>12</w:t>
+          <w:t>13</w:t>
         </w:r>
         <w:r>
           <w:rPr>
@@ -1447,7 +1515,7 @@
           <w:noProof/>
         </w:rPr>
       </w:pPr>
-      <w:hyperlink w:anchor="_Toc243643173" w:history="1">
+      <w:hyperlink w:anchor="_Toc243647348" w:history="1">
         <w:r>
           <w:rPr>
             <w:rStyle w:val="Hyperlink"/>
@@ -1474,7 +1542,7 @@
             <w:noProof/>
             <w:webHidden/>
           </w:rPr>
-          <w:instrText xml:space="preserve"> PAGEREF _Toc243643173 \h </w:instrText>
+          <w:instrText xml:space="preserve"> PAGEREF _Toc243647348 \h </w:instrText>
         </w:r>
         <w:r>
           <w:rPr>
@@ -1494,7 +1562,7 @@
             <w:noProof/>
             <w:webHidden/>
           </w:rPr>
-          <w:t>12</w:t>
+          <w:t>13</w:t>
         </w:r>
         <w:r>
           <w:rPr>
@@ -1515,7 +1583,7 @@
           <w:noProof/>
         </w:rPr>
       </w:pPr>
-      <w:hyperlink w:anchor="_Toc243643174" w:history="1">
+      <w:hyperlink w:anchor="_Toc243647349" w:history="1">
         <w:r>
           <w:rPr>
             <w:rStyle w:val="Hyperlink"/>
@@ -1542,7 +1610,7 @@
             <w:noProof/>
             <w:webHidden/>
           </w:rPr>
-          <w:instrText xml:space="preserve"> PAGEREF _Toc243643174 \h </w:instrText>
+          <w:instrText xml:space="preserve"> PAGEREF _Toc243647349 \h </w:instrText>
         </w:r>
         <w:r>
           <w:rPr>
@@ -1562,7 +1630,7 @@
             <w:noProof/>
             <w:webHidden/>
           </w:rPr>
-          <w:t>12</w:t>
+          <w:t>13</w:t>
         </w:r>
         <w:r>
           <w:rPr>
@@ -1583,7 +1651,7 @@
           <w:noProof/>
         </w:rPr>
       </w:pPr>
-      <w:hyperlink w:anchor="_Toc243643175" w:history="1">
+      <w:hyperlink w:anchor="_Toc243647350" w:history="1">
         <w:r>
           <w:rPr>
             <w:rStyle w:val="Hyperlink"/>
@@ -1610,7 +1678,7 @@
             <w:noProof/>
             <w:webHidden/>
           </w:rPr>
-          <w:instrText xml:space="preserve"> PAGEREF _Toc243643175 \h </w:instrText>
+          <w:instrText xml:space="preserve"> PAGEREF _Toc243647350 \h </w:instrText>
         </w:r>
         <w:r>
           <w:rPr>
@@ -1630,7 +1698,7 @@
             <w:noProof/>
             <w:webHidden/>
           </w:rPr>
-          <w:t>12</w:t>
+          <w:t>13</w:t>
         </w:r>
         <w:r>
           <w:rPr>
@@ -1651,7 +1719,7 @@
           <w:noProof/>
         </w:rPr>
       </w:pPr>
-      <w:hyperlink w:anchor="_Toc243643176" w:history="1">
+      <w:hyperlink w:anchor="_Toc243647351" w:history="1">
         <w:r>
           <w:rPr>
             <w:rStyle w:val="Hyperlink"/>
@@ -1678,7 +1746,7 @@
             <w:noProof/>
             <w:webHidden/>
           </w:rPr>
-          <w:instrText xml:space="preserve"> PAGEREF _Toc243643176 \h </w:instrText>
+          <w:instrText xml:space="preserve"> PAGEREF _Toc243647351 \h </w:instrText>
         </w:r>
         <w:r>
           <w:rPr>
@@ -1698,7 +1766,7 @@
             <w:noProof/>
             <w:webHidden/>
           </w:rPr>
-          <w:t>13</w:t>
+          <w:t>14</w:t>
         </w:r>
         <w:r>
           <w:rPr>
@@ -1719,7 +1787,7 @@
           <w:noProof/>
         </w:rPr>
       </w:pPr>
-      <w:hyperlink w:anchor="_Toc243643177" w:history="1">
+      <w:hyperlink w:anchor="_Toc243647352" w:history="1">
         <w:r>
           <w:rPr>
             <w:rStyle w:val="Hyperlink"/>
@@ -1746,7 +1814,7 @@
             <w:noProof/>
             <w:webHidden/>
           </w:rPr>
-          <w:instrText xml:space="preserve"> PAGEREF _Toc243643177 \h </w:instrText>
+          <w:instrText xml:space="preserve"> PAGEREF _Toc243647352 \h </w:instrText>
         </w:r>
         <w:r>
           <w:rPr>
@@ -1766,7 +1834,7 @@
             <w:noProof/>
             <w:webHidden/>
           </w:rPr>
-          <w:t>13</w:t>
+          <w:t>14</w:t>
         </w:r>
         <w:r>
           <w:rPr>
@@ -1787,7 +1855,7 @@
           <w:noProof/>
         </w:rPr>
       </w:pPr>
-      <w:hyperlink w:anchor="_Toc243643178" w:history="1">
+      <w:hyperlink w:anchor="_Toc243647353" w:history="1">
         <w:r>
           <w:rPr>
             <w:rStyle w:val="Hyperlink"/>
@@ -1814,7 +1882,7 @@
             <w:noProof/>
             <w:webHidden/>
           </w:rPr>
-          <w:instrText xml:space="preserve"> PAGEREF _Toc243643178 \h </w:instrText>
+          <w:instrText xml:space="preserve"> PAGEREF _Toc243647353 \h </w:instrText>
         </w:r>
         <w:r>
           <w:rPr>
@@ -1834,7 +1902,7 @@
             <w:noProof/>
             <w:webHidden/>
           </w:rPr>
-          <w:t>13</w:t>
+          <w:t>14</w:t>
         </w:r>
         <w:r>
           <w:rPr>
@@ -1855,7 +1923,7 @@
           <w:noProof/>
         </w:rPr>
       </w:pPr>
-      <w:hyperlink w:anchor="_Toc243643179" w:history="1">
+      <w:hyperlink w:anchor="_Toc243647354" w:history="1">
         <w:r>
           <w:rPr>
             <w:rStyle w:val="Hyperlink"/>
@@ -1882,7 +1950,7 @@
             <w:noProof/>
             <w:webHidden/>
           </w:rPr>
-          <w:instrText xml:space="preserve"> PAGEREF _Toc243643179 \h </w:instrText>
+          <w:instrText xml:space="preserve"> PAGEREF _Toc243647354 \h </w:instrText>
         </w:r>
         <w:r>
           <w:rPr>
@@ -1902,7 +1970,7 @@
             <w:noProof/>
             <w:webHidden/>
           </w:rPr>
-          <w:t>14</w:t>
+          <w:t>15</w:t>
         </w:r>
         <w:r>
           <w:rPr>
@@ -1923,7 +1991,7 @@
           <w:noProof/>
         </w:rPr>
       </w:pPr>
-      <w:hyperlink w:anchor="_Toc243643180" w:history="1">
+      <w:hyperlink w:anchor="_Toc243647355" w:history="1">
         <w:r>
           <w:rPr>
             <w:rStyle w:val="Hyperlink"/>
@@ -1950,7 +2018,7 @@
             <w:noProof/>
             <w:webHidden/>
           </w:rPr>
-          <w:instrText xml:space="preserve"> PAGEREF _Toc243643180 \h </w:instrText>
+          <w:instrText xml:space="preserve"> PAGEREF _Toc243647355 \h </w:instrText>
         </w:r>
         <w:r>
           <w:rPr>
@@ -1970,7 +2038,7 @@
             <w:noProof/>
             <w:webHidden/>
           </w:rPr>
-          <w:t>14</w:t>
+          <w:t>15</w:t>
         </w:r>
         <w:r>
           <w:rPr>
@@ -1991,7 +2059,7 @@
           <w:noProof/>
         </w:rPr>
       </w:pPr>
-      <w:hyperlink w:anchor="_Toc243643181" w:history="1">
+      <w:hyperlink w:anchor="_Toc243647356" w:history="1">
         <w:r>
           <w:rPr>
             <w:rStyle w:val="Hyperlink"/>
@@ -2018,7 +2086,7 @@
             <w:noProof/>
             <w:webHidden/>
           </w:rPr>
-          <w:instrText xml:space="preserve"> PAGEREF _Toc243643181 \h </w:instrText>
+          <w:instrText xml:space="preserve"> PAGEREF _Toc243647356 \h </w:instrText>
         </w:r>
         <w:r>
           <w:rPr>
@@ -2038,7 +2106,7 @@
             <w:noProof/>
             <w:webHidden/>
           </w:rPr>
-          <w:t>14</w:t>
+          <w:t>15</w:t>
         </w:r>
         <w:r>
           <w:rPr>
@@ -2059,7 +2127,7 @@
           <w:noProof/>
         </w:rPr>
       </w:pPr>
-      <w:hyperlink w:anchor="_Toc243643182" w:history="1">
+      <w:hyperlink w:anchor="_Toc243647357" w:history="1">
         <w:r>
           <w:rPr>
             <w:rStyle w:val="Hyperlink"/>
@@ -2086,7 +2154,7 @@
             <w:noProof/>
             <w:webHidden/>
           </w:rPr>
-          <w:instrText xml:space="preserve"> PAGEREF _Toc243643182 \h </w:instrText>
+          <w:instrText xml:space="preserve"> PAGEREF _Toc243647357 \h </w:instrText>
         </w:r>
         <w:r>
           <w:rPr>
@@ -2106,7 +2174,7 @@
             <w:noProof/>
             <w:webHidden/>
           </w:rPr>
-          <w:t>15</w:t>
+          <w:t>16</w:t>
         </w:r>
         <w:r>
           <w:rPr>
@@ -2127,7 +2195,7 @@
           <w:noProof/>
         </w:rPr>
       </w:pPr>
-      <w:hyperlink w:anchor="_Toc243643183" w:history="1">
+      <w:hyperlink w:anchor="_Toc243647358" w:history="1">
         <w:r>
           <w:rPr>
             <w:rStyle w:val="Hyperlink"/>
@@ -2154,7 +2222,7 @@
             <w:noProof/>
             <w:webHidden/>
           </w:rPr>
-          <w:instrText xml:space="preserve"> PAGEREF _Toc243643183 \h </w:instrText>
+          <w:instrText xml:space="preserve"> PAGEREF _Toc243647358 \h </w:instrText>
         </w:r>
         <w:r>
           <w:rPr>
@@ -2174,7 +2242,7 @@
             <w:noProof/>
             <w:webHidden/>
           </w:rPr>
-          <w:t>16</w:t>
+          <w:t>17</w:t>
         </w:r>
         <w:r>
           <w:rPr>
@@ -2195,7 +2263,7 @@
           <w:noProof/>
         </w:rPr>
       </w:pPr>
-      <w:hyperlink w:anchor="_Toc243643184" w:history="1">
+      <w:hyperlink w:anchor="_Toc243647359" w:history="1">
         <w:r>
           <w:rPr>
             <w:rStyle w:val="Hyperlink"/>
@@ -2222,7 +2290,7 @@
             <w:noProof/>
             <w:webHidden/>
           </w:rPr>
-          <w:instrText xml:space="preserve"> PAGEREF _Toc243643184 \h </w:instrText>
+          <w:instrText xml:space="preserve"> PAGEREF _Toc243647359 \h </w:instrText>
         </w:r>
         <w:r>
           <w:rPr>
@@ -2242,7 +2310,7 @@
             <w:noProof/>
             <w:webHidden/>
           </w:rPr>
-          <w:t>16</w:t>
+          <w:t>17</w:t>
         </w:r>
         <w:r>
           <w:rPr>
@@ -2263,7 +2331,7 @@
           <w:noProof/>
         </w:rPr>
       </w:pPr>
-      <w:hyperlink w:anchor="_Toc243643185" w:history="1">
+      <w:hyperlink w:anchor="_Toc243647360" w:history="1">
         <w:r>
           <w:rPr>
             <w:rStyle w:val="Hyperlink"/>
@@ -2290,7 +2358,7 @@
             <w:noProof/>
             <w:webHidden/>
           </w:rPr>
-          <w:instrText xml:space="preserve"> PAGEREF _Toc243643185 \h </w:instrText>
+          <w:instrText xml:space="preserve"> PAGEREF _Toc243647360 \h </w:instrText>
         </w:r>
         <w:r>
           <w:rPr>
@@ -2310,7 +2378,7 @@
             <w:noProof/>
             <w:webHidden/>
           </w:rPr>
-          <w:t>16</w:t>
+          <w:t>17</w:t>
         </w:r>
         <w:r>
           <w:rPr>
@@ -2331,7 +2399,7 @@
           <w:noProof/>
         </w:rPr>
       </w:pPr>
-      <w:hyperlink w:anchor="_Toc243643186" w:history="1">
+      <w:hyperlink w:anchor="_Toc243647361" w:history="1">
         <w:r>
           <w:rPr>
             <w:rStyle w:val="Hyperlink"/>
@@ -2358,7 +2426,7 @@
             <w:noProof/>
             <w:webHidden/>
           </w:rPr>
-          <w:instrText xml:space="preserve"> PAGEREF _Toc243643186 \h </w:instrText>
+          <w:instrText xml:space="preserve"> PAGEREF _Toc243647361 \h </w:instrText>
         </w:r>
         <w:r>
           <w:rPr>
@@ -2378,7 +2446,7 @@
             <w:noProof/>
             <w:webHidden/>
           </w:rPr>
-          <w:t>16</w:t>
+          <w:t>17</w:t>
         </w:r>
         <w:r>
           <w:rPr>
@@ -2399,7 +2467,7 @@
           <w:noProof/>
         </w:rPr>
       </w:pPr>
-      <w:hyperlink w:anchor="_Toc243643187" w:history="1">
+      <w:hyperlink w:anchor="_Toc243647362" w:history="1">
         <w:r>
           <w:rPr>
             <w:rStyle w:val="Hyperlink"/>
@@ -2426,7 +2494,7 @@
             <w:noProof/>
             <w:webHidden/>
           </w:rPr>
-          <w:instrText xml:space="preserve"> PAGEREF _Toc243643187 \h </w:instrText>
+          <w:instrText xml:space="preserve"> PAGEREF _Toc243647362 \h </w:instrText>
         </w:r>
         <w:r>
           <w:rPr>
@@ -2446,7 +2514,7 @@
             <w:noProof/>
             <w:webHidden/>
           </w:rPr>
-          <w:t>17</w:t>
+          <w:t>18</w:t>
         </w:r>
         <w:r>
           <w:rPr>
@@ -2467,7 +2535,7 @@
           <w:noProof/>
         </w:rPr>
       </w:pPr>
-      <w:hyperlink w:anchor="_Toc243643188" w:history="1">
+      <w:hyperlink w:anchor="_Toc243647363" w:history="1">
         <w:r>
           <w:rPr>
             <w:rStyle w:val="Hyperlink"/>
@@ -2494,7 +2562,7 @@
             <w:noProof/>
             <w:webHidden/>
           </w:rPr>
-          <w:instrText xml:space="preserve"> PAGEREF _Toc243643188 \h </w:instrText>
+          <w:instrText xml:space="preserve"> PAGEREF _Toc243647363 \h </w:instrText>
         </w:r>
         <w:r>
           <w:rPr>
@@ -2514,7 +2582,7 @@
             <w:noProof/>
             <w:webHidden/>
           </w:rPr>
-          <w:t>17</w:t>
+          <w:t>18</w:t>
         </w:r>
         <w:r>
           <w:rPr>
@@ -2535,7 +2603,7 @@
           <w:noProof/>
         </w:rPr>
       </w:pPr>
-      <w:hyperlink w:anchor="_Toc243643189" w:history="1">
+      <w:hyperlink w:anchor="_Toc243647364" w:history="1">
         <w:r>
           <w:rPr>
             <w:rStyle w:val="Hyperlink"/>
@@ -2562,7 +2630,7 @@
             <w:noProof/>
             <w:webHidden/>
           </w:rPr>
-          <w:instrText xml:space="preserve"> PAGEREF _Toc243643189 \h </w:instrText>
+          <w:instrText xml:space="preserve"> PAGEREF _Toc243647364 \h </w:instrText>
         </w:r>
         <w:r>
           <w:rPr>
@@ -2582,7 +2650,7 @@
             <w:noProof/>
             <w:webHidden/>
           </w:rPr>
-          <w:t>18</w:t>
+          <w:t>19</w:t>
         </w:r>
         <w:r>
           <w:rPr>
@@ -2603,7 +2671,7 @@
           <w:noProof/>
         </w:rPr>
       </w:pPr>
-      <w:hyperlink w:anchor="_Toc243643190" w:history="1">
+      <w:hyperlink w:anchor="_Toc243647365" w:history="1">
         <w:r>
           <w:rPr>
             <w:rStyle w:val="Hyperlink"/>
@@ -2630,7 +2698,7 @@
             <w:noProof/>
             <w:webHidden/>
           </w:rPr>
-          <w:instrText xml:space="preserve"> PAGEREF _Toc243643190 \h </w:instrText>
+          <w:instrText xml:space="preserve"> PAGEREF _Toc243647365 \h </w:instrText>
         </w:r>
         <w:r>
           <w:rPr>
@@ -2650,7 +2718,7 @@
             <w:noProof/>
             <w:webHidden/>
           </w:rPr>
-          <w:t>18</w:t>
+          <w:t>19</w:t>
         </w:r>
         <w:r>
           <w:rPr>
@@ -2671,7 +2739,7 @@
           <w:noProof/>
         </w:rPr>
       </w:pPr>
-      <w:hyperlink w:anchor="_Toc243643191" w:history="1">
+      <w:hyperlink w:anchor="_Toc243647366" w:history="1">
         <w:r>
           <w:rPr>
             <w:rStyle w:val="Hyperlink"/>
@@ -2698,7 +2766,7 @@
             <w:noProof/>
             <w:webHidden/>
           </w:rPr>
-          <w:instrText xml:space="preserve"> PAGEREF _Toc243643191 \h </w:instrText>
+          <w:instrText xml:space="preserve"> PAGEREF _Toc243647366 \h </w:instrText>
         </w:r>
         <w:r>
           <w:rPr>
@@ -2718,7 +2786,7 @@
             <w:noProof/>
             <w:webHidden/>
           </w:rPr>
-          <w:t>18</w:t>
+          <w:t>19</w:t>
         </w:r>
         <w:r>
           <w:rPr>
@@ -2739,7 +2807,7 @@
           <w:noProof/>
         </w:rPr>
       </w:pPr>
-      <w:hyperlink w:anchor="_Toc243643192" w:history="1">
+      <w:hyperlink w:anchor="_Toc243647367" w:history="1">
         <w:r>
           <w:rPr>
             <w:rStyle w:val="Hyperlink"/>
@@ -2766,7 +2834,7 @@
             <w:noProof/>
             <w:webHidden/>
           </w:rPr>
-          <w:instrText xml:space="preserve"> PAGEREF _Toc243643192 \h </w:instrText>
+          <w:instrText xml:space="preserve"> PAGEREF _Toc243647367 \h </w:instrText>
         </w:r>
         <w:r>
           <w:rPr>
@@ -2786,7 +2854,7 @@
             <w:noProof/>
             <w:webHidden/>
           </w:rPr>
-          <w:t>18</w:t>
+          <w:t>19</w:t>
         </w:r>
         <w:r>
           <w:rPr>
@@ -2807,7 +2875,7 @@
           <w:noProof/>
         </w:rPr>
       </w:pPr>
-      <w:hyperlink w:anchor="_Toc243643193" w:history="1">
+      <w:hyperlink w:anchor="_Toc243647368" w:history="1">
         <w:r>
           <w:rPr>
             <w:rStyle w:val="Hyperlink"/>
@@ -2834,7 +2902,7 @@
             <w:noProof/>
             <w:webHidden/>
           </w:rPr>
-          <w:instrText xml:space="preserve"> PAGEREF _Toc243643193 \h </w:instrText>
+          <w:instrText xml:space="preserve"> PAGEREF _Toc243647368 \h </w:instrText>
         </w:r>
         <w:r>
           <w:rPr>
@@ -2854,7 +2922,7 @@
             <w:noProof/>
             <w:webHidden/>
           </w:rPr>
-          <w:t>20</w:t>
+          <w:t>21</w:t>
         </w:r>
         <w:r>
           <w:rPr>
@@ -2875,7 +2943,7 @@
           <w:noProof/>
         </w:rPr>
       </w:pPr>
-      <w:hyperlink w:anchor="_Toc243643194" w:history="1">
+      <w:hyperlink w:anchor="_Toc243647369" w:history="1">
         <w:r>
           <w:rPr>
             <w:rStyle w:val="Hyperlink"/>
@@ -2902,7 +2970,7 @@
             <w:noProof/>
             <w:webHidden/>
           </w:rPr>
-          <w:instrText xml:space="preserve"> PAGEREF _Toc243643194 \h </w:instrText>
+          <w:instrText xml:space="preserve"> PAGEREF _Toc243647369 \h </w:instrText>
         </w:r>
         <w:r>
           <w:rPr>
@@ -2922,7 +2990,7 @@
             <w:noProof/>
             <w:webHidden/>
           </w:rPr>
-          <w:t>21</w:t>
+          <w:t>22</w:t>
         </w:r>
         <w:r>
           <w:rPr>
@@ -2943,7 +3011,7 @@
           <w:noProof/>
         </w:rPr>
       </w:pPr>
-      <w:hyperlink w:anchor="_Toc243643195" w:history="1">
+      <w:hyperlink w:anchor="_Toc243647370" w:history="1">
         <w:r>
           <w:rPr>
             <w:rStyle w:val="Hyperlink"/>
@@ -2970,7 +3038,7 @@
             <w:noProof/>
             <w:webHidden/>
           </w:rPr>
-          <w:instrText xml:space="preserve"> PAGEREF _Toc243643195 \h </w:instrText>
+          <w:instrText xml:space="preserve"> PAGEREF _Toc243647370 \h </w:instrText>
         </w:r>
         <w:r>
           <w:rPr>
@@ -2990,7 +3058,7 @@
             <w:noProof/>
             <w:webHidden/>
           </w:rPr>
-          <w:t>22</w:t>
+          <w:t>23</w:t>
         </w:r>
         <w:r>
           <w:rPr>
@@ -3011,7 +3079,7 @@
           <w:noProof/>
         </w:rPr>
       </w:pPr>
-      <w:hyperlink w:anchor="_Toc243643196" w:history="1">
+      <w:hyperlink w:anchor="_Toc243647371" w:history="1">
         <w:r>
           <w:rPr>
             <w:rStyle w:val="Hyperlink"/>
@@ -3038,7 +3106,7 @@
             <w:noProof/>
             <w:webHidden/>
           </w:rPr>
-          <w:instrText xml:space="preserve"> PAGEREF _Toc243643196 \h </w:instrText>
+          <w:instrText xml:space="preserve"> PAGEREF _Toc243647371 \h </w:instrText>
         </w:r>
         <w:r>
           <w:rPr>
@@ -3058,7 +3126,7 @@
             <w:noProof/>
             <w:webHidden/>
           </w:rPr>
-          <w:t>22</w:t>
+          <w:t>23</w:t>
         </w:r>
         <w:r>
           <w:rPr>
@@ -3079,7 +3147,7 @@
           <w:noProof/>
         </w:rPr>
       </w:pPr>
-      <w:hyperlink w:anchor="_Toc243643197" w:history="1">
+      <w:hyperlink w:anchor="_Toc243647372" w:history="1">
         <w:r>
           <w:rPr>
             <w:rStyle w:val="Hyperlink"/>
@@ -3106,7 +3174,7 @@
             <w:noProof/>
             <w:webHidden/>
           </w:rPr>
-          <w:instrText xml:space="preserve"> PAGEREF _Toc243643197 \h </w:instrText>
+          <w:instrText xml:space="preserve"> PAGEREF _Toc243647372 \h </w:instrText>
         </w:r>
         <w:r>
           <w:rPr>
@@ -3126,7 +3194,7 @@
             <w:noProof/>
             <w:webHidden/>
           </w:rPr>
-          <w:t>22</w:t>
+          <w:t>23</w:t>
         </w:r>
         <w:r>
           <w:rPr>
@@ -3147,7 +3215,7 @@
           <w:noProof/>
         </w:rPr>
       </w:pPr>
-      <w:hyperlink w:anchor="_Toc243643198" w:history="1">
+      <w:hyperlink w:anchor="_Toc243647373" w:history="1">
         <w:r>
           <w:rPr>
             <w:rStyle w:val="Hyperlink"/>
@@ -3174,7 +3242,7 @@
             <w:noProof/>
             <w:webHidden/>
           </w:rPr>
-          <w:instrText xml:space="preserve"> PAGEREF _Toc243643198 \h </w:instrText>
+          <w:instrText xml:space="preserve"> PAGEREF _Toc243647373 \h </w:instrText>
         </w:r>
         <w:r>
           <w:rPr>
@@ -3194,7 +3262,7 @@
             <w:noProof/>
             <w:webHidden/>
           </w:rPr>
-          <w:t>22</w:t>
+          <w:t>23</w:t>
         </w:r>
         <w:r>
           <w:rPr>
@@ -3215,7 +3283,7 @@
           <w:noProof/>
         </w:rPr>
       </w:pPr>
-      <w:hyperlink w:anchor="_Toc243643199" w:history="1">
+      <w:hyperlink w:anchor="_Toc243647374" w:history="1">
         <w:r>
           <w:rPr>
             <w:rStyle w:val="Hyperlink"/>
@@ -3242,7 +3310,7 @@
             <w:noProof/>
             <w:webHidden/>
           </w:rPr>
-          <w:instrText xml:space="preserve"> PAGEREF _Toc243643199 \h </w:instrText>
+          <w:instrText xml:space="preserve"> PAGEREF _Toc243647374 \h </w:instrText>
         </w:r>
         <w:r>
           <w:rPr>
@@ -3262,7 +3330,7 @@
             <w:noProof/>
             <w:webHidden/>
           </w:rPr>
-          <w:t>23</w:t>
+          <w:t>24</w:t>
         </w:r>
         <w:r>
           <w:rPr>
@@ -3287,7 +3355,7 @@
       <w:pPr>
         <w:pStyle w:val="Heading1"/>
       </w:pPr>
-      <w:bookmarkStart w:id="0" w:name="_Toc243643153"/>
+      <w:bookmarkStart w:id="0" w:name="_Toc243647327"/>
       <w:r>
         <w:lastRenderedPageBreak/>
         <w:t>What Litterbox is</w:t>
@@ -3383,7 +3451,7 @@
       <w:pPr>
         <w:pStyle w:val="Heading2"/>
       </w:pPr>
-      <w:bookmarkStart w:id="1" w:name="_Toc243643154"/>
+      <w:bookmarkStart w:id="1" w:name="_Toc243647328"/>
       <w:r>
         <w:t>Terms</w:t>
       </w:r>
@@ -3811,7 +3879,7 @@
       <w:pPr>
         <w:pStyle w:val="Heading1"/>
       </w:pPr>
-      <w:bookmarkStart w:id="2" w:name="_Toc243643155"/>
+      <w:bookmarkStart w:id="2" w:name="_Toc243647329"/>
       <w:r>
         <w:lastRenderedPageBreak/>
         <w:t>Getting started</w:t>
@@ -3820,14 +3888,14 @@
     </w:p>
     <w:p>
       <w:r>
-        <w:t>If someone has already set up your team, read What you need, Installing Litterbox, and Joining your team's vault, then go to The main window. If you are setting up a team, read the whole chapter.</w:t>
+        <w:t>If someone has already set up your team, read What you need, Installing Litterbox, Joining your team's vault, and Decisions to make first, then go to The main window. If you are setting up a team, read the whole chapter.</w:t>
       </w:r>
     </w:p>
     <w:p>
       <w:pPr>
         <w:pStyle w:val="Heading2"/>
       </w:pPr>
-      <w:bookmarkStart w:id="3" w:name="_Toc243643156"/>
+      <w:bookmarkStart w:id="3" w:name="_Toc243647330"/>
       <w:r>
         <w:t>What you need</w:t>
       </w:r>
@@ -3912,7 +3980,7 @@
       <w:pPr>
         <w:pStyle w:val="Heading2"/>
       </w:pPr>
-      <w:bookmarkStart w:id="4" w:name="_Toc243643157"/>
+      <w:bookmarkStart w:id="4" w:name="_Toc243647331"/>
       <w:r>
         <w:t>Installing Litterbox</w:t>
       </w:r>
@@ -3991,7 +4059,7 @@
       <w:pPr>
         <w:pStyle w:val="Heading2"/>
       </w:pPr>
-      <w:bookmarkStart w:id="5" w:name="_Toc243643158"/>
+      <w:bookmarkStart w:id="5" w:name="_Toc243647332"/>
       <w:r>
         <w:t>Joining your team's vault</w:t>
       </w:r>
@@ -4097,12 +4165,284 @@
       <w:pPr>
         <w:pStyle w:val="Heading2"/>
       </w:pPr>
-      <w:bookmarkStart w:id="6" w:name="_Toc243643159"/>
+      <w:bookmarkStart w:id="6" w:name="_Toc243647333"/>
       <w:r>
         <w:lastRenderedPageBreak/>
+        <w:t>Decisions to make first</w:t>
+      </w:r>
+      <w:bookmarkEnd w:id="6"/>
+    </w:p>
+    <w:p>
+      <w:r>
+        <w:t>Some choices are built into a team's CAD files and history as soon as parts are released, and a later update of Litterbox can't undo them. Decide these before the first part:</w:t>
+      </w:r>
+    </w:p>
+    <w:tbl>
+      <w:tblPr>
+        <w:tblStyle w:val="TableGrid"/>
+        <w:tblW w:w="0" w:type="auto"/>
+        <w:jc w:val="center"/>
+        <w:tblLayout w:type="fixed"/>
+        <w:tblLook w:val="04A0" w:firstRow="1" w:lastRow="0" w:firstColumn="1" w:lastColumn="0" w:noHBand="0" w:noVBand="1"/>
+      </w:tblPr>
+      <w:tblGrid>
+        <w:gridCol w:w="2448"/>
+        <w:gridCol w:w="6912"/>
+      </w:tblGrid>
+      <w:tr>
+        <w:trPr>
+          <w:cantSplit/>
+          <w:tblHeader/>
+          <w:jc w:val="center"/>
+        </w:trPr>
+        <w:tc>
+          <w:tcPr>
+            <w:tcW w:w="2448" w:type="dxa"/>
+            <w:shd w:val="clear" w:color="auto" w:fill="1F5F8B"/>
+          </w:tcPr>
+          <w:p>
+            <w:pPr>
+              <w:spacing w:after="40"/>
+            </w:pPr>
+            <w:r>
+              <w:rPr>
+                <w:b/>
+                <w:color w:val="FFFFFF"/>
+                <w:sz w:val="20"/>
+              </w:rPr>
+              <w:t>Decision</w:t>
+            </w:r>
+          </w:p>
+        </w:tc>
+        <w:tc>
+          <w:tcPr>
+            <w:tcW w:w="6912" w:type="dxa"/>
+            <w:shd w:val="clear" w:color="auto" w:fill="1F5F8B"/>
+          </w:tcPr>
+          <w:p>
+            <w:pPr>
+              <w:spacing w:after="40"/>
+            </w:pPr>
+            <w:r>
+              <w:rPr>
+                <w:b/>
+                <w:color w:val="FFFFFF"/>
+                <w:sz w:val="20"/>
+              </w:rPr>
+              <w:t>Recommendation</w:t>
+            </w:r>
+          </w:p>
+        </w:tc>
+      </w:tr>
+      <w:tr>
+        <w:trPr>
+          <w:cantSplit/>
+          <w:jc w:val="center"/>
+        </w:trPr>
+        <w:tc>
+          <w:tcPr>
+            <w:tcW w:w="2448" w:type="dxa"/>
+          </w:tcPr>
+          <w:p>
+            <w:pPr>
+              <w:spacing w:after="40"/>
+            </w:pPr>
+            <w:r>
+              <w:rPr>
+                <w:sz w:val="20"/>
+              </w:rPr>
+              <w:t>Toolbox fasteners</w:t>
+            </w:r>
+          </w:p>
+        </w:tc>
+        <w:tc>
+          <w:tcPr>
+            <w:tcW w:w="6912" w:type="dxa"/>
+          </w:tcPr>
+          <w:p>
+            <w:pPr>
+              <w:spacing w:after="40"/>
+            </w:pPr>
+            <w:r>
+              <w:rPr>
+                <w:sz w:val="20"/>
+              </w:rPr>
+              <w:t>Don't use SolidWorks Toolbox. Model each fastener as a part of its own, so it has a part number, revisions, and purchasing info like any other part. Toolbox files are kept outside the vault, and a released assembly keeps pointing at wherever they were. If you must use Toolbox, keep the Toolbox folder as a controlled document (in a .zip), and make sure every member installs that copy in the same folder.</w:t>
+            </w:r>
+          </w:p>
+        </w:tc>
+      </w:tr>
+      <w:tr>
+        <w:trPr>
+          <w:cantSplit/>
+          <w:jc w:val="center"/>
+        </w:trPr>
+        <w:tc>
+          <w:tcPr>
+            <w:tcW w:w="2448" w:type="dxa"/>
+            <w:shd w:val="clear" w:color="auto" w:fill="EEF3F7"/>
+          </w:tcPr>
+          <w:p>
+            <w:pPr>
+              <w:spacing w:after="40"/>
+            </w:pPr>
+            <w:r>
+              <w:rPr>
+                <w:sz w:val="20"/>
+              </w:rPr>
+              <w:t>Configurations and design tables</w:t>
+            </w:r>
+          </w:p>
+        </w:tc>
+        <w:tc>
+          <w:tcPr>
+            <w:tcW w:w="6912" w:type="dxa"/>
+            <w:shd w:val="clear" w:color="auto" w:fill="EEF3F7"/>
+          </w:tcPr>
+          <w:p>
+            <w:pPr>
+              <w:spacing w:after="40"/>
+            </w:pPr>
+            <w:r>
+              <w:rPr>
+                <w:sz w:val="20"/>
+              </w:rPr>
+              <w:t>Don't keep several configurations in one file: model each one as a separate part. Litterbox gives each file one part number, one material, and one BOM line, and a file can't be split into several part numbers later. If linked tables (Excel design tables or equation files) define a part's geometry, keep them as controlled documents, so a change to them is released like any other. Revising such a document gives its file a new name (_B), so point the parts at the new file when they are next revised.</w:t>
+            </w:r>
+          </w:p>
+        </w:tc>
+      </w:tr>
+      <w:tr>
+        <w:trPr>
+          <w:cantSplit/>
+          <w:jc w:val="center"/>
+        </w:trPr>
+        <w:tc>
+          <w:tcPr>
+            <w:tcW w:w="2448" w:type="dxa"/>
+          </w:tcPr>
+          <w:p>
+            <w:pPr>
+              <w:spacing w:after="40"/>
+            </w:pPr>
+            <w:r>
+              <w:rPr>
+                <w:sz w:val="20"/>
+              </w:rPr>
+              <w:t>Part number digits</w:t>
+            </w:r>
+          </w:p>
+        </w:tc>
+        <w:tc>
+          <w:tcPr>
+            <w:tcW w:w="6912" w:type="dxa"/>
+          </w:tcPr>
+          <w:p>
+            <w:pPr>
+              <w:spacing w:after="40"/>
+            </w:pPr>
+            <w:r>
+              <w:rPr>
+                <w:sz w:val="20"/>
+              </w:rPr>
+              <w:t>Use at least 6 digits in the base number, and more for a larger team. The digits can't be changed after the vault is set up.</w:t>
+            </w:r>
+          </w:p>
+        </w:tc>
+      </w:tr>
+      <w:tr>
+        <w:trPr>
+          <w:cantSplit/>
+          <w:jc w:val="center"/>
+        </w:trPr>
+        <w:tc>
+          <w:tcPr>
+            <w:tcW w:w="2448" w:type="dxa"/>
+            <w:shd w:val="clear" w:color="auto" w:fill="EEF3F7"/>
+          </w:tcPr>
+          <w:p>
+            <w:pPr>
+              <w:spacing w:after="40"/>
+            </w:pPr>
+            <w:r>
+              <w:rPr>
+                <w:sz w:val="20"/>
+              </w:rPr>
+              <w:t>One vault</w:t>
+            </w:r>
+          </w:p>
+        </w:tc>
+        <w:tc>
+          <w:tcPr>
+            <w:tcW w:w="6912" w:type="dxa"/>
+            <w:shd w:val="clear" w:color="auto" w:fill="EEF3F7"/>
+          </w:tcPr>
+          <w:p>
+            <w:pPr>
+              <w:spacing w:after="40"/>
+            </w:pPr>
+            <w:r>
+              <w:rPr>
+                <w:sz w:val="20"/>
+              </w:rPr>
+              <w:t>Keep one vault for the whole team and all its projects. An assembly can only use parts in its own vault, and parts can't move between vaults. Use projects to separate work inside it (see Projects for what Restrict and Hide do and don't protect).</w:t>
+            </w:r>
+          </w:p>
+        </w:tc>
+      </w:tr>
+      <w:tr>
+        <w:trPr>
+          <w:cantSplit/>
+          <w:jc w:val="center"/>
+        </w:trPr>
+        <w:tc>
+          <w:tcPr>
+            <w:tcW w:w="2448" w:type="dxa"/>
+          </w:tcPr>
+          <w:p>
+            <w:pPr>
+              <w:spacing w:after="40"/>
+            </w:pPr>
+            <w:r>
+              <w:rPr>
+                <w:sz w:val="20"/>
+              </w:rPr>
+              <w:t>Git host</w:t>
+            </w:r>
+          </w:p>
+        </w:tc>
+        <w:tc>
+          <w:tcPr>
+            <w:tcW w:w="6912" w:type="dxa"/>
+          </w:tcPr>
+          <w:p>
+            <w:pPr>
+              <w:spacing w:after="40"/>
+            </w:pPr>
+            <w:r>
+              <w:rPr>
+                <w:sz w:val="20"/>
+              </w:rPr>
+              <w:t>For a team of more than three or four members, consider GitLab Premium. Free plans limit the number of members or the Git LFS storage. Moving to another host later is possible but takes planning (every part must be checked in first), and files can't be removed from the vault's history, so its storage only grows.</w:t>
+            </w:r>
+          </w:p>
+        </w:tc>
+      </w:tr>
+    </w:tbl>
+    <w:p>
+      <w:pPr>
+        <w:spacing w:after="40"/>
+      </w:pPr>
+    </w:p>
+    <w:p>
+      <w:pPr>
+        <w:pStyle w:val="Heading2"/>
+      </w:pPr>
+      <w:bookmarkStart w:id="7" w:name="_Toc243647334"/>
+      <w:r>
         <w:t>Setting up a new team</w:t>
       </w:r>
-      <w:bookmarkEnd w:id="6"/>
+      <w:bookmarkEnd w:id="7"/>
     </w:p>
     <w:p>
       <w:r>
@@ -4115,7 +4455,7 @@
         <w:t>Owner</w:t>
       </w:r>
       <w:r>
-        <w:t>. The org code and the part number format can't be changed afterwards, so decide them first.</w:t>
+        <w:t>. The org code and the part number format can't be changed afterwards, so decide them first (see Decisions to make first).</w:t>
       </w:r>
     </w:p>
     <w:p>
@@ -4256,6 +4596,7 @@
         <w:rPr>
           <w:b/>
         </w:rPr>
+        <w:lastRenderedPageBreak/>
         <w:t>Roles...</w:t>
       </w:r>
       <w:r>
@@ -4358,11 +4699,11 @@
       <w:pPr>
         <w:pStyle w:val="Heading2"/>
       </w:pPr>
-      <w:bookmarkStart w:id="7" w:name="_Toc243643160"/>
+      <w:bookmarkStart w:id="8" w:name="_Toc243647335"/>
       <w:r>
         <w:t>The main window</w:t>
       </w:r>
-      <w:bookmarkEnd w:id="7"/>
+      <w:bookmarkEnd w:id="8"/>
     </w:p>
     <w:tbl>
       <w:tblPr>
@@ -4704,7 +5045,6 @@
         <w:rPr>
           <w:b/>
         </w:rPr>
-        <w:lastRenderedPageBreak/>
         <w:t>Ticking</w:t>
       </w:r>
       <w:r>
@@ -4729,11 +5069,11 @@
       <w:pPr>
         <w:pStyle w:val="Heading2"/>
       </w:pPr>
-      <w:bookmarkStart w:id="8" w:name="_Toc243643161"/>
+      <w:bookmarkStart w:id="9" w:name="_Toc243647336"/>
       <w:r>
         <w:t>Your first part</w:t>
       </w:r>
-      <w:bookmarkEnd w:id="8"/>
+      <w:bookmarkEnd w:id="9"/>
     </w:p>
     <w:p>
       <w:pPr>
@@ -4812,6 +5152,7 @@
     </w:p>
     <w:p>
       <w:r>
+        <w:lastRenderedPageBreak/>
         <w:t>Other people see the part after their next Get Latest.</w:t>
       </w:r>
     </w:p>
@@ -4824,22 +5165,22 @@
       <w:pPr>
         <w:pStyle w:val="Heading1"/>
       </w:pPr>
-      <w:bookmarkStart w:id="9" w:name="_Toc243643162"/>
+      <w:bookmarkStart w:id="10" w:name="_Toc243647337"/>
       <w:r>
         <w:lastRenderedPageBreak/>
         <w:t>Everyday work</w:t>
       </w:r>
-      <w:bookmarkEnd w:id="9"/>
+      <w:bookmarkEnd w:id="10"/>
     </w:p>
     <w:p>
       <w:pPr>
         <w:pStyle w:val="Heading2"/>
       </w:pPr>
-      <w:bookmarkStart w:id="10" w:name="_Toc243643163"/>
+      <w:bookmarkStart w:id="11" w:name="_Toc243647338"/>
       <w:r>
         <w:t>Part numbers and file names</w:t>
       </w:r>
-      <w:bookmarkEnd w:id="10"/>
+      <w:bookmarkEnd w:id="11"/>
     </w:p>
     <w:p>
       <w:r>
@@ -4864,11 +5205,11 @@
       <w:pPr>
         <w:pStyle w:val="Heading2"/>
       </w:pPr>
-      <w:bookmarkStart w:id="11" w:name="_Toc243643164"/>
+      <w:bookmarkStart w:id="12" w:name="_Toc243647339"/>
       <w:r>
         <w:t>Projects</w:t>
       </w:r>
-      <w:bookmarkEnd w:id="11"/>
+      <w:bookmarkEnd w:id="12"/>
     </w:p>
     <w:p>
       <w:r>
@@ -5102,11 +5443,11 @@
       <w:pPr>
         <w:pStyle w:val="Heading2"/>
       </w:pPr>
-      <w:bookmarkStart w:id="12" w:name="_Toc243643165"/>
+      <w:bookmarkStart w:id="13" w:name="_Toc243647340"/>
       <w:r>
         <w:t>Finding parts</w:t>
       </w:r>
-      <w:bookmarkEnd w:id="12"/>
+      <w:bookmarkEnd w:id="13"/>
     </w:p>
     <w:p>
       <w:pPr>
@@ -5157,11 +5498,11 @@
       <w:pPr>
         <w:pStyle w:val="Heading2"/>
       </w:pPr>
-      <w:bookmarkStart w:id="13" w:name="_Toc243643166"/>
+      <w:bookmarkStart w:id="14" w:name="_Toc243647341"/>
       <w:r>
         <w:t>Checking out and checking in</w:t>
       </w:r>
-      <w:bookmarkEnd w:id="13"/>
+      <w:bookmarkEnd w:id="14"/>
     </w:p>
     <w:p>
       <w:r>
@@ -5273,11 +5614,11 @@
       <w:pPr>
         <w:pStyle w:val="Heading2"/>
       </w:pPr>
-      <w:bookmarkStart w:id="14" w:name="_Toc243643167"/>
+      <w:bookmarkStart w:id="15" w:name="_Toc243647342"/>
       <w:r>
         <w:t>Getting other people's changes</w:t>
       </w:r>
-      <w:bookmarkEnd w:id="14"/>
+      <w:bookmarkEnd w:id="15"/>
     </w:p>
     <w:p>
       <w:r>
@@ -5303,11 +5644,11 @@
       <w:pPr>
         <w:pStyle w:val="Heading2"/>
       </w:pPr>
-      <w:bookmarkStart w:id="15" w:name="_Toc243643168"/>
+      <w:bookmarkStart w:id="16" w:name="_Toc243647343"/>
       <w:r>
         <w:t>Opening files</w:t>
       </w:r>
-      <w:bookmarkEnd w:id="15"/>
+      <w:bookmarkEnd w:id="16"/>
     </w:p>
     <w:p>
       <w:r>
@@ -5362,11 +5703,11 @@
       <w:pPr>
         <w:pStyle w:val="Heading2"/>
       </w:pPr>
-      <w:bookmarkStart w:id="16" w:name="_Toc243643169"/>
+      <w:bookmarkStart w:id="17" w:name="_Toc243647344"/>
       <w:r>
         <w:t>The details pane</w:t>
       </w:r>
-      <w:bookmarkEnd w:id="16"/>
+      <w:bookmarkEnd w:id="17"/>
     </w:p>
     <w:tbl>
       <w:tblPr>
@@ -5635,12 +5976,12 @@
       <w:pPr>
         <w:pStyle w:val="Heading1"/>
       </w:pPr>
-      <w:bookmarkStart w:id="17" w:name="_Toc243643170"/>
+      <w:bookmarkStart w:id="18" w:name="_Toc243647345"/>
       <w:r>
         <w:lastRenderedPageBreak/>
         <w:t>Revisions and the lifecycle</w:t>
       </w:r>
-      <w:bookmarkEnd w:id="17"/>
+      <w:bookmarkEnd w:id="18"/>
     </w:p>
     <w:p>
       <w:r>
@@ -6005,11 +6346,11 @@
       <w:pPr>
         <w:pStyle w:val="Heading2"/>
       </w:pPr>
-      <w:bookmarkStart w:id="18" w:name="_Toc243643171"/>
+      <w:bookmarkStart w:id="19" w:name="_Toc243647346"/>
       <w:r>
         <w:t>Form, Fit, Function, and Dispo</w:t>
       </w:r>
-      <w:bookmarkEnd w:id="18"/>
+      <w:bookmarkEnd w:id="19"/>
     </w:p>
     <w:p>
       <w:r>
@@ -6099,22 +6440,22 @@
       <w:pPr>
         <w:pStyle w:val="Heading1"/>
       </w:pPr>
-      <w:bookmarkStart w:id="19" w:name="_Toc243643172"/>
+      <w:bookmarkStart w:id="20" w:name="_Toc243647347"/>
       <w:r>
         <w:lastRenderedPageBreak/>
         <w:t>Assemblies, references, and BOMs</w:t>
       </w:r>
-      <w:bookmarkEnd w:id="19"/>
+      <w:bookmarkEnd w:id="20"/>
     </w:p>
     <w:p>
       <w:pPr>
         <w:pStyle w:val="Heading2"/>
       </w:pPr>
-      <w:bookmarkStart w:id="20" w:name="_Toc243643173"/>
+      <w:bookmarkStart w:id="21" w:name="_Toc243647348"/>
       <w:r>
         <w:t>Uses and where used</w:t>
       </w:r>
-      <w:bookmarkEnd w:id="20"/>
+      <w:bookmarkEnd w:id="21"/>
     </w:p>
     <w:p>
       <w:r>
@@ -6163,11 +6504,11 @@
       <w:pPr>
         <w:pStyle w:val="Heading2"/>
       </w:pPr>
-      <w:bookmarkStart w:id="21" w:name="_Toc243643174"/>
+      <w:bookmarkStart w:id="22" w:name="_Toc243647349"/>
       <w:r>
         <w:t>The BOM tab</w:t>
       </w:r>
-      <w:bookmarkEnd w:id="21"/>
+      <w:bookmarkEnd w:id="22"/>
     </w:p>
     <w:p>
       <w:r>
@@ -6262,11 +6603,11 @@
       <w:pPr>
         <w:pStyle w:val="Heading2"/>
       </w:pPr>
-      <w:bookmarkStart w:id="22" w:name="_Toc243643175"/>
+      <w:bookmarkStart w:id="23" w:name="_Toc243647350"/>
       <w:r>
         <w:t>Non-CAD parts and kits</w:t>
       </w:r>
-      <w:bookmarkEnd w:id="22"/>
+      <w:bookmarkEnd w:id="23"/>
     </w:p>
     <w:p>
       <w:r>
@@ -6332,22 +6673,22 @@
       <w:pPr>
         <w:pStyle w:val="Heading1"/>
       </w:pPr>
-      <w:bookmarkStart w:id="23" w:name="_Toc243643176"/>
+      <w:bookmarkStart w:id="24" w:name="_Toc243647351"/>
       <w:r>
         <w:lastRenderedPageBreak/>
         <w:t>Purchasing, costs, and materials</w:t>
       </w:r>
-      <w:bookmarkEnd w:id="23"/>
+      <w:bookmarkEnd w:id="24"/>
     </w:p>
     <w:p>
       <w:pPr>
         <w:pStyle w:val="Heading2"/>
       </w:pPr>
-      <w:bookmarkStart w:id="24" w:name="_Toc243643177"/>
+      <w:bookmarkStart w:id="25" w:name="_Toc243647352"/>
       <w:r>
         <w:t>Purchasing info</w:t>
       </w:r>
-      <w:bookmarkEnd w:id="24"/>
+      <w:bookmarkEnd w:id="25"/>
     </w:p>
     <w:p>
       <w:r>
@@ -6381,11 +6722,11 @@
       <w:pPr>
         <w:pStyle w:val="Heading2"/>
       </w:pPr>
-      <w:bookmarkStart w:id="25" w:name="_Toc243643178"/>
+      <w:bookmarkStart w:id="26" w:name="_Toc243647353"/>
       <w:r>
         <w:t>Materials</w:t>
       </w:r>
-      <w:bookmarkEnd w:id="25"/>
+      <w:bookmarkEnd w:id="26"/>
     </w:p>
     <w:p>
       <w:r>
@@ -6419,22 +6760,22 @@
       <w:pPr>
         <w:pStyle w:val="Heading1"/>
       </w:pPr>
-      <w:bookmarkStart w:id="26" w:name="_Toc243643179"/>
+      <w:bookmarkStart w:id="27" w:name="_Toc243647354"/>
       <w:r>
         <w:lastRenderedPageBreak/>
         <w:t>Release outputs and exports</w:t>
       </w:r>
-      <w:bookmarkEnd w:id="26"/>
+      <w:bookmarkEnd w:id="27"/>
     </w:p>
     <w:p>
       <w:pPr>
         <w:pStyle w:val="Heading2"/>
       </w:pPr>
-      <w:bookmarkStart w:id="27" w:name="_Toc243643180"/>
+      <w:bookmarkStart w:id="28" w:name="_Toc243647355"/>
       <w:r>
         <w:t>STEP and PDF files</w:t>
       </w:r>
-      <w:bookmarkEnd w:id="27"/>
+      <w:bookmarkEnd w:id="28"/>
     </w:p>
     <w:p>
       <w:pPr>
@@ -6491,11 +6832,11 @@
       <w:pPr>
         <w:pStyle w:val="Heading2"/>
       </w:pPr>
-      <w:bookmarkStart w:id="28" w:name="_Toc243643181"/>
+      <w:bookmarkStart w:id="29" w:name="_Toc243647356"/>
       <w:r>
         <w:t>Exporting</w:t>
       </w:r>
-      <w:bookmarkEnd w:id="28"/>
+      <w:bookmarkEnd w:id="29"/>
     </w:p>
     <w:p>
       <w:r>
@@ -6520,12 +6861,12 @@
       <w:pPr>
         <w:pStyle w:val="Heading1"/>
       </w:pPr>
-      <w:bookmarkStart w:id="29" w:name="_Toc243643182"/>
+      <w:bookmarkStart w:id="30" w:name="_Toc243647357"/>
       <w:r>
         <w:lastRenderedPageBreak/>
         <w:t>Documents</w:t>
       </w:r>
-      <w:bookmarkEnd w:id="29"/>
+      <w:bookmarkEnd w:id="30"/>
     </w:p>
     <w:p>
       <w:r>
@@ -6625,22 +6966,22 @@
       <w:pPr>
         <w:pStyle w:val="Heading1"/>
       </w:pPr>
-      <w:bookmarkStart w:id="30" w:name="_Toc243643183"/>
+      <w:bookmarkStart w:id="31" w:name="_Toc243647358"/>
       <w:r>
         <w:lastRenderedPageBreak/>
         <w:t>Sign-off workflows and ECOs</w:t>
       </w:r>
-      <w:bookmarkEnd w:id="30"/>
+      <w:bookmarkEnd w:id="31"/>
     </w:p>
     <w:p>
       <w:pPr>
         <w:pStyle w:val="Heading2"/>
       </w:pPr>
-      <w:bookmarkStart w:id="31" w:name="_Toc243643184"/>
+      <w:bookmarkStart w:id="32" w:name="_Toc243647359"/>
       <w:r>
         <w:t>How workflows work</w:t>
       </w:r>
-      <w:bookmarkEnd w:id="31"/>
+      <w:bookmarkEnd w:id="32"/>
     </w:p>
     <w:p>
       <w:r>
@@ -6692,11 +7033,11 @@
       <w:pPr>
         <w:pStyle w:val="Heading2"/>
       </w:pPr>
-      <w:bookmarkStart w:id="32" w:name="_Toc243643185"/>
+      <w:bookmarkStart w:id="33" w:name="_Toc243647360"/>
       <w:r>
         <w:t>Asking for sign-off</w:t>
       </w:r>
-      <w:bookmarkEnd w:id="32"/>
+      <w:bookmarkEnd w:id="33"/>
     </w:p>
     <w:p>
       <w:pPr>
@@ -6853,11 +7194,11 @@
       <w:pPr>
         <w:pStyle w:val="Heading2"/>
       </w:pPr>
-      <w:bookmarkStart w:id="33" w:name="_Toc243643186"/>
+      <w:bookmarkStart w:id="34" w:name="_Toc243647361"/>
       <w:r>
         <w:t>Reviewing a request</w:t>
       </w:r>
-      <w:bookmarkEnd w:id="33"/>
+      <w:bookmarkEnd w:id="34"/>
     </w:p>
     <w:p>
       <w:r>
@@ -7155,11 +7496,11 @@
       <w:pPr>
         <w:pStyle w:val="Heading2"/>
       </w:pPr>
-      <w:bookmarkStart w:id="34" w:name="_Toc243643187"/>
+      <w:bookmarkStart w:id="35" w:name="_Toc243647362"/>
       <w:r>
         <w:t>Rejected requests</w:t>
       </w:r>
-      <w:bookmarkEnd w:id="34"/>
+      <w:bookmarkEnd w:id="35"/>
     </w:p>
     <w:p>
       <w:r>
@@ -7228,11 +7569,11 @@
       <w:pPr>
         <w:pStyle w:val="Heading2"/>
       </w:pPr>
-      <w:bookmarkStart w:id="35" w:name="_Toc243643188"/>
+      <w:bookmarkStart w:id="36" w:name="_Toc243647363"/>
       <w:r>
         <w:t>Engineering change orders</w:t>
       </w:r>
-      <w:bookmarkEnd w:id="35"/>
+      <w:bookmarkEnd w:id="36"/>
     </w:p>
     <w:p>
       <w:r>
@@ -7280,12 +7621,12 @@
       <w:pPr>
         <w:pStyle w:val="Heading1"/>
       </w:pPr>
-      <w:bookmarkStart w:id="36" w:name="_Toc243643189"/>
+      <w:bookmarkStart w:id="37" w:name="_Toc243647364"/>
       <w:r>
         <w:lastRenderedPageBreak/>
         <w:t>Running the team</w:t>
       </w:r>
-      <w:bookmarkEnd w:id="36"/>
+      <w:bookmarkEnd w:id="37"/>
     </w:p>
     <w:p>
       <w:r>
@@ -7305,11 +7646,11 @@
       <w:pPr>
         <w:pStyle w:val="Heading2"/>
       </w:pPr>
-      <w:bookmarkStart w:id="37" w:name="_Toc243643190"/>
+      <w:bookmarkStart w:id="38" w:name="_Toc243647365"/>
       <w:r>
         <w:t>People and access</w:t>
       </w:r>
-      <w:bookmarkEnd w:id="37"/>
+      <w:bookmarkEnd w:id="38"/>
     </w:p>
     <w:tbl>
       <w:tblPr>
@@ -7571,11 +7912,11 @@
       <w:pPr>
         <w:pStyle w:val="Heading2"/>
       </w:pPr>
-      <w:bookmarkStart w:id="38" w:name="_Toc243643191"/>
+      <w:bookmarkStart w:id="39" w:name="_Toc243647366"/>
       <w:r>
         <w:t>Vault settings</w:t>
       </w:r>
-      <w:bookmarkEnd w:id="38"/>
+      <w:bookmarkEnd w:id="39"/>
     </w:p>
     <w:tbl>
       <w:tblPr>
@@ -7916,11 +8257,11 @@
       <w:pPr>
         <w:pStyle w:val="Heading2"/>
       </w:pPr>
-      <w:bookmarkStart w:id="39" w:name="_Toc243643192"/>
+      <w:bookmarkStart w:id="40" w:name="_Toc243647367"/>
       <w:r>
         <w:t>Vault maintenance</w:t>
       </w:r>
-      <w:bookmarkEnd w:id="39"/>
+      <w:bookmarkEnd w:id="40"/>
     </w:p>
     <w:p>
       <w:pPr>
@@ -7945,6 +8286,20 @@
           <w:b/>
         </w:rPr>
         <w:lastRenderedPageBreak/>
+        <w:t>Vault &gt; Upgrade records...</w:t>
+      </w:r>
+      <w:r>
+        <w:t xml:space="preserve"> appears when an update of Litterbox keeps part records in a new format. Until an Admin upgrades the vault, nobody on the new version can change anything, so an Admin is asked once per session. Upgrading makes everyone update Litterbox, and rewrites every record in one upload. Parts checked out at the time are upgraded when they are checked in.</w:t>
+      </w:r>
+    </w:p>
+    <w:p>
+      <w:pPr>
+        <w:pStyle w:val="ListBullet"/>
+      </w:pPr>
+      <w:r>
+        <w:rPr>
+          <w:b/>
+        </w:rPr>
         <w:t>Vault &gt; Vault Size...</w:t>
       </w:r>
       <w:r>
@@ -7968,12 +8323,12 @@
       <w:pPr>
         <w:pStyle w:val="Heading1"/>
       </w:pPr>
-      <w:bookmarkStart w:id="40" w:name="_Toc243643193"/>
+      <w:bookmarkStart w:id="41" w:name="_Toc243647368"/>
       <w:r>
         <w:lastRenderedPageBreak/>
         <w:t>Importing existing CAD</w:t>
       </w:r>
-      <w:bookmarkEnd w:id="40"/>
+      <w:bookmarkEnd w:id="41"/>
     </w:p>
     <w:p>
       <w:r>
@@ -8064,12 +8419,12 @@
       <w:pPr>
         <w:pStyle w:val="Heading1"/>
       </w:pPr>
-      <w:bookmarkStart w:id="41" w:name="_Toc243643194"/>
+      <w:bookmarkStart w:id="42" w:name="_Toc243647369"/>
       <w:r>
         <w:lastRenderedPageBreak/>
         <w:t>Working with SolidWorks</w:t>
       </w:r>
-      <w:bookmarkEnd w:id="41"/>
+      <w:bookmarkEnd w:id="42"/>
     </w:p>
     <w:p>
       <w:r>
@@ -8145,22 +8500,22 @@
       <w:pPr>
         <w:pStyle w:val="Heading1"/>
       </w:pPr>
-      <w:bookmarkStart w:id="42" w:name="_Toc243643195"/>
+      <w:bookmarkStart w:id="43" w:name="_Toc243647370"/>
       <w:r>
         <w:lastRenderedPageBreak/>
         <w:t>Settings and troubleshooting</w:t>
       </w:r>
-      <w:bookmarkEnd w:id="42"/>
+      <w:bookmarkEnd w:id="43"/>
     </w:p>
     <w:p>
       <w:pPr>
         <w:pStyle w:val="Heading2"/>
       </w:pPr>
-      <w:bookmarkStart w:id="43" w:name="_Toc243643196"/>
+      <w:bookmarkStart w:id="44" w:name="_Toc243647371"/>
       <w:r>
         <w:t>Your settings</w:t>
       </w:r>
-      <w:bookmarkEnd w:id="43"/>
+      <w:bookmarkEnd w:id="44"/>
     </w:p>
     <w:p>
       <w:r>
@@ -8482,11 +8837,11 @@
       <w:pPr>
         <w:pStyle w:val="Heading2"/>
       </w:pPr>
-      <w:bookmarkStart w:id="44" w:name="_Toc243643197"/>
+      <w:bookmarkStart w:id="45" w:name="_Toc243647372"/>
       <w:r>
         <w:t>Problems</w:t>
       </w:r>
-      <w:bookmarkEnd w:id="44"/>
+      <w:bookmarkEnd w:id="45"/>
     </w:p>
     <w:p>
       <w:pPr>
@@ -8550,11 +8905,11 @@
       <w:pPr>
         <w:pStyle w:val="Heading2"/>
       </w:pPr>
-      <w:bookmarkStart w:id="45" w:name="_Toc243643198"/>
+      <w:bookmarkStart w:id="46" w:name="_Toc243647373"/>
       <w:r>
         <w:t>The command line</w:t>
       </w:r>
-      <w:bookmarkEnd w:id="45"/>
+      <w:bookmarkEnd w:id="46"/>
     </w:p>
     <w:p>
       <w:r>
@@ -8590,12 +8945,12 @@
       <w:pPr>
         <w:pStyle w:val="Heading1"/>
       </w:pPr>
-      <w:bookmarkStart w:id="46" w:name="_Toc243643199"/>
+      <w:bookmarkStart w:id="47" w:name="_Toc243647374"/>
       <w:r>
         <w:lastRenderedPageBreak/>
         <w:t>Quick reference</w:t>
       </w:r>
-      <w:bookmarkEnd w:id="46"/>
+      <w:bookmarkEnd w:id="47"/>
     </w:p>
     <w:tbl>
       <w:tblPr>
@@ -9216,70 +9571,70 @@
       </w:rPr>
     </w:lvl>
   </w:abstractNum>
-  <w:num w:numId="1" w16cid:durableId="479034542">
+  <w:num w:numId="1" w16cid:durableId="82117508">
     <w:abstractNumId w:val="8"/>
   </w:num>
-  <w:num w:numId="2" w16cid:durableId="2020738595">
+  <w:num w:numId="2" w16cid:durableId="307443746">
     <w:abstractNumId w:val="6"/>
   </w:num>
-  <w:num w:numId="3" w16cid:durableId="610430742">
+  <w:num w:numId="3" w16cid:durableId="1160776278">
     <w:abstractNumId w:val="5"/>
   </w:num>
-  <w:num w:numId="4" w16cid:durableId="2086879443">
+  <w:num w:numId="4" w16cid:durableId="1441300096">
     <w:abstractNumId w:val="4"/>
   </w:num>
-  <w:num w:numId="5" w16cid:durableId="735208508">
+  <w:num w:numId="5" w16cid:durableId="225410854">
     <w:abstractNumId w:val="7"/>
   </w:num>
-  <w:num w:numId="6" w16cid:durableId="2088068269">
+  <w:num w:numId="6" w16cid:durableId="1753309861">
     <w:abstractNumId w:val="3"/>
   </w:num>
-  <w:num w:numId="7" w16cid:durableId="436340498">
+  <w:num w:numId="7" w16cid:durableId="1857379785">
     <w:abstractNumId w:val="2"/>
   </w:num>
-  <w:num w:numId="8" w16cid:durableId="107311846">
+  <w:num w:numId="8" w16cid:durableId="642388066">
     <w:abstractNumId w:val="1"/>
   </w:num>
-  <w:num w:numId="9" w16cid:durableId="252974979">
+  <w:num w:numId="9" w16cid:durableId="831944286">
     <w:abstractNumId w:val="0"/>
   </w:num>
-  <w:num w:numId="10" w16cid:durableId="2081369673">
+  <w:num w:numId="10" w16cid:durableId="965308186">
     <w:abstractNumId w:val="7"/>
     <w:lvlOverride w:ilvl="0">
       <w:startOverride w:val="1"/>
     </w:lvlOverride>
   </w:num>
-  <w:num w:numId="11" w16cid:durableId="785857104">
+  <w:num w:numId="11" w16cid:durableId="452597324">
     <w:abstractNumId w:val="7"/>
     <w:lvlOverride w:ilvl="0">
       <w:startOverride w:val="1"/>
     </w:lvlOverride>
   </w:num>
-  <w:num w:numId="12" w16cid:durableId="1298876271">
+  <w:num w:numId="12" w16cid:durableId="1399094072">
     <w:abstractNumId w:val="7"/>
     <w:lvlOverride w:ilvl="0">
       <w:startOverride w:val="1"/>
     </w:lvlOverride>
   </w:num>
-  <w:num w:numId="13" w16cid:durableId="1244485214">
+  <w:num w:numId="13" w16cid:durableId="181433683">
     <w:abstractNumId w:val="7"/>
     <w:lvlOverride w:ilvl="0">
       <w:startOverride w:val="1"/>
     </w:lvlOverride>
   </w:num>
-  <w:num w:numId="14" w16cid:durableId="853302617">
+  <w:num w:numId="14" w16cid:durableId="1075318410">
     <w:abstractNumId w:val="7"/>
     <w:lvlOverride w:ilvl="0">
       <w:startOverride w:val="1"/>
     </w:lvlOverride>
   </w:num>
-  <w:num w:numId="15" w16cid:durableId="1416394170">
+  <w:num w:numId="15" w16cid:durableId="1524242026">
     <w:abstractNumId w:val="7"/>
     <w:lvlOverride w:ilvl="0">
       <w:startOverride w:val="1"/>
     </w:lvlOverride>
   </w:num>
-  <w:num w:numId="16" w16cid:durableId="2015455994">
+  <w:num w:numId="16" w16cid:durableId="1857815622">
     <w:abstractNumId w:val="7"/>
     <w:lvlOverride w:ilvl="0">
       <w:startOverride w:val="1"/>
@@ -20649,7 +21004,7 @@
     <w:autoRedefine/>
     <w:uiPriority w:val="39"/>
     <w:unhideWhenUsed/>
-    <w:rsid w:val="00AF57BE"/>
+    <w:rsid w:val="006703F7"/>
     <w:pPr>
       <w:spacing w:after="100"/>
     </w:pPr>
@@ -20661,7 +21016,7 @@
     <w:autoRedefine/>
     <w:uiPriority w:val="39"/>
     <w:unhideWhenUsed/>
-    <w:rsid w:val="00AF57BE"/>
+    <w:rsid w:val="006703F7"/>
     <w:pPr>
       <w:spacing w:after="100"/>
       <w:ind w:left="210"/>
@@ -20672,7 +21027,7 @@
     <w:basedOn w:val="DefaultParagraphFont"/>
     <w:uiPriority w:val="99"/>
     <w:unhideWhenUsed/>
-    <w:rsid w:val="00AF57BE"/>
+    <w:rsid w:val="006703F7"/>
     <w:rPr>
       <w:color w:val="0000FF" w:themeColor="hyperlink"/>
       <w:u w:val="single"/>

</xml_diff>

<commit_message>
0.6.0: the CAD adapter, the Toolbox rule and the team's Toolbox; user guide for 0.6.0
- CAD programs behind one interface (cad/cad_program.py, cad/cad_programs.py, cad/solidworks/sw_program.py);
  nothing outside cad/ imports SolidWorks code. Extensions per program in core/file_types.py (moved from cad/).
- Toolbox rule (vault setting toolbox: none / team / no check), checked at Check In and Release against what each
  assembly revision uses that isn't a Litterbox part (record field other_files). New vaults take no Toolbox parts.
- The team's Toolbox in the vault's toolbox/ folder (Team > Toolbox...): only Admins and the Owner copy it in or
  upload changes; read-only and lockable (file rules version 3); uploads touching it are refused for anyone else.
- Handoff notes: docs/handoffs/HANDOFF_20261023_3.md

Co-Authored-By: Claude Opus 5.5 <noreply@anthropic.com>
</commit_message>
<xml_diff>
--- a/docs/Litterbox_User_Guide.docx
+++ b/docs/Litterbox_User_Guide.docx
@@ -46,7 +46,7 @@
         <w:rPr>
           <w:color w:val="666666"/>
         </w:rPr>
-        <w:t>For Litterbox 0.5.7  ·  October 2026</w:t>
+        <w:t>For Litterbox 0.6.0  ·  October 2026</w:t>
       </w:r>
     </w:p>
     <w:p>
@@ -87,7 +87,7 @@
       <w:r>
         <w:fldChar w:fldCharType="separate"/>
       </w:r>
-      <w:hyperlink w:anchor="_Toc243647327" w:history="1">
+      <w:hyperlink w:anchor="_Toc243651005" w:history="1">
         <w:r>
           <w:rPr>
             <w:rStyle w:val="Hyperlink"/>
@@ -114,7 +114,7 @@
             <w:noProof/>
             <w:webHidden/>
           </w:rPr>
-          <w:instrText xml:space="preserve"> PAGEREF _Toc243647327 \h </w:instrText>
+          <w:instrText xml:space="preserve"> PAGEREF _Toc243651005 \h </w:instrText>
         </w:r>
         <w:r>
           <w:rPr>
@@ -155,7 +155,7 @@
           <w:noProof/>
         </w:rPr>
       </w:pPr>
-      <w:hyperlink w:anchor="_Toc243647328" w:history="1">
+      <w:hyperlink w:anchor="_Toc243651006" w:history="1">
         <w:r>
           <w:rPr>
             <w:rStyle w:val="Hyperlink"/>
@@ -182,7 +182,7 @@
             <w:noProof/>
             <w:webHidden/>
           </w:rPr>
-          <w:instrText xml:space="preserve"> PAGEREF _Toc243647328 \h </w:instrText>
+          <w:instrText xml:space="preserve"> PAGEREF _Toc243651006 \h </w:instrText>
         </w:r>
         <w:r>
           <w:rPr>
@@ -223,7 +223,7 @@
           <w:noProof/>
         </w:rPr>
       </w:pPr>
-      <w:hyperlink w:anchor="_Toc243647329" w:history="1">
+      <w:hyperlink w:anchor="_Toc243651007" w:history="1">
         <w:r>
           <w:rPr>
             <w:rStyle w:val="Hyperlink"/>
@@ -250,7 +250,7 @@
             <w:noProof/>
             <w:webHidden/>
           </w:rPr>
-          <w:instrText xml:space="preserve"> PAGEREF _Toc243647329 \h </w:instrText>
+          <w:instrText xml:space="preserve"> PAGEREF _Toc243651007 \h </w:instrText>
         </w:r>
         <w:r>
           <w:rPr>
@@ -291,7 +291,7 @@
           <w:noProof/>
         </w:rPr>
       </w:pPr>
-      <w:hyperlink w:anchor="_Toc243647330" w:history="1">
+      <w:hyperlink w:anchor="_Toc243651008" w:history="1">
         <w:r>
           <w:rPr>
             <w:rStyle w:val="Hyperlink"/>
@@ -318,7 +318,7 @@
             <w:noProof/>
             <w:webHidden/>
           </w:rPr>
-          <w:instrText xml:space="preserve"> PAGEREF _Toc243647330 \h </w:instrText>
+          <w:instrText xml:space="preserve"> PAGEREF _Toc243651008 \h </w:instrText>
         </w:r>
         <w:r>
           <w:rPr>
@@ -359,7 +359,7 @@
           <w:noProof/>
         </w:rPr>
       </w:pPr>
-      <w:hyperlink w:anchor="_Toc243647331" w:history="1">
+      <w:hyperlink w:anchor="_Toc243651009" w:history="1">
         <w:r>
           <w:rPr>
             <w:rStyle w:val="Hyperlink"/>
@@ -386,7 +386,7 @@
             <w:noProof/>
             <w:webHidden/>
           </w:rPr>
-          <w:instrText xml:space="preserve"> PAGEREF _Toc243647331 \h </w:instrText>
+          <w:instrText xml:space="preserve"> PAGEREF _Toc243651009 \h </w:instrText>
         </w:r>
         <w:r>
           <w:rPr>
@@ -427,7 +427,7 @@
           <w:noProof/>
         </w:rPr>
       </w:pPr>
-      <w:hyperlink w:anchor="_Toc243647332" w:history="1">
+      <w:hyperlink w:anchor="_Toc243651010" w:history="1">
         <w:r>
           <w:rPr>
             <w:rStyle w:val="Hyperlink"/>
@@ -454,7 +454,7 @@
             <w:noProof/>
             <w:webHidden/>
           </w:rPr>
-          <w:instrText xml:space="preserve"> PAGEREF _Toc243647332 \h </w:instrText>
+          <w:instrText xml:space="preserve"> PAGEREF _Toc243651010 \h </w:instrText>
         </w:r>
         <w:r>
           <w:rPr>
@@ -495,7 +495,7 @@
           <w:noProof/>
         </w:rPr>
       </w:pPr>
-      <w:hyperlink w:anchor="_Toc243647333" w:history="1">
+      <w:hyperlink w:anchor="_Toc243651011" w:history="1">
         <w:r>
           <w:rPr>
             <w:rStyle w:val="Hyperlink"/>
@@ -522,7 +522,7 @@
             <w:noProof/>
             <w:webHidden/>
           </w:rPr>
-          <w:instrText xml:space="preserve"> PAGEREF _Toc243647333 \h </w:instrText>
+          <w:instrText xml:space="preserve"> PAGEREF _Toc243651011 \h </w:instrText>
         </w:r>
         <w:r>
           <w:rPr>
@@ -563,7 +563,7 @@
           <w:noProof/>
         </w:rPr>
       </w:pPr>
-      <w:hyperlink w:anchor="_Toc243647334" w:history="1">
+      <w:hyperlink w:anchor="_Toc243651012" w:history="1">
         <w:r>
           <w:rPr>
             <w:rStyle w:val="Hyperlink"/>
@@ -590,7 +590,7 @@
             <w:noProof/>
             <w:webHidden/>
           </w:rPr>
-          <w:instrText xml:space="preserve"> PAGEREF _Toc243647334 \h </w:instrText>
+          <w:instrText xml:space="preserve"> PAGEREF _Toc243651012 \h </w:instrText>
         </w:r>
         <w:r>
           <w:rPr>
@@ -631,7 +631,7 @@
           <w:noProof/>
         </w:rPr>
       </w:pPr>
-      <w:hyperlink w:anchor="_Toc243647335" w:history="1">
+      <w:hyperlink w:anchor="_Toc243651013" w:history="1">
         <w:r>
           <w:rPr>
             <w:rStyle w:val="Hyperlink"/>
@@ -658,7 +658,7 @@
             <w:noProof/>
             <w:webHidden/>
           </w:rPr>
-          <w:instrText xml:space="preserve"> PAGEREF _Toc243647335 \h </w:instrText>
+          <w:instrText xml:space="preserve"> PAGEREF _Toc243651013 \h </w:instrText>
         </w:r>
         <w:r>
           <w:rPr>
@@ -699,7 +699,7 @@
           <w:noProof/>
         </w:rPr>
       </w:pPr>
-      <w:hyperlink w:anchor="_Toc243647336" w:history="1">
+      <w:hyperlink w:anchor="_Toc243651014" w:history="1">
         <w:r>
           <w:rPr>
             <w:rStyle w:val="Hyperlink"/>
@@ -726,7 +726,7 @@
             <w:noProof/>
             <w:webHidden/>
           </w:rPr>
-          <w:instrText xml:space="preserve"> PAGEREF _Toc243647336 \h </w:instrText>
+          <w:instrText xml:space="preserve"> PAGEREF _Toc243651014 \h </w:instrText>
         </w:r>
         <w:r>
           <w:rPr>
@@ -767,7 +767,7 @@
           <w:noProof/>
         </w:rPr>
       </w:pPr>
-      <w:hyperlink w:anchor="_Toc243647337" w:history="1">
+      <w:hyperlink w:anchor="_Toc243651015" w:history="1">
         <w:r>
           <w:rPr>
             <w:rStyle w:val="Hyperlink"/>
@@ -794,7 +794,7 @@
             <w:noProof/>
             <w:webHidden/>
           </w:rPr>
-          <w:instrText xml:space="preserve"> PAGEREF _Toc243647337 \h </w:instrText>
+          <w:instrText xml:space="preserve"> PAGEREF _Toc243651015 \h </w:instrText>
         </w:r>
         <w:r>
           <w:rPr>
@@ -835,7 +835,7 @@
           <w:noProof/>
         </w:rPr>
       </w:pPr>
-      <w:hyperlink w:anchor="_Toc243647338" w:history="1">
+      <w:hyperlink w:anchor="_Toc243651016" w:history="1">
         <w:r>
           <w:rPr>
             <w:rStyle w:val="Hyperlink"/>
@@ -862,7 +862,7 @@
             <w:noProof/>
             <w:webHidden/>
           </w:rPr>
-          <w:instrText xml:space="preserve"> PAGEREF _Toc243647338 \h </w:instrText>
+          <w:instrText xml:space="preserve"> PAGEREF _Toc243651016 \h </w:instrText>
         </w:r>
         <w:r>
           <w:rPr>
@@ -903,7 +903,7 @@
           <w:noProof/>
         </w:rPr>
       </w:pPr>
-      <w:hyperlink w:anchor="_Toc243647339" w:history="1">
+      <w:hyperlink w:anchor="_Toc243651017" w:history="1">
         <w:r>
           <w:rPr>
             <w:rStyle w:val="Hyperlink"/>
@@ -930,7 +930,7 @@
             <w:noProof/>
             <w:webHidden/>
           </w:rPr>
-          <w:instrText xml:space="preserve"> PAGEREF _Toc243647339 \h </w:instrText>
+          <w:instrText xml:space="preserve"> PAGEREF _Toc243651017 \h </w:instrText>
         </w:r>
         <w:r>
           <w:rPr>
@@ -971,7 +971,7 @@
           <w:noProof/>
         </w:rPr>
       </w:pPr>
-      <w:hyperlink w:anchor="_Toc243647340" w:history="1">
+      <w:hyperlink w:anchor="_Toc243651018" w:history="1">
         <w:r>
           <w:rPr>
             <w:rStyle w:val="Hyperlink"/>
@@ -998,7 +998,7 @@
             <w:noProof/>
             <w:webHidden/>
           </w:rPr>
-          <w:instrText xml:space="preserve"> PAGEREF _Toc243647340 \h </w:instrText>
+          <w:instrText xml:space="preserve"> PAGEREF _Toc243651018 \h </w:instrText>
         </w:r>
         <w:r>
           <w:rPr>
@@ -1039,7 +1039,7 @@
           <w:noProof/>
         </w:rPr>
       </w:pPr>
-      <w:hyperlink w:anchor="_Toc243647341" w:history="1">
+      <w:hyperlink w:anchor="_Toc243651019" w:history="1">
         <w:r>
           <w:rPr>
             <w:rStyle w:val="Hyperlink"/>
@@ -1066,7 +1066,7 @@
             <w:noProof/>
             <w:webHidden/>
           </w:rPr>
-          <w:instrText xml:space="preserve"> PAGEREF _Toc243647341 \h </w:instrText>
+          <w:instrText xml:space="preserve"> PAGEREF _Toc243651019 \h </w:instrText>
         </w:r>
         <w:r>
           <w:rPr>
@@ -1107,7 +1107,7 @@
           <w:noProof/>
         </w:rPr>
       </w:pPr>
-      <w:hyperlink w:anchor="_Toc243647342" w:history="1">
+      <w:hyperlink w:anchor="_Toc243651020" w:history="1">
         <w:r>
           <w:rPr>
             <w:rStyle w:val="Hyperlink"/>
@@ -1134,7 +1134,7 @@
             <w:noProof/>
             <w:webHidden/>
           </w:rPr>
-          <w:instrText xml:space="preserve"> PAGEREF _Toc243647342 \h </w:instrText>
+          <w:instrText xml:space="preserve"> PAGEREF _Toc243651020 \h </w:instrText>
         </w:r>
         <w:r>
           <w:rPr>
@@ -1175,7 +1175,7 @@
           <w:noProof/>
         </w:rPr>
       </w:pPr>
-      <w:hyperlink w:anchor="_Toc243647343" w:history="1">
+      <w:hyperlink w:anchor="_Toc243651021" w:history="1">
         <w:r>
           <w:rPr>
             <w:rStyle w:val="Hyperlink"/>
@@ -1202,7 +1202,7 @@
             <w:noProof/>
             <w:webHidden/>
           </w:rPr>
-          <w:instrText xml:space="preserve"> PAGEREF _Toc243647343 \h </w:instrText>
+          <w:instrText xml:space="preserve"> PAGEREF _Toc243651021 \h </w:instrText>
         </w:r>
         <w:r>
           <w:rPr>
@@ -1243,7 +1243,7 @@
           <w:noProof/>
         </w:rPr>
       </w:pPr>
-      <w:hyperlink w:anchor="_Toc243647344" w:history="1">
+      <w:hyperlink w:anchor="_Toc243651022" w:history="1">
         <w:r>
           <w:rPr>
             <w:rStyle w:val="Hyperlink"/>
@@ -1270,7 +1270,7 @@
             <w:noProof/>
             <w:webHidden/>
           </w:rPr>
-          <w:instrText xml:space="preserve"> PAGEREF _Toc243647344 \h </w:instrText>
+          <w:instrText xml:space="preserve"> PAGEREF _Toc243651022 \h </w:instrText>
         </w:r>
         <w:r>
           <w:rPr>
@@ -1290,7 +1290,7 @@
             <w:noProof/>
             <w:webHidden/>
           </w:rPr>
-          <w:t>10</w:t>
+          <w:t>11</w:t>
         </w:r>
         <w:r>
           <w:rPr>
@@ -1311,7 +1311,7 @@
           <w:noProof/>
         </w:rPr>
       </w:pPr>
-      <w:hyperlink w:anchor="_Toc243647345" w:history="1">
+      <w:hyperlink w:anchor="_Toc243651023" w:history="1">
         <w:r>
           <w:rPr>
             <w:rStyle w:val="Hyperlink"/>
@@ -1338,7 +1338,7 @@
             <w:noProof/>
             <w:webHidden/>
           </w:rPr>
-          <w:instrText xml:space="preserve"> PAGEREF _Toc243647345 \h </w:instrText>
+          <w:instrText xml:space="preserve"> PAGEREF _Toc243651023 \h </w:instrText>
         </w:r>
         <w:r>
           <w:rPr>
@@ -1379,7 +1379,7 @@
           <w:noProof/>
         </w:rPr>
       </w:pPr>
-      <w:hyperlink w:anchor="_Toc243647346" w:history="1">
+      <w:hyperlink w:anchor="_Toc243651024" w:history="1">
         <w:r>
           <w:rPr>
             <w:rStyle w:val="Hyperlink"/>
@@ -1406,7 +1406,7 @@
             <w:noProof/>
             <w:webHidden/>
           </w:rPr>
-          <w:instrText xml:space="preserve"> PAGEREF _Toc243647346 \h </w:instrText>
+          <w:instrText xml:space="preserve"> PAGEREF _Toc243651024 \h </w:instrText>
         </w:r>
         <w:r>
           <w:rPr>
@@ -1447,7 +1447,7 @@
           <w:noProof/>
         </w:rPr>
       </w:pPr>
-      <w:hyperlink w:anchor="_Toc243647347" w:history="1">
+      <w:hyperlink w:anchor="_Toc243651025" w:history="1">
         <w:r>
           <w:rPr>
             <w:rStyle w:val="Hyperlink"/>
@@ -1474,7 +1474,7 @@
             <w:noProof/>
             <w:webHidden/>
           </w:rPr>
-          <w:instrText xml:space="preserve"> PAGEREF _Toc243647347 \h </w:instrText>
+          <w:instrText xml:space="preserve"> PAGEREF _Toc243651025 \h </w:instrText>
         </w:r>
         <w:r>
           <w:rPr>
@@ -1515,7 +1515,7 @@
           <w:noProof/>
         </w:rPr>
       </w:pPr>
-      <w:hyperlink w:anchor="_Toc243647348" w:history="1">
+      <w:hyperlink w:anchor="_Toc243651026" w:history="1">
         <w:r>
           <w:rPr>
             <w:rStyle w:val="Hyperlink"/>
@@ -1542,7 +1542,7 @@
             <w:noProof/>
             <w:webHidden/>
           </w:rPr>
-          <w:instrText xml:space="preserve"> PAGEREF _Toc243647348 \h </w:instrText>
+          <w:instrText xml:space="preserve"> PAGEREF _Toc243651026 \h </w:instrText>
         </w:r>
         <w:r>
           <w:rPr>
@@ -1583,7 +1583,7 @@
           <w:noProof/>
         </w:rPr>
       </w:pPr>
-      <w:hyperlink w:anchor="_Toc243647349" w:history="1">
+      <w:hyperlink w:anchor="_Toc243651027" w:history="1">
         <w:r>
           <w:rPr>
             <w:rStyle w:val="Hyperlink"/>
@@ -1610,7 +1610,7 @@
             <w:noProof/>
             <w:webHidden/>
           </w:rPr>
-          <w:instrText xml:space="preserve"> PAGEREF _Toc243647349 \h </w:instrText>
+          <w:instrText xml:space="preserve"> PAGEREF _Toc243651027 \h </w:instrText>
         </w:r>
         <w:r>
           <w:rPr>
@@ -1651,12 +1651,80 @@
           <w:noProof/>
         </w:rPr>
       </w:pPr>
-      <w:hyperlink w:anchor="_Toc243647350" w:history="1">
+      <w:hyperlink w:anchor="_Toc243651028" w:history="1">
         <w:r>
           <w:rPr>
             <w:rStyle w:val="Hyperlink"/>
             <w:noProof/>
           </w:rPr>
+          <w:t>Toolbox parts</w:t>
+        </w:r>
+        <w:r>
+          <w:rPr>
+            <w:noProof/>
+            <w:webHidden/>
+          </w:rPr>
+          <w:tab/>
+        </w:r>
+        <w:r>
+          <w:rPr>
+            <w:noProof/>
+            <w:webHidden/>
+          </w:rPr>
+          <w:fldChar w:fldCharType="begin"/>
+        </w:r>
+        <w:r>
+          <w:rPr>
+            <w:noProof/>
+            <w:webHidden/>
+          </w:rPr>
+          <w:instrText xml:space="preserve"> PAGEREF _Toc243651028 \h </w:instrText>
+        </w:r>
+        <w:r>
+          <w:rPr>
+            <w:noProof/>
+            <w:webHidden/>
+          </w:rPr>
+        </w:r>
+        <w:r>
+          <w:rPr>
+            <w:noProof/>
+            <w:webHidden/>
+          </w:rPr>
+          <w:fldChar w:fldCharType="separate"/>
+        </w:r>
+        <w:r>
+          <w:rPr>
+            <w:noProof/>
+            <w:webHidden/>
+          </w:rPr>
+          <w:t>13</w:t>
+        </w:r>
+        <w:r>
+          <w:rPr>
+            <w:noProof/>
+            <w:webHidden/>
+          </w:rPr>
+          <w:fldChar w:fldCharType="end"/>
+        </w:r>
+      </w:hyperlink>
+    </w:p>
+    <w:p>
+      <w:pPr>
+        <w:pStyle w:val="TOC2"/>
+        <w:tabs>
+          <w:tab w:val="right" w:leader="dot" w:pos="9350"/>
+        </w:tabs>
+        <w:rPr>
+          <w:noProof/>
+        </w:rPr>
+      </w:pPr>
+      <w:hyperlink w:anchor="_Toc243651029" w:history="1">
+        <w:r>
+          <w:rPr>
+            <w:rStyle w:val="Hyperlink"/>
+            <w:noProof/>
+          </w:rPr>
           <w:t>Non-CAD parts and kits</w:t>
         </w:r>
         <w:r>
@@ -1678,7 +1746,7 @@
             <w:noProof/>
             <w:webHidden/>
           </w:rPr>
-          <w:instrText xml:space="preserve"> PAGEREF _Toc243647350 \h </w:instrText>
+          <w:instrText xml:space="preserve"> PAGEREF _Toc243651029 \h </w:instrText>
         </w:r>
         <w:r>
           <w:rPr>
@@ -1698,7 +1766,7 @@
             <w:noProof/>
             <w:webHidden/>
           </w:rPr>
-          <w:t>13</w:t>
+          <w:t>14</w:t>
         </w:r>
         <w:r>
           <w:rPr>
@@ -1719,7 +1787,7 @@
           <w:noProof/>
         </w:rPr>
       </w:pPr>
-      <w:hyperlink w:anchor="_Toc243647351" w:history="1">
+      <w:hyperlink w:anchor="_Toc243651030" w:history="1">
         <w:r>
           <w:rPr>
             <w:rStyle w:val="Hyperlink"/>
@@ -1746,7 +1814,7 @@
             <w:noProof/>
             <w:webHidden/>
           </w:rPr>
-          <w:instrText xml:space="preserve"> PAGEREF _Toc243647351 \h </w:instrText>
+          <w:instrText xml:space="preserve"> PAGEREF _Toc243651030 \h </w:instrText>
         </w:r>
         <w:r>
           <w:rPr>
@@ -1766,7 +1834,7 @@
             <w:noProof/>
             <w:webHidden/>
           </w:rPr>
-          <w:t>14</w:t>
+          <w:t>15</w:t>
         </w:r>
         <w:r>
           <w:rPr>
@@ -1787,7 +1855,7 @@
           <w:noProof/>
         </w:rPr>
       </w:pPr>
-      <w:hyperlink w:anchor="_Toc243647352" w:history="1">
+      <w:hyperlink w:anchor="_Toc243651031" w:history="1">
         <w:r>
           <w:rPr>
             <w:rStyle w:val="Hyperlink"/>
@@ -1814,7 +1882,7 @@
             <w:noProof/>
             <w:webHidden/>
           </w:rPr>
-          <w:instrText xml:space="preserve"> PAGEREF _Toc243647352 \h </w:instrText>
+          <w:instrText xml:space="preserve"> PAGEREF _Toc243651031 \h </w:instrText>
         </w:r>
         <w:r>
           <w:rPr>
@@ -1834,7 +1902,7 @@
             <w:noProof/>
             <w:webHidden/>
           </w:rPr>
-          <w:t>14</w:t>
+          <w:t>15</w:t>
         </w:r>
         <w:r>
           <w:rPr>
@@ -1855,7 +1923,7 @@
           <w:noProof/>
         </w:rPr>
       </w:pPr>
-      <w:hyperlink w:anchor="_Toc243647353" w:history="1">
+      <w:hyperlink w:anchor="_Toc243651032" w:history="1">
         <w:r>
           <w:rPr>
             <w:rStyle w:val="Hyperlink"/>
@@ -1882,7 +1950,7 @@
             <w:noProof/>
             <w:webHidden/>
           </w:rPr>
-          <w:instrText xml:space="preserve"> PAGEREF _Toc243647353 \h </w:instrText>
+          <w:instrText xml:space="preserve"> PAGEREF _Toc243651032 \h </w:instrText>
         </w:r>
         <w:r>
           <w:rPr>
@@ -1902,7 +1970,7 @@
             <w:noProof/>
             <w:webHidden/>
           </w:rPr>
-          <w:t>14</w:t>
+          <w:t>15</w:t>
         </w:r>
         <w:r>
           <w:rPr>
@@ -1923,7 +1991,7 @@
           <w:noProof/>
         </w:rPr>
       </w:pPr>
-      <w:hyperlink w:anchor="_Toc243647354" w:history="1">
+      <w:hyperlink w:anchor="_Toc243651033" w:history="1">
         <w:r>
           <w:rPr>
             <w:rStyle w:val="Hyperlink"/>
@@ -1950,7 +2018,7 @@
             <w:noProof/>
             <w:webHidden/>
           </w:rPr>
-          <w:instrText xml:space="preserve"> PAGEREF _Toc243647354 \h </w:instrText>
+          <w:instrText xml:space="preserve"> PAGEREF _Toc243651033 \h </w:instrText>
         </w:r>
         <w:r>
           <w:rPr>
@@ -1970,7 +2038,7 @@
             <w:noProof/>
             <w:webHidden/>
           </w:rPr>
-          <w:t>15</w:t>
+          <w:t>16</w:t>
         </w:r>
         <w:r>
           <w:rPr>
@@ -1991,7 +2059,7 @@
           <w:noProof/>
         </w:rPr>
       </w:pPr>
-      <w:hyperlink w:anchor="_Toc243647355" w:history="1">
+      <w:hyperlink w:anchor="_Toc243651034" w:history="1">
         <w:r>
           <w:rPr>
             <w:rStyle w:val="Hyperlink"/>
@@ -2018,7 +2086,7 @@
             <w:noProof/>
             <w:webHidden/>
           </w:rPr>
-          <w:instrText xml:space="preserve"> PAGEREF _Toc243647355 \h </w:instrText>
+          <w:instrText xml:space="preserve"> PAGEREF _Toc243651034 \h </w:instrText>
         </w:r>
         <w:r>
           <w:rPr>
@@ -2038,7 +2106,7 @@
             <w:noProof/>
             <w:webHidden/>
           </w:rPr>
-          <w:t>15</w:t>
+          <w:t>16</w:t>
         </w:r>
         <w:r>
           <w:rPr>
@@ -2059,7 +2127,7 @@
           <w:noProof/>
         </w:rPr>
       </w:pPr>
-      <w:hyperlink w:anchor="_Toc243647356" w:history="1">
+      <w:hyperlink w:anchor="_Toc243651035" w:history="1">
         <w:r>
           <w:rPr>
             <w:rStyle w:val="Hyperlink"/>
@@ -2086,7 +2154,7 @@
             <w:noProof/>
             <w:webHidden/>
           </w:rPr>
-          <w:instrText xml:space="preserve"> PAGEREF _Toc243647356 \h </w:instrText>
+          <w:instrText xml:space="preserve"> PAGEREF _Toc243651035 \h </w:instrText>
         </w:r>
         <w:r>
           <w:rPr>
@@ -2106,7 +2174,7 @@
             <w:noProof/>
             <w:webHidden/>
           </w:rPr>
-          <w:t>15</w:t>
+          <w:t>16</w:t>
         </w:r>
         <w:r>
           <w:rPr>
@@ -2127,7 +2195,7 @@
           <w:noProof/>
         </w:rPr>
       </w:pPr>
-      <w:hyperlink w:anchor="_Toc243647357" w:history="1">
+      <w:hyperlink w:anchor="_Toc243651036" w:history="1">
         <w:r>
           <w:rPr>
             <w:rStyle w:val="Hyperlink"/>
@@ -2154,7 +2222,7 @@
             <w:noProof/>
             <w:webHidden/>
           </w:rPr>
-          <w:instrText xml:space="preserve"> PAGEREF _Toc243647357 \h </w:instrText>
+          <w:instrText xml:space="preserve"> PAGEREF _Toc243651036 \h </w:instrText>
         </w:r>
         <w:r>
           <w:rPr>
@@ -2174,7 +2242,7 @@
             <w:noProof/>
             <w:webHidden/>
           </w:rPr>
-          <w:t>16</w:t>
+          <w:t>17</w:t>
         </w:r>
         <w:r>
           <w:rPr>
@@ -2195,7 +2263,7 @@
           <w:noProof/>
         </w:rPr>
       </w:pPr>
-      <w:hyperlink w:anchor="_Toc243647358" w:history="1">
+      <w:hyperlink w:anchor="_Toc243651037" w:history="1">
         <w:r>
           <w:rPr>
             <w:rStyle w:val="Hyperlink"/>
@@ -2222,7 +2290,7 @@
             <w:noProof/>
             <w:webHidden/>
           </w:rPr>
-          <w:instrText xml:space="preserve"> PAGEREF _Toc243647358 \h </w:instrText>
+          <w:instrText xml:space="preserve"> PAGEREF _Toc243651037 \h </w:instrText>
         </w:r>
         <w:r>
           <w:rPr>
@@ -2242,7 +2310,7 @@
             <w:noProof/>
             <w:webHidden/>
           </w:rPr>
-          <w:t>17</w:t>
+          <w:t>18</w:t>
         </w:r>
         <w:r>
           <w:rPr>
@@ -2263,7 +2331,7 @@
           <w:noProof/>
         </w:rPr>
       </w:pPr>
-      <w:hyperlink w:anchor="_Toc243647359" w:history="1">
+      <w:hyperlink w:anchor="_Toc243651038" w:history="1">
         <w:r>
           <w:rPr>
             <w:rStyle w:val="Hyperlink"/>
@@ -2290,7 +2358,7 @@
             <w:noProof/>
             <w:webHidden/>
           </w:rPr>
-          <w:instrText xml:space="preserve"> PAGEREF _Toc243647359 \h </w:instrText>
+          <w:instrText xml:space="preserve"> PAGEREF _Toc243651038 \h </w:instrText>
         </w:r>
         <w:r>
           <w:rPr>
@@ -2310,7 +2378,7 @@
             <w:noProof/>
             <w:webHidden/>
           </w:rPr>
-          <w:t>17</w:t>
+          <w:t>18</w:t>
         </w:r>
         <w:r>
           <w:rPr>
@@ -2331,7 +2399,7 @@
           <w:noProof/>
         </w:rPr>
       </w:pPr>
-      <w:hyperlink w:anchor="_Toc243647360" w:history="1">
+      <w:hyperlink w:anchor="_Toc243651039" w:history="1">
         <w:r>
           <w:rPr>
             <w:rStyle w:val="Hyperlink"/>
@@ -2358,7 +2426,7 @@
             <w:noProof/>
             <w:webHidden/>
           </w:rPr>
-          <w:instrText xml:space="preserve"> PAGEREF _Toc243647360 \h </w:instrText>
+          <w:instrText xml:space="preserve"> PAGEREF _Toc243651039 \h </w:instrText>
         </w:r>
         <w:r>
           <w:rPr>
@@ -2378,7 +2446,7 @@
             <w:noProof/>
             <w:webHidden/>
           </w:rPr>
-          <w:t>17</w:t>
+          <w:t>18</w:t>
         </w:r>
         <w:r>
           <w:rPr>
@@ -2399,7 +2467,7 @@
           <w:noProof/>
         </w:rPr>
       </w:pPr>
-      <w:hyperlink w:anchor="_Toc243647361" w:history="1">
+      <w:hyperlink w:anchor="_Toc243651040" w:history="1">
         <w:r>
           <w:rPr>
             <w:rStyle w:val="Hyperlink"/>
@@ -2426,7 +2494,7 @@
             <w:noProof/>
             <w:webHidden/>
           </w:rPr>
-          <w:instrText xml:space="preserve"> PAGEREF _Toc243647361 \h </w:instrText>
+          <w:instrText xml:space="preserve"> PAGEREF _Toc243651040 \h </w:instrText>
         </w:r>
         <w:r>
           <w:rPr>
@@ -2446,7 +2514,7 @@
             <w:noProof/>
             <w:webHidden/>
           </w:rPr>
-          <w:t>17</w:t>
+          <w:t>18</w:t>
         </w:r>
         <w:r>
           <w:rPr>
@@ -2467,7 +2535,7 @@
           <w:noProof/>
         </w:rPr>
       </w:pPr>
-      <w:hyperlink w:anchor="_Toc243647362" w:history="1">
+      <w:hyperlink w:anchor="_Toc243651041" w:history="1">
         <w:r>
           <w:rPr>
             <w:rStyle w:val="Hyperlink"/>
@@ -2494,7 +2562,7 @@
             <w:noProof/>
             <w:webHidden/>
           </w:rPr>
-          <w:instrText xml:space="preserve"> PAGEREF _Toc243647362 \h </w:instrText>
+          <w:instrText xml:space="preserve"> PAGEREF _Toc243651041 \h </w:instrText>
         </w:r>
         <w:r>
           <w:rPr>
@@ -2514,7 +2582,7 @@
             <w:noProof/>
             <w:webHidden/>
           </w:rPr>
-          <w:t>18</w:t>
+          <w:t>19</w:t>
         </w:r>
         <w:r>
           <w:rPr>
@@ -2535,7 +2603,7 @@
           <w:noProof/>
         </w:rPr>
       </w:pPr>
-      <w:hyperlink w:anchor="_Toc243647363" w:history="1">
+      <w:hyperlink w:anchor="_Toc243651042" w:history="1">
         <w:r>
           <w:rPr>
             <w:rStyle w:val="Hyperlink"/>
@@ -2562,7 +2630,7 @@
             <w:noProof/>
             <w:webHidden/>
           </w:rPr>
-          <w:instrText xml:space="preserve"> PAGEREF _Toc243647363 \h </w:instrText>
+          <w:instrText xml:space="preserve"> PAGEREF _Toc243651042 \h </w:instrText>
         </w:r>
         <w:r>
           <w:rPr>
@@ -2582,7 +2650,7 @@
             <w:noProof/>
             <w:webHidden/>
           </w:rPr>
-          <w:t>18</w:t>
+          <w:t>19</w:t>
         </w:r>
         <w:r>
           <w:rPr>
@@ -2603,7 +2671,7 @@
           <w:noProof/>
         </w:rPr>
       </w:pPr>
-      <w:hyperlink w:anchor="_Toc243647364" w:history="1">
+      <w:hyperlink w:anchor="_Toc243651043" w:history="1">
         <w:r>
           <w:rPr>
             <w:rStyle w:val="Hyperlink"/>
@@ -2630,7 +2698,7 @@
             <w:noProof/>
             <w:webHidden/>
           </w:rPr>
-          <w:instrText xml:space="preserve"> PAGEREF _Toc243647364 \h </w:instrText>
+          <w:instrText xml:space="preserve"> PAGEREF _Toc243651043 \h </w:instrText>
         </w:r>
         <w:r>
           <w:rPr>
@@ -2650,7 +2718,7 @@
             <w:noProof/>
             <w:webHidden/>
           </w:rPr>
-          <w:t>19</w:t>
+          <w:t>20</w:t>
         </w:r>
         <w:r>
           <w:rPr>
@@ -2671,7 +2739,7 @@
           <w:noProof/>
         </w:rPr>
       </w:pPr>
-      <w:hyperlink w:anchor="_Toc243647365" w:history="1">
+      <w:hyperlink w:anchor="_Toc243651044" w:history="1">
         <w:r>
           <w:rPr>
             <w:rStyle w:val="Hyperlink"/>
@@ -2698,7 +2766,7 @@
             <w:noProof/>
             <w:webHidden/>
           </w:rPr>
-          <w:instrText xml:space="preserve"> PAGEREF _Toc243647365 \h </w:instrText>
+          <w:instrText xml:space="preserve"> PAGEREF _Toc243651044 \h </w:instrText>
         </w:r>
         <w:r>
           <w:rPr>
@@ -2718,7 +2786,7 @@
             <w:noProof/>
             <w:webHidden/>
           </w:rPr>
-          <w:t>19</w:t>
+          <w:t>20</w:t>
         </w:r>
         <w:r>
           <w:rPr>
@@ -2739,7 +2807,7 @@
           <w:noProof/>
         </w:rPr>
       </w:pPr>
-      <w:hyperlink w:anchor="_Toc243647366" w:history="1">
+      <w:hyperlink w:anchor="_Toc243651045" w:history="1">
         <w:r>
           <w:rPr>
             <w:rStyle w:val="Hyperlink"/>
@@ -2766,7 +2834,7 @@
             <w:noProof/>
             <w:webHidden/>
           </w:rPr>
-          <w:instrText xml:space="preserve"> PAGEREF _Toc243647366 \h </w:instrText>
+          <w:instrText xml:space="preserve"> PAGEREF _Toc243651045 \h </w:instrText>
         </w:r>
         <w:r>
           <w:rPr>
@@ -2786,7 +2854,7 @@
             <w:noProof/>
             <w:webHidden/>
           </w:rPr>
-          <w:t>19</w:t>
+          <w:t>20</w:t>
         </w:r>
         <w:r>
           <w:rPr>
@@ -2807,12 +2875,80 @@
           <w:noProof/>
         </w:rPr>
       </w:pPr>
-      <w:hyperlink w:anchor="_Toc243647367" w:history="1">
+      <w:hyperlink w:anchor="_Toc243651046" w:history="1">
         <w:r>
           <w:rPr>
             <w:rStyle w:val="Hyperlink"/>
             <w:noProof/>
           </w:rPr>
+          <w:t>The team's Toolbox</w:t>
+        </w:r>
+        <w:r>
+          <w:rPr>
+            <w:noProof/>
+            <w:webHidden/>
+          </w:rPr>
+          <w:tab/>
+        </w:r>
+        <w:r>
+          <w:rPr>
+            <w:noProof/>
+            <w:webHidden/>
+          </w:rPr>
+          <w:fldChar w:fldCharType="begin"/>
+        </w:r>
+        <w:r>
+          <w:rPr>
+            <w:noProof/>
+            <w:webHidden/>
+          </w:rPr>
+          <w:instrText xml:space="preserve"> PAGEREF _Toc243651046 \h </w:instrText>
+        </w:r>
+        <w:r>
+          <w:rPr>
+            <w:noProof/>
+            <w:webHidden/>
+          </w:rPr>
+        </w:r>
+        <w:r>
+          <w:rPr>
+            <w:noProof/>
+            <w:webHidden/>
+          </w:rPr>
+          <w:fldChar w:fldCharType="separate"/>
+        </w:r>
+        <w:r>
+          <w:rPr>
+            <w:noProof/>
+            <w:webHidden/>
+          </w:rPr>
+          <w:t>21</w:t>
+        </w:r>
+        <w:r>
+          <w:rPr>
+            <w:noProof/>
+            <w:webHidden/>
+          </w:rPr>
+          <w:fldChar w:fldCharType="end"/>
+        </w:r>
+      </w:hyperlink>
+    </w:p>
+    <w:p>
+      <w:pPr>
+        <w:pStyle w:val="TOC2"/>
+        <w:tabs>
+          <w:tab w:val="right" w:leader="dot" w:pos="9350"/>
+        </w:tabs>
+        <w:rPr>
+          <w:noProof/>
+        </w:rPr>
+      </w:pPr>
+      <w:hyperlink w:anchor="_Toc243651047" w:history="1">
+        <w:r>
+          <w:rPr>
+            <w:rStyle w:val="Hyperlink"/>
+            <w:noProof/>
+          </w:rPr>
           <w:t>Vault maintenance</w:t>
         </w:r>
         <w:r>
@@ -2834,7 +2970,7 @@
             <w:noProof/>
             <w:webHidden/>
           </w:rPr>
-          <w:instrText xml:space="preserve"> PAGEREF _Toc243647367 \h </w:instrText>
+          <w:instrText xml:space="preserve"> PAGEREF _Toc243651047 \h </w:instrText>
         </w:r>
         <w:r>
           <w:rPr>
@@ -2854,7 +2990,7 @@
             <w:noProof/>
             <w:webHidden/>
           </w:rPr>
-          <w:t>19</w:t>
+          <w:t>21</w:t>
         </w:r>
         <w:r>
           <w:rPr>
@@ -2875,7 +3011,7 @@
           <w:noProof/>
         </w:rPr>
       </w:pPr>
-      <w:hyperlink w:anchor="_Toc243647368" w:history="1">
+      <w:hyperlink w:anchor="_Toc243651048" w:history="1">
         <w:r>
           <w:rPr>
             <w:rStyle w:val="Hyperlink"/>
@@ -2902,7 +3038,7 @@
             <w:noProof/>
             <w:webHidden/>
           </w:rPr>
-          <w:instrText xml:space="preserve"> PAGEREF _Toc243647368 \h </w:instrText>
+          <w:instrText xml:space="preserve"> PAGEREF _Toc243651048 \h </w:instrText>
         </w:r>
         <w:r>
           <w:rPr>
@@ -2922,7 +3058,7 @@
             <w:noProof/>
             <w:webHidden/>
           </w:rPr>
-          <w:t>21</w:t>
+          <w:t>22</w:t>
         </w:r>
         <w:r>
           <w:rPr>
@@ -2943,7 +3079,7 @@
           <w:noProof/>
         </w:rPr>
       </w:pPr>
-      <w:hyperlink w:anchor="_Toc243647369" w:history="1">
+      <w:hyperlink w:anchor="_Toc243651049" w:history="1">
         <w:r>
           <w:rPr>
             <w:rStyle w:val="Hyperlink"/>
@@ -2970,7 +3106,7 @@
             <w:noProof/>
             <w:webHidden/>
           </w:rPr>
-          <w:instrText xml:space="preserve"> PAGEREF _Toc243647369 \h </w:instrText>
+          <w:instrText xml:space="preserve"> PAGEREF _Toc243651049 \h </w:instrText>
         </w:r>
         <w:r>
           <w:rPr>
@@ -2990,7 +3126,7 @@
             <w:noProof/>
             <w:webHidden/>
           </w:rPr>
-          <w:t>22</w:t>
+          <w:t>23</w:t>
         </w:r>
         <w:r>
           <w:rPr>
@@ -3011,7 +3147,7 @@
           <w:noProof/>
         </w:rPr>
       </w:pPr>
-      <w:hyperlink w:anchor="_Toc243647370" w:history="1">
+      <w:hyperlink w:anchor="_Toc243651050" w:history="1">
         <w:r>
           <w:rPr>
             <w:rStyle w:val="Hyperlink"/>
@@ -3038,7 +3174,7 @@
             <w:noProof/>
             <w:webHidden/>
           </w:rPr>
-          <w:instrText xml:space="preserve"> PAGEREF _Toc243647370 \h </w:instrText>
+          <w:instrText xml:space="preserve"> PAGEREF _Toc243651050 \h </w:instrText>
         </w:r>
         <w:r>
           <w:rPr>
@@ -3058,7 +3194,7 @@
             <w:noProof/>
             <w:webHidden/>
           </w:rPr>
-          <w:t>23</w:t>
+          <w:t>24</w:t>
         </w:r>
         <w:r>
           <w:rPr>
@@ -3079,7 +3215,7 @@
           <w:noProof/>
         </w:rPr>
       </w:pPr>
-      <w:hyperlink w:anchor="_Toc243647371" w:history="1">
+      <w:hyperlink w:anchor="_Toc243651051" w:history="1">
         <w:r>
           <w:rPr>
             <w:rStyle w:val="Hyperlink"/>
@@ -3106,7 +3242,7 @@
             <w:noProof/>
             <w:webHidden/>
           </w:rPr>
-          <w:instrText xml:space="preserve"> PAGEREF _Toc243647371 \h </w:instrText>
+          <w:instrText xml:space="preserve"> PAGEREF _Toc243651051 \h </w:instrText>
         </w:r>
         <w:r>
           <w:rPr>
@@ -3126,7 +3262,7 @@
             <w:noProof/>
             <w:webHidden/>
           </w:rPr>
-          <w:t>23</w:t>
+          <w:t>24</w:t>
         </w:r>
         <w:r>
           <w:rPr>
@@ -3147,7 +3283,7 @@
           <w:noProof/>
         </w:rPr>
       </w:pPr>
-      <w:hyperlink w:anchor="_Toc243647372" w:history="1">
+      <w:hyperlink w:anchor="_Toc243651052" w:history="1">
         <w:r>
           <w:rPr>
             <w:rStyle w:val="Hyperlink"/>
@@ -3174,7 +3310,7 @@
             <w:noProof/>
             <w:webHidden/>
           </w:rPr>
-          <w:instrText xml:space="preserve"> PAGEREF _Toc243647372 \h </w:instrText>
+          <w:instrText xml:space="preserve"> PAGEREF _Toc243651052 \h </w:instrText>
         </w:r>
         <w:r>
           <w:rPr>
@@ -3194,7 +3330,7 @@
             <w:noProof/>
             <w:webHidden/>
           </w:rPr>
-          <w:t>23</w:t>
+          <w:t>24</w:t>
         </w:r>
         <w:r>
           <w:rPr>
@@ -3215,7 +3351,7 @@
           <w:noProof/>
         </w:rPr>
       </w:pPr>
-      <w:hyperlink w:anchor="_Toc243647373" w:history="1">
+      <w:hyperlink w:anchor="_Toc243651053" w:history="1">
         <w:r>
           <w:rPr>
             <w:rStyle w:val="Hyperlink"/>
@@ -3242,7 +3378,7 @@
             <w:noProof/>
             <w:webHidden/>
           </w:rPr>
-          <w:instrText xml:space="preserve"> PAGEREF _Toc243647373 \h </w:instrText>
+          <w:instrText xml:space="preserve"> PAGEREF _Toc243651053 \h </w:instrText>
         </w:r>
         <w:r>
           <w:rPr>
@@ -3262,7 +3398,7 @@
             <w:noProof/>
             <w:webHidden/>
           </w:rPr>
-          <w:t>23</w:t>
+          <w:t>24</w:t>
         </w:r>
         <w:r>
           <w:rPr>
@@ -3283,7 +3419,7 @@
           <w:noProof/>
         </w:rPr>
       </w:pPr>
-      <w:hyperlink w:anchor="_Toc243647374" w:history="1">
+      <w:hyperlink w:anchor="_Toc243651054" w:history="1">
         <w:r>
           <w:rPr>
             <w:rStyle w:val="Hyperlink"/>
@@ -3310,7 +3446,7 @@
             <w:noProof/>
             <w:webHidden/>
           </w:rPr>
-          <w:instrText xml:space="preserve"> PAGEREF _Toc243647374 \h </w:instrText>
+          <w:instrText xml:space="preserve"> PAGEREF _Toc243651054 \h </w:instrText>
         </w:r>
         <w:r>
           <w:rPr>
@@ -3330,7 +3466,7 @@
             <w:noProof/>
             <w:webHidden/>
           </w:rPr>
-          <w:t>24</w:t>
+          <w:t>25</w:t>
         </w:r>
         <w:r>
           <w:rPr>
@@ -3355,7 +3491,7 @@
       <w:pPr>
         <w:pStyle w:val="Heading1"/>
       </w:pPr>
-      <w:bookmarkStart w:id="0" w:name="_Toc243647327"/>
+      <w:bookmarkStart w:id="0" w:name="_Toc243651005"/>
       <w:r>
         <w:lastRenderedPageBreak/>
         <w:t>What Litterbox is</w:t>
@@ -3451,7 +3587,7 @@
       <w:pPr>
         <w:pStyle w:val="Heading2"/>
       </w:pPr>
-      <w:bookmarkStart w:id="1" w:name="_Toc243647328"/>
+      <w:bookmarkStart w:id="1" w:name="_Toc243651006"/>
       <w:r>
         <w:t>Terms</w:t>
       </w:r>
@@ -3879,7 +4015,7 @@
       <w:pPr>
         <w:pStyle w:val="Heading1"/>
       </w:pPr>
-      <w:bookmarkStart w:id="2" w:name="_Toc243647329"/>
+      <w:bookmarkStart w:id="2" w:name="_Toc243651007"/>
       <w:r>
         <w:lastRenderedPageBreak/>
         <w:t>Getting started</w:t>
@@ -3895,7 +4031,7 @@
       <w:pPr>
         <w:pStyle w:val="Heading2"/>
       </w:pPr>
-      <w:bookmarkStart w:id="3" w:name="_Toc243647330"/>
+      <w:bookmarkStart w:id="3" w:name="_Toc243651008"/>
       <w:r>
         <w:t>What you need</w:t>
       </w:r>
@@ -3980,7 +4116,7 @@
       <w:pPr>
         <w:pStyle w:val="Heading2"/>
       </w:pPr>
-      <w:bookmarkStart w:id="4" w:name="_Toc243647331"/>
+      <w:bookmarkStart w:id="4" w:name="_Toc243651009"/>
       <w:r>
         <w:t>Installing Litterbox</w:t>
       </w:r>
@@ -4059,7 +4195,7 @@
       <w:pPr>
         <w:pStyle w:val="Heading2"/>
       </w:pPr>
-      <w:bookmarkStart w:id="5" w:name="_Toc243647332"/>
+      <w:bookmarkStart w:id="5" w:name="_Toc243651010"/>
       <w:r>
         <w:t>Joining your team's vault</w:t>
       </w:r>
@@ -4165,7 +4301,7 @@
       <w:pPr>
         <w:pStyle w:val="Heading2"/>
       </w:pPr>
-      <w:bookmarkStart w:id="6" w:name="_Toc243647333"/>
+      <w:bookmarkStart w:id="6" w:name="_Toc243651011"/>
       <w:r>
         <w:lastRenderedPageBreak/>
         <w:t>Decisions to make first</w:t>
@@ -4267,7 +4403,7 @@
               <w:rPr>
                 <w:sz w:val="20"/>
               </w:rPr>
-              <w:t>Don't use SolidWorks Toolbox. Model each fastener as a part of its own, so it has a part number, revisions, and purchasing info like any other part. Toolbox files are kept outside the vault, and a released assembly keeps pointing at wherever they were. If you must use Toolbox, keep the Toolbox folder as a controlled document (in a .zip), and make sure every member installs that copy in the same folder.</w:t>
+              <w:t>Don't use SolidWorks Toolbox. Model each fastener as a part of its own, so it has a part number, revisions, and purchasing info like any other part. A new vault refuses Toolbox parts (the Toolbox rule, in Vault settings). If you must use Toolbox, an Admin keeps the team's own copy in the vault (see The team's Toolbox), and everyone points SolidWorks at it.</w:t>
             </w:r>
           </w:p>
         </w:tc>
@@ -4438,7 +4574,7 @@
       <w:pPr>
         <w:pStyle w:val="Heading2"/>
       </w:pPr>
-      <w:bookmarkStart w:id="7" w:name="_Toc243647334"/>
+      <w:bookmarkStart w:id="7" w:name="_Toc243651012"/>
       <w:r>
         <w:t>Setting up a new team</w:t>
       </w:r>
@@ -4655,6 +4791,15 @@
         <w:t>Document Types...</w:t>
       </w:r>
       <w:r>
+        <w:t xml:space="preserve">, </w:t>
+      </w:r>
+      <w:r>
+        <w:rPr>
+          <w:b/>
+        </w:rPr>
+        <w:t>Toolbox...</w:t>
+      </w:r>
+      <w:r>
         <w:t xml:space="preserve">, and </w:t>
       </w:r>
       <w:r>
@@ -4699,7 +4844,7 @@
       <w:pPr>
         <w:pStyle w:val="Heading2"/>
       </w:pPr>
-      <w:bookmarkStart w:id="8" w:name="_Toc243647335"/>
+      <w:bookmarkStart w:id="8" w:name="_Toc243651013"/>
       <w:r>
         <w:t>The main window</w:t>
       </w:r>
@@ -5069,7 +5214,7 @@
       <w:pPr>
         <w:pStyle w:val="Heading2"/>
       </w:pPr>
-      <w:bookmarkStart w:id="9" w:name="_Toc243647336"/>
+      <w:bookmarkStart w:id="9" w:name="_Toc243651014"/>
       <w:r>
         <w:t>Your first part</w:t>
       </w:r>
@@ -5165,7 +5310,7 @@
       <w:pPr>
         <w:pStyle w:val="Heading1"/>
       </w:pPr>
-      <w:bookmarkStart w:id="10" w:name="_Toc243647337"/>
+      <w:bookmarkStart w:id="10" w:name="_Toc243651015"/>
       <w:r>
         <w:lastRenderedPageBreak/>
         <w:t>Everyday work</w:t>
@@ -5176,7 +5321,7 @@
       <w:pPr>
         <w:pStyle w:val="Heading2"/>
       </w:pPr>
-      <w:bookmarkStart w:id="11" w:name="_Toc243647338"/>
+      <w:bookmarkStart w:id="11" w:name="_Toc243651016"/>
       <w:r>
         <w:t>Part numbers and file names</w:t>
       </w:r>
@@ -5205,7 +5350,7 @@
       <w:pPr>
         <w:pStyle w:val="Heading2"/>
       </w:pPr>
-      <w:bookmarkStart w:id="12" w:name="_Toc243647339"/>
+      <w:bookmarkStart w:id="12" w:name="_Toc243651017"/>
       <w:r>
         <w:t>Projects</w:t>
       </w:r>
@@ -5443,7 +5588,7 @@
       <w:pPr>
         <w:pStyle w:val="Heading2"/>
       </w:pPr>
-      <w:bookmarkStart w:id="13" w:name="_Toc243647340"/>
+      <w:bookmarkStart w:id="13" w:name="_Toc243651018"/>
       <w:r>
         <w:t>Finding parts</w:t>
       </w:r>
@@ -5498,7 +5643,7 @@
       <w:pPr>
         <w:pStyle w:val="Heading2"/>
       </w:pPr>
-      <w:bookmarkStart w:id="14" w:name="_Toc243647341"/>
+      <w:bookmarkStart w:id="14" w:name="_Toc243651019"/>
       <w:r>
         <w:t>Checking out and checking in</w:t>
       </w:r>
@@ -5607,14 +5752,28 @@
     </w:p>
     <w:p>
       <w:r>
-        <w:t>When an assembly is checked in with SolidWorks open, Litterbox reads which parts it uses and how many of each. When a part is checked in with SolidWorks open, Litterbox reads its material. Without SolidWorks the check-in still works, and Litterbox marks these as needing an update (see Assemblies, references, and BOMs, and Materials).</w:t>
+        <w:t>When an assembly is checked in with SolidWorks open, Litterbox reads which parts it uses and how many of each, and which Toolbox parts and files from outside the vault it uses. When a part is checked in with SolidWorks open, Litterbox reads its material. Without SolidWorks the check-in still works, and Litterbox marks these as needing an update (see Assemblies, references, and BOMs, and Materials).</w:t>
+      </w:r>
+    </w:p>
+    <w:p>
+      <w:r>
+        <w:t xml:space="preserve">If the team has a </w:t>
+      </w:r>
+      <w:r>
+        <w:rPr>
+          <w:b/>
+        </w:rPr>
+        <w:t>Toolbox rule</w:t>
+      </w:r>
+      <w:r>
+        <w:t xml:space="preserve"> (see Toolbox parts), Check In refuses an assembly that breaks it, says which files are the problem, and leaves it checked out to you.</w:t>
       </w:r>
     </w:p>
     <w:p>
       <w:pPr>
         <w:pStyle w:val="Heading2"/>
       </w:pPr>
-      <w:bookmarkStart w:id="15" w:name="_Toc243647342"/>
+      <w:bookmarkStart w:id="15" w:name="_Toc243651020"/>
       <w:r>
         <w:t>Getting other people's changes</w:t>
       </w:r>
@@ -5644,7 +5803,7 @@
       <w:pPr>
         <w:pStyle w:val="Heading2"/>
       </w:pPr>
-      <w:bookmarkStart w:id="16" w:name="_Toc243647343"/>
+      <w:bookmarkStart w:id="16" w:name="_Toc243651021"/>
       <w:r>
         <w:t>Opening files</w:t>
       </w:r>
@@ -5703,8 +5862,9 @@
       <w:pPr>
         <w:pStyle w:val="Heading2"/>
       </w:pPr>
-      <w:bookmarkStart w:id="17" w:name="_Toc243647344"/>
-      <w:r>
+      <w:bookmarkStart w:id="17" w:name="_Toc243651022"/>
+      <w:r>
+        <w:lastRenderedPageBreak/>
         <w:t>The details pane</w:t>
       </w:r>
       <w:bookmarkEnd w:id="17"/>
@@ -5783,7 +5943,6 @@
               <w:rPr>
                 <w:sz w:val="20"/>
               </w:rPr>
-              <w:lastRenderedPageBreak/>
               <w:t>Details</w:t>
             </w:r>
           </w:p>
@@ -5976,7 +6135,7 @@
       <w:pPr>
         <w:pStyle w:val="Heading1"/>
       </w:pPr>
-      <w:bookmarkStart w:id="18" w:name="_Toc243647345"/>
+      <w:bookmarkStart w:id="18" w:name="_Toc243651023"/>
       <w:r>
         <w:lastRenderedPageBreak/>
         <w:t>Revisions and the lifecycle</w:t>
@@ -6346,7 +6505,7 @@
       <w:pPr>
         <w:pStyle w:val="Heading2"/>
       </w:pPr>
-      <w:bookmarkStart w:id="19" w:name="_Toc243647346"/>
+      <w:bookmarkStart w:id="19" w:name="_Toc243651024"/>
       <w:r>
         <w:t>Form, Fit, Function, and Dispo</w:t>
       </w:r>
@@ -6440,7 +6599,7 @@
       <w:pPr>
         <w:pStyle w:val="Heading1"/>
       </w:pPr>
-      <w:bookmarkStart w:id="20" w:name="_Toc243647347"/>
+      <w:bookmarkStart w:id="20" w:name="_Toc243651025"/>
       <w:r>
         <w:lastRenderedPageBreak/>
         <w:t>Assemblies, references, and BOMs</w:t>
@@ -6451,7 +6610,7 @@
       <w:pPr>
         <w:pStyle w:val="Heading2"/>
       </w:pPr>
-      <w:bookmarkStart w:id="21" w:name="_Toc243647348"/>
+      <w:bookmarkStart w:id="21" w:name="_Toc243651026"/>
       <w:r>
         <w:t>Uses and where used</w:t>
       </w:r>
@@ -6504,7 +6663,7 @@
       <w:pPr>
         <w:pStyle w:val="Heading2"/>
       </w:pPr>
-      <w:bookmarkStart w:id="22" w:name="_Toc243647349"/>
+      <w:bookmarkStart w:id="22" w:name="_Toc243651027"/>
       <w:r>
         <w:t>The BOM tab</w:t>
       </w:r>
@@ -6603,11 +6762,246 @@
       <w:pPr>
         <w:pStyle w:val="Heading2"/>
       </w:pPr>
-      <w:bookmarkStart w:id="23" w:name="_Toc243647350"/>
+      <w:bookmarkStart w:id="23" w:name="_Toc243651028"/>
+      <w:r>
+        <w:t>Toolbox parts</w:t>
+      </w:r>
+      <w:bookmarkEnd w:id="23"/>
+    </w:p>
+    <w:p>
+      <w:r>
+        <w:t xml:space="preserve">An Admin chooses the team's </w:t>
+      </w:r>
+      <w:r>
+        <w:rPr>
+          <w:b/>
+        </w:rPr>
+        <w:t>Toolbox rule</w:t>
+      </w:r>
+      <w:r>
+        <w:t xml:space="preserve"> in Team &gt; Vault Settings...:</w:t>
+      </w:r>
+    </w:p>
+    <w:tbl>
+      <w:tblPr>
+        <w:tblStyle w:val="TableGrid"/>
+        <w:tblW w:w="0" w:type="auto"/>
+        <w:jc w:val="center"/>
+        <w:tblLayout w:type="fixed"/>
+        <w:tblLook w:val="04A0" w:firstRow="1" w:lastRow="0" w:firstColumn="1" w:lastColumn="0" w:noHBand="0" w:noVBand="1"/>
+      </w:tblPr>
+      <w:tblGrid>
+        <w:gridCol w:w="2736"/>
+        <w:gridCol w:w="6624"/>
+      </w:tblGrid>
+      <w:tr>
+        <w:trPr>
+          <w:cantSplit/>
+          <w:tblHeader/>
+          <w:jc w:val="center"/>
+        </w:trPr>
+        <w:tc>
+          <w:tcPr>
+            <w:tcW w:w="2736" w:type="dxa"/>
+            <w:shd w:val="clear" w:color="auto" w:fill="1F5F8B"/>
+          </w:tcPr>
+          <w:p>
+            <w:pPr>
+              <w:spacing w:after="40"/>
+            </w:pPr>
+            <w:r>
+              <w:rPr>
+                <w:b/>
+                <w:color w:val="FFFFFF"/>
+                <w:sz w:val="20"/>
+              </w:rPr>
+              <w:t>Rule</w:t>
+            </w:r>
+          </w:p>
+        </w:tc>
+        <w:tc>
+          <w:tcPr>
+            <w:tcW w:w="6624" w:type="dxa"/>
+            <w:shd w:val="clear" w:color="auto" w:fill="1F5F8B"/>
+          </w:tcPr>
+          <w:p>
+            <w:pPr>
+              <w:spacing w:after="40"/>
+            </w:pPr>
+            <w:r>
+              <w:rPr>
+                <w:b/>
+                <w:color w:val="FFFFFF"/>
+                <w:sz w:val="20"/>
+              </w:rPr>
+              <w:t>An assembly may use</w:t>
+            </w:r>
+          </w:p>
+        </w:tc>
+      </w:tr>
+      <w:tr>
+        <w:trPr>
+          <w:cantSplit/>
+          <w:jc w:val="center"/>
+        </w:trPr>
+        <w:tc>
+          <w:tcPr>
+            <w:tcW w:w="2736" w:type="dxa"/>
+          </w:tcPr>
+          <w:p>
+            <w:pPr>
+              <w:spacing w:after="40"/>
+            </w:pPr>
+            <w:r>
+              <w:rPr>
+                <w:sz w:val="20"/>
+              </w:rPr>
+              <w:t>No Toolbox parts</w:t>
+            </w:r>
+          </w:p>
+        </w:tc>
+        <w:tc>
+          <w:tcPr>
+            <w:tcW w:w="6624" w:type="dxa"/>
+          </w:tcPr>
+          <w:p>
+            <w:pPr>
+              <w:spacing w:after="40"/>
+            </w:pPr>
+            <w:r>
+              <w:rPr>
+                <w:sz w:val="20"/>
+              </w:rPr>
+              <w:t>Only parts in the vault: no SolidWorks Toolbox parts, and no files from outside the vault. A new vault starts with this rule.</w:t>
+            </w:r>
+          </w:p>
+        </w:tc>
+      </w:tr>
+      <w:tr>
+        <w:trPr>
+          <w:cantSplit/>
+          <w:jc w:val="center"/>
+        </w:trPr>
+        <w:tc>
+          <w:tcPr>
+            <w:tcW w:w="2736" w:type="dxa"/>
+            <w:shd w:val="clear" w:color="auto" w:fill="EEF3F7"/>
+          </w:tcPr>
+          <w:p>
+            <w:pPr>
+              <w:spacing w:after="40"/>
+            </w:pPr>
+            <w:r>
+              <w:rPr>
+                <w:sz w:val="20"/>
+              </w:rPr>
+              <w:t>Only the team's Toolbox</w:t>
+            </w:r>
+          </w:p>
+        </w:tc>
+        <w:tc>
+          <w:tcPr>
+            <w:tcW w:w="6624" w:type="dxa"/>
+            <w:shd w:val="clear" w:color="auto" w:fill="EEF3F7"/>
+          </w:tcPr>
+          <w:p>
+            <w:pPr>
+              <w:spacing w:after="40"/>
+            </w:pPr>
+            <w:r>
+              <w:rPr>
+                <w:sz w:val="20"/>
+              </w:rPr>
+              <w:t>Toolbox parts from the team's Toolbox in the vault (see The team's Toolbox), and no other files from outside the vault.</w:t>
+            </w:r>
+          </w:p>
+        </w:tc>
+      </w:tr>
+      <w:tr>
+        <w:trPr>
+          <w:cantSplit/>
+          <w:jc w:val="center"/>
+        </w:trPr>
+        <w:tc>
+          <w:tcPr>
+            <w:tcW w:w="2736" w:type="dxa"/>
+          </w:tcPr>
+          <w:p>
+            <w:pPr>
+              <w:spacing w:after="40"/>
+            </w:pPr>
+            <w:r>
+              <w:rPr>
+                <w:sz w:val="20"/>
+              </w:rPr>
+              <w:t>Don't check</w:t>
+            </w:r>
+          </w:p>
+        </w:tc>
+        <w:tc>
+          <w:tcPr>
+            <w:tcW w:w="6624" w:type="dxa"/>
+          </w:tcPr>
+          <w:p>
+            <w:pPr>
+              <w:spacing w:after="40"/>
+            </w:pPr>
+            <w:r>
+              <w:rPr>
+                <w:sz w:val="20"/>
+              </w:rPr>
+              <w:t>Anything. Vaults made before Litterbox 0.6.0 start with this.</w:t>
+            </w:r>
+          </w:p>
+        </w:tc>
+      </w:tr>
+    </w:tbl>
+    <w:p>
+      <w:pPr>
+        <w:spacing w:after="40"/>
+      </w:pPr>
+    </w:p>
+    <w:p>
+      <w:r>
+        <w:t xml:space="preserve">Check In refuses an assembly that breaks the rule, and so does </w:t>
+      </w:r>
+      <w:r>
+        <w:rPr>
+          <w:b/>
+        </w:rPr>
+        <w:t>Release</w:t>
+      </w:r>
+      <w:r>
+        <w:t xml:space="preserve">, since a rule can be set after an assembly was checked in. An assembly checked in without SolidWorks open hasn't been looked at, so Release asks for </w:t>
+      </w:r>
+      <w:r>
+        <w:rPr>
+          <w:b/>
+        </w:rPr>
+        <w:t>Update BOM</w:t>
+      </w:r>
+      <w:r>
+        <w:t xml:space="preserve"> first (on the BOM tab), which reads it with SolidWorks.</w:t>
+      </w:r>
+    </w:p>
+    <w:p>
+      <w:r>
+        <w:t xml:space="preserve">SolidWorks takes every Toolbox part from the Toolbox folder it is set to use (Tools &gt; Options &gt; System Options &gt; Hole Wizard/Toolbox), whatever folder the assembly was saved with. So with Only </w:t>
+      </w:r>
+      <w:r>
+        <w:lastRenderedPageBreak/>
+        <w:t>the team's Toolbox, set SolidWorks to the team's folder once on each computer. Litterbox says so after the first refresh if it isn't.</w:t>
+      </w:r>
+    </w:p>
+    <w:p>
+      <w:pPr>
+        <w:pStyle w:val="Heading2"/>
+      </w:pPr>
+      <w:bookmarkStart w:id="24" w:name="_Toc243651029"/>
       <w:r>
         <w:t>Non-CAD parts and kits</w:t>
       </w:r>
-      <w:bookmarkEnd w:id="23"/>
+      <w:bookmarkEnd w:id="24"/>
     </w:p>
     <w:p>
       <w:r>
@@ -6673,22 +7067,22 @@
       <w:pPr>
         <w:pStyle w:val="Heading1"/>
       </w:pPr>
-      <w:bookmarkStart w:id="24" w:name="_Toc243647351"/>
+      <w:bookmarkStart w:id="25" w:name="_Toc243651030"/>
       <w:r>
         <w:lastRenderedPageBreak/>
         <w:t>Purchasing, costs, and materials</w:t>
       </w:r>
-      <w:bookmarkEnd w:id="24"/>
+      <w:bookmarkEnd w:id="25"/>
     </w:p>
     <w:p>
       <w:pPr>
         <w:pStyle w:val="Heading2"/>
       </w:pPr>
-      <w:bookmarkStart w:id="25" w:name="_Toc243647352"/>
+      <w:bookmarkStart w:id="26" w:name="_Toc243651031"/>
       <w:r>
         <w:t>Purchasing info</w:t>
       </w:r>
-      <w:bookmarkEnd w:id="25"/>
+      <w:bookmarkEnd w:id="26"/>
     </w:p>
     <w:p>
       <w:r>
@@ -6722,11 +7116,11 @@
       <w:pPr>
         <w:pStyle w:val="Heading2"/>
       </w:pPr>
-      <w:bookmarkStart w:id="26" w:name="_Toc243647353"/>
+      <w:bookmarkStart w:id="27" w:name="_Toc243651032"/>
       <w:r>
         <w:t>Materials</w:t>
       </w:r>
-      <w:bookmarkEnd w:id="26"/>
+      <w:bookmarkEnd w:id="27"/>
     </w:p>
     <w:p>
       <w:r>
@@ -6760,22 +7154,22 @@
       <w:pPr>
         <w:pStyle w:val="Heading1"/>
       </w:pPr>
-      <w:bookmarkStart w:id="27" w:name="_Toc243647354"/>
+      <w:bookmarkStart w:id="28" w:name="_Toc243651033"/>
       <w:r>
         <w:lastRenderedPageBreak/>
         <w:t>Release outputs and exports</w:t>
       </w:r>
-      <w:bookmarkEnd w:id="27"/>
+      <w:bookmarkEnd w:id="28"/>
     </w:p>
     <w:p>
       <w:pPr>
         <w:pStyle w:val="Heading2"/>
       </w:pPr>
-      <w:bookmarkStart w:id="28" w:name="_Toc243647355"/>
+      <w:bookmarkStart w:id="29" w:name="_Toc243651034"/>
       <w:r>
         <w:t>STEP and PDF files</w:t>
       </w:r>
-      <w:bookmarkEnd w:id="28"/>
+      <w:bookmarkEnd w:id="29"/>
     </w:p>
     <w:p>
       <w:pPr>
@@ -6832,11 +7226,11 @@
       <w:pPr>
         <w:pStyle w:val="Heading2"/>
       </w:pPr>
-      <w:bookmarkStart w:id="29" w:name="_Toc243647356"/>
+      <w:bookmarkStart w:id="30" w:name="_Toc243651035"/>
       <w:r>
         <w:t>Exporting</w:t>
       </w:r>
-      <w:bookmarkEnd w:id="29"/>
+      <w:bookmarkEnd w:id="30"/>
     </w:p>
     <w:p>
       <w:r>
@@ -6861,12 +7255,12 @@
       <w:pPr>
         <w:pStyle w:val="Heading1"/>
       </w:pPr>
-      <w:bookmarkStart w:id="30" w:name="_Toc243647357"/>
+      <w:bookmarkStart w:id="31" w:name="_Toc243651036"/>
       <w:r>
         <w:lastRenderedPageBreak/>
         <w:t>Documents</w:t>
       </w:r>
-      <w:bookmarkEnd w:id="30"/>
+      <w:bookmarkEnd w:id="31"/>
     </w:p>
     <w:p>
       <w:r>
@@ -6966,22 +7360,22 @@
       <w:pPr>
         <w:pStyle w:val="Heading1"/>
       </w:pPr>
-      <w:bookmarkStart w:id="31" w:name="_Toc243647358"/>
+      <w:bookmarkStart w:id="32" w:name="_Toc243651037"/>
       <w:r>
         <w:lastRenderedPageBreak/>
         <w:t>Sign-off workflows and ECOs</w:t>
       </w:r>
-      <w:bookmarkEnd w:id="31"/>
+      <w:bookmarkEnd w:id="32"/>
     </w:p>
     <w:p>
       <w:pPr>
         <w:pStyle w:val="Heading2"/>
       </w:pPr>
-      <w:bookmarkStart w:id="32" w:name="_Toc243647359"/>
+      <w:bookmarkStart w:id="33" w:name="_Toc243651038"/>
       <w:r>
         <w:t>How workflows work</w:t>
       </w:r>
-      <w:bookmarkEnd w:id="32"/>
+      <w:bookmarkEnd w:id="33"/>
     </w:p>
     <w:p>
       <w:r>
@@ -7033,11 +7427,11 @@
       <w:pPr>
         <w:pStyle w:val="Heading2"/>
       </w:pPr>
-      <w:bookmarkStart w:id="33" w:name="_Toc243647360"/>
+      <w:bookmarkStart w:id="34" w:name="_Toc243651039"/>
       <w:r>
         <w:t>Asking for sign-off</w:t>
       </w:r>
-      <w:bookmarkEnd w:id="33"/>
+      <w:bookmarkEnd w:id="34"/>
     </w:p>
     <w:p>
       <w:pPr>
@@ -7194,11 +7588,11 @@
       <w:pPr>
         <w:pStyle w:val="Heading2"/>
       </w:pPr>
-      <w:bookmarkStart w:id="34" w:name="_Toc243647361"/>
+      <w:bookmarkStart w:id="35" w:name="_Toc243651040"/>
       <w:r>
         <w:t>Reviewing a request</w:t>
       </w:r>
-      <w:bookmarkEnd w:id="34"/>
+      <w:bookmarkEnd w:id="35"/>
     </w:p>
     <w:p>
       <w:r>
@@ -7496,11 +7890,11 @@
       <w:pPr>
         <w:pStyle w:val="Heading2"/>
       </w:pPr>
-      <w:bookmarkStart w:id="35" w:name="_Toc243647362"/>
+      <w:bookmarkStart w:id="36" w:name="_Toc243651041"/>
       <w:r>
         <w:t>Rejected requests</w:t>
       </w:r>
-      <w:bookmarkEnd w:id="35"/>
+      <w:bookmarkEnd w:id="36"/>
     </w:p>
     <w:p>
       <w:r>
@@ -7569,11 +7963,11 @@
       <w:pPr>
         <w:pStyle w:val="Heading2"/>
       </w:pPr>
-      <w:bookmarkStart w:id="36" w:name="_Toc243647363"/>
+      <w:bookmarkStart w:id="37" w:name="_Toc243651042"/>
       <w:r>
         <w:t>Engineering change orders</w:t>
       </w:r>
-      <w:bookmarkEnd w:id="36"/>
+      <w:bookmarkEnd w:id="37"/>
     </w:p>
     <w:p>
       <w:r>
@@ -7621,12 +8015,12 @@
       <w:pPr>
         <w:pStyle w:val="Heading1"/>
       </w:pPr>
-      <w:bookmarkStart w:id="37" w:name="_Toc243647364"/>
+      <w:bookmarkStart w:id="38" w:name="_Toc243651043"/>
       <w:r>
         <w:lastRenderedPageBreak/>
         <w:t>Running the team</w:t>
       </w:r>
-      <w:bookmarkEnd w:id="37"/>
+      <w:bookmarkEnd w:id="38"/>
     </w:p>
     <w:p>
       <w:r>
@@ -7646,11 +8040,11 @@
       <w:pPr>
         <w:pStyle w:val="Heading2"/>
       </w:pPr>
-      <w:bookmarkStart w:id="38" w:name="_Toc243647365"/>
+      <w:bookmarkStart w:id="39" w:name="_Toc243651044"/>
       <w:r>
         <w:t>People and access</w:t>
       </w:r>
-      <w:bookmarkEnd w:id="38"/>
+      <w:bookmarkEnd w:id="39"/>
     </w:p>
     <w:tbl>
       <w:tblPr>
@@ -7782,7 +8176,7 @@
               <w:rPr>
                 <w:sz w:val="20"/>
               </w:rPr>
-              <w:t>Manage people, roles, workflows, projects, document types, and vault settings; override workflows; break a checkout; remake released STEP/PDF files; link documents to released parts. Admins can work in every project, restricted or hidden.</w:t>
+              <w:t>Manage people, roles, workflows, projects, document types, the team's Toolbox, and vault settings; override workflows; break a checkout; remake released STEP/PDF files; link documents to released parts. Admins can work in every project, restricted or hidden.</w:t>
             </w:r>
           </w:p>
         </w:tc>
@@ -7912,11 +8306,11 @@
       <w:pPr>
         <w:pStyle w:val="Heading2"/>
       </w:pPr>
-      <w:bookmarkStart w:id="39" w:name="_Toc243647366"/>
+      <w:bookmarkStart w:id="40" w:name="_Toc243651045"/>
       <w:r>
         <w:t>Vault settings</w:t>
       </w:r>
-      <w:bookmarkEnd w:id="39"/>
+      <w:bookmarkEnd w:id="40"/>
     </w:p>
     <w:tbl>
       <w:tblPr>
@@ -8247,6 +8641,46 @@
           </w:p>
         </w:tc>
       </w:tr>
+      <w:tr>
+        <w:trPr>
+          <w:cantSplit/>
+          <w:jc w:val="center"/>
+        </w:trPr>
+        <w:tc>
+          <w:tcPr>
+            <w:tcW w:w="2592" w:type="dxa"/>
+            <w:shd w:val="clear" w:color="auto" w:fill="EEF3F7"/>
+          </w:tcPr>
+          <w:p>
+            <w:pPr>
+              <w:spacing w:after="40"/>
+            </w:pPr>
+            <w:r>
+              <w:rPr>
+                <w:sz w:val="20"/>
+              </w:rPr>
+              <w:t>SolidWorks Toolbox parts</w:t>
+            </w:r>
+          </w:p>
+        </w:tc>
+        <w:tc>
+          <w:tcPr>
+            <w:tcW w:w="6768" w:type="dxa"/>
+            <w:shd w:val="clear" w:color="auto" w:fill="EEF3F7"/>
+          </w:tcPr>
+          <w:p>
+            <w:pPr>
+              <w:spacing w:after="40"/>
+            </w:pPr>
+            <w:r>
+              <w:rPr>
+                <w:sz w:val="20"/>
+              </w:rPr>
+              <w:t>The Toolbox rule (see Toolbox parts). Setting one makes everyone need Litterbox 0.6.0 or newer.</w:t>
+            </w:r>
+          </w:p>
+        </w:tc>
+      </w:tr>
     </w:tbl>
     <w:p>
       <w:pPr>
@@ -8257,91 +8691,43 @@
       <w:pPr>
         <w:pStyle w:val="Heading2"/>
       </w:pPr>
-      <w:bookmarkStart w:id="40" w:name="_Toc243647367"/>
-      <w:r>
-        <w:t>Vault maintenance</w:t>
-      </w:r>
-      <w:bookmarkEnd w:id="40"/>
-    </w:p>
-    <w:p>
-      <w:pPr>
-        <w:pStyle w:val="ListBullet"/>
-      </w:pPr>
+      <w:bookmarkStart w:id="41" w:name="_Toc243651046"/>
+      <w:r>
+        <w:lastRenderedPageBreak/>
+        <w:t>The team's Toolbox</w:t>
+      </w:r>
+      <w:bookmarkEnd w:id="41"/>
+    </w:p>
+    <w:p>
+      <w:r>
+        <w:t xml:space="preserve">With the rule Only the team's Toolbox, the team shares one copy of the SolidWorks Toolbox, kept in the vault's </w:t>
+      </w:r>
       <w:r>
         <w:rPr>
           <w:b/>
         </w:rPr>
-        <w:t>Vault &gt; Update file rules...</w:t>
-      </w:r>
-      <w:r>
-        <w:t xml:space="preserve"> appears when Litterbox has newer rules for which files Git LFS stores and locks. An Admin is asked once per session. The update changes only Litterbox's own lines.</w:t>
-      </w:r>
-    </w:p>
-    <w:p>
-      <w:pPr>
-        <w:pStyle w:val="ListBullet"/>
-      </w:pPr>
+        <w:t>toolbox</w:t>
+      </w:r>
+      <w:r>
+        <w:t xml:space="preserve"> folder (C:\Litterbox\&lt;vault&gt;\toolbox). Team &gt; </w:t>
+      </w:r>
       <w:r>
         <w:rPr>
           <w:b/>
         </w:rPr>
-        <w:lastRenderedPageBreak/>
-        <w:t>Vault &gt; Upgrade records...</w:t>
-      </w:r>
-      <w:r>
-        <w:t xml:space="preserve"> appears when an update of Litterbox keeps part records in a new format. Until an Admin upgrades the vault, nobody on the new version can change anything, so an Admin is asked once per session. Upgrading makes everyone update Litterbox, and rewrites every record in one upload. Parts checked out at the time are upgraded when they are checked in.</w:t>
-      </w:r>
-    </w:p>
-    <w:p>
-      <w:pPr>
-        <w:pStyle w:val="ListBullet"/>
-      </w:pPr>
+        <w:t>Toolbox...</w:t>
+      </w:r>
+      <w:r>
+        <w:t xml:space="preserve"> shows it: how many files it has, how many are downloaded on your computer, and whether your SolidWorks uses it. Everyone can open it and press </w:t>
+      </w:r>
       <w:r>
         <w:rPr>
           <w:b/>
         </w:rPr>
-        <w:t>Vault &gt; Vault Size...</w:t>
-      </w:r>
-      <w:r>
-        <w:t xml:space="preserve"> shows how much the vault uses on the host (its history and every version of every Git LFS file) and how much is downloaded on your computer.</w:t>
-      </w:r>
-    </w:p>
-    <w:p>
-      <w:pPr>
-        <w:pStyle w:val="ListBullet"/>
-      </w:pPr>
-      <w:r>
-        <w:t>Some features raise the oldest Litterbox version the vault accepts (workflows, projects, documents, and others). Litterbox tells anyone on an older version to update before they upload anything.</w:t>
-      </w:r>
-    </w:p>
-    <w:p>
-      <w:r>
-        <w:br w:type="page"/>
-      </w:r>
-    </w:p>
-    <w:p>
-      <w:pPr>
-        <w:pStyle w:val="Heading1"/>
-      </w:pPr>
-      <w:bookmarkStart w:id="41" w:name="_Toc243647368"/>
-      <w:r>
-        <w:lastRenderedPageBreak/>
-        <w:t>Importing existing CAD</w:t>
-      </w:r>
-      <w:bookmarkEnd w:id="41"/>
-    </w:p>
-    <w:p>
-      <w:r>
-        <w:t xml:space="preserve">Create &gt; </w:t>
-      </w:r>
-      <w:r>
-        <w:rPr>
-          <w:b/>
-        </w:rPr>
-        <w:t>Import...</w:t>
-      </w:r>
-      <w:r>
-        <w:t xml:space="preserve"> brings a folder of SolidWorks files into the vault. It gives each part a number and renames the files to match, updating their references so assemblies still find their parts.</w:t>
+        <w:t>Download</w:t>
+      </w:r>
+      <w:r>
+        <w:t>. Only Admins and the Owner can change it:</w:t>
       </w:r>
     </w:p>
     <w:p>
@@ -8353,7 +8739,13 @@
         </w:numPr>
       </w:pPr>
       <w:r>
-        <w:t>Choose the folders to import, or a saved scan. Litterbox scans them with SolidWorks to find the parts, assemblies, and drawings, what each assembly uses, and which files the vault already has.</w:t>
+        <w:rPr>
+          <w:b/>
+        </w:rPr>
+        <w:t>Copy in a Toolbox folder...</w:t>
+      </w:r>
+      <w:r>
+        <w:t xml:space="preserve"> makes the team's Toolbox a copy of a Toolbox folder (C:\SOLIDWORKS Data, say) and uploads it. A whole Toolbox is several hundred MB, so this takes a while. Copying in again replaces it.</w:t>
       </w:r>
     </w:p>
     <w:p>
@@ -8365,7 +8757,7 @@
         </w:numPr>
       </w:pPr>
       <w:r>
-        <w:t>Review the table. Each item has a proposed part number, which you can change, and a name. Choose a project (only projects you can use are offered), or import a family under one base number. Untick anything you don't want.</w:t>
+        <w:t>Everyone sets SolidWorks to use the team's folder (Tools &gt; Options &gt; System Options &gt; Hole Wizard/Toolbox).</w:t>
       </w:r>
     </w:p>
     <w:p>
@@ -8374,6 +8766,155 @@
         <w:numPr>
           <w:ilvl w:val="0"/>
           <w:numId w:val="16"/>
+        </w:numPr>
+      </w:pPr>
+      <w:r>
+        <w:t xml:space="preserve">To add sizes or change Toolbox's settings, press </w:t>
+      </w:r>
+      <w:r>
+        <w:rPr>
+          <w:b/>
+        </w:rPr>
+        <w:t>Let me change it</w:t>
+      </w:r>
+      <w:r>
+        <w:t xml:space="preserve">, make the changes in SolidWorks, then press </w:t>
+      </w:r>
+      <w:r>
+        <w:rPr>
+          <w:b/>
+        </w:rPr>
+        <w:t>Upload changes</w:t>
+      </w:r>
+      <w:r>
+        <w:t>. Set Toolbox to make a file for each size (Toolbox Settings &gt; User Settings &gt; Create Parts), so a new size is a new file rather than a change to a shared one.</w:t>
+      </w:r>
+    </w:p>
+    <w:p>
+      <w:r>
+        <w:t>The team's Toolbox is read-only on everyone's computer, and Litterbox refuses to upload a change to it from anyone but an Admin or the Owner. An assembly can't be checked in with a Toolbox part that is on your computer but not uploaded to the team's Toolbox yet.</w:t>
+      </w:r>
+    </w:p>
+    <w:p>
+      <w:pPr>
+        <w:pStyle w:val="Heading2"/>
+      </w:pPr>
+      <w:bookmarkStart w:id="42" w:name="_Toc243651047"/>
+      <w:r>
+        <w:t>Vault maintenance</w:t>
+      </w:r>
+      <w:bookmarkEnd w:id="42"/>
+    </w:p>
+    <w:p>
+      <w:pPr>
+        <w:pStyle w:val="ListBullet"/>
+      </w:pPr>
+      <w:r>
+        <w:rPr>
+          <w:b/>
+        </w:rPr>
+        <w:t>Vault &gt; Update file rules...</w:t>
+      </w:r>
+      <w:r>
+        <w:t xml:space="preserve"> appears when Litterbox has newer rules for which files Git LFS stores and locks. An Admin is asked once per session. The update changes only Litterbox's own lines.</w:t>
+      </w:r>
+    </w:p>
+    <w:p>
+      <w:pPr>
+        <w:pStyle w:val="ListBullet"/>
+      </w:pPr>
+      <w:r>
+        <w:rPr>
+          <w:b/>
+        </w:rPr>
+        <w:t>Vault &gt; Upgrade records...</w:t>
+      </w:r>
+      <w:r>
+        <w:t xml:space="preserve"> appears when an update of Litterbox keeps part records in a new format. Until an Admin upgrades the vault, nobody on the new version can change anything, so an Admin is asked once per session. Upgrading makes everyone update Litterbox, and rewrites every record in one upload. Parts checked out at the time are upgraded when they are checked in.</w:t>
+      </w:r>
+    </w:p>
+    <w:p>
+      <w:pPr>
+        <w:pStyle w:val="ListBullet"/>
+      </w:pPr>
+      <w:r>
+        <w:rPr>
+          <w:b/>
+        </w:rPr>
+        <w:t>Vault &gt; Vault Size...</w:t>
+      </w:r>
+      <w:r>
+        <w:t xml:space="preserve"> shows how much the vault uses on the host (its history and every version of every Git LFS file) and how much is downloaded on your computer.</w:t>
+      </w:r>
+    </w:p>
+    <w:p>
+      <w:pPr>
+        <w:pStyle w:val="ListBullet"/>
+      </w:pPr>
+      <w:r>
+        <w:t>Some features raise the oldest Litterbox version the vault accepts (workflows, projects, documents, the Toolbox rule, and others). Litterbox tells anyone on an older version to update before they upload anything.</w:t>
+      </w:r>
+    </w:p>
+    <w:p>
+      <w:r>
+        <w:br w:type="page"/>
+      </w:r>
+    </w:p>
+    <w:p>
+      <w:pPr>
+        <w:pStyle w:val="Heading1"/>
+      </w:pPr>
+      <w:bookmarkStart w:id="43" w:name="_Toc243651048"/>
+      <w:r>
+        <w:lastRenderedPageBreak/>
+        <w:t>Importing existing CAD</w:t>
+      </w:r>
+      <w:bookmarkEnd w:id="43"/>
+    </w:p>
+    <w:p>
+      <w:r>
+        <w:t xml:space="preserve">Create &gt; </w:t>
+      </w:r>
+      <w:r>
+        <w:rPr>
+          <w:b/>
+        </w:rPr>
+        <w:t>Import...</w:t>
+      </w:r>
+      <w:r>
+        <w:t xml:space="preserve"> brings a folder of SolidWorks files into the vault. It gives each part a number and renames the files to match, updating their references so assemblies still find their parts.</w:t>
+      </w:r>
+    </w:p>
+    <w:p>
+      <w:pPr>
+        <w:pStyle w:val="ListNumber"/>
+        <w:numPr>
+          <w:ilvl w:val="0"/>
+          <w:numId w:val="17"/>
+        </w:numPr>
+      </w:pPr>
+      <w:r>
+        <w:t>Choose the folders to import, or a saved scan. Litterbox scans them with SolidWorks to find the parts, assemblies, and drawings, what each assembly uses, and which files the vault already has.</w:t>
+      </w:r>
+    </w:p>
+    <w:p>
+      <w:pPr>
+        <w:pStyle w:val="ListNumber"/>
+        <w:numPr>
+          <w:ilvl w:val="0"/>
+          <w:numId w:val="17"/>
+        </w:numPr>
+      </w:pPr>
+      <w:r>
+        <w:t>Review the table. Each item has a proposed part number, which you can change, and a name. Choose a project (only projects you can use are offered), or import a family under one base number. Untick anything you don't want.</w:t>
+      </w:r>
+    </w:p>
+    <w:p>
+      <w:pPr>
+        <w:pStyle w:val="ListNumber"/>
+        <w:numPr>
+          <w:ilvl w:val="0"/>
+          <w:numId w:val="17"/>
         </w:numPr>
       </w:pPr>
       <w:r>
@@ -8419,16 +8960,16 @@
       <w:pPr>
         <w:pStyle w:val="Heading1"/>
       </w:pPr>
-      <w:bookmarkStart w:id="42" w:name="_Toc243647369"/>
+      <w:bookmarkStart w:id="44" w:name="_Toc243651049"/>
       <w:r>
         <w:lastRenderedPageBreak/>
         <w:t>Working with SolidWorks</w:t>
       </w:r>
-      <w:bookmarkEnd w:id="42"/>
-    </w:p>
-    <w:p>
-      <w:r>
-        <w:t>Litterbox uses the SolidWorks API to read references, count parts, read materials, copy files at Revise and Import, and make STEP and PDF files.</w:t>
+      <w:bookmarkEnd w:id="44"/>
+    </w:p>
+    <w:p>
+      <w:r>
+        <w:t>Litterbox uses the SolidWorks API to read references, count parts, find Toolbox parts, read materials, copy files at Revise and Import, and make STEP and PDF files.</w:t>
       </w:r>
     </w:p>
     <w:p>
@@ -8461,7 +9002,7 @@
         <w:pStyle w:val="ListBullet"/>
       </w:pPr>
       <w:r>
-        <w:t>Litterbox reads your installed SolidWorks version from Windows, without starting it, for the org's version check.</w:t>
+        <w:t>Litterbox reads your installed SolidWorks version and its Toolbox folder from Windows, without starting it, for the org's version check and the Toolbox rule.</w:t>
       </w:r>
     </w:p>
     <w:p>
@@ -8500,22 +9041,22 @@
       <w:pPr>
         <w:pStyle w:val="Heading1"/>
       </w:pPr>
-      <w:bookmarkStart w:id="43" w:name="_Toc243647370"/>
+      <w:bookmarkStart w:id="45" w:name="_Toc243651050"/>
       <w:r>
         <w:lastRenderedPageBreak/>
         <w:t>Settings and troubleshooting</w:t>
       </w:r>
-      <w:bookmarkEnd w:id="43"/>
+      <w:bookmarkEnd w:id="45"/>
     </w:p>
     <w:p>
       <w:pPr>
         <w:pStyle w:val="Heading2"/>
       </w:pPr>
-      <w:bookmarkStart w:id="44" w:name="_Toc243647371"/>
+      <w:bookmarkStart w:id="46" w:name="_Toc243651051"/>
       <w:r>
         <w:t>Your settings</w:t>
       </w:r>
-      <w:bookmarkEnd w:id="44"/>
+      <w:bookmarkEnd w:id="46"/>
     </w:p>
     <w:p>
       <w:r>
@@ -8837,11 +9378,11 @@
       <w:pPr>
         <w:pStyle w:val="Heading2"/>
       </w:pPr>
-      <w:bookmarkStart w:id="45" w:name="_Toc243647372"/>
+      <w:bookmarkStart w:id="47" w:name="_Toc243651052"/>
       <w:r>
         <w:t>Problems</w:t>
       </w:r>
-      <w:bookmarkEnd w:id="45"/>
+      <w:bookmarkEnd w:id="47"/>
     </w:p>
     <w:p>
       <w:pPr>
@@ -8905,11 +9446,11 @@
       <w:pPr>
         <w:pStyle w:val="Heading2"/>
       </w:pPr>
-      <w:bookmarkStart w:id="46" w:name="_Toc243647373"/>
+      <w:bookmarkStart w:id="48" w:name="_Toc243651053"/>
       <w:r>
         <w:t>The command line</w:t>
       </w:r>
-      <w:bookmarkEnd w:id="46"/>
+      <w:bookmarkEnd w:id="48"/>
     </w:p>
     <w:p>
       <w:r>
@@ -8945,12 +9486,12 @@
       <w:pPr>
         <w:pStyle w:val="Heading1"/>
       </w:pPr>
-      <w:bookmarkStart w:id="47" w:name="_Toc243647374"/>
+      <w:bookmarkStart w:id="49" w:name="_Toc243651054"/>
       <w:r>
         <w:lastRenderedPageBreak/>
         <w:t>Quick reference</w:t>
       </w:r>
-      <w:bookmarkEnd w:id="47"/>
+      <w:bookmarkEnd w:id="49"/>
     </w:p>
     <w:tbl>
       <w:tblPr>
@@ -9571,70 +10112,76 @@
       </w:rPr>
     </w:lvl>
   </w:abstractNum>
-  <w:num w:numId="1" w16cid:durableId="82117508">
+  <w:num w:numId="1" w16cid:durableId="1122655859">
     <w:abstractNumId w:val="8"/>
   </w:num>
-  <w:num w:numId="2" w16cid:durableId="307443746">
+  <w:num w:numId="2" w16cid:durableId="1943688454">
     <w:abstractNumId w:val="6"/>
   </w:num>
-  <w:num w:numId="3" w16cid:durableId="1160776278">
+  <w:num w:numId="3" w16cid:durableId="1905796317">
     <w:abstractNumId w:val="5"/>
   </w:num>
-  <w:num w:numId="4" w16cid:durableId="1441300096">
+  <w:num w:numId="4" w16cid:durableId="874582183">
     <w:abstractNumId w:val="4"/>
   </w:num>
-  <w:num w:numId="5" w16cid:durableId="225410854">
+  <w:num w:numId="5" w16cid:durableId="1537234259">
     <w:abstractNumId w:val="7"/>
   </w:num>
-  <w:num w:numId="6" w16cid:durableId="1753309861">
+  <w:num w:numId="6" w16cid:durableId="1539775369">
     <w:abstractNumId w:val="3"/>
   </w:num>
-  <w:num w:numId="7" w16cid:durableId="1857379785">
+  <w:num w:numId="7" w16cid:durableId="1270820099">
     <w:abstractNumId w:val="2"/>
   </w:num>
-  <w:num w:numId="8" w16cid:durableId="642388066">
+  <w:num w:numId="8" w16cid:durableId="697972183">
     <w:abstractNumId w:val="1"/>
   </w:num>
-  <w:num w:numId="9" w16cid:durableId="831944286">
+  <w:num w:numId="9" w16cid:durableId="184177163">
     <w:abstractNumId w:val="0"/>
   </w:num>
-  <w:num w:numId="10" w16cid:durableId="965308186">
+  <w:num w:numId="10" w16cid:durableId="871309886">
     <w:abstractNumId w:val="7"/>
     <w:lvlOverride w:ilvl="0">
       <w:startOverride w:val="1"/>
     </w:lvlOverride>
   </w:num>
-  <w:num w:numId="11" w16cid:durableId="452597324">
+  <w:num w:numId="11" w16cid:durableId="171266768">
     <w:abstractNumId w:val="7"/>
     <w:lvlOverride w:ilvl="0">
       <w:startOverride w:val="1"/>
     </w:lvlOverride>
   </w:num>
-  <w:num w:numId="12" w16cid:durableId="1399094072">
+  <w:num w:numId="12" w16cid:durableId="572741547">
     <w:abstractNumId w:val="7"/>
     <w:lvlOverride w:ilvl="0">
       <w:startOverride w:val="1"/>
     </w:lvlOverride>
   </w:num>
-  <w:num w:numId="13" w16cid:durableId="181433683">
+  <w:num w:numId="13" w16cid:durableId="967710101">
     <w:abstractNumId w:val="7"/>
     <w:lvlOverride w:ilvl="0">
       <w:startOverride w:val="1"/>
     </w:lvlOverride>
   </w:num>
-  <w:num w:numId="14" w16cid:durableId="1075318410">
+  <w:num w:numId="14" w16cid:durableId="1409306911">
     <w:abstractNumId w:val="7"/>
     <w:lvlOverride w:ilvl="0">
       <w:startOverride w:val="1"/>
     </w:lvlOverride>
   </w:num>
-  <w:num w:numId="15" w16cid:durableId="1524242026">
+  <w:num w:numId="15" w16cid:durableId="1045300489">
     <w:abstractNumId w:val="7"/>
     <w:lvlOverride w:ilvl="0">
       <w:startOverride w:val="1"/>
     </w:lvlOverride>
   </w:num>
-  <w:num w:numId="16" w16cid:durableId="1857815622">
+  <w:num w:numId="16" w16cid:durableId="483202469">
+    <w:abstractNumId w:val="7"/>
+    <w:lvlOverride w:ilvl="0">
+      <w:startOverride w:val="1"/>
+    </w:lvlOverride>
+  </w:num>
+  <w:num w:numId="17" w16cid:durableId="1492795313">
     <w:abstractNumId w:val="7"/>
     <w:lvlOverride w:ilvl="0">
       <w:startOverride w:val="1"/>
@@ -21004,7 +21551,7 @@
     <w:autoRedefine/>
     <w:uiPriority w:val="39"/>
     <w:unhideWhenUsed/>
-    <w:rsid w:val="006703F7"/>
+    <w:rsid w:val="00B307C8"/>
     <w:pPr>
       <w:spacing w:after="100"/>
     </w:pPr>
@@ -21016,7 +21563,7 @@
     <w:autoRedefine/>
     <w:uiPriority w:val="39"/>
     <w:unhideWhenUsed/>
-    <w:rsid w:val="006703F7"/>
+    <w:rsid w:val="00B307C8"/>
     <w:pPr>
       <w:spacing w:after="100"/>
       <w:ind w:left="210"/>
@@ -21027,7 +21574,7 @@
     <w:basedOn w:val="DefaultParagraphFont"/>
     <w:uiPriority w:val="99"/>
     <w:unhideWhenUsed/>
-    <w:rsid w:val="006703F7"/>
+    <w:rsid w:val="00B307C8"/>
     <w:rPr>
       <w:color w:val="0000FF" w:themeColor="hyperlink"/>
       <w:u w:val="single"/>

</xml_diff>

<commit_message>
0.6.2: SolidWorks templates for new parts, assemblies and drawings
- The org's and each project's templates (.prtdot, .asmdot, .drwdot) in the vault's templates/
  folder, one default per kind and owner; a project's part gets its project's default, else the org's
- New Part / New Assembly: a Template box; Litterbox makes the model and opens it
- Create > New Model... and New Drawing... (an empty sheet) for a part checked out to you
- Team > Templates...: Admins and the Owner change the org's, a project's Lead its own;
  guarded_push refuses anyone else's template changes; a renamed project keeps its templates
- SolidWorks backend: new_from_template (tried in SolidWorks 2024)
- User guide: a Templates section with what to watch; version 0.6.2; handoff

Co-Authored-By: Claude Opus 5.5 <noreply@anthropic.com>
</commit_message>
<xml_diff>
--- a/docs/Litterbox_User_Guide.docx
+++ b/docs/Litterbox_User_Guide.docx
@@ -47,7 +47,7 @@
         <w:rPr>
           <w:color w:val="666666"/>
         </w:rPr>
-        <w:t>For Litterbox 0.6.1  ·  October 2026</w:t>
+        <w:t>For Litterbox 0.6.2  ·  October 2026</w:t>
       </w:r>
     </w:p>
     <w:p>
@@ -626,6 +626,43 @@
           </w:p>
         </w:tc>
       </w:tr>
+      <w:tr>
+        <w:trPr>
+          <w:cantSplit/>
+        </w:trPr>
+        <w:tc>
+          <w:tcPr>
+            <w:tcW w:type="dxa" w:w="2304"/>
+          </w:tcPr>
+          <w:p>
+            <w:pPr>
+              <w:spacing w:after="40"/>
+            </w:pPr>
+            <w:r>
+              <w:rPr>
+                <w:sz w:val="20"/>
+              </w:rPr>
+              <w:t>Template</w:t>
+            </w:r>
+          </w:p>
+        </w:tc>
+        <w:tc>
+          <w:tcPr>
+            <w:tcW w:type="dxa" w:w="7056"/>
+          </w:tcPr>
+          <w:p>
+            <w:pPr>
+              <w:spacing w:after="40"/>
+            </w:pPr>
+            <w:r>
+              <w:rPr>
+                <w:sz w:val="20"/>
+              </w:rPr>
+              <w:t>A SolidWorks file that new parts, assemblies, or drawings start from (.prtdot, .asmdot, .drwdot). The org has its own, a project can have more, and one of each kind is the default.</w:t>
+            </w:r>
+          </w:p>
+        </w:tc>
+      </w:tr>
     </w:tbl>
     <w:p>
       <w:pPr>
@@ -1882,7 +1919,16 @@
         </w:numPr>
       </w:pPr>
       <w:r>
-        <w:t>Litterbox creates the part's record, checks it out to you, and shows the file name its model must have (for example HCR‑100010‑001_A), with a Copy button.</w:t>
+        <w:t xml:space="preserve">Choose its </w:t>
+      </w:r>
+      <w:r>
+        <w:rPr>
+          <w:b/>
+        </w:rPr>
+        <w:t>Template</w:t>
+      </w:r>
+      <w:r>
+        <w:t>: the default is chosen for you (see Templates). Litterbox creates the part's record, checks it out to you, makes its model from the template under the right name (for example HCR‑100010‑001_A.SLDPRT), and opens it in SolidWorks.</w:t>
       </w:r>
     </w:p>
     <w:p>
@@ -1894,16 +1940,16 @@
         </w:numPr>
       </w:pPr>
       <w:r>
-        <w:t xml:space="preserve">In SolidWorks, model the part and </w:t>
+        <w:t xml:space="preserve">Model the part and save it. For a drawing, choose Create &gt; </w:t>
       </w:r>
       <w:r>
         <w:rPr>
           <w:b/>
         </w:rPr>
-        <w:t>Save As</w:t>
-      </w:r>
-      <w:r>
-        <w:t xml:space="preserve"> into the vault's cad folder (C:\Litterbox\&lt;vault&gt;\cad\) under that name. A drawing has the same name with .SLDDRW.</w:t>
+        <w:t>New Drawing...</w:t>
+      </w:r>
+      <w:r>
+        <w:t>: Litterbox makes HCR‑100010‑001_A.SLDDRW from the drawing template, as an empty sheet, and opens it.</w:t>
       </w:r>
     </w:p>
     <w:p>
@@ -1930,6 +1976,29 @@
     <w:p>
       <w:r>
         <w:t>Other people see the part after their next Get Latest.</w:t>
+      </w:r>
+    </w:p>
+    <w:p>
+      <w:r>
+        <w:t xml:space="preserve">With </w:t>
+      </w:r>
+      <w:r>
+        <w:rPr>
+          <w:b/>
+        </w:rPr>
+        <w:t>None</w:t>
+      </w:r>
+      <w:r>
+        <w:t xml:space="preserve"> as the template (or without SolidWorks on your computer), Litterbox instead shows the file name the model must have, with a Copy button: in SolidWorks, </w:t>
+      </w:r>
+      <w:r>
+        <w:rPr>
+          <w:b/>
+        </w:rPr>
+        <w:t>Save As</w:t>
+      </w:r>
+      <w:r>
+        <w:t xml:space="preserve"> into the vault's cad folder (C:\Litterbox\&lt;vault&gt;\cad\) under that name. A drawing has the same name with .SLDDRW.</w:t>
       </w:r>
     </w:p>
     <w:p>
@@ -5064,7 +5133,7 @@
               <w:rPr>
                 <w:sz w:val="20"/>
               </w:rPr>
-              <w:t>Manage people, roles, workflows, projects, document types, the team's Toolbox, and vault settings; override workflows; break a checkout; remake released STEP/PDF files; link documents to released parts. Admins can work in every project, restricted or hidden.</w:t>
+              <w:t>Manage people, roles, workflows, projects, document types, the team's Toolbox, templates, and vault settings; override workflows; break a checkout; remake released STEP/PDF files; link documents to released parts. Admins can work in every project, restricted or hidden.</w:t>
             </w:r>
           </w:p>
         </w:tc>
@@ -5101,7 +5170,7 @@
               <w:rPr>
                 <w:sz w:val="20"/>
               </w:rPr>
-              <w:t>Everyday work: create, check out, check in, release (subject to workflows), and sign off. A project's Lead can change that project.</w:t>
+              <w:t>Everyday work: create, check out, check in, release (subject to workflows), and sign off. A project's Lead can change that project and its templates.</w:t>
             </w:r>
           </w:p>
         </w:tc>
@@ -5865,7 +5934,7 @@
     </w:p>
     <w:p>
       <w:r>
-        <w:t>Litterbox uses the SolidWorks API to read references, count parts, find Toolbox parts, read materials, copy files at Revise and Import, and make STEP and PDF files.</w:t>
+        <w:t>Litterbox uses the SolidWorks API to read references, count parts, find Toolbox parts, read materials, copy files at Revise and Import, make new files from templates, and make STEP and PDF files.</w:t>
       </w:r>
     </w:p>
     <w:p>
@@ -5985,6 +6054,276 @@
       </w:r>
       <w:r>
         <w:t xml:space="preserve"> Litterbox says when a configuration that an assembly uses was deleted from a part (SolidWorks would show another configuration there), when a part's configurations have different materials (Litterbox keeps one material per revision: the configuration's the file was saved in), and when a part is linked to a design table or equations file outside it (Litterbox can't keep that file with the revisions; embed it instead). Update references says when the newer revision has lost a configuration an assembly uses.</w:t>
+      </w:r>
+    </w:p>
+    <w:p>
+      <w:pPr>
+        <w:pStyle w:val="Heading2"/>
+      </w:pPr>
+      <w:r>
+        <w:t>Templates</w:t>
+      </w:r>
+    </w:p>
+    <w:p>
+      <w:r>
+        <w:t xml:space="preserve">Litterbox makes a part's files from the team's SolidWorks </w:t>
+      </w:r>
+      <w:r>
+        <w:rPr>
+          <w:b/>
+        </w:rPr>
+        <w:t>templates</w:t>
+      </w:r>
+      <w:r>
+        <w:t>, so every part, assembly, and drawing starts with the same units, materials, drafting standard, and title block. There are three kinds: part templates (.prtdot), assembly templates (.asmdot), and drawing templates (.drwdot).</w:t>
+      </w:r>
+    </w:p>
+    <w:p>
+      <w:pPr>
+        <w:pStyle w:val="ListBullet"/>
+      </w:pPr>
+      <w:r>
+        <w:rPr>
+          <w:b/>
+        </w:rPr>
+        <w:t>The org's and each project's.</w:t>
+      </w:r>
+      <w:r>
+        <w:t xml:space="preserve"> The org has its own templates, and each project can have more. Among the org's templates of one kind, one is the </w:t>
+      </w:r>
+      <w:r>
+        <w:rPr>
+          <w:b/>
+        </w:rPr>
+        <w:t>default</w:t>
+      </w:r>
+      <w:r>
+        <w:t>, and the same among each project's. A part in a project gets its project's default if the project has templates of that kind, otherwise the org's default. Every other template of the project and the org can be chosen instead.</w:t>
+      </w:r>
+    </w:p>
+    <w:p>
+      <w:pPr>
+        <w:pStyle w:val="ListBullet"/>
+      </w:pPr>
+      <w:r>
+        <w:rPr>
+          <w:b/>
+        </w:rPr>
+        <w:t>New Part and New Assembly</w:t>
+      </w:r>
+      <w:r>
+        <w:t xml:space="preserve"> have a </w:t>
+      </w:r>
+      <w:r>
+        <w:rPr>
+          <w:b/>
+        </w:rPr>
+        <w:t>Template</w:t>
+      </w:r>
+      <w:r>
+        <w:t xml:space="preserve"> box, with the default chosen. Litterbox makes the model from it and opens it. Choose None to save the model yourself.</w:t>
+      </w:r>
+    </w:p>
+    <w:p>
+      <w:pPr>
+        <w:pStyle w:val="ListBullet"/>
+      </w:pPr>
+      <w:r>
+        <w:rPr>
+          <w:b/>
+        </w:rPr>
+        <w:t>Create &gt; New Model...</w:t>
+      </w:r>
+      <w:r>
+        <w:t xml:space="preserve"> makes the model of a part checked out to you that has none yet (one created with None, say), and </w:t>
+      </w:r>
+      <w:r>
+        <w:rPr>
+          <w:b/>
+        </w:rPr>
+        <w:t>Create &gt; New Drawing...</w:t>
+      </w:r>
+      <w:r>
+        <w:t xml:space="preserve"> makes the drawing of a part that has a model and no drawing. Both ask which template, with the default chosen. A new drawing is an </w:t>
+      </w:r>
+      <w:r>
+        <w:rPr>
+          <w:b/>
+        </w:rPr>
+        <w:t>empty sheet</w:t>
+      </w:r>
+      <w:r>
+        <w:t xml:space="preserve"> of the template's size, with its title block: add the views in SolidWorks.</w:t>
+      </w:r>
+    </w:p>
+    <w:p>
+      <w:pPr>
+        <w:pStyle w:val="ListBullet"/>
+      </w:pPr>
+      <w:r>
+        <w:t>The file is made in the cad folder under the part's name for its working revision, like a file you saved there, and goes up with your next Check In. Litterbox needs SolidWorks on your computer to make it (it starts SolidWorks in the background if it isn't running).</w:t>
+      </w:r>
+    </w:p>
+    <w:p>
+      <w:r>
+        <w:t xml:space="preserve">Team &gt; </w:t>
+      </w:r>
+      <w:r>
+        <w:rPr>
+          <w:b/>
+        </w:rPr>
+        <w:t>Templates...</w:t>
+      </w:r>
+      <w:r>
+        <w:t xml:space="preserve"> shows the org's templates and each project's. Everyone can look. Admins and the Owner change the org's; a project's Lead (and Admins, and the Owner) changes the project's:</w:t>
+      </w:r>
+    </w:p>
+    <w:p>
+      <w:pPr>
+        <w:pStyle w:val="ListBullet"/>
+      </w:pPr>
+      <w:r>
+        <w:rPr>
+          <w:b/>
+        </w:rPr>
+        <w:t>Add...</w:t>
+      </w:r>
+      <w:r>
+        <w:t xml:space="preserve"> copies a template file into the vault's </w:t>
+      </w:r>
+      <w:r>
+        <w:rPr>
+          <w:b/>
+        </w:rPr>
+        <w:t>templates</w:t>
+      </w:r>
+      <w:r>
+        <w:t xml:space="preserve"> folder and uploads it. The first template of a kind becomes the default. Every template in the vault needs its own file name, the org's and the projects' together, so give them clear names (HCR A size, Rover A3).</w:t>
+      </w:r>
+    </w:p>
+    <w:p>
+      <w:pPr>
+        <w:pStyle w:val="ListBullet"/>
+      </w:pPr>
+      <w:r>
+        <w:rPr>
+          <w:b/>
+        </w:rPr>
+        <w:t>Make Default</w:t>
+      </w:r>
+      <w:r>
+        <w:t xml:space="preserve"> makes the selected template the default of its kind.</w:t>
+      </w:r>
+    </w:p>
+    <w:p>
+      <w:pPr>
+        <w:pStyle w:val="ListBullet"/>
+      </w:pPr>
+      <w:r>
+        <w:rPr>
+          <w:b/>
+        </w:rPr>
+        <w:t>Remove...</w:t>
+      </w:r>
+      <w:r>
+        <w:t xml:space="preserve"> takes a template out of the vault. Files already made from it don't change. If it was the default, the next one by name becomes the default.</w:t>
+      </w:r>
+    </w:p>
+    <w:p>
+      <w:r>
+        <w:t>Litterbox refuses to upload a template change from anyone else. A renamed project keeps its templates.</w:t>
+      </w:r>
+    </w:p>
+    <w:p>
+      <w:pPr>
+        <w:pStyle w:val="Heading3"/>
+      </w:pPr>
+      <w:r>
+        <w:t>Things to watch</w:t>
+      </w:r>
+    </w:p>
+    <w:p>
+      <w:pPr>
+        <w:pStyle w:val="ListBullet"/>
+      </w:pPr>
+      <w:r>
+        <w:rPr>
+          <w:b/>
+        </w:rPr>
+        <w:t>Keep the sheet format in the drawing template.</w:t>
+      </w:r>
+      <w:r>
+        <w:t xml:space="preserve"> SolidWorks saves the sheet format (the border and title block) inside a drawing template, so a drawing made from it has the title block even on a computer without the sheet format's .slddrt file. The template also remembers where that .slddrt file was, and SolidWorks only looks there when someone reloads or changes the sheet format. Keep the team's .slddrt files where everyone has them at the same path.</w:t>
+      </w:r>
+    </w:p>
+    <w:p>
+      <w:pPr>
+        <w:pStyle w:val="ListBullet"/>
+      </w:pPr>
+      <w:r>
+        <w:rPr>
+          <w:b/>
+        </w:rPr>
+        <w:t>Save templates in the org's SolidWorks version, or older.</w:t>
+      </w:r>
+      <w:r>
+        <w:t xml:space="preserve"> A template saved in a newer SolidWorks can't be used by an older one; Litterbox says so when it can't make a file. When the org moves to a newer SolidWorks, the templates can stay as they are.</w:t>
+      </w:r>
+    </w:p>
+    <w:p>
+      <w:pPr>
+        <w:pStyle w:val="ListBullet"/>
+      </w:pPr>
+      <w:r>
+        <w:rPr>
+          <w:b/>
+        </w:rPr>
+        <w:t>Title blocks.</w:t>
+      </w:r>
+      <w:r>
+        <w:t xml:space="preserve"> Litterbox names each file after its part and revision (HCR‑100010‑001_A), and, with SolidWorks open at check-in, names a file's only configuration after the part's Name (see Configurations). A title block that shows the file name and the configuration name ($PRP:"SW-File Name" and $PRP:"SW-Configuration Name", or $PRPSHEET for the model on the sheet) therefore shows the part number, revision, and Name without anyone typing them. Litterbox doesn't write other properties into the files.</w:t>
+      </w:r>
+    </w:p>
+    <w:p>
+      <w:pPr>
+        <w:pStyle w:val="ListBullet"/>
+      </w:pPr>
+      <w:r>
+        <w:rPr>
+          <w:b/>
+        </w:rPr>
+        <w:t>Units, materials, and drafting standards come from the template.</w:t>
+      </w:r>
+      <w:r>
+        <w:t xml:space="preserve"> Set them in the template, not part by part, so new parts agree.</w:t>
+      </w:r>
+    </w:p>
+    <w:p>
+      <w:pPr>
+        <w:pStyle w:val="ListBullet"/>
+      </w:pPr>
+      <w:r>
+        <w:rPr>
+          <w:b/>
+        </w:rPr>
+        <w:t>A changed template only changes new files.</w:t>
+      </w:r>
+      <w:r>
+        <w:t xml:space="preserve"> Existing drawings keep their sheet format; to bring one up to date, reload its sheet format in SolidWorks while it is checked out.</w:t>
+      </w:r>
+    </w:p>
+    <w:p>
+      <w:pPr>
+        <w:pStyle w:val="ListBullet"/>
+      </w:pPr>
+      <w:r>
+        <w:rPr>
+          <w:b/>
+        </w:rPr>
+        <w:t>SolidWorks' own File &gt; New</w:t>
+      </w:r>
+      <w:r>
+        <w:t xml:space="preserve"> still uses the templates SolidWorks is set to (Tools &gt; Options &gt; System Options &gt; Default Templates and File Locations &gt; Document Templates). Point Document Templates at the vault's templates folder (C:\Litterbox\&lt;vault&gt;\templates) so File &gt; New offers the team's templates too.</w:t>
       </w:r>
     </w:p>
     <w:p>

</xml_diff>

<commit_message>
0.6.2: a templates folder per project; guide: How Litterbox works and the job queue
- templates/<project>/ for each project's templates (the org's stay at the top); a template is
  known by its path there (Template.key), so names are unique per owner; a renamed project's
  folder moves with it
- User guide: a How Litterbox works chapter (the vault, Git LFS, locks, uploads, downloads,
  the job queue), and the late 0.6.1 changes to Folders and Check In
- Handoff updated

Co-Authored-By: Claude Opus 5.5 <noreply@anthropic.com>
</commit_message>
<xml_diff>
--- a/docs/Litterbox_User_Guide.docx
+++ b/docs/Litterbox_User_Guide.docx
@@ -2604,7 +2604,7 @@
         <w:t>Rename...</w:t>
       </w:r>
       <w:r>
-        <w:t xml:space="preserve">, </w:t>
+        <w:t xml:space="preserve"> and </w:t>
       </w:r>
       <w:r>
         <w:rPr>
@@ -2613,6 +2613,15 @@
         <w:t>Delete Folder...</w:t>
       </w:r>
       <w:r>
+        <w:t xml:space="preserve"> (folders only), </w:t>
+      </w:r>
+      <w:r>
+        <w:rPr>
+          <w:b/>
+        </w:rPr>
+        <w:t>Add Parts...</w:t>
+      </w:r>
+      <w:r>
         <w:t xml:space="preserve">, and </w:t>
       </w:r>
       <w:r>
@@ -2651,10 +2660,49 @@
         <w:rPr>
           <w:b/>
         </w:rPr>
+        <w:t>Add Parts...</w:t>
+      </w:r>
+      <w:r>
+        <w:t xml:space="preserve"> opens a search window of every part and document not in that folder yet. Type to search by number, name, or description, select one or several (Ctrl or Shift), and press </w:t>
+      </w:r>
+      <w:r>
+        <w:rPr>
+          <w:b/>
+        </w:rPr>
+        <w:t>Add selected</w:t>
+      </w:r>
+      <w:r>
+        <w:t>.</w:t>
+      </w:r>
+    </w:p>
+    <w:p>
+      <w:pPr>
+        <w:pStyle w:val="ListBullet"/>
+      </w:pPr>
+      <w:r>
+        <w:t>Parts, documents, and ECOs can go straight in a top (Personal, Team, or a project), outside every folder: right-click the top, drag onto it, or choose it in Add to Folder.</w:t>
+      </w:r>
+    </w:p>
+    <w:p>
+      <w:pPr>
+        <w:pStyle w:val="ListBullet"/>
+      </w:pPr>
+      <w:r>
+        <w:t>In a top or a folder, the folders come first, then parts, documents, and ECOs, each by number.</w:t>
+      </w:r>
+    </w:p>
+    <w:p>
+      <w:pPr>
+        <w:pStyle w:val="ListBullet"/>
+      </w:pPr>
+      <w:r>
+        <w:rPr>
+          <w:b/>
+        </w:rPr>
         <w:t>Add to Folder...</w:t>
       </w:r>
       <w:r>
-        <w:t xml:space="preserve"> in the Part menu, on the Documents screen, and on the ECOs screen puts the ticked parts (or the highlighted one) in a folder you choose, or in a new one.</w:t>
+        <w:t xml:space="preserve"> in the Part menu, on the Documents screen, and on the ECOs screen puts the ticked parts (or the highlighted one) in a folder (or a top) you choose, or in a new folder.</w:t>
       </w:r>
     </w:p>
     <w:p>
@@ -2768,7 +2816,7 @@
         <w:t>Save Progress</w:t>
       </w:r>
       <w:r>
-        <w:t xml:space="preserve"> to upload them and keep the lock.</w:t>
+        <w:t xml:space="preserve"> to upload them and keep the lock. A window lists the parts about to go up (number, revision, and name) and asks what you changed; the comment goes in each part's history, and may be left blank.</w:t>
       </w:r>
     </w:p>
     <w:p>
@@ -6198,7 +6246,7 @@
         <w:t>templates</w:t>
       </w:r>
       <w:r>
-        <w:t xml:space="preserve"> folder and uploads it. The first template of a kind becomes the default. Every template in the vault needs its own file name, the org's and the projects' together, so give them clear names (HCR A size, Rover A3).</w:t>
+        <w:t xml:space="preserve"> folder and uploads it: the org's at the top of the folder, a project's in a folder of the project's name (templates\Rover). The first template of a kind becomes the default. The org and each project can't have two templates of the same file name, but the org and a project can.</w:t>
       </w:r>
     </w:p>
     <w:p>
@@ -6231,7 +6279,7 @@
     </w:p>
     <w:p>
       <w:r>
-        <w:t>Litterbox refuses to upload a template change from anyone else. A renamed project keeps its templates.</w:t>
+        <w:t>Litterbox refuses to upload a template change from anyone else. A renamed project keeps its templates: its folder is renamed with it.</w:t>
       </w:r>
     </w:p>
     <w:p>
@@ -6323,7 +6371,680 @@
         <w:t>SolidWorks' own File &gt; New</w:t>
       </w:r>
       <w:r>
-        <w:t xml:space="preserve"> still uses the templates SolidWorks is set to (Tools &gt; Options &gt; System Options &gt; Default Templates and File Locations &gt; Document Templates). Point Document Templates at the vault's templates folder (C:\Litterbox\&lt;vault&gt;\templates) so File &gt; New offers the team's templates too.</w:t>
+        <w:t xml:space="preserve"> still uses the templates SolidWorks is set to (Tools &gt; Options &gt; System Options &gt; Default Templates and File Locations &gt; Document Templates). Point Document Templates at the vault's templates folder (C:\Litterbox\&lt;vault&gt;\templates), and your project's folder inside it, so File &gt; New offers the team's templates too.</w:t>
+      </w:r>
+    </w:p>
+    <w:p>
+      <w:r>
+        <w:br w:type="page"/>
+      </w:r>
+    </w:p>
+    <w:p>
+      <w:pPr>
+        <w:pStyle w:val="Heading1"/>
+      </w:pPr>
+      <w:r>
+        <w:t>How Litterbox works</w:t>
+      </w:r>
+    </w:p>
+    <w:p>
+      <w:r>
+        <w:t>This chapter is for the curious, and for whoever looks after the vault. Nothing in it needs doing by hand.</w:t>
+      </w:r>
+    </w:p>
+    <w:p>
+      <w:pPr>
+        <w:pStyle w:val="Heading2"/>
+      </w:pPr>
+      <w:r>
+        <w:t>The vault is a Git repository</w:t>
+      </w:r>
+    </w:p>
+    <w:p>
+      <w:r>
+        <w:t>A vault is a Git repository on the team's Git host, with a copy on each computer in C:\Litterbox\&lt;vault&gt;. Everything Litterbox keeps is a file in it:</w:t>
+      </w:r>
+    </w:p>
+    <w:tbl>
+      <w:tblPr>
+        <w:tblStyle w:val="TableGrid"/>
+        <w:tblW w:type="auto" w:w="0"/>
+        <w:jc w:val="center"/>
+        <w:tblLayout w:type="fixed"/>
+        <w:tblLook w:firstColumn="1" w:firstRow="1" w:lastColumn="0" w:lastRow="0" w:noHBand="0" w:noVBand="1" w:val="04A0"/>
+      </w:tblPr>
+      <w:tblGrid>
+        <w:gridCol w:w="2304"/>
+        <w:gridCol w:w="7056"/>
+      </w:tblGrid>
+      <w:tr>
+        <w:trPr>
+          <w:cantSplit/>
+          <w:tblHeader w:val="true"/>
+        </w:trPr>
+        <w:tc>
+          <w:tcPr>
+            <w:tcW w:type="dxa" w:w="2304"/>
+            <w:shd w:val="clear" w:color="auto" w:fill="1F5F8B"/>
+          </w:tcPr>
+          <w:p>
+            <w:pPr>
+              <w:spacing w:after="40"/>
+            </w:pPr>
+            <w:r>
+              <w:rPr>
+                <w:b/>
+                <w:color w:val="FFFFFF"/>
+                <w:sz w:val="20"/>
+              </w:rPr>
+              <w:t>Folder</w:t>
+            </w:r>
+          </w:p>
+        </w:tc>
+        <w:tc>
+          <w:tcPr>
+            <w:tcW w:type="dxa" w:w="7056"/>
+            <w:shd w:val="clear" w:color="auto" w:fill="1F5F8B"/>
+          </w:tcPr>
+          <w:p>
+            <w:pPr>
+              <w:spacing w:after="40"/>
+            </w:pPr>
+            <w:r>
+              <w:rPr>
+                <w:b/>
+                <w:color w:val="FFFFFF"/>
+                <w:sz w:val="20"/>
+              </w:rPr>
+              <w:t>What it holds</w:t>
+            </w:r>
+          </w:p>
+        </w:tc>
+      </w:tr>
+      <w:tr>
+        <w:trPr>
+          <w:cantSplit/>
+        </w:trPr>
+        <w:tc>
+          <w:tcPr>
+            <w:tcW w:type="dxa" w:w="2304"/>
+          </w:tcPr>
+          <w:p>
+            <w:pPr>
+              <w:spacing w:after="40"/>
+            </w:pPr>
+            <w:r>
+              <w:rPr>
+                <w:sz w:val="20"/>
+              </w:rPr>
+              <w:t>PN-logs, DOC-logs</w:t>
+            </w:r>
+          </w:p>
+        </w:tc>
+        <w:tc>
+          <w:tcPr>
+            <w:tcW w:type="dxa" w:w="7056"/>
+          </w:tcPr>
+          <w:p>
+            <w:pPr>
+              <w:spacing w:after="40"/>
+            </w:pPr>
+            <w:r>
+              <w:rPr>
+                <w:sz w:val="20"/>
+              </w:rPr>
+              <w:t>One record per part or document (HCR‑100010‑001.yaml): its name, revisions, history, purchasing info, and what it uses. Plain text.</w:t>
+            </w:r>
+          </w:p>
+        </w:tc>
+      </w:tr>
+      <w:tr>
+        <w:trPr>
+          <w:cantSplit/>
+        </w:trPr>
+        <w:tc>
+          <w:tcPr>
+            <w:tcW w:type="dxa" w:w="2304"/>
+            <w:shd w:val="clear" w:color="auto" w:fill="EEF3F7"/>
+          </w:tcPr>
+          <w:p>
+            <w:pPr>
+              <w:spacing w:after="40"/>
+            </w:pPr>
+            <w:r>
+              <w:rPr>
+                <w:sz w:val="20"/>
+              </w:rPr>
+              <w:t>cad, documents</w:t>
+            </w:r>
+          </w:p>
+        </w:tc>
+        <w:tc>
+          <w:tcPr>
+            <w:tcW w:type="dxa" w:w="7056"/>
+            <w:shd w:val="clear" w:color="auto" w:fill="EEF3F7"/>
+          </w:tcPr>
+          <w:p>
+            <w:pPr>
+              <w:spacing w:after="40"/>
+            </w:pPr>
+            <w:r>
+              <w:rPr>
+                <w:sz w:val="20"/>
+              </w:rPr>
+              <w:t>The parts' and documents' files, named after them (HCR‑100010‑001_A.SLDPRT).</w:t>
+            </w:r>
+          </w:p>
+        </w:tc>
+      </w:tr>
+      <w:tr>
+        <w:trPr>
+          <w:cantSplit/>
+        </w:trPr>
+        <w:tc>
+          <w:tcPr>
+            <w:tcW w:type="dxa" w:w="2304"/>
+          </w:tcPr>
+          <w:p>
+            <w:pPr>
+              <w:spacing w:after="40"/>
+            </w:pPr>
+            <w:r>
+              <w:rPr>
+                <w:sz w:val="20"/>
+              </w:rPr>
+              <w:t>ECO</w:t>
+            </w:r>
+          </w:p>
+        </w:tc>
+        <w:tc>
+          <w:tcPr>
+            <w:tcW w:type="dxa" w:w="7056"/>
+          </w:tcPr>
+          <w:p>
+            <w:pPr>
+              <w:spacing w:after="40"/>
+            </w:pPr>
+            <w:r>
+              <w:rPr>
+                <w:sz w:val="20"/>
+              </w:rPr>
+              <w:t>Engineering change orders.</w:t>
+            </w:r>
+          </w:p>
+        </w:tc>
+      </w:tr>
+      <w:tr>
+        <w:trPr>
+          <w:cantSplit/>
+        </w:trPr>
+        <w:tc>
+          <w:tcPr>
+            <w:tcW w:type="dxa" w:w="2304"/>
+            <w:shd w:val="clear" w:color="auto" w:fill="EEF3F7"/>
+          </w:tcPr>
+          <w:p>
+            <w:pPr>
+              <w:spacing w:after="40"/>
+            </w:pPr>
+            <w:r>
+              <w:rPr>
+                <w:sz w:val="20"/>
+              </w:rPr>
+              <w:t>cancelled-revs</w:t>
+            </w:r>
+          </w:p>
+        </w:tc>
+        <w:tc>
+          <w:tcPr>
+            <w:tcW w:type="dxa" w:w="7056"/>
+            <w:shd w:val="clear" w:color="auto" w:fill="EEF3F7"/>
+          </w:tcPr>
+          <w:p>
+            <w:pPr>
+              <w:spacing w:after="40"/>
+            </w:pPr>
+            <w:r>
+              <w:rPr>
+                <w:sz w:val="20"/>
+              </w:rPr>
+              <w:t>Revisions cancelled before release, kept for the history.</w:t>
+            </w:r>
+          </w:p>
+        </w:tc>
+      </w:tr>
+      <w:tr>
+        <w:trPr>
+          <w:cantSplit/>
+        </w:trPr>
+        <w:tc>
+          <w:tcPr>
+            <w:tcW w:type="dxa" w:w="2304"/>
+          </w:tcPr>
+          <w:p>
+            <w:pPr>
+              <w:spacing w:after="40"/>
+            </w:pPr>
+            <w:r>
+              <w:rPr>
+                <w:sz w:val="20"/>
+              </w:rPr>
+              <w:t>folders</w:t>
+            </w:r>
+          </w:p>
+        </w:tc>
+        <w:tc>
+          <w:tcPr>
+            <w:tcW w:type="dxa" w:w="7056"/>
+          </w:tcPr>
+          <w:p>
+            <w:pPr>
+              <w:spacing w:after="40"/>
+            </w:pPr>
+            <w:r>
+              <w:rPr>
+                <w:sz w:val="20"/>
+              </w:rPr>
+              <w:t>The Team and project folders: one small file per change, never edited, so two people never clash.</w:t>
+            </w:r>
+          </w:p>
+        </w:tc>
+      </w:tr>
+      <w:tr>
+        <w:trPr>
+          <w:cantSplit/>
+        </w:trPr>
+        <w:tc>
+          <w:tcPr>
+            <w:tcW w:type="dxa" w:w="2304"/>
+            <w:shd w:val="clear" w:color="auto" w:fill="EEF3F7"/>
+          </w:tcPr>
+          <w:p>
+            <w:pPr>
+              <w:spacing w:after="40"/>
+            </w:pPr>
+            <w:r>
+              <w:rPr>
+                <w:sz w:val="20"/>
+              </w:rPr>
+              <w:t>templates</w:t>
+            </w:r>
+          </w:p>
+        </w:tc>
+        <w:tc>
+          <w:tcPr>
+            <w:tcW w:type="dxa" w:w="7056"/>
+            <w:shd w:val="clear" w:color="auto" w:fill="EEF3F7"/>
+          </w:tcPr>
+          <w:p>
+            <w:pPr>
+              <w:spacing w:after="40"/>
+            </w:pPr>
+            <w:r>
+              <w:rPr>
+                <w:sz w:val="20"/>
+              </w:rPr>
+              <w:t>The org's and projects' SolidWorks templates, and templates.yaml saying which is the default.</w:t>
+            </w:r>
+          </w:p>
+        </w:tc>
+      </w:tr>
+      <w:tr>
+        <w:trPr>
+          <w:cantSplit/>
+        </w:trPr>
+        <w:tc>
+          <w:tcPr>
+            <w:tcW w:type="dxa" w:w="2304"/>
+          </w:tcPr>
+          <w:p>
+            <w:pPr>
+              <w:spacing w:after="40"/>
+            </w:pPr>
+            <w:r>
+              <w:rPr>
+                <w:sz w:val="20"/>
+              </w:rPr>
+              <w:t>toolbox</w:t>
+            </w:r>
+          </w:p>
+        </w:tc>
+        <w:tc>
+          <w:tcPr>
+            <w:tcW w:type="dxa" w:w="7056"/>
+          </w:tcPr>
+          <w:p>
+            <w:pPr>
+              <w:spacing w:after="40"/>
+            </w:pPr>
+            <w:r>
+              <w:rPr>
+                <w:sz w:val="20"/>
+              </w:rPr>
+              <w:t>The team's SolidWorks Toolbox, if it keeps one.</w:t>
+            </w:r>
+          </w:p>
+        </w:tc>
+      </w:tr>
+      <w:tr>
+        <w:trPr>
+          <w:cantSplit/>
+        </w:trPr>
+        <w:tc>
+          <w:tcPr>
+            <w:tcW w:type="dxa" w:w="2304"/>
+            <w:shd w:val="clear" w:color="auto" w:fill="EEF3F7"/>
+          </w:tcPr>
+          <w:p>
+            <w:pPr>
+              <w:spacing w:after="40"/>
+            </w:pPr>
+            <w:r>
+              <w:rPr>
+                <w:sz w:val="20"/>
+              </w:rPr>
+              <w:t>.litterbox</w:t>
+            </w:r>
+          </w:p>
+        </w:tc>
+        <w:tc>
+          <w:tcPr>
+            <w:tcW w:type="dxa" w:w="7056"/>
+            <w:shd w:val="clear" w:color="auto" w:fill="EEF3F7"/>
+          </w:tcPr>
+          <w:p>
+            <w:pPr>
+              <w:spacing w:after="40"/>
+            </w:pPr>
+            <w:r>
+              <w:rPr>
+                <w:sz w:val="20"/>
+              </w:rPr>
+              <w:t>The shared settings (config.yaml), the team (people.yaml), workflows, and document types.</w:t>
+            </w:r>
+          </w:p>
+        </w:tc>
+      </w:tr>
+    </w:tbl>
+    <w:p>
+      <w:pPr>
+        <w:spacing w:after="40"/>
+      </w:pPr>
+    </w:p>
+    <w:p>
+      <w:r>
+        <w:t xml:space="preserve">Large files (CAD files, PDFs, pictures, and templates) are stored with </w:t>
+      </w:r>
+      <w:r>
+        <w:rPr>
+          <w:b/>
+        </w:rPr>
+        <w:t>Git LFS</w:t>
+      </w:r>
+      <w:r>
+        <w:t>, Git's add-on for large files: Git keeps a small pointer, and the file itself is kept once on the host. The vault's .gitattributes file says which files go to Git LFS and which can be locked; Vault &gt; Update file rules... keeps it current.</w:t>
+      </w:r>
+    </w:p>
+    <w:p>
+      <w:pPr>
+        <w:pStyle w:val="Heading2"/>
+      </w:pPr>
+      <w:r>
+        <w:t>Locks, read-only files, and uploads</w:t>
+      </w:r>
+    </w:p>
+    <w:p>
+      <w:pPr>
+        <w:pStyle w:val="ListBullet"/>
+      </w:pPr>
+      <w:r>
+        <w:rPr>
+          <w:b/>
+        </w:rPr>
+        <w:t>Check Out</w:t>
+      </w:r>
+      <w:r>
+        <w:t xml:space="preserve"> takes Git LFS </w:t>
+      </w:r>
+      <w:r>
+        <w:rPr>
+          <w:b/>
+        </w:rPr>
+        <w:t>locks</w:t>
+      </w:r>
+      <w:r>
+        <w:t xml:space="preserve"> on the part's record and files. The host keeps the locks, so only one person can hold a part at a time, and Litterbox makes those files writable for them alone. Every other file of a part is </w:t>
+      </w:r>
+      <w:r>
+        <w:rPr>
+          <w:b/>
+        </w:rPr>
+        <w:t>read-only</w:t>
+      </w:r>
+      <w:r>
+        <w:t xml:space="preserve"> on your disk; Litterbox puts that back after every download, check-in, and undo.</w:t>
+      </w:r>
+    </w:p>
+    <w:p>
+      <w:pPr>
+        <w:pStyle w:val="ListBullet"/>
+      </w:pPr>
+      <w:r>
+        <w:t xml:space="preserve">Every change is a Git </w:t>
+      </w:r>
+      <w:r>
+        <w:rPr>
+          <w:b/>
+        </w:rPr>
+        <w:t>commit</w:t>
+      </w:r>
+      <w:r>
+        <w:t xml:space="preserve"> with your name and a message ("HCR‑100010‑001: Thicker flange"), so the history says who did what, when, and why. If the team requires signed commits, each is signed with your key.</w:t>
+      </w:r>
+    </w:p>
+    <w:p>
+      <w:pPr>
+        <w:pStyle w:val="ListBullet"/>
+      </w:pPr>
+      <w:r>
+        <w:t xml:space="preserve">An </w:t>
+      </w:r>
+      <w:r>
+        <w:rPr>
+          <w:b/>
+        </w:rPr>
+        <w:t>upload</w:t>
+      </w:r>
+      <w:r>
+        <w:t xml:space="preserve"> first gets everyone else's changes (a sync), then checks the upload is allowed: you are still on the team, your Litterbox is new enough for the vault, and any changes to the Toolbox, folders, or templates are ones you may make. Then it pushes. If someone else uploaded in the meantime, Litterbox syncs and tries again. If it still can't, your commit stays on your computer and goes up with the next upload; nothing is left half done.</w:t>
+      </w:r>
+    </w:p>
+    <w:p>
+      <w:pPr>
+        <w:pStyle w:val="ListBullet"/>
+      </w:pPr>
+      <w:r>
+        <w:t>Actions on several parts (Check In, Release, and others) do one sync, one commit, and one upload for the whole batch, while each part still gets its own history entry. A part that can't be done is reported, and the rest carry on.</w:t>
+      </w:r>
+    </w:p>
+    <w:p>
+      <w:pPr>
+        <w:pStyle w:val="ListBullet"/>
+      </w:pPr>
+      <w:r>
+        <w:t>Check In remembers each file's size and time when you press it, and refuses to upload a part saved in SolidWorks after that, so a half-saved file is never uploaded.</w:t>
+      </w:r>
+    </w:p>
+    <w:p>
+      <w:pPr>
+        <w:pStyle w:val="ListBullet"/>
+      </w:pPr>
+      <w:r>
+        <w:t>Long operations (Import, Revise) write a small note in the vault's .git folder before they start. If Litterbox stops part-way, the note says what to finish or undo next time.</w:t>
+      </w:r>
+    </w:p>
+    <w:p>
+      <w:pPr>
+        <w:pStyle w:val="Heading2"/>
+      </w:pPr>
+      <w:r>
+        <w:t>Downloads</w:t>
+      </w:r>
+    </w:p>
+    <w:p>
+      <w:r>
+        <w:t xml:space="preserve">Litterbox gets other people's changes at Get Latest and before every upload. With </w:t>
+      </w:r>
+      <w:r>
+        <w:rPr>
+          <w:b/>
+        </w:rPr>
+        <w:t>download on demand</w:t>
+      </w:r>
+      <w:r>
+        <w:t xml:space="preserve"> (the usual setting), Git leaves every CAD file as a small pointer until it is needed, and Litterbox downloads exactly the files it needs: those you open or check out, and what an assembly uses. Files you already have stay downloaded at each Get Latest. A hidden project's files are left out of the copies of people who aren't in it (Git's sparse checkout), so they are never downloaded.</w:t>
+      </w:r>
+    </w:p>
+    <w:p>
+      <w:pPr>
+        <w:pStyle w:val="Heading2"/>
+      </w:pPr>
+      <w:r>
+        <w:t>The job queue</w:t>
+      </w:r>
+    </w:p>
+    <w:p>
+      <w:r>
+        <w:t xml:space="preserve">Everything that touches the vault or SolidWorks runs in the </w:t>
+      </w:r>
+      <w:r>
+        <w:rPr>
+          <w:b/>
+        </w:rPr>
+        <w:t>background</w:t>
+      </w:r>
+      <w:r>
+        <w:t xml:space="preserve">, so the window never freezes: you click, the work becomes a </w:t>
+      </w:r>
+      <w:r>
+        <w:rPr>
+          <w:b/>
+        </w:rPr>
+        <w:t>job</w:t>
+      </w:r>
+      <w:r>
+        <w:t xml:space="preserve"> in a queue, and you can carry on browsing, ticking, and queueing more.</w:t>
+      </w:r>
+    </w:p>
+    <w:p>
+      <w:pPr>
+        <w:pStyle w:val="ListBullet"/>
+      </w:pPr>
+      <w:r>
+        <w:t xml:space="preserve">Jobs run </w:t>
+      </w:r>
+      <w:r>
+        <w:rPr>
+          <w:b/>
+        </w:rPr>
+        <w:t>one at a time, in the order they were queued</w:t>
+      </w:r>
+      <w:r>
+        <w:t>, because Git can change only one thing in a vault at once. The status bar shows the job running, and how many more are waiting ("Checking in 3 parts - 2 more waiting"); a job queued behind others shows "Queued: ...".</w:t>
+      </w:r>
+    </w:p>
+    <w:p>
+      <w:pPr>
+        <w:pStyle w:val="ListBullet"/>
+      </w:pPr>
+      <w:r>
+        <w:t xml:space="preserve">Each job knows the parts it changes. Those parts are </w:t>
+      </w:r>
+      <w:r>
+        <w:rPr>
+          <w:b/>
+        </w:rPr>
+        <w:t>busy</w:t>
+      </w:r>
+      <w:r>
+        <w:t xml:space="preserve"> until it has finished and its result is shown: their status says so, and other changes to them are refused until then. Looking at a busy part (Open, Details, Export) still works.</w:t>
+      </w:r>
+    </w:p>
+    <w:p>
+      <w:pPr>
+        <w:pStyle w:val="ListBullet"/>
+      </w:pPr>
+      <w:r>
+        <w:t xml:space="preserve">A </w:t>
+      </w:r>
+      <w:r>
+        <w:rPr>
+          <w:b/>
+        </w:rPr>
+        <w:t>refresh</w:t>
+      </w:r>
+      <w:r>
+        <w:t xml:space="preserve"> (re-reading your copy of the vault) is queued like any job. A newer refresh replaces one still waiting, so they never pile up.</w:t>
+      </w:r>
+    </w:p>
+    <w:p>
+      <w:pPr>
+        <w:pStyle w:val="ListBullet"/>
+      </w:pPr>
+      <w:r>
+        <w:t xml:space="preserve">When a job finishes, the window shows the result and refreshes the list. If it </w:t>
+      </w:r>
+      <w:r>
+        <w:rPr>
+          <w:b/>
+        </w:rPr>
+        <w:t>failed</w:t>
+      </w:r>
+      <w:r>
+        <w:t xml:space="preserve">, there is no pop-up (you may be busy elsewhere): the status bar's dot turns red and stays red until you press </w:t>
+      </w:r>
+      <w:r>
+        <w:rPr>
+          <w:b/>
+        </w:rPr>
+        <w:t>Details...</w:t>
+      </w:r>
+      <w:r>
+        <w:t xml:space="preserve"> and dismiss it, so a problem isn't missed during a break. Jobs queued after it still run.</w:t>
+      </w:r>
+    </w:p>
+    <w:p>
+      <w:pPr>
+        <w:pStyle w:val="ListBullet"/>
+      </w:pPr>
+      <w:r>
+        <w:t>A few things need the vault to themselves, so they can't be used while jobs are queued or running: switching org, Import, and Get Latest from the header.</w:t>
+      </w:r>
+    </w:p>
+    <w:p>
+      <w:pPr>
+        <w:pStyle w:val="ListBullet"/>
+      </w:pPr>
+      <w:r>
+        <w:t>SolidWorks work in a job uses a SolidWorks that is already running, or starts one in the background and closes it when the job is done.</w:t>
+      </w:r>
+    </w:p>
+    <w:p>
+      <w:pPr>
+        <w:pStyle w:val="ListBullet"/>
+      </w:pPr>
+      <w:r>
+        <w:t xml:space="preserve">With </w:t>
+      </w:r>
+      <w:r>
+        <w:rPr>
+          <w:rFonts w:ascii="Roboto Mono" w:hAnsi="Roboto Mono" w:eastAsia="Roboto Mono"/>
+          <w:sz w:val="18"/>
+        </w:rPr>
+        <w:t>debug_mode: true</w:t>
+      </w:r>
+      <w:r>
+        <w:t xml:space="preserve"> in settings.yaml, the status bar shows how long a job has been running, so a slow host looks slow rather than stuck.</w:t>
       </w:r>
     </w:p>
     <w:p>

</xml_diff>

<commit_message>
0.6.3: cancelled revisions kept in cad/cancelled-revs
- layout.CANCELLED_DIR_NAME is cad/cancelled-revs (read-only, lockable like the rest of cad/)
- File rules version 4: the rule for the new folder; the update also moves an existing vault's
  cancelled-revs/ there in the same commit (moved back on a failed upload) and raises the
  minimum to 0.6.3; offered again while the old folder has files
- Hidden projects leave out cancelled revisions in both places
- Window text, user guide, CHANGELOG and handoff updated

Co-Authored-By: Claude Opus 5.5 <noreply@anthropic.com>
</commit_message>
<xml_diff>
--- a/docs/Litterbox_User_Guide.docx
+++ b/docs/Litterbox_User_Guide.docx
@@ -47,7 +47,7 @@
         <w:rPr>
           <w:color w:val="666666"/>
         </w:rPr>
-        <w:t>For Litterbox 0.6.2  ·  October 2026</w:t>
+        <w:t>For Litterbox 0.6.3  ·  October 2026</w:t>
       </w:r>
     </w:p>
     <w:p>
@@ -3397,7 +3397,7 @@
               <w:rPr>
                 <w:sz w:val="20"/>
               </w:rPr>
-              <w:t>Discards a revision that was never released. Its files move to the cancelled-revs folder, and its letter isn't reused.</w:t>
+              <w:t>Discards a revision that was never released. Its files move to the cad\cancelled-revs folder (read-only, kept for the history), and its letter isn't reused.</w:t>
             </w:r>
           </w:p>
         </w:tc>
@@ -5835,7 +5835,7 @@
         <w:t>Vault &gt; Update file rules...</w:t>
       </w:r>
       <w:r>
-        <w:t xml:space="preserve"> appears when Litterbox has newer rules for which files Git LFS stores and locks. An Admin is asked once per session. The update changes only Litterbox's own lines.</w:t>
+        <w:t xml:space="preserve"> appears when Litterbox has newer rules for which files Git LFS stores and locks. An Admin is asked once per session. The update changes only Litterbox's own lines. Version 4 (Litterbox 0.6.3) also moves the vault's cancelled revisions from the old cancelled-revs folder at the top of the vault into cad\cancelled-revs, with their history, and makes everyone need 0.6.3.</w:t>
       </w:r>
     </w:p>
     <w:p>
@@ -6591,7 +6591,7 @@
               <w:rPr>
                 <w:sz w:val="20"/>
               </w:rPr>
-              <w:t>cancelled-revs</w:t>
+              <w:t>cad\cancelled-revs</w:t>
             </w:r>
           </w:p>
         </w:tc>
@@ -6608,7 +6608,7 @@
               <w:rPr>
                 <w:sz w:val="20"/>
               </w:rPr>
-              <w:t>Revisions cancelled before release, kept for the history.</w:t>
+              <w:t>Revisions cancelled before release, kept for the history (at the top of the vault before 0.6.3).</w:t>
             </w:r>
           </w:p>
         </w:tc>

</xml_diff>

<commit_message>
0.6.3: purchasing columns; saved BOMs for kits, flagged until saved, Save Released BOM, in Export Files
- View > Columns: Supplier, Supplier part number, Unit cost (team's currency), Lead time (days);
  numeric sorting for cost and lead time (TableSorter numeric columns)
- Kits (non-CAD assemblies) get their BOM saved at release like CAD assemblies
- A release flags its BOM (exports bom_wanted) until it is saved; "BOM file needs saving" in the
  status; Part > Save Released BOM and the Details tab's Save BOM File save it later (never over
  one saved with the release)
- Export Files offers the BOM saved at release
- Guide, CHANGELOG, REMINDERS (check-in batching kept for later), handoff

Co-Authored-By: Claude Opus 5.5 <noreply@anthropic.com>
</commit_message>
<xml_diff>
--- a/docs/Litterbox_User_Guide.docx
+++ b/docs/Litterbox_User_Guide.docx
@@ -2371,7 +2371,7 @@
         <w:pStyle w:val="ListBullet"/>
       </w:pPr>
       <w:r>
-        <w:t>Click a column heading to sort. Part number, Rev, Name, Description, Files, and Kind show to start with. View &gt; Columns adds Project, COTS, Status, Checked out by, Released rev, Imported from, and Material.</w:t>
+        <w:t>Click a column heading to sort. Part number, Rev, Name, Description, Files, and Kind show to start with. View &gt; Columns adds Project, COTS, Status, Checked out by, Released rev, Imported from, Material, and the purchasing info: Supplier, Supplier part number, Unit cost, and Lead time (days). Unit cost and Lead time sort as numbers.</w:t>
       </w:r>
     </w:p>
     <w:p>
@@ -3815,7 +3815,34 @@
     </w:p>
     <w:p>
       <w:r>
-        <w:t>When an assembly is released, Litterbox saves its indented BOM beside the model as HCR‑100010‑500_A_BOM.csv, as a fixed record of the released revision.</w:t>
+        <w:t xml:space="preserve">When an assembly or a kit is released, Litterbox saves its indented BOM in the cad folder as HCR‑100010‑500_A_BOM.csv, as a fixed record of the released revision: what it was made of, with names, quantities, and costs as they stood at release. If it can't be saved then (the upload failed, say), the part is flagged </w:t>
+      </w:r>
+      <w:r>
+        <w:rPr>
+          <w:b/>
+        </w:rPr>
+        <w:t>BOM file needs saving</w:t>
+      </w:r>
+      <w:r>
+        <w:t xml:space="preserve">, and Part &gt; </w:t>
+      </w:r>
+      <w:r>
+        <w:rPr>
+          <w:b/>
+        </w:rPr>
+        <w:t>Save Released BOM</w:t>
+      </w:r>
+      <w:r>
+        <w:t xml:space="preserve"> (or </w:t>
+      </w:r>
+      <w:r>
+        <w:rPr>
+          <w:b/>
+        </w:rPr>
+        <w:t>Save BOM File</w:t>
+      </w:r>
+      <w:r>
+        <w:t xml:space="preserve"> on the Details tab) saves it later, with names and costs as they are when it is saved. A BOM saved with its release is never saved again over it.</w:t>
       </w:r>
     </w:p>
     <w:p>
@@ -4103,7 +4130,7 @@
         <w:t>kit</w:t>
       </w:r>
       <w:r>
-        <w:t xml:space="preserve"> is a non-CAD assembly made only of lines added this way, from any parts. Added lines freeze at release and carry on to the next revision.</w:t>
+        <w:t xml:space="preserve"> is a non-CAD assembly made only of lines added this way, from any parts. Added lines freeze at release and carry on to the next revision. A released kit's BOM is saved with it like an assembly's: its only file.</w:t>
       </w:r>
     </w:p>
     <w:p>
@@ -4138,7 +4165,7 @@
         <w:t>Purchasing Info...</w:t>
       </w:r>
       <w:r>
-        <w:t xml:space="preserve"> sets a part's supplier, supplier part number, unit cost, and lead time in days. Purchasing info belongs to the part, not to a revision, so it needs no check-out and works on released parts. The change is uploaded at once and recorded in the part's history.</w:t>
+        <w:t xml:space="preserve"> sets a part's supplier, supplier part number, unit cost, and lead time in days. Purchasing info belongs to the part, not to a revision, so it needs no check-out and works on released parts. The change is uploaded at once and recorded in the part's history. View &gt; Columns can show it in the parts list. An assembly's columns show its own purchasing info, not a total of its parts' (the BOM tab adds those up).</w:t>
       </w:r>
     </w:p>
     <w:p>
@@ -4277,7 +4304,7 @@
         <w:t>Export Files...</w:t>
       </w:r>
       <w:r>
-        <w:t xml:space="preserve"> copies the ticked parts' files to a folder you choose: any of model, drawing, STEP, and PDF, from the latest released revision, the working revision, or a revision you pick, and optionally the parts each assembly uses. Exports always go outside C:\Litterbox and outside any Git repository.</w:t>
+        <w:t xml:space="preserve"> copies the ticked parts' files to a folder you choose: any of model, drawing, STEP, PDF, and the BOM saved at release, from the latest released revision, the working revision, or a revision you pick, and optionally the parts each assembly uses. Exports always go outside C:\Litterbox and outside any Git repository.</w:t>
       </w:r>
     </w:p>
     <w:p>

</xml_diff>

<commit_message>
0.6.5: report contents, betas, signed notices, licences, safer releases
- Report a problem lists exactly what goes in the report (one list drives the
  window, CONTENTS.txt and the zip); the log and settings can be left out.
- Betas: X.Y.Z-beta.N versions, Help > Get beta versions, a beta-channel
  release; a beta counts as its final version for a vault's minimum.
- Signed notices (notices.json, spare key only): revoked update keys and a
  signed "moved to", kept in settings.yaml; packaging/sign_notice.py.
- The installed program carries third-party licences (licenses folder).
- Release pipeline split: the build job has no secrets; the publish job signs
  in the release environment; packages pinned with hashes.
- SECURITY.md, Dependabot for actions, README for outside teams, guide PDF.
- Internal notes moved out of the repository (docs/ keeps the guide,
  ARCHITECTURE and RELEASING).

Co-Authored-By: Claude Opus 5.5 <noreply@anthropic.com>
</commit_message>
<xml_diff>
--- a/docs/Litterbox_User_Guide.docx
+++ b/docs/Litterbox_User_Guide.docx
@@ -47,7 +47,7 @@
         <w:rPr>
           <w:color w:val="666666"/>
         </w:rPr>
-        <w:t>For Litterbox 0.6.4  ·  October 2026</w:t>
+        <w:t>For Litterbox 0.6.5  ·  October 2026</w:t>
       </w:r>
     </w:p>
     <w:p>
@@ -849,6 +849,57 @@
     </w:p>
     <w:p>
       <w:pPr>
+        <w:pStyle w:val="ListBullet"/>
+      </w:pPr>
+      <w:r>
+        <w:rPr>
+          <w:b/>
+        </w:rPr>
+        <w:t>Betas.</w:t>
+      </w:r>
+      <w:r>
+        <w:t xml:space="preserve"> Help &gt; </w:t>
+      </w:r>
+      <w:r>
+        <w:rPr>
+          <w:b/>
+        </w:rPr>
+        <w:t>Get beta versions</w:t>
+      </w:r>
+      <w:r>
+        <w:t xml:space="preserve"> offers betas as well as releases: the next version before it is finished, for trying new things early. Expect more bugs, and report them with Help &gt; Report a problem. A beta can make a vault need the version it leads to, which teammates on the released version don't have yet, so try betas in a test vault, or move the whole team at once. When that version is released, you are offered it like everyone else. Turning betas off keeps the beta you have until a newer release comes out.</w:t>
+      </w:r>
+    </w:p>
+    <w:p>
+      <w:pPr>
+        <w:pStyle w:val="ListBullet"/>
+      </w:pPr>
+      <w:r>
+        <w:rPr>
+          <w:b/>
+        </w:rPr>
+        <w:t>Signed notices.</w:t>
+      </w:r>
+      <w:r>
+        <w:t xml:space="preserve"> With each check, Litterbox also reads a notice signed by the Litterbox maintainers. It can withdraw an update key (if one were ever stolen, Litterbox stops trusting it straight away) or say that Litterbox's releases have moved; Litterbox remembers either in settings.yaml and says so.</w:t>
+      </w:r>
+    </w:p>
+    <w:p>
+      <w:pPr>
+        <w:pStyle w:val="ListBullet"/>
+      </w:pPr>
+      <w:r>
+        <w:rPr>
+          <w:b/>
+        </w:rPr>
+        <w:t>Licences.</w:t>
+      </w:r>
+      <w:r>
+        <w:t xml:space="preserve"> Litterbox is free software under the MIT licence. The licences of the other programs it is built with are in the licenses folder beside Litterbox.exe (in %LOCALAPPDATA%\Programs\Litterbox).</w:t>
+      </w:r>
+    </w:p>
+    <w:p>
+      <w:pPr>
         <w:pStyle w:val="Heading2"/>
       </w:pPr>
       <w:r>
@@ -7238,6 +7289,44 @@
               <w:rPr>
                 <w:sz w:val="20"/>
               </w:rPr>
+              <w:t>update_channel: beta</w:t>
+            </w:r>
+          </w:p>
+        </w:tc>
+        <w:tc>
+          <w:tcPr>
+            <w:tcW w:type="dxa" w:w="6192"/>
+            <w:shd w:val="clear" w:color="auto" w:fill="EEF3F7"/>
+          </w:tcPr>
+          <w:p>
+            <w:pPr>
+              <w:spacing w:after="40"/>
+            </w:pPr>
+            <w:r>
+              <w:rPr>
+                <w:sz w:val="20"/>
+              </w:rPr>
+              <w:t>Offer betas too (set by Help &gt; Get beta versions).</w:t>
+            </w:r>
+          </w:p>
+        </w:tc>
+      </w:tr>
+      <w:tr>
+        <w:trPr>
+          <w:cantSplit/>
+        </w:trPr>
+        <w:tc>
+          <w:tcPr>
+            <w:tcW w:type="dxa" w:w="3168"/>
+          </w:tcPr>
+          <w:p>
+            <w:pPr>
+              <w:spacing w:after="40"/>
+            </w:pPr>
+            <w:r>
+              <w:rPr>
+                <w:sz w:val="20"/>
+              </w:rPr>
               <w:t>download: all</w:t>
             </w:r>
           </w:p>
@@ -7245,7 +7334,6 @@
         <w:tc>
           <w:tcPr>
             <w:tcW w:type="dxa" w:w="6192"/>
-            <w:shd w:val="clear" w:color="auto" w:fill="EEF3F7"/>
           </w:tcPr>
           <w:p>
             <w:pPr>
@@ -7267,6 +7355,7 @@
         <w:tc>
           <w:tcPr>
             <w:tcW w:type="dxa" w:w="3168"/>
+            <w:shd w:val="clear" w:color="auto" w:fill="EEF3F7"/>
           </w:tcPr>
           <w:p>
             <w:pPr>
@@ -7283,6 +7372,7 @@
         <w:tc>
           <w:tcPr>
             <w:tcW w:type="dxa" w:w="6192"/>
+            <w:shd w:val="clear" w:color="auto" w:fill="EEF3F7"/>
           </w:tcPr>
           <w:p>
             <w:pPr>
@@ -7304,7 +7394,6 @@
         <w:tc>
           <w:tcPr>
             <w:tcW w:type="dxa" w:w="3168"/>
-            <w:shd w:val="clear" w:color="auto" w:fill="EEF3F7"/>
           </w:tcPr>
           <w:p>
             <w:pPr>
@@ -7321,7 +7410,6 @@
         <w:tc>
           <w:tcPr>
             <w:tcW w:type="dxa" w:w="6192"/>
-            <w:shd w:val="clear" w:color="auto" w:fill="EEF3F7"/>
           </w:tcPr>
           <w:p>
             <w:pPr>
@@ -7343,6 +7431,7 @@
         <w:tc>
           <w:tcPr>
             <w:tcW w:type="dxa" w:w="3168"/>
+            <w:shd w:val="clear" w:color="auto" w:fill="EEF3F7"/>
           </w:tcPr>
           <w:p>
             <w:pPr>
@@ -7359,6 +7448,7 @@
         <w:tc>
           <w:tcPr>
             <w:tcW w:type="dxa" w:w="6192"/>
+            <w:shd w:val="clear" w:color="auto" w:fill="EEF3F7"/>
           </w:tcPr>
           <w:p>
             <w:pPr>
@@ -7380,7 +7470,6 @@
         <w:tc>
           <w:tcPr>
             <w:tcW w:type="dxa" w:w="3168"/>
-            <w:shd w:val="clear" w:color="auto" w:fill="EEF3F7"/>
           </w:tcPr>
           <w:p>
             <w:pPr>
@@ -7397,7 +7486,6 @@
         <w:tc>
           <w:tcPr>
             <w:tcW w:type="dxa" w:w="6192"/>
-            <w:shd w:val="clear" w:color="auto" w:fill="EEF3F7"/>
           </w:tcPr>
           <w:p>
             <w:pPr>
@@ -7477,7 +7565,33 @@
         <w:t>Report...</w:t>
       </w:r>
       <w:r>
-        <w:t xml:space="preserve"> in the Details window) asks what you were doing, then makes a report and opens an email to the Litterbox team with it, for you to send. With Outlook, the report is attached; otherwise attach it yourself (Explorer shows it). The report has your comment, the versions of Litterbox, Windows, SolidWorks, and Git, the problems in the status bar, Litterbox's log, and your settings, with passwords and tokens taken out. The log names parts and files you worked on. Reports are kept in C:\Litterbox\logs\reports.</w:t>
+        <w:t xml:space="preserve"> in the Details window) lists exactly what goes in the report (each file, about how big, and what it holds), asks what you were doing, then makes the report and opens an email to the Litterbox team with it, for you to send. Nothing is sent until you press Send. With Outlook, the report is attached and Litterbox offers to open it first; otherwise attach it yourself (Explorer shows it).</w:t>
+      </w:r>
+    </w:p>
+    <w:p>
+      <w:pPr>
+        <w:pStyle w:val="ListBullet"/>
+      </w:pPr>
+      <w:r>
+        <w:t xml:space="preserve">The report holds report.txt (your comment, the versions of Litterbox, Windows, Python, SolidWorks, Git, and Git LFS, the problems in the status bar, and this session's unexpected errors), Litterbox's log, your Litterbox settings, the vault's shared settings, and CONTENTS.txt listing them. Untick </w:t>
+      </w:r>
+      <w:r>
+        <w:rPr>
+          <w:b/>
+        </w:rPr>
+        <w:t>Include Litterbox's log</w:t>
+      </w:r>
+      <w:r>
+        <w:t xml:space="preserve"> or </w:t>
+      </w:r>
+      <w:r>
+        <w:rPr>
+          <w:b/>
+        </w:rPr>
+        <w:t>Include your Litterbox settings...</w:t>
+      </w:r>
+      <w:r>
+        <w:t xml:space="preserve"> to leave those out. The log names parts, files, and check-in comments, and can name people on your team. Passwords and tokens are taken out of every file, and no CAD files, documents, part records, or the team list ever go in. Reports are kept in C:\Litterbox\logs\reports.</w:t>
       </w:r>
     </w:p>
     <w:p>

</xml_diff>

<commit_message>
1.0.1: the guide's foreword in guide_content.py; Word fills in the contents
- The Foreword (written in the .docx) is now in guide_content.py, so a
  rebuild keeps it.
- build_guide.py has Word fill in the table of contents, save, and write
  Litterbox_User_Guide.pdf, so no Update Field by hand.
- CHANGELOG 1.0.1: the privacy policy link, the foreword.

Co-Authored-By: Claude Opus 5.5 <noreply@anthropic.com>
</commit_message>
<xml_diff>
--- a/docs/Litterbox_User_Guide.docx
+++ b/docs/Litterbox_User_Guide.docx
@@ -46,7 +46,7 @@
         <w:rPr>
           <w:color w:val="666666"/>
         </w:rPr>
-        <w:t>For Litterbox 1.0.0  ·  October 2026</w:t>
+        <w:t>For Litterbox 1.0.1  ·  October 2026</w:t>
       </w:r>
     </w:p>
     <w:p>
@@ -75,13 +75,7 @@
           <w:tab w:val="right" w:leader="dot" w:pos="9350"/>
         </w:tabs>
         <w:rPr>
-          <w:rFonts w:asciiTheme="minorHAnsi" w:eastAsiaTheme="minorEastAsia" w:hAnsiTheme="minorHAnsi" w:cstheme="minorBidi"/>
           <w:noProof/>
-          <w:color w:val="auto"/>
-          <w:kern w:val="2"/>
-          <w:sz w:val="24"/>
-          <w:szCs w:val="24"/>
-          <w14:ligatures w14:val="standardContextual"/>
         </w:rPr>
       </w:pPr>
       <w:r>
@@ -93,7 +87,7 @@
       <w:r>
         <w:fldChar w:fldCharType="separate"/>
       </w:r>
-      <w:hyperlink w:anchor="_Toc243832757" w:history="1">
+      <w:hyperlink w:anchor="_Toc243833135" w:history="1">
         <w:r>
           <w:rPr>
             <w:rStyle w:val="Hyperlink"/>
@@ -120,7 +114,7 @@
             <w:noProof/>
             <w:webHidden/>
           </w:rPr>
-          <w:instrText xml:space="preserve"> PAGEREF _Toc243832757 \h </w:instrText>
+          <w:instrText xml:space="preserve"> PAGEREF _Toc243833135 \h </w:instrText>
         </w:r>
         <w:r>
           <w:rPr>
@@ -158,16 +152,10 @@
           <w:tab w:val="right" w:leader="dot" w:pos="9350"/>
         </w:tabs>
         <w:rPr>
-          <w:rFonts w:asciiTheme="minorHAnsi" w:eastAsiaTheme="minorEastAsia" w:hAnsiTheme="minorHAnsi" w:cstheme="minorBidi"/>
           <w:noProof/>
-          <w:color w:val="auto"/>
-          <w:kern w:val="2"/>
-          <w:sz w:val="24"/>
-          <w:szCs w:val="24"/>
-          <w14:ligatures w14:val="standardContextual"/>
-        </w:rPr>
-      </w:pPr>
-      <w:hyperlink w:anchor="_Toc243832758" w:history="1">
+        </w:rPr>
+      </w:pPr>
+      <w:hyperlink w:anchor="_Toc243833136" w:history="1">
         <w:r>
           <w:rPr>
             <w:rStyle w:val="Hyperlink"/>
@@ -194,7 +182,7 @@
             <w:noProof/>
             <w:webHidden/>
           </w:rPr>
-          <w:instrText xml:space="preserve"> PAGEREF _Toc243832758 \h </w:instrText>
+          <w:instrText xml:space="preserve"> PAGEREF _Toc243833136 \h </w:instrText>
         </w:r>
         <w:r>
           <w:rPr>
@@ -232,16 +220,10 @@
           <w:tab w:val="right" w:leader="dot" w:pos="9350"/>
         </w:tabs>
         <w:rPr>
-          <w:rFonts w:asciiTheme="minorHAnsi" w:eastAsiaTheme="minorEastAsia" w:hAnsiTheme="minorHAnsi" w:cstheme="minorBidi"/>
           <w:noProof/>
-          <w:color w:val="auto"/>
-          <w:kern w:val="2"/>
-          <w:sz w:val="24"/>
-          <w:szCs w:val="24"/>
-          <w14:ligatures w14:val="standardContextual"/>
-        </w:rPr>
-      </w:pPr>
-      <w:hyperlink w:anchor="_Toc243832759" w:history="1">
+        </w:rPr>
+      </w:pPr>
+      <w:hyperlink w:anchor="_Toc243833137" w:history="1">
         <w:r>
           <w:rPr>
             <w:rStyle w:val="Hyperlink"/>
@@ -268,7 +250,7 @@
             <w:noProof/>
             <w:webHidden/>
           </w:rPr>
-          <w:instrText xml:space="preserve"> PAGEREF _Toc243832759 \h </w:instrText>
+          <w:instrText xml:space="preserve"> PAGEREF _Toc243833137 \h </w:instrText>
         </w:r>
         <w:r>
           <w:rPr>
@@ -306,16 +288,10 @@
           <w:tab w:val="right" w:leader="dot" w:pos="9350"/>
         </w:tabs>
         <w:rPr>
-          <w:rFonts w:asciiTheme="minorHAnsi" w:eastAsiaTheme="minorEastAsia" w:hAnsiTheme="minorHAnsi" w:cstheme="minorBidi"/>
           <w:noProof/>
-          <w:color w:val="auto"/>
-          <w:kern w:val="2"/>
-          <w:sz w:val="24"/>
-          <w:szCs w:val="24"/>
-          <w14:ligatures w14:val="standardContextual"/>
-        </w:rPr>
-      </w:pPr>
-      <w:hyperlink w:anchor="_Toc243832760" w:history="1">
+        </w:rPr>
+      </w:pPr>
+      <w:hyperlink w:anchor="_Toc243833138" w:history="1">
         <w:r>
           <w:rPr>
             <w:rStyle w:val="Hyperlink"/>
@@ -342,7 +318,7 @@
             <w:noProof/>
             <w:webHidden/>
           </w:rPr>
-          <w:instrText xml:space="preserve"> PAGEREF _Toc243832760 \h </w:instrText>
+          <w:instrText xml:space="preserve"> PAGEREF _Toc243833138 \h </w:instrText>
         </w:r>
         <w:r>
           <w:rPr>
@@ -380,16 +356,10 @@
           <w:tab w:val="right" w:leader="dot" w:pos="9350"/>
         </w:tabs>
         <w:rPr>
-          <w:rFonts w:asciiTheme="minorHAnsi" w:eastAsiaTheme="minorEastAsia" w:hAnsiTheme="minorHAnsi" w:cstheme="minorBidi"/>
           <w:noProof/>
-          <w:color w:val="auto"/>
-          <w:kern w:val="2"/>
-          <w:sz w:val="24"/>
-          <w:szCs w:val="24"/>
-          <w14:ligatures w14:val="standardContextual"/>
-        </w:rPr>
-      </w:pPr>
-      <w:hyperlink w:anchor="_Toc243832761" w:history="1">
+        </w:rPr>
+      </w:pPr>
+      <w:hyperlink w:anchor="_Toc243833139" w:history="1">
         <w:r>
           <w:rPr>
             <w:rStyle w:val="Hyperlink"/>
@@ -416,7 +386,7 @@
             <w:noProof/>
             <w:webHidden/>
           </w:rPr>
-          <w:instrText xml:space="preserve"> PAGEREF _Toc243832761 \h </w:instrText>
+          <w:instrText xml:space="preserve"> PAGEREF _Toc243833139 \h </w:instrText>
         </w:r>
         <w:r>
           <w:rPr>
@@ -454,16 +424,10 @@
           <w:tab w:val="right" w:leader="dot" w:pos="9350"/>
         </w:tabs>
         <w:rPr>
-          <w:rFonts w:asciiTheme="minorHAnsi" w:eastAsiaTheme="minorEastAsia" w:hAnsiTheme="minorHAnsi" w:cstheme="minorBidi"/>
           <w:noProof/>
-          <w:color w:val="auto"/>
-          <w:kern w:val="2"/>
-          <w:sz w:val="24"/>
-          <w:szCs w:val="24"/>
-          <w14:ligatures w14:val="standardContextual"/>
-        </w:rPr>
-      </w:pPr>
-      <w:hyperlink w:anchor="_Toc243832762" w:history="1">
+        </w:rPr>
+      </w:pPr>
+      <w:hyperlink w:anchor="_Toc243833140" w:history="1">
         <w:r>
           <w:rPr>
             <w:rStyle w:val="Hyperlink"/>
@@ -490,7 +454,7 @@
             <w:noProof/>
             <w:webHidden/>
           </w:rPr>
-          <w:instrText xml:space="preserve"> PAGEREF _Toc243832762 \h </w:instrText>
+          <w:instrText xml:space="preserve"> PAGEREF _Toc243833140 \h </w:instrText>
         </w:r>
         <w:r>
           <w:rPr>
@@ -528,16 +492,10 @@
           <w:tab w:val="right" w:leader="dot" w:pos="9350"/>
         </w:tabs>
         <w:rPr>
-          <w:rFonts w:asciiTheme="minorHAnsi" w:eastAsiaTheme="minorEastAsia" w:hAnsiTheme="minorHAnsi" w:cstheme="minorBidi"/>
           <w:noProof/>
-          <w:color w:val="auto"/>
-          <w:kern w:val="2"/>
-          <w:sz w:val="24"/>
-          <w:szCs w:val="24"/>
-          <w14:ligatures w14:val="standardContextual"/>
-        </w:rPr>
-      </w:pPr>
-      <w:hyperlink w:anchor="_Toc243832763" w:history="1">
+        </w:rPr>
+      </w:pPr>
+      <w:hyperlink w:anchor="_Toc243833141" w:history="1">
         <w:r>
           <w:rPr>
             <w:rStyle w:val="Hyperlink"/>
@@ -564,7 +522,7 @@
             <w:noProof/>
             <w:webHidden/>
           </w:rPr>
-          <w:instrText xml:space="preserve"> PAGEREF _Toc243832763 \h </w:instrText>
+          <w:instrText xml:space="preserve"> PAGEREF _Toc243833141 \h </w:instrText>
         </w:r>
         <w:r>
           <w:rPr>
@@ -602,16 +560,10 @@
           <w:tab w:val="right" w:leader="dot" w:pos="9350"/>
         </w:tabs>
         <w:rPr>
-          <w:rFonts w:asciiTheme="minorHAnsi" w:eastAsiaTheme="minorEastAsia" w:hAnsiTheme="minorHAnsi" w:cstheme="minorBidi"/>
           <w:noProof/>
-          <w:color w:val="auto"/>
-          <w:kern w:val="2"/>
-          <w:sz w:val="24"/>
-          <w:szCs w:val="24"/>
-          <w14:ligatures w14:val="standardContextual"/>
-        </w:rPr>
-      </w:pPr>
-      <w:hyperlink w:anchor="_Toc243832764" w:history="1">
+        </w:rPr>
+      </w:pPr>
+      <w:hyperlink w:anchor="_Toc243833142" w:history="1">
         <w:r>
           <w:rPr>
             <w:rStyle w:val="Hyperlink"/>
@@ -638,7 +590,7 @@
             <w:noProof/>
             <w:webHidden/>
           </w:rPr>
-          <w:instrText xml:space="preserve"> PAGEREF _Toc243832764 \h </w:instrText>
+          <w:instrText xml:space="preserve"> PAGEREF _Toc243833142 \h </w:instrText>
         </w:r>
         <w:r>
           <w:rPr>
@@ -676,16 +628,10 @@
           <w:tab w:val="right" w:leader="dot" w:pos="9350"/>
         </w:tabs>
         <w:rPr>
-          <w:rFonts w:asciiTheme="minorHAnsi" w:eastAsiaTheme="minorEastAsia" w:hAnsiTheme="minorHAnsi" w:cstheme="minorBidi"/>
           <w:noProof/>
-          <w:color w:val="auto"/>
-          <w:kern w:val="2"/>
-          <w:sz w:val="24"/>
-          <w:szCs w:val="24"/>
-          <w14:ligatures w14:val="standardContextual"/>
-        </w:rPr>
-      </w:pPr>
-      <w:hyperlink w:anchor="_Toc243832765" w:history="1">
+        </w:rPr>
+      </w:pPr>
+      <w:hyperlink w:anchor="_Toc243833143" w:history="1">
         <w:r>
           <w:rPr>
             <w:rStyle w:val="Hyperlink"/>
@@ -712,7 +658,7 @@
             <w:noProof/>
             <w:webHidden/>
           </w:rPr>
-          <w:instrText xml:space="preserve"> PAGEREF _Toc243832765 \h </w:instrText>
+          <w:instrText xml:space="preserve"> PAGEREF _Toc243833143 \h </w:instrText>
         </w:r>
         <w:r>
           <w:rPr>
@@ -750,16 +696,10 @@
           <w:tab w:val="right" w:leader="dot" w:pos="9350"/>
         </w:tabs>
         <w:rPr>
-          <w:rFonts w:asciiTheme="minorHAnsi" w:eastAsiaTheme="minorEastAsia" w:hAnsiTheme="minorHAnsi" w:cstheme="minorBidi"/>
           <w:noProof/>
-          <w:color w:val="auto"/>
-          <w:kern w:val="2"/>
-          <w:sz w:val="24"/>
-          <w:szCs w:val="24"/>
-          <w14:ligatures w14:val="standardContextual"/>
-        </w:rPr>
-      </w:pPr>
-      <w:hyperlink w:anchor="_Toc243832766" w:history="1">
+        </w:rPr>
+      </w:pPr>
+      <w:hyperlink w:anchor="_Toc243833144" w:history="1">
         <w:r>
           <w:rPr>
             <w:rStyle w:val="Hyperlink"/>
@@ -786,7 +726,7 @@
             <w:noProof/>
             <w:webHidden/>
           </w:rPr>
-          <w:instrText xml:space="preserve"> PAGEREF _Toc243832766 \h </w:instrText>
+          <w:instrText xml:space="preserve"> PAGEREF _Toc243833144 \h </w:instrText>
         </w:r>
         <w:r>
           <w:rPr>
@@ -824,16 +764,10 @@
           <w:tab w:val="right" w:leader="dot" w:pos="9350"/>
         </w:tabs>
         <w:rPr>
-          <w:rFonts w:asciiTheme="minorHAnsi" w:eastAsiaTheme="minorEastAsia" w:hAnsiTheme="minorHAnsi" w:cstheme="minorBidi"/>
           <w:noProof/>
-          <w:color w:val="auto"/>
-          <w:kern w:val="2"/>
-          <w:sz w:val="24"/>
-          <w:szCs w:val="24"/>
-          <w14:ligatures w14:val="standardContextual"/>
-        </w:rPr>
-      </w:pPr>
-      <w:hyperlink w:anchor="_Toc243832767" w:history="1">
+        </w:rPr>
+      </w:pPr>
+      <w:hyperlink w:anchor="_Toc243833145" w:history="1">
         <w:r>
           <w:rPr>
             <w:rStyle w:val="Hyperlink"/>
@@ -860,7 +794,7 @@
             <w:noProof/>
             <w:webHidden/>
           </w:rPr>
-          <w:instrText xml:space="preserve"> PAGEREF _Toc243832767 \h </w:instrText>
+          <w:instrText xml:space="preserve"> PAGEREF _Toc243833145 \h </w:instrText>
         </w:r>
         <w:r>
           <w:rPr>
@@ -898,16 +832,10 @@
           <w:tab w:val="right" w:leader="dot" w:pos="9350"/>
         </w:tabs>
         <w:rPr>
-          <w:rFonts w:asciiTheme="minorHAnsi" w:eastAsiaTheme="minorEastAsia" w:hAnsiTheme="minorHAnsi" w:cstheme="minorBidi"/>
           <w:noProof/>
-          <w:color w:val="auto"/>
-          <w:kern w:val="2"/>
-          <w:sz w:val="24"/>
-          <w:szCs w:val="24"/>
-          <w14:ligatures w14:val="standardContextual"/>
-        </w:rPr>
-      </w:pPr>
-      <w:hyperlink w:anchor="_Toc243832768" w:history="1">
+        </w:rPr>
+      </w:pPr>
+      <w:hyperlink w:anchor="_Toc243833146" w:history="1">
         <w:r>
           <w:rPr>
             <w:rStyle w:val="Hyperlink"/>
@@ -934,7 +862,7 @@
             <w:noProof/>
             <w:webHidden/>
           </w:rPr>
-          <w:instrText xml:space="preserve"> PAGEREF _Toc243832768 \h </w:instrText>
+          <w:instrText xml:space="preserve"> PAGEREF _Toc243833146 \h </w:instrText>
         </w:r>
         <w:r>
           <w:rPr>
@@ -972,16 +900,10 @@
           <w:tab w:val="right" w:leader="dot" w:pos="9350"/>
         </w:tabs>
         <w:rPr>
-          <w:rFonts w:asciiTheme="minorHAnsi" w:eastAsiaTheme="minorEastAsia" w:hAnsiTheme="minorHAnsi" w:cstheme="minorBidi"/>
           <w:noProof/>
-          <w:color w:val="auto"/>
-          <w:kern w:val="2"/>
-          <w:sz w:val="24"/>
-          <w:szCs w:val="24"/>
-          <w14:ligatures w14:val="standardContextual"/>
-        </w:rPr>
-      </w:pPr>
-      <w:hyperlink w:anchor="_Toc243832769" w:history="1">
+        </w:rPr>
+      </w:pPr>
+      <w:hyperlink w:anchor="_Toc243833147" w:history="1">
         <w:r>
           <w:rPr>
             <w:rStyle w:val="Hyperlink"/>
@@ -1008,7 +930,7 @@
             <w:noProof/>
             <w:webHidden/>
           </w:rPr>
-          <w:instrText xml:space="preserve"> PAGEREF _Toc243832769 \h </w:instrText>
+          <w:instrText xml:space="preserve"> PAGEREF _Toc243833147 \h </w:instrText>
         </w:r>
         <w:r>
           <w:rPr>
@@ -1046,16 +968,10 @@
           <w:tab w:val="right" w:leader="dot" w:pos="9350"/>
         </w:tabs>
         <w:rPr>
-          <w:rFonts w:asciiTheme="minorHAnsi" w:eastAsiaTheme="minorEastAsia" w:hAnsiTheme="minorHAnsi" w:cstheme="minorBidi"/>
           <w:noProof/>
-          <w:color w:val="auto"/>
-          <w:kern w:val="2"/>
-          <w:sz w:val="24"/>
-          <w:szCs w:val="24"/>
-          <w14:ligatures w14:val="standardContextual"/>
-        </w:rPr>
-      </w:pPr>
-      <w:hyperlink w:anchor="_Toc243832770" w:history="1">
+        </w:rPr>
+      </w:pPr>
+      <w:hyperlink w:anchor="_Toc243833148" w:history="1">
         <w:r>
           <w:rPr>
             <w:rStyle w:val="Hyperlink"/>
@@ -1082,7 +998,7 @@
             <w:noProof/>
             <w:webHidden/>
           </w:rPr>
-          <w:instrText xml:space="preserve"> PAGEREF _Toc243832770 \h </w:instrText>
+          <w:instrText xml:space="preserve"> PAGEREF _Toc243833148 \h </w:instrText>
         </w:r>
         <w:r>
           <w:rPr>
@@ -1120,16 +1036,10 @@
           <w:tab w:val="right" w:leader="dot" w:pos="9350"/>
         </w:tabs>
         <w:rPr>
-          <w:rFonts w:asciiTheme="minorHAnsi" w:eastAsiaTheme="minorEastAsia" w:hAnsiTheme="minorHAnsi" w:cstheme="minorBidi"/>
           <w:noProof/>
-          <w:color w:val="auto"/>
-          <w:kern w:val="2"/>
-          <w:sz w:val="24"/>
-          <w:szCs w:val="24"/>
-          <w14:ligatures w14:val="standardContextual"/>
-        </w:rPr>
-      </w:pPr>
-      <w:hyperlink w:anchor="_Toc243832771" w:history="1">
+        </w:rPr>
+      </w:pPr>
+      <w:hyperlink w:anchor="_Toc243833149" w:history="1">
         <w:r>
           <w:rPr>
             <w:rStyle w:val="Hyperlink"/>
@@ -1156,7 +1066,7 @@
             <w:noProof/>
             <w:webHidden/>
           </w:rPr>
-          <w:instrText xml:space="preserve"> PAGEREF _Toc243832771 \h </w:instrText>
+          <w:instrText xml:space="preserve"> PAGEREF _Toc243833149 \h </w:instrText>
         </w:r>
         <w:r>
           <w:rPr>
@@ -1194,16 +1104,10 @@
           <w:tab w:val="right" w:leader="dot" w:pos="9350"/>
         </w:tabs>
         <w:rPr>
-          <w:rFonts w:asciiTheme="minorHAnsi" w:eastAsiaTheme="minorEastAsia" w:hAnsiTheme="minorHAnsi" w:cstheme="minorBidi"/>
           <w:noProof/>
-          <w:color w:val="auto"/>
-          <w:kern w:val="2"/>
-          <w:sz w:val="24"/>
-          <w:szCs w:val="24"/>
-          <w14:ligatures w14:val="standardContextual"/>
-        </w:rPr>
-      </w:pPr>
-      <w:hyperlink w:anchor="_Toc243832772" w:history="1">
+        </w:rPr>
+      </w:pPr>
+      <w:hyperlink w:anchor="_Toc243833150" w:history="1">
         <w:r>
           <w:rPr>
             <w:rStyle w:val="Hyperlink"/>
@@ -1230,7 +1134,7 @@
             <w:noProof/>
             <w:webHidden/>
           </w:rPr>
-          <w:instrText xml:space="preserve"> PAGEREF _Toc243832772 \h </w:instrText>
+          <w:instrText xml:space="preserve"> PAGEREF _Toc243833150 \h </w:instrText>
         </w:r>
         <w:r>
           <w:rPr>
@@ -1268,16 +1172,10 @@
           <w:tab w:val="right" w:leader="dot" w:pos="9350"/>
         </w:tabs>
         <w:rPr>
-          <w:rFonts w:asciiTheme="minorHAnsi" w:eastAsiaTheme="minorEastAsia" w:hAnsiTheme="minorHAnsi" w:cstheme="minorBidi"/>
           <w:noProof/>
-          <w:color w:val="auto"/>
-          <w:kern w:val="2"/>
-          <w:sz w:val="24"/>
-          <w:szCs w:val="24"/>
-          <w14:ligatures w14:val="standardContextual"/>
-        </w:rPr>
-      </w:pPr>
-      <w:hyperlink w:anchor="_Toc243832773" w:history="1">
+        </w:rPr>
+      </w:pPr>
+      <w:hyperlink w:anchor="_Toc243833151" w:history="1">
         <w:r>
           <w:rPr>
             <w:rStyle w:val="Hyperlink"/>
@@ -1304,7 +1202,7 @@
             <w:noProof/>
             <w:webHidden/>
           </w:rPr>
-          <w:instrText xml:space="preserve"> PAGEREF _Toc243832773 \h </w:instrText>
+          <w:instrText xml:space="preserve"> PAGEREF _Toc243833151 \h </w:instrText>
         </w:r>
         <w:r>
           <w:rPr>
@@ -1342,16 +1240,10 @@
           <w:tab w:val="right" w:leader="dot" w:pos="9350"/>
         </w:tabs>
         <w:rPr>
-          <w:rFonts w:asciiTheme="minorHAnsi" w:eastAsiaTheme="minorEastAsia" w:hAnsiTheme="minorHAnsi" w:cstheme="minorBidi"/>
           <w:noProof/>
-          <w:color w:val="auto"/>
-          <w:kern w:val="2"/>
-          <w:sz w:val="24"/>
-          <w:szCs w:val="24"/>
-          <w14:ligatures w14:val="standardContextual"/>
-        </w:rPr>
-      </w:pPr>
-      <w:hyperlink w:anchor="_Toc243832774" w:history="1">
+        </w:rPr>
+      </w:pPr>
+      <w:hyperlink w:anchor="_Toc243833152" w:history="1">
         <w:r>
           <w:rPr>
             <w:rStyle w:val="Hyperlink"/>
@@ -1378,7 +1270,7 @@
             <w:noProof/>
             <w:webHidden/>
           </w:rPr>
-          <w:instrText xml:space="preserve"> PAGEREF _Toc243832774 \h </w:instrText>
+          <w:instrText xml:space="preserve"> PAGEREF _Toc243833152 \h </w:instrText>
         </w:r>
         <w:r>
           <w:rPr>
@@ -1416,16 +1308,10 @@
           <w:tab w:val="right" w:leader="dot" w:pos="9350"/>
         </w:tabs>
         <w:rPr>
-          <w:rFonts w:asciiTheme="minorHAnsi" w:eastAsiaTheme="minorEastAsia" w:hAnsiTheme="minorHAnsi" w:cstheme="minorBidi"/>
           <w:noProof/>
-          <w:color w:val="auto"/>
-          <w:kern w:val="2"/>
-          <w:sz w:val="24"/>
-          <w:szCs w:val="24"/>
-          <w14:ligatures w14:val="standardContextual"/>
-        </w:rPr>
-      </w:pPr>
-      <w:hyperlink w:anchor="_Toc243832775" w:history="1">
+        </w:rPr>
+      </w:pPr>
+      <w:hyperlink w:anchor="_Toc243833153" w:history="1">
         <w:r>
           <w:rPr>
             <w:rStyle w:val="Hyperlink"/>
@@ -1452,7 +1338,7 @@
             <w:noProof/>
             <w:webHidden/>
           </w:rPr>
-          <w:instrText xml:space="preserve"> PAGEREF _Toc243832775 \h </w:instrText>
+          <w:instrText xml:space="preserve"> PAGEREF _Toc243833153 \h </w:instrText>
         </w:r>
         <w:r>
           <w:rPr>
@@ -1490,16 +1376,10 @@
           <w:tab w:val="right" w:leader="dot" w:pos="9350"/>
         </w:tabs>
         <w:rPr>
-          <w:rFonts w:asciiTheme="minorHAnsi" w:eastAsiaTheme="minorEastAsia" w:hAnsiTheme="minorHAnsi" w:cstheme="minorBidi"/>
           <w:noProof/>
-          <w:color w:val="auto"/>
-          <w:kern w:val="2"/>
-          <w:sz w:val="24"/>
-          <w:szCs w:val="24"/>
-          <w14:ligatures w14:val="standardContextual"/>
-        </w:rPr>
-      </w:pPr>
-      <w:hyperlink w:anchor="_Toc243832776" w:history="1">
+        </w:rPr>
+      </w:pPr>
+      <w:hyperlink w:anchor="_Toc243833154" w:history="1">
         <w:r>
           <w:rPr>
             <w:rStyle w:val="Hyperlink"/>
@@ -1526,7 +1406,7 @@
             <w:noProof/>
             <w:webHidden/>
           </w:rPr>
-          <w:instrText xml:space="preserve"> PAGEREF _Toc243832776 \h </w:instrText>
+          <w:instrText xml:space="preserve"> PAGEREF _Toc243833154 \h </w:instrText>
         </w:r>
         <w:r>
           <w:rPr>
@@ -1564,16 +1444,10 @@
           <w:tab w:val="right" w:leader="dot" w:pos="9350"/>
         </w:tabs>
         <w:rPr>
-          <w:rFonts w:asciiTheme="minorHAnsi" w:eastAsiaTheme="minorEastAsia" w:hAnsiTheme="minorHAnsi" w:cstheme="minorBidi"/>
           <w:noProof/>
-          <w:color w:val="auto"/>
-          <w:kern w:val="2"/>
-          <w:sz w:val="24"/>
-          <w:szCs w:val="24"/>
-          <w14:ligatures w14:val="standardContextual"/>
-        </w:rPr>
-      </w:pPr>
-      <w:hyperlink w:anchor="_Toc243832777" w:history="1">
+        </w:rPr>
+      </w:pPr>
+      <w:hyperlink w:anchor="_Toc243833155" w:history="1">
         <w:r>
           <w:rPr>
             <w:rStyle w:val="Hyperlink"/>
@@ -1600,7 +1474,7 @@
             <w:noProof/>
             <w:webHidden/>
           </w:rPr>
-          <w:instrText xml:space="preserve"> PAGEREF _Toc243832777 \h </w:instrText>
+          <w:instrText xml:space="preserve"> PAGEREF _Toc243833155 \h </w:instrText>
         </w:r>
         <w:r>
           <w:rPr>
@@ -1638,16 +1512,10 @@
           <w:tab w:val="right" w:leader="dot" w:pos="9350"/>
         </w:tabs>
         <w:rPr>
-          <w:rFonts w:asciiTheme="minorHAnsi" w:eastAsiaTheme="minorEastAsia" w:hAnsiTheme="minorHAnsi" w:cstheme="minorBidi"/>
           <w:noProof/>
-          <w:color w:val="auto"/>
-          <w:kern w:val="2"/>
-          <w:sz w:val="24"/>
-          <w:szCs w:val="24"/>
-          <w14:ligatures w14:val="standardContextual"/>
-        </w:rPr>
-      </w:pPr>
-      <w:hyperlink w:anchor="_Toc243832778" w:history="1">
+        </w:rPr>
+      </w:pPr>
+      <w:hyperlink w:anchor="_Toc243833156" w:history="1">
         <w:r>
           <w:rPr>
             <w:rStyle w:val="Hyperlink"/>
@@ -1674,7 +1542,7 @@
             <w:noProof/>
             <w:webHidden/>
           </w:rPr>
-          <w:instrText xml:space="preserve"> PAGEREF _Toc243832778 \h </w:instrText>
+          <w:instrText xml:space="preserve"> PAGEREF _Toc243833156 \h </w:instrText>
         </w:r>
         <w:r>
           <w:rPr>
@@ -1712,16 +1580,10 @@
           <w:tab w:val="right" w:leader="dot" w:pos="9350"/>
         </w:tabs>
         <w:rPr>
-          <w:rFonts w:asciiTheme="minorHAnsi" w:eastAsiaTheme="minorEastAsia" w:hAnsiTheme="minorHAnsi" w:cstheme="minorBidi"/>
           <w:noProof/>
-          <w:color w:val="auto"/>
-          <w:kern w:val="2"/>
-          <w:sz w:val="24"/>
-          <w:szCs w:val="24"/>
-          <w14:ligatures w14:val="standardContextual"/>
-        </w:rPr>
-      </w:pPr>
-      <w:hyperlink w:anchor="_Toc243832779" w:history="1">
+        </w:rPr>
+      </w:pPr>
+      <w:hyperlink w:anchor="_Toc243833157" w:history="1">
         <w:r>
           <w:rPr>
             <w:rStyle w:val="Hyperlink"/>
@@ -1748,7 +1610,7 @@
             <w:noProof/>
             <w:webHidden/>
           </w:rPr>
-          <w:instrText xml:space="preserve"> PAGEREF _Toc243832779 \h </w:instrText>
+          <w:instrText xml:space="preserve"> PAGEREF _Toc243833157 \h </w:instrText>
         </w:r>
         <w:r>
           <w:rPr>
@@ -1786,16 +1648,10 @@
           <w:tab w:val="right" w:leader="dot" w:pos="9350"/>
         </w:tabs>
         <w:rPr>
-          <w:rFonts w:asciiTheme="minorHAnsi" w:eastAsiaTheme="minorEastAsia" w:hAnsiTheme="minorHAnsi" w:cstheme="minorBidi"/>
           <w:noProof/>
-          <w:color w:val="auto"/>
-          <w:kern w:val="2"/>
-          <w:sz w:val="24"/>
-          <w:szCs w:val="24"/>
-          <w14:ligatures w14:val="standardContextual"/>
-        </w:rPr>
-      </w:pPr>
-      <w:hyperlink w:anchor="_Toc243832780" w:history="1">
+        </w:rPr>
+      </w:pPr>
+      <w:hyperlink w:anchor="_Toc243833158" w:history="1">
         <w:r>
           <w:rPr>
             <w:rStyle w:val="Hyperlink"/>
@@ -1822,7 +1678,7 @@
             <w:noProof/>
             <w:webHidden/>
           </w:rPr>
-          <w:instrText xml:space="preserve"> PAGEREF _Toc243832780 \h </w:instrText>
+          <w:instrText xml:space="preserve"> PAGEREF _Toc243833158 \h </w:instrText>
         </w:r>
         <w:r>
           <w:rPr>
@@ -1860,16 +1716,10 @@
           <w:tab w:val="right" w:leader="dot" w:pos="9350"/>
         </w:tabs>
         <w:rPr>
-          <w:rFonts w:asciiTheme="minorHAnsi" w:eastAsiaTheme="minorEastAsia" w:hAnsiTheme="minorHAnsi" w:cstheme="minorBidi"/>
           <w:noProof/>
-          <w:color w:val="auto"/>
-          <w:kern w:val="2"/>
-          <w:sz w:val="24"/>
-          <w:szCs w:val="24"/>
-          <w14:ligatures w14:val="standardContextual"/>
-        </w:rPr>
-      </w:pPr>
-      <w:hyperlink w:anchor="_Toc243832781" w:history="1">
+        </w:rPr>
+      </w:pPr>
+      <w:hyperlink w:anchor="_Toc243833159" w:history="1">
         <w:r>
           <w:rPr>
             <w:rStyle w:val="Hyperlink"/>
@@ -1896,7 +1746,7 @@
             <w:noProof/>
             <w:webHidden/>
           </w:rPr>
-          <w:instrText xml:space="preserve"> PAGEREF _Toc243832781 \h </w:instrText>
+          <w:instrText xml:space="preserve"> PAGEREF _Toc243833159 \h </w:instrText>
         </w:r>
         <w:r>
           <w:rPr>
@@ -1934,16 +1784,10 @@
           <w:tab w:val="right" w:leader="dot" w:pos="9350"/>
         </w:tabs>
         <w:rPr>
-          <w:rFonts w:asciiTheme="minorHAnsi" w:eastAsiaTheme="minorEastAsia" w:hAnsiTheme="minorHAnsi" w:cstheme="minorBidi"/>
           <w:noProof/>
-          <w:color w:val="auto"/>
-          <w:kern w:val="2"/>
-          <w:sz w:val="24"/>
-          <w:szCs w:val="24"/>
-          <w14:ligatures w14:val="standardContextual"/>
-        </w:rPr>
-      </w:pPr>
-      <w:hyperlink w:anchor="_Toc243832782" w:history="1">
+        </w:rPr>
+      </w:pPr>
+      <w:hyperlink w:anchor="_Toc243833160" w:history="1">
         <w:r>
           <w:rPr>
             <w:rStyle w:val="Hyperlink"/>
@@ -1970,7 +1814,7 @@
             <w:noProof/>
             <w:webHidden/>
           </w:rPr>
-          <w:instrText xml:space="preserve"> PAGEREF _Toc243832782 \h </w:instrText>
+          <w:instrText xml:space="preserve"> PAGEREF _Toc243833160 \h </w:instrText>
         </w:r>
         <w:r>
           <w:rPr>
@@ -2008,16 +1852,10 @@
           <w:tab w:val="right" w:leader="dot" w:pos="9350"/>
         </w:tabs>
         <w:rPr>
-          <w:rFonts w:asciiTheme="minorHAnsi" w:eastAsiaTheme="minorEastAsia" w:hAnsiTheme="minorHAnsi" w:cstheme="minorBidi"/>
           <w:noProof/>
-          <w:color w:val="auto"/>
-          <w:kern w:val="2"/>
-          <w:sz w:val="24"/>
-          <w:szCs w:val="24"/>
-          <w14:ligatures w14:val="standardContextual"/>
-        </w:rPr>
-      </w:pPr>
-      <w:hyperlink w:anchor="_Toc243832783" w:history="1">
+        </w:rPr>
+      </w:pPr>
+      <w:hyperlink w:anchor="_Toc243833161" w:history="1">
         <w:r>
           <w:rPr>
             <w:rStyle w:val="Hyperlink"/>
@@ -2044,7 +1882,7 @@
             <w:noProof/>
             <w:webHidden/>
           </w:rPr>
-          <w:instrText xml:space="preserve"> PAGEREF _Toc243832783 \h </w:instrText>
+          <w:instrText xml:space="preserve"> PAGEREF _Toc243833161 \h </w:instrText>
         </w:r>
         <w:r>
           <w:rPr>
@@ -2082,16 +1920,10 @@
           <w:tab w:val="right" w:leader="dot" w:pos="9350"/>
         </w:tabs>
         <w:rPr>
-          <w:rFonts w:asciiTheme="minorHAnsi" w:eastAsiaTheme="minorEastAsia" w:hAnsiTheme="minorHAnsi" w:cstheme="minorBidi"/>
           <w:noProof/>
-          <w:color w:val="auto"/>
-          <w:kern w:val="2"/>
-          <w:sz w:val="24"/>
-          <w:szCs w:val="24"/>
-          <w14:ligatures w14:val="standardContextual"/>
-        </w:rPr>
-      </w:pPr>
-      <w:hyperlink w:anchor="_Toc243832784" w:history="1">
+        </w:rPr>
+      </w:pPr>
+      <w:hyperlink w:anchor="_Toc243833162" w:history="1">
         <w:r>
           <w:rPr>
             <w:rStyle w:val="Hyperlink"/>
@@ -2118,7 +1950,7 @@
             <w:noProof/>
             <w:webHidden/>
           </w:rPr>
-          <w:instrText xml:space="preserve"> PAGEREF _Toc243832784 \h </w:instrText>
+          <w:instrText xml:space="preserve"> PAGEREF _Toc243833162 \h </w:instrText>
         </w:r>
         <w:r>
           <w:rPr>
@@ -2156,16 +1988,10 @@
           <w:tab w:val="right" w:leader="dot" w:pos="9350"/>
         </w:tabs>
         <w:rPr>
-          <w:rFonts w:asciiTheme="minorHAnsi" w:eastAsiaTheme="minorEastAsia" w:hAnsiTheme="minorHAnsi" w:cstheme="minorBidi"/>
           <w:noProof/>
-          <w:color w:val="auto"/>
-          <w:kern w:val="2"/>
-          <w:sz w:val="24"/>
-          <w:szCs w:val="24"/>
-          <w14:ligatures w14:val="standardContextual"/>
-        </w:rPr>
-      </w:pPr>
-      <w:hyperlink w:anchor="_Toc243832785" w:history="1">
+        </w:rPr>
+      </w:pPr>
+      <w:hyperlink w:anchor="_Toc243833163" w:history="1">
         <w:r>
           <w:rPr>
             <w:rStyle w:val="Hyperlink"/>
@@ -2192,7 +2018,7 @@
             <w:noProof/>
             <w:webHidden/>
           </w:rPr>
-          <w:instrText xml:space="preserve"> PAGEREF _Toc243832785 \h </w:instrText>
+          <w:instrText xml:space="preserve"> PAGEREF _Toc243833163 \h </w:instrText>
         </w:r>
         <w:r>
           <w:rPr>
@@ -2230,16 +2056,10 @@
           <w:tab w:val="right" w:leader="dot" w:pos="9350"/>
         </w:tabs>
         <w:rPr>
-          <w:rFonts w:asciiTheme="minorHAnsi" w:eastAsiaTheme="minorEastAsia" w:hAnsiTheme="minorHAnsi" w:cstheme="minorBidi"/>
           <w:noProof/>
-          <w:color w:val="auto"/>
-          <w:kern w:val="2"/>
-          <w:sz w:val="24"/>
-          <w:szCs w:val="24"/>
-          <w14:ligatures w14:val="standardContextual"/>
-        </w:rPr>
-      </w:pPr>
-      <w:hyperlink w:anchor="_Toc243832786" w:history="1">
+        </w:rPr>
+      </w:pPr>
+      <w:hyperlink w:anchor="_Toc243833164" w:history="1">
         <w:r>
           <w:rPr>
             <w:rStyle w:val="Hyperlink"/>
@@ -2266,7 +2086,7 @@
             <w:noProof/>
             <w:webHidden/>
           </w:rPr>
-          <w:instrText xml:space="preserve"> PAGEREF _Toc243832786 \h </w:instrText>
+          <w:instrText xml:space="preserve"> PAGEREF _Toc243833164 \h </w:instrText>
         </w:r>
         <w:r>
           <w:rPr>
@@ -2304,16 +2124,10 @@
           <w:tab w:val="right" w:leader="dot" w:pos="9350"/>
         </w:tabs>
         <w:rPr>
-          <w:rFonts w:asciiTheme="minorHAnsi" w:eastAsiaTheme="minorEastAsia" w:hAnsiTheme="minorHAnsi" w:cstheme="minorBidi"/>
           <w:noProof/>
-          <w:color w:val="auto"/>
-          <w:kern w:val="2"/>
-          <w:sz w:val="24"/>
-          <w:szCs w:val="24"/>
-          <w14:ligatures w14:val="standardContextual"/>
-        </w:rPr>
-      </w:pPr>
-      <w:hyperlink w:anchor="_Toc243832787" w:history="1">
+        </w:rPr>
+      </w:pPr>
+      <w:hyperlink w:anchor="_Toc243833165" w:history="1">
         <w:r>
           <w:rPr>
             <w:rStyle w:val="Hyperlink"/>
@@ -2340,7 +2154,7 @@
             <w:noProof/>
             <w:webHidden/>
           </w:rPr>
-          <w:instrText xml:space="preserve"> PAGEREF _Toc243832787 \h </w:instrText>
+          <w:instrText xml:space="preserve"> PAGEREF _Toc243833165 \h </w:instrText>
         </w:r>
         <w:r>
           <w:rPr>
@@ -2378,16 +2192,10 @@
           <w:tab w:val="right" w:leader="dot" w:pos="9350"/>
         </w:tabs>
         <w:rPr>
-          <w:rFonts w:asciiTheme="minorHAnsi" w:eastAsiaTheme="minorEastAsia" w:hAnsiTheme="minorHAnsi" w:cstheme="minorBidi"/>
           <w:noProof/>
-          <w:color w:val="auto"/>
-          <w:kern w:val="2"/>
-          <w:sz w:val="24"/>
-          <w:szCs w:val="24"/>
-          <w14:ligatures w14:val="standardContextual"/>
-        </w:rPr>
-      </w:pPr>
-      <w:hyperlink w:anchor="_Toc243832788" w:history="1">
+        </w:rPr>
+      </w:pPr>
+      <w:hyperlink w:anchor="_Toc243833166" w:history="1">
         <w:r>
           <w:rPr>
             <w:rStyle w:val="Hyperlink"/>
@@ -2414,7 +2222,7 @@
             <w:noProof/>
             <w:webHidden/>
           </w:rPr>
-          <w:instrText xml:space="preserve"> PAGEREF _Toc243832788 \h </w:instrText>
+          <w:instrText xml:space="preserve"> PAGEREF _Toc243833166 \h </w:instrText>
         </w:r>
         <w:r>
           <w:rPr>
@@ -2452,16 +2260,10 @@
           <w:tab w:val="right" w:leader="dot" w:pos="9350"/>
         </w:tabs>
         <w:rPr>
-          <w:rFonts w:asciiTheme="minorHAnsi" w:eastAsiaTheme="minorEastAsia" w:hAnsiTheme="minorHAnsi" w:cstheme="minorBidi"/>
           <w:noProof/>
-          <w:color w:val="auto"/>
-          <w:kern w:val="2"/>
-          <w:sz w:val="24"/>
-          <w:szCs w:val="24"/>
-          <w14:ligatures w14:val="standardContextual"/>
-        </w:rPr>
-      </w:pPr>
-      <w:hyperlink w:anchor="_Toc243832789" w:history="1">
+        </w:rPr>
+      </w:pPr>
+      <w:hyperlink w:anchor="_Toc243833167" w:history="1">
         <w:r>
           <w:rPr>
             <w:rStyle w:val="Hyperlink"/>
@@ -2488,7 +2290,7 @@
             <w:noProof/>
             <w:webHidden/>
           </w:rPr>
-          <w:instrText xml:space="preserve"> PAGEREF _Toc243832789 \h </w:instrText>
+          <w:instrText xml:space="preserve"> PAGEREF _Toc243833167 \h </w:instrText>
         </w:r>
         <w:r>
           <w:rPr>
@@ -2526,16 +2328,10 @@
           <w:tab w:val="right" w:leader="dot" w:pos="9350"/>
         </w:tabs>
         <w:rPr>
-          <w:rFonts w:asciiTheme="minorHAnsi" w:eastAsiaTheme="minorEastAsia" w:hAnsiTheme="minorHAnsi" w:cstheme="minorBidi"/>
           <w:noProof/>
-          <w:color w:val="auto"/>
-          <w:kern w:val="2"/>
-          <w:sz w:val="24"/>
-          <w:szCs w:val="24"/>
-          <w14:ligatures w14:val="standardContextual"/>
-        </w:rPr>
-      </w:pPr>
-      <w:hyperlink w:anchor="_Toc243832790" w:history="1">
+        </w:rPr>
+      </w:pPr>
+      <w:hyperlink w:anchor="_Toc243833168" w:history="1">
         <w:r>
           <w:rPr>
             <w:rStyle w:val="Hyperlink"/>
@@ -2562,7 +2358,7 @@
             <w:noProof/>
             <w:webHidden/>
           </w:rPr>
-          <w:instrText xml:space="preserve"> PAGEREF _Toc243832790 \h </w:instrText>
+          <w:instrText xml:space="preserve"> PAGEREF _Toc243833168 \h </w:instrText>
         </w:r>
         <w:r>
           <w:rPr>
@@ -2600,16 +2396,10 @@
           <w:tab w:val="right" w:leader="dot" w:pos="9350"/>
         </w:tabs>
         <w:rPr>
-          <w:rFonts w:asciiTheme="minorHAnsi" w:eastAsiaTheme="minorEastAsia" w:hAnsiTheme="minorHAnsi" w:cstheme="minorBidi"/>
           <w:noProof/>
-          <w:color w:val="auto"/>
-          <w:kern w:val="2"/>
-          <w:sz w:val="24"/>
-          <w:szCs w:val="24"/>
-          <w14:ligatures w14:val="standardContextual"/>
-        </w:rPr>
-      </w:pPr>
-      <w:hyperlink w:anchor="_Toc243832791" w:history="1">
+        </w:rPr>
+      </w:pPr>
+      <w:hyperlink w:anchor="_Toc243833169" w:history="1">
         <w:r>
           <w:rPr>
             <w:rStyle w:val="Hyperlink"/>
@@ -2636,7 +2426,7 @@
             <w:noProof/>
             <w:webHidden/>
           </w:rPr>
-          <w:instrText xml:space="preserve"> PAGEREF _Toc243832791 \h </w:instrText>
+          <w:instrText xml:space="preserve"> PAGEREF _Toc243833169 \h </w:instrText>
         </w:r>
         <w:r>
           <w:rPr>
@@ -2674,16 +2464,10 @@
           <w:tab w:val="right" w:leader="dot" w:pos="9350"/>
         </w:tabs>
         <w:rPr>
-          <w:rFonts w:asciiTheme="minorHAnsi" w:eastAsiaTheme="minorEastAsia" w:hAnsiTheme="minorHAnsi" w:cstheme="minorBidi"/>
           <w:noProof/>
-          <w:color w:val="auto"/>
-          <w:kern w:val="2"/>
-          <w:sz w:val="24"/>
-          <w:szCs w:val="24"/>
-          <w14:ligatures w14:val="standardContextual"/>
-        </w:rPr>
-      </w:pPr>
-      <w:hyperlink w:anchor="_Toc243832792" w:history="1">
+        </w:rPr>
+      </w:pPr>
+      <w:hyperlink w:anchor="_Toc243833170" w:history="1">
         <w:r>
           <w:rPr>
             <w:rStyle w:val="Hyperlink"/>
@@ -2710,7 +2494,7 @@
             <w:noProof/>
             <w:webHidden/>
           </w:rPr>
-          <w:instrText xml:space="preserve"> PAGEREF _Toc243832792 \h </w:instrText>
+          <w:instrText xml:space="preserve"> PAGEREF _Toc243833170 \h </w:instrText>
         </w:r>
         <w:r>
           <w:rPr>
@@ -2748,16 +2532,10 @@
           <w:tab w:val="right" w:leader="dot" w:pos="9350"/>
         </w:tabs>
         <w:rPr>
-          <w:rFonts w:asciiTheme="minorHAnsi" w:eastAsiaTheme="minorEastAsia" w:hAnsiTheme="minorHAnsi" w:cstheme="minorBidi"/>
           <w:noProof/>
-          <w:color w:val="auto"/>
-          <w:kern w:val="2"/>
-          <w:sz w:val="24"/>
-          <w:szCs w:val="24"/>
-          <w14:ligatures w14:val="standardContextual"/>
-        </w:rPr>
-      </w:pPr>
-      <w:hyperlink w:anchor="_Toc243832793" w:history="1">
+        </w:rPr>
+      </w:pPr>
+      <w:hyperlink w:anchor="_Toc243833171" w:history="1">
         <w:r>
           <w:rPr>
             <w:rStyle w:val="Hyperlink"/>
@@ -2784,7 +2562,7 @@
             <w:noProof/>
             <w:webHidden/>
           </w:rPr>
-          <w:instrText xml:space="preserve"> PAGEREF _Toc243832793 \h </w:instrText>
+          <w:instrText xml:space="preserve"> PAGEREF _Toc243833171 \h </w:instrText>
         </w:r>
         <w:r>
           <w:rPr>
@@ -2822,16 +2600,10 @@
           <w:tab w:val="right" w:leader="dot" w:pos="9350"/>
         </w:tabs>
         <w:rPr>
-          <w:rFonts w:asciiTheme="minorHAnsi" w:eastAsiaTheme="minorEastAsia" w:hAnsiTheme="minorHAnsi" w:cstheme="minorBidi"/>
           <w:noProof/>
-          <w:color w:val="auto"/>
-          <w:kern w:val="2"/>
-          <w:sz w:val="24"/>
-          <w:szCs w:val="24"/>
-          <w14:ligatures w14:val="standardContextual"/>
-        </w:rPr>
-      </w:pPr>
-      <w:hyperlink w:anchor="_Toc243832794" w:history="1">
+        </w:rPr>
+      </w:pPr>
+      <w:hyperlink w:anchor="_Toc243833172" w:history="1">
         <w:r>
           <w:rPr>
             <w:rStyle w:val="Hyperlink"/>
@@ -2858,7 +2630,7 @@
             <w:noProof/>
             <w:webHidden/>
           </w:rPr>
-          <w:instrText xml:space="preserve"> PAGEREF _Toc243832794 \h </w:instrText>
+          <w:instrText xml:space="preserve"> PAGEREF _Toc243833172 \h </w:instrText>
         </w:r>
         <w:r>
           <w:rPr>
@@ -2896,16 +2668,10 @@
           <w:tab w:val="right" w:leader="dot" w:pos="9350"/>
         </w:tabs>
         <w:rPr>
-          <w:rFonts w:asciiTheme="minorHAnsi" w:eastAsiaTheme="minorEastAsia" w:hAnsiTheme="minorHAnsi" w:cstheme="minorBidi"/>
           <w:noProof/>
-          <w:color w:val="auto"/>
-          <w:kern w:val="2"/>
-          <w:sz w:val="24"/>
-          <w:szCs w:val="24"/>
-          <w14:ligatures w14:val="standardContextual"/>
-        </w:rPr>
-      </w:pPr>
-      <w:hyperlink w:anchor="_Toc243832795" w:history="1">
+        </w:rPr>
+      </w:pPr>
+      <w:hyperlink w:anchor="_Toc243833173" w:history="1">
         <w:r>
           <w:rPr>
             <w:rStyle w:val="Hyperlink"/>
@@ -2932,7 +2698,7 @@
             <w:noProof/>
             <w:webHidden/>
           </w:rPr>
-          <w:instrText xml:space="preserve"> PAGEREF _Toc243832795 \h </w:instrText>
+          <w:instrText xml:space="preserve"> PAGEREF _Toc243833173 \h </w:instrText>
         </w:r>
         <w:r>
           <w:rPr>
@@ -2970,16 +2736,10 @@
           <w:tab w:val="right" w:leader="dot" w:pos="9350"/>
         </w:tabs>
         <w:rPr>
-          <w:rFonts w:asciiTheme="minorHAnsi" w:eastAsiaTheme="minorEastAsia" w:hAnsiTheme="minorHAnsi" w:cstheme="minorBidi"/>
           <w:noProof/>
-          <w:color w:val="auto"/>
-          <w:kern w:val="2"/>
-          <w:sz w:val="24"/>
-          <w:szCs w:val="24"/>
-          <w14:ligatures w14:val="standardContextual"/>
-        </w:rPr>
-      </w:pPr>
-      <w:hyperlink w:anchor="_Toc243832796" w:history="1">
+        </w:rPr>
+      </w:pPr>
+      <w:hyperlink w:anchor="_Toc243833174" w:history="1">
         <w:r>
           <w:rPr>
             <w:rStyle w:val="Hyperlink"/>
@@ -3006,7 +2766,7 @@
             <w:noProof/>
             <w:webHidden/>
           </w:rPr>
-          <w:instrText xml:space="preserve"> PAGEREF _Toc243832796 \h </w:instrText>
+          <w:instrText xml:space="preserve"> PAGEREF _Toc243833174 \h </w:instrText>
         </w:r>
         <w:r>
           <w:rPr>
@@ -3044,16 +2804,10 @@
           <w:tab w:val="right" w:leader="dot" w:pos="9350"/>
         </w:tabs>
         <w:rPr>
-          <w:rFonts w:asciiTheme="minorHAnsi" w:eastAsiaTheme="minorEastAsia" w:hAnsiTheme="minorHAnsi" w:cstheme="minorBidi"/>
           <w:noProof/>
-          <w:color w:val="auto"/>
-          <w:kern w:val="2"/>
-          <w:sz w:val="24"/>
-          <w:szCs w:val="24"/>
-          <w14:ligatures w14:val="standardContextual"/>
-        </w:rPr>
-      </w:pPr>
-      <w:hyperlink w:anchor="_Toc243832797" w:history="1">
+        </w:rPr>
+      </w:pPr>
+      <w:hyperlink w:anchor="_Toc243833175" w:history="1">
         <w:r>
           <w:rPr>
             <w:rStyle w:val="Hyperlink"/>
@@ -3080,7 +2834,7 @@
             <w:noProof/>
             <w:webHidden/>
           </w:rPr>
-          <w:instrText xml:space="preserve"> PAGEREF _Toc243832797 \h </w:instrText>
+          <w:instrText xml:space="preserve"> PAGEREF _Toc243833175 \h </w:instrText>
         </w:r>
         <w:r>
           <w:rPr>
@@ -3118,16 +2872,10 @@
           <w:tab w:val="right" w:leader="dot" w:pos="9350"/>
         </w:tabs>
         <w:rPr>
-          <w:rFonts w:asciiTheme="minorHAnsi" w:eastAsiaTheme="minorEastAsia" w:hAnsiTheme="minorHAnsi" w:cstheme="minorBidi"/>
           <w:noProof/>
-          <w:color w:val="auto"/>
-          <w:kern w:val="2"/>
-          <w:sz w:val="24"/>
-          <w:szCs w:val="24"/>
-          <w14:ligatures w14:val="standardContextual"/>
-        </w:rPr>
-      </w:pPr>
-      <w:hyperlink w:anchor="_Toc243832798" w:history="1">
+        </w:rPr>
+      </w:pPr>
+      <w:hyperlink w:anchor="_Toc243833176" w:history="1">
         <w:r>
           <w:rPr>
             <w:rStyle w:val="Hyperlink"/>
@@ -3154,7 +2902,7 @@
             <w:noProof/>
             <w:webHidden/>
           </w:rPr>
-          <w:instrText xml:space="preserve"> PAGEREF _Toc243832798 \h </w:instrText>
+          <w:instrText xml:space="preserve"> PAGEREF _Toc243833176 \h </w:instrText>
         </w:r>
         <w:r>
           <w:rPr>
@@ -3192,16 +2940,10 @@
           <w:tab w:val="right" w:leader="dot" w:pos="9350"/>
         </w:tabs>
         <w:rPr>
-          <w:rFonts w:asciiTheme="minorHAnsi" w:eastAsiaTheme="minorEastAsia" w:hAnsiTheme="minorHAnsi" w:cstheme="minorBidi"/>
           <w:noProof/>
-          <w:color w:val="auto"/>
-          <w:kern w:val="2"/>
-          <w:sz w:val="24"/>
-          <w:szCs w:val="24"/>
-          <w14:ligatures w14:val="standardContextual"/>
-        </w:rPr>
-      </w:pPr>
-      <w:hyperlink w:anchor="_Toc243832799" w:history="1">
+        </w:rPr>
+      </w:pPr>
+      <w:hyperlink w:anchor="_Toc243833177" w:history="1">
         <w:r>
           <w:rPr>
             <w:rStyle w:val="Hyperlink"/>
@@ -3228,7 +2970,7 @@
             <w:noProof/>
             <w:webHidden/>
           </w:rPr>
-          <w:instrText xml:space="preserve"> PAGEREF _Toc243832799 \h </w:instrText>
+          <w:instrText xml:space="preserve"> PAGEREF _Toc243833177 \h </w:instrText>
         </w:r>
         <w:r>
           <w:rPr>
@@ -3266,16 +3008,10 @@
           <w:tab w:val="right" w:leader="dot" w:pos="9350"/>
         </w:tabs>
         <w:rPr>
-          <w:rFonts w:asciiTheme="minorHAnsi" w:eastAsiaTheme="minorEastAsia" w:hAnsiTheme="minorHAnsi" w:cstheme="minorBidi"/>
           <w:noProof/>
-          <w:color w:val="auto"/>
-          <w:kern w:val="2"/>
-          <w:sz w:val="24"/>
-          <w:szCs w:val="24"/>
-          <w14:ligatures w14:val="standardContextual"/>
-        </w:rPr>
-      </w:pPr>
-      <w:hyperlink w:anchor="_Toc243832800" w:history="1">
+        </w:rPr>
+      </w:pPr>
+      <w:hyperlink w:anchor="_Toc243833178" w:history="1">
         <w:r>
           <w:rPr>
             <w:rStyle w:val="Hyperlink"/>
@@ -3302,7 +3038,7 @@
             <w:noProof/>
             <w:webHidden/>
           </w:rPr>
-          <w:instrText xml:space="preserve"> PAGEREF _Toc243832800 \h </w:instrText>
+          <w:instrText xml:space="preserve"> PAGEREF _Toc243833178 \h </w:instrText>
         </w:r>
         <w:r>
           <w:rPr>
@@ -3340,16 +3076,10 @@
           <w:tab w:val="right" w:leader="dot" w:pos="9350"/>
         </w:tabs>
         <w:rPr>
-          <w:rFonts w:asciiTheme="minorHAnsi" w:eastAsiaTheme="minorEastAsia" w:hAnsiTheme="minorHAnsi" w:cstheme="minorBidi"/>
           <w:noProof/>
-          <w:color w:val="auto"/>
-          <w:kern w:val="2"/>
-          <w:sz w:val="24"/>
-          <w:szCs w:val="24"/>
-          <w14:ligatures w14:val="standardContextual"/>
-        </w:rPr>
-      </w:pPr>
-      <w:hyperlink w:anchor="_Toc243832801" w:history="1">
+        </w:rPr>
+      </w:pPr>
+      <w:hyperlink w:anchor="_Toc243833179" w:history="1">
         <w:r>
           <w:rPr>
             <w:rStyle w:val="Hyperlink"/>
@@ -3376,7 +3106,7 @@
             <w:noProof/>
             <w:webHidden/>
           </w:rPr>
-          <w:instrText xml:space="preserve"> PAGEREF _Toc243832801 \h </w:instrText>
+          <w:instrText xml:space="preserve"> PAGEREF _Toc243833179 \h </w:instrText>
         </w:r>
         <w:r>
           <w:rPr>
@@ -3414,16 +3144,10 @@
           <w:tab w:val="right" w:leader="dot" w:pos="9350"/>
         </w:tabs>
         <w:rPr>
-          <w:rFonts w:asciiTheme="minorHAnsi" w:eastAsiaTheme="minorEastAsia" w:hAnsiTheme="minorHAnsi" w:cstheme="minorBidi"/>
           <w:noProof/>
-          <w:color w:val="auto"/>
-          <w:kern w:val="2"/>
-          <w:sz w:val="24"/>
-          <w:szCs w:val="24"/>
-          <w14:ligatures w14:val="standardContextual"/>
-        </w:rPr>
-      </w:pPr>
-      <w:hyperlink w:anchor="_Toc243832802" w:history="1">
+        </w:rPr>
+      </w:pPr>
+      <w:hyperlink w:anchor="_Toc243833180" w:history="1">
         <w:r>
           <w:rPr>
             <w:rStyle w:val="Hyperlink"/>
@@ -3450,7 +3174,7 @@
             <w:noProof/>
             <w:webHidden/>
           </w:rPr>
-          <w:instrText xml:space="preserve"> PAGEREF _Toc243832802 \h </w:instrText>
+          <w:instrText xml:space="preserve"> PAGEREF _Toc243833180 \h </w:instrText>
         </w:r>
         <w:r>
           <w:rPr>
@@ -3488,16 +3212,10 @@
           <w:tab w:val="right" w:leader="dot" w:pos="9350"/>
         </w:tabs>
         <w:rPr>
-          <w:rFonts w:asciiTheme="minorHAnsi" w:eastAsiaTheme="minorEastAsia" w:hAnsiTheme="minorHAnsi" w:cstheme="minorBidi"/>
           <w:noProof/>
-          <w:color w:val="auto"/>
-          <w:kern w:val="2"/>
-          <w:sz w:val="24"/>
-          <w:szCs w:val="24"/>
-          <w14:ligatures w14:val="standardContextual"/>
-        </w:rPr>
-      </w:pPr>
-      <w:hyperlink w:anchor="_Toc243832803" w:history="1">
+        </w:rPr>
+      </w:pPr>
+      <w:hyperlink w:anchor="_Toc243833181" w:history="1">
         <w:r>
           <w:rPr>
             <w:rStyle w:val="Hyperlink"/>
@@ -3524,7 +3242,7 @@
             <w:noProof/>
             <w:webHidden/>
           </w:rPr>
-          <w:instrText xml:space="preserve"> PAGEREF _Toc243832803 \h </w:instrText>
+          <w:instrText xml:space="preserve"> PAGEREF _Toc243833181 \h </w:instrText>
         </w:r>
         <w:r>
           <w:rPr>
@@ -3562,16 +3280,10 @@
           <w:tab w:val="right" w:leader="dot" w:pos="9350"/>
         </w:tabs>
         <w:rPr>
-          <w:rFonts w:asciiTheme="minorHAnsi" w:eastAsiaTheme="minorEastAsia" w:hAnsiTheme="minorHAnsi" w:cstheme="minorBidi"/>
           <w:noProof/>
-          <w:color w:val="auto"/>
-          <w:kern w:val="2"/>
-          <w:sz w:val="24"/>
-          <w:szCs w:val="24"/>
-          <w14:ligatures w14:val="standardContextual"/>
-        </w:rPr>
-      </w:pPr>
-      <w:hyperlink w:anchor="_Toc243832804" w:history="1">
+        </w:rPr>
+      </w:pPr>
+      <w:hyperlink w:anchor="_Toc243833182" w:history="1">
         <w:r>
           <w:rPr>
             <w:rStyle w:val="Hyperlink"/>
@@ -3598,7 +3310,7 @@
             <w:noProof/>
             <w:webHidden/>
           </w:rPr>
-          <w:instrText xml:space="preserve"> PAGEREF _Toc243832804 \h </w:instrText>
+          <w:instrText xml:space="preserve"> PAGEREF _Toc243833182 \h </w:instrText>
         </w:r>
         <w:r>
           <w:rPr>
@@ -3636,16 +3348,10 @@
           <w:tab w:val="right" w:leader="dot" w:pos="9350"/>
         </w:tabs>
         <w:rPr>
-          <w:rFonts w:asciiTheme="minorHAnsi" w:eastAsiaTheme="minorEastAsia" w:hAnsiTheme="minorHAnsi" w:cstheme="minorBidi"/>
           <w:noProof/>
-          <w:color w:val="auto"/>
-          <w:kern w:val="2"/>
-          <w:sz w:val="24"/>
-          <w:szCs w:val="24"/>
-          <w14:ligatures w14:val="standardContextual"/>
-        </w:rPr>
-      </w:pPr>
-      <w:hyperlink w:anchor="_Toc243832805" w:history="1">
+        </w:rPr>
+      </w:pPr>
+      <w:hyperlink w:anchor="_Toc243833183" w:history="1">
         <w:r>
           <w:rPr>
             <w:rStyle w:val="Hyperlink"/>
@@ -3672,7 +3378,7 @@
             <w:noProof/>
             <w:webHidden/>
           </w:rPr>
-          <w:instrText xml:space="preserve"> PAGEREF _Toc243832805 \h </w:instrText>
+          <w:instrText xml:space="preserve"> PAGEREF _Toc243833183 \h </w:instrText>
         </w:r>
         <w:r>
           <w:rPr>
@@ -3710,16 +3416,10 @@
           <w:tab w:val="right" w:leader="dot" w:pos="9350"/>
         </w:tabs>
         <w:rPr>
-          <w:rFonts w:asciiTheme="minorHAnsi" w:eastAsiaTheme="minorEastAsia" w:hAnsiTheme="minorHAnsi" w:cstheme="minorBidi"/>
           <w:noProof/>
-          <w:color w:val="auto"/>
-          <w:kern w:val="2"/>
-          <w:sz w:val="24"/>
-          <w:szCs w:val="24"/>
-          <w14:ligatures w14:val="standardContextual"/>
-        </w:rPr>
-      </w:pPr>
-      <w:hyperlink w:anchor="_Toc243832806" w:history="1">
+        </w:rPr>
+      </w:pPr>
+      <w:hyperlink w:anchor="_Toc243833184" w:history="1">
         <w:r>
           <w:rPr>
             <w:rStyle w:val="Hyperlink"/>
@@ -3746,7 +3446,7 @@
             <w:noProof/>
             <w:webHidden/>
           </w:rPr>
-          <w:instrText xml:space="preserve"> PAGEREF _Toc243832806 \h </w:instrText>
+          <w:instrText xml:space="preserve"> PAGEREF _Toc243833184 \h </w:instrText>
         </w:r>
         <w:r>
           <w:rPr>
@@ -3784,16 +3484,10 @@
           <w:tab w:val="right" w:leader="dot" w:pos="9350"/>
         </w:tabs>
         <w:rPr>
-          <w:rFonts w:asciiTheme="minorHAnsi" w:eastAsiaTheme="minorEastAsia" w:hAnsiTheme="minorHAnsi" w:cstheme="minorBidi"/>
           <w:noProof/>
-          <w:color w:val="auto"/>
-          <w:kern w:val="2"/>
-          <w:sz w:val="24"/>
-          <w:szCs w:val="24"/>
-          <w14:ligatures w14:val="standardContextual"/>
-        </w:rPr>
-      </w:pPr>
-      <w:hyperlink w:anchor="_Toc243832807" w:history="1">
+        </w:rPr>
+      </w:pPr>
+      <w:hyperlink w:anchor="_Toc243833185" w:history="1">
         <w:r>
           <w:rPr>
             <w:rStyle w:val="Hyperlink"/>
@@ -3820,7 +3514,7 @@
             <w:noProof/>
             <w:webHidden/>
           </w:rPr>
-          <w:instrText xml:space="preserve"> PAGEREF _Toc243832807 \h </w:instrText>
+          <w:instrText xml:space="preserve"> PAGEREF _Toc243833185 \h </w:instrText>
         </w:r>
         <w:r>
           <w:rPr>
@@ -3858,16 +3552,10 @@
           <w:tab w:val="right" w:leader="dot" w:pos="9350"/>
         </w:tabs>
         <w:rPr>
-          <w:rFonts w:asciiTheme="minorHAnsi" w:eastAsiaTheme="minorEastAsia" w:hAnsiTheme="minorHAnsi" w:cstheme="minorBidi"/>
           <w:noProof/>
-          <w:color w:val="auto"/>
-          <w:kern w:val="2"/>
-          <w:sz w:val="24"/>
-          <w:szCs w:val="24"/>
-          <w14:ligatures w14:val="standardContextual"/>
-        </w:rPr>
-      </w:pPr>
-      <w:hyperlink w:anchor="_Toc243832808" w:history="1">
+        </w:rPr>
+      </w:pPr>
+      <w:hyperlink w:anchor="_Toc243833186" w:history="1">
         <w:r>
           <w:rPr>
             <w:rStyle w:val="Hyperlink"/>
@@ -3894,7 +3582,7 @@
             <w:noProof/>
             <w:webHidden/>
           </w:rPr>
-          <w:instrText xml:space="preserve"> PAGEREF _Toc243832808 \h </w:instrText>
+          <w:instrText xml:space="preserve"> PAGEREF _Toc243833186 \h </w:instrText>
         </w:r>
         <w:r>
           <w:rPr>
@@ -3932,16 +3620,10 @@
           <w:tab w:val="right" w:leader="dot" w:pos="9350"/>
         </w:tabs>
         <w:rPr>
-          <w:rFonts w:asciiTheme="minorHAnsi" w:eastAsiaTheme="minorEastAsia" w:hAnsiTheme="minorHAnsi" w:cstheme="minorBidi"/>
           <w:noProof/>
-          <w:color w:val="auto"/>
-          <w:kern w:val="2"/>
-          <w:sz w:val="24"/>
-          <w:szCs w:val="24"/>
-          <w14:ligatures w14:val="standardContextual"/>
-        </w:rPr>
-      </w:pPr>
-      <w:hyperlink w:anchor="_Toc243832809" w:history="1">
+        </w:rPr>
+      </w:pPr>
+      <w:hyperlink w:anchor="_Toc243833187" w:history="1">
         <w:r>
           <w:rPr>
             <w:rStyle w:val="Hyperlink"/>
@@ -3968,7 +3650,7 @@
             <w:noProof/>
             <w:webHidden/>
           </w:rPr>
-          <w:instrText xml:space="preserve"> PAGEREF _Toc243832809 \h </w:instrText>
+          <w:instrText xml:space="preserve"> PAGEREF _Toc243833187 \h </w:instrText>
         </w:r>
         <w:r>
           <w:rPr>
@@ -4006,16 +3688,10 @@
           <w:tab w:val="right" w:leader="dot" w:pos="9350"/>
         </w:tabs>
         <w:rPr>
-          <w:rFonts w:asciiTheme="minorHAnsi" w:eastAsiaTheme="minorEastAsia" w:hAnsiTheme="minorHAnsi" w:cstheme="minorBidi"/>
           <w:noProof/>
-          <w:color w:val="auto"/>
-          <w:kern w:val="2"/>
-          <w:sz w:val="24"/>
-          <w:szCs w:val="24"/>
-          <w14:ligatures w14:val="standardContextual"/>
-        </w:rPr>
-      </w:pPr>
-      <w:hyperlink w:anchor="_Toc243832810" w:history="1">
+        </w:rPr>
+      </w:pPr>
+      <w:hyperlink w:anchor="_Toc243833188" w:history="1">
         <w:r>
           <w:rPr>
             <w:rStyle w:val="Hyperlink"/>
@@ -4042,7 +3718,7 @@
             <w:noProof/>
             <w:webHidden/>
           </w:rPr>
-          <w:instrText xml:space="preserve"> PAGEREF _Toc243832810 \h </w:instrText>
+          <w:instrText xml:space="preserve"> PAGEREF _Toc243833188 \h </w:instrText>
         </w:r>
         <w:r>
           <w:rPr>
@@ -4080,16 +3756,10 @@
           <w:tab w:val="right" w:leader="dot" w:pos="9350"/>
         </w:tabs>
         <w:rPr>
-          <w:rFonts w:asciiTheme="minorHAnsi" w:eastAsiaTheme="minorEastAsia" w:hAnsiTheme="minorHAnsi" w:cstheme="minorBidi"/>
           <w:noProof/>
-          <w:color w:val="auto"/>
-          <w:kern w:val="2"/>
-          <w:sz w:val="24"/>
-          <w:szCs w:val="24"/>
-          <w14:ligatures w14:val="standardContextual"/>
-        </w:rPr>
-      </w:pPr>
-      <w:hyperlink w:anchor="_Toc243832811" w:history="1">
+        </w:rPr>
+      </w:pPr>
+      <w:hyperlink w:anchor="_Toc243833189" w:history="1">
         <w:r>
           <w:rPr>
             <w:rStyle w:val="Hyperlink"/>
@@ -4116,7 +3786,7 @@
             <w:noProof/>
             <w:webHidden/>
           </w:rPr>
-          <w:instrText xml:space="preserve"> PAGEREF _Toc243832811 \h </w:instrText>
+          <w:instrText xml:space="preserve"> PAGEREF _Toc243833189 \h </w:instrText>
         </w:r>
         <w:r>
           <w:rPr>
@@ -4154,16 +3824,10 @@
           <w:tab w:val="right" w:leader="dot" w:pos="9350"/>
         </w:tabs>
         <w:rPr>
-          <w:rFonts w:asciiTheme="minorHAnsi" w:eastAsiaTheme="minorEastAsia" w:hAnsiTheme="minorHAnsi" w:cstheme="minorBidi"/>
           <w:noProof/>
-          <w:color w:val="auto"/>
-          <w:kern w:val="2"/>
-          <w:sz w:val="24"/>
-          <w:szCs w:val="24"/>
-          <w14:ligatures w14:val="standardContextual"/>
-        </w:rPr>
-      </w:pPr>
-      <w:hyperlink w:anchor="_Toc243832812" w:history="1">
+        </w:rPr>
+      </w:pPr>
+      <w:hyperlink w:anchor="_Toc243833190" w:history="1">
         <w:r>
           <w:rPr>
             <w:rStyle w:val="Hyperlink"/>
@@ -4190,7 +3854,7 @@
             <w:noProof/>
             <w:webHidden/>
           </w:rPr>
-          <w:instrText xml:space="preserve"> PAGEREF _Toc243832812 \h </w:instrText>
+          <w:instrText xml:space="preserve"> PAGEREF _Toc243833190 \h </w:instrText>
         </w:r>
         <w:r>
           <w:rPr>
@@ -4228,16 +3892,10 @@
           <w:tab w:val="right" w:leader="dot" w:pos="9350"/>
         </w:tabs>
         <w:rPr>
-          <w:rFonts w:asciiTheme="minorHAnsi" w:eastAsiaTheme="minorEastAsia" w:hAnsiTheme="minorHAnsi" w:cstheme="minorBidi"/>
           <w:noProof/>
-          <w:color w:val="auto"/>
-          <w:kern w:val="2"/>
-          <w:sz w:val="24"/>
-          <w:szCs w:val="24"/>
-          <w14:ligatures w14:val="standardContextual"/>
-        </w:rPr>
-      </w:pPr>
-      <w:hyperlink w:anchor="_Toc243832813" w:history="1">
+        </w:rPr>
+      </w:pPr>
+      <w:hyperlink w:anchor="_Toc243833191" w:history="1">
         <w:r>
           <w:rPr>
             <w:rStyle w:val="Hyperlink"/>
@@ -4264,7 +3922,7 @@
             <w:noProof/>
             <w:webHidden/>
           </w:rPr>
-          <w:instrText xml:space="preserve"> PAGEREF _Toc243832813 \h </w:instrText>
+          <w:instrText xml:space="preserve"> PAGEREF _Toc243833191 \h </w:instrText>
         </w:r>
         <w:r>
           <w:rPr>
@@ -4302,16 +3960,10 @@
           <w:tab w:val="right" w:leader="dot" w:pos="9350"/>
         </w:tabs>
         <w:rPr>
-          <w:rFonts w:asciiTheme="minorHAnsi" w:eastAsiaTheme="minorEastAsia" w:hAnsiTheme="minorHAnsi" w:cstheme="minorBidi"/>
           <w:noProof/>
-          <w:color w:val="auto"/>
-          <w:kern w:val="2"/>
-          <w:sz w:val="24"/>
-          <w:szCs w:val="24"/>
-          <w14:ligatures w14:val="standardContextual"/>
-        </w:rPr>
-      </w:pPr>
-      <w:hyperlink w:anchor="_Toc243832814" w:history="1">
+        </w:rPr>
+      </w:pPr>
+      <w:hyperlink w:anchor="_Toc243833192" w:history="1">
         <w:r>
           <w:rPr>
             <w:rStyle w:val="Hyperlink"/>
@@ -4338,7 +3990,7 @@
             <w:noProof/>
             <w:webHidden/>
           </w:rPr>
-          <w:instrText xml:space="preserve"> PAGEREF _Toc243832814 \h </w:instrText>
+          <w:instrText xml:space="preserve"> PAGEREF _Toc243833192 \h </w:instrText>
         </w:r>
         <w:r>
           <w:rPr>
@@ -4376,16 +4028,10 @@
           <w:tab w:val="right" w:leader="dot" w:pos="9350"/>
         </w:tabs>
         <w:rPr>
-          <w:rFonts w:asciiTheme="minorHAnsi" w:eastAsiaTheme="minorEastAsia" w:hAnsiTheme="minorHAnsi" w:cstheme="minorBidi"/>
           <w:noProof/>
-          <w:color w:val="auto"/>
-          <w:kern w:val="2"/>
-          <w:sz w:val="24"/>
-          <w:szCs w:val="24"/>
-          <w14:ligatures w14:val="standardContextual"/>
-        </w:rPr>
-      </w:pPr>
-      <w:hyperlink w:anchor="_Toc243832815" w:history="1">
+        </w:rPr>
+      </w:pPr>
+      <w:hyperlink w:anchor="_Toc243833193" w:history="1">
         <w:r>
           <w:rPr>
             <w:rStyle w:val="Hyperlink"/>
@@ -4412,7 +4058,7 @@
             <w:noProof/>
             <w:webHidden/>
           </w:rPr>
-          <w:instrText xml:space="preserve"> PAGEREF _Toc243832815 \h </w:instrText>
+          <w:instrText xml:space="preserve"> PAGEREF _Toc243833193 \h </w:instrText>
         </w:r>
         <w:r>
           <w:rPr>
@@ -4457,7 +4103,7 @@
       <w:pPr>
         <w:pStyle w:val="Heading1"/>
       </w:pPr>
-      <w:bookmarkStart w:id="0" w:name="_Toc243832757"/>
+      <w:bookmarkStart w:id="0" w:name="_Toc243833135"/>
       <w:r>
         <w:lastRenderedPageBreak/>
         <w:t>Foreword</w:t>
@@ -4465,58 +4111,24 @@
       <w:bookmarkEnd w:id="0"/>
     </w:p>
     <w:p>
-      <w:pPr>
-        <w:spacing w:after="200" w:line="276" w:lineRule="auto"/>
-      </w:pPr>
-      <w:r>
-        <w:t xml:space="preserve">Half Cat Rocketry needed a better method to manage CAD than sharing files through a common cloud drive folder, which had become burdensome over years of modeling and manual version tracking. A better solution was needed, and it was recognized that many student and hobbyist teams could also benefit from </w:t>
-      </w:r>
-      <w:r>
-        <w:t>free</w:t>
-      </w:r>
-      <w:r>
-        <w:t xml:space="preserve"> PDM software designed for modestly-sized teams.</w:t>
-      </w:r>
-    </w:p>
-    <w:p>
-      <w:pPr>
-        <w:spacing w:after="200" w:line="276" w:lineRule="auto"/>
-      </w:pPr>
-      <w:r>
-        <w:t>Litterbox is almost entirely vibecoded, as is most of this guide, using Claude Code (Opus 5.5). The author of this program does not have anywhere close to the coding skills required to create a PDM from scratch, but does know a thing or two about CAD and process management in engineering. Litterbox would not have been possible without</w:t>
-      </w:r>
-      <w:r>
-        <w:t xml:space="preserve"> </w:t>
-      </w:r>
-      <w:r>
-        <w:t xml:space="preserve">AI coding tools that have become available in </w:t>
-      </w:r>
-      <w:r>
-        <w:t xml:space="preserve">recent times, with the hope that students become acquainted with a basic version of the tools they will encounter in their careers. </w:t>
-      </w:r>
-    </w:p>
-    <w:p>
-      <w:pPr>
-        <w:spacing w:after="200" w:line="276" w:lineRule="auto"/>
-      </w:pPr>
-      <w:r>
-        <w:t>Litterbox is provided as-is under the MIT open-source license, for the benefit of the engineering community at large. Half Cat Rocketry makes no attempt to monetize this software nor restrict its usage.</w:t>
-      </w:r>
-      <w:r>
-        <w:t xml:space="preserve"> A best-effort was made to design it as user-friendly and forgiving as possible so that it is usable without an in-depth knowledge of Python or Git.</w:t>
-      </w:r>
-    </w:p>
-    <w:p>
-      <w:pPr>
-        <w:spacing w:after="200" w:line="276" w:lineRule="auto"/>
-        <w:rPr>
-          <w:b/>
-          <w:bCs/>
-          <w:color w:val="1F5F8B"/>
-          <w:sz w:val="36"/>
-          <w:szCs w:val="28"/>
-        </w:rPr>
-      </w:pPr>
+      <w:r>
+        <w:t>Half Cat Rocketry needed a better method to manage CAD than sharing files through a common cloud drive folder, which had become burdensome over years of modeling and manual version tracking. A better solution was needed, and it was recognized that many student and hobbyist teams could also benefit from free PDM software designed for modestly-sized teams.</w:t>
+      </w:r>
+    </w:p>
+    <w:p>
+      <w:r>
+        <w:t>Litterbox is almost entirely vibecoded, as is most of this guide, using Claude Code (Opus 5.5). The author of this program does not have anywhere close to the coding skills required to create a PDM from scratch, but does know a thing or two about CAD and process management in engineering. Litterbox would not have been possible without AI coding tools that have become available in recent times, with the hope that students become acquainted with a basic version of the tools they will encounter in their career</w:t>
+      </w:r>
+      <w:r>
+        <w:t>s.</w:t>
+      </w:r>
+    </w:p>
+    <w:p>
+      <w:r>
+        <w:t>Litterbox is provided as-is under the MIT open-source license, for the benefit of the engineering community at large. Half Cat Rocketry makes no attempt to monetize this software nor restrict its usage. A best-effort was made to design it as user-friendly and forgiving as possible so that it is usable without an in-depth knowledge of Python or Git.</w:t>
+      </w:r>
+    </w:p>
+    <w:p>
       <w:r>
         <w:br w:type="page"/>
       </w:r>
@@ -4525,7 +4137,7 @@
       <w:pPr>
         <w:pStyle w:val="Heading1"/>
       </w:pPr>
-      <w:bookmarkStart w:id="1" w:name="_Toc243832758"/>
+      <w:bookmarkStart w:id="1" w:name="_Toc243833136"/>
       <w:r>
         <w:lastRenderedPageBreak/>
         <w:t>What Litterbox is</w:t>
@@ -4621,7 +4233,7 @@
       <w:pPr>
         <w:pStyle w:val="Heading2"/>
       </w:pPr>
-      <w:bookmarkStart w:id="2" w:name="_Toc243832759"/>
+      <w:bookmarkStart w:id="2" w:name="_Toc243833137"/>
       <w:r>
         <w:t>Terms</w:t>
       </w:r>
@@ -5128,7 +4740,7 @@
       <w:pPr>
         <w:pStyle w:val="Heading1"/>
       </w:pPr>
-      <w:bookmarkStart w:id="3" w:name="_Toc243832760"/>
+      <w:bookmarkStart w:id="3" w:name="_Toc243833138"/>
       <w:r>
         <w:lastRenderedPageBreak/>
         <w:t>Getting started</w:t>
@@ -5144,7 +4756,7 @@
       <w:pPr>
         <w:pStyle w:val="Heading2"/>
       </w:pPr>
-      <w:bookmarkStart w:id="4" w:name="_Toc243832761"/>
+      <w:bookmarkStart w:id="4" w:name="_Toc243833139"/>
       <w:r>
         <w:t>What you need</w:t>
       </w:r>
@@ -5229,7 +4841,7 @@
       <w:pPr>
         <w:pStyle w:val="Heading2"/>
       </w:pPr>
-      <w:bookmarkStart w:id="5" w:name="_Toc243832762"/>
+      <w:bookmarkStart w:id="5" w:name="_Toc243833140"/>
       <w:r>
         <w:t>Installing Litterbox</w:t>
       </w:r>
@@ -5359,7 +4971,7 @@
       <w:pPr>
         <w:pStyle w:val="Heading2"/>
       </w:pPr>
-      <w:bookmarkStart w:id="6" w:name="_Toc243832763"/>
+      <w:bookmarkStart w:id="6" w:name="_Toc243833141"/>
       <w:r>
         <w:lastRenderedPageBreak/>
         <w:t>Joining your team's vault</w:t>
@@ -5466,7 +5078,7 @@
       <w:pPr>
         <w:pStyle w:val="Heading2"/>
       </w:pPr>
-      <w:bookmarkStart w:id="7" w:name="_Toc243832764"/>
+      <w:bookmarkStart w:id="7" w:name="_Toc243833142"/>
       <w:r>
         <w:t>Decisions to make first</w:t>
       </w:r>
@@ -5738,7 +5350,7 @@
       <w:pPr>
         <w:pStyle w:val="Heading2"/>
       </w:pPr>
-      <w:bookmarkStart w:id="8" w:name="_Toc243832765"/>
+      <w:bookmarkStart w:id="8" w:name="_Toc243833143"/>
       <w:r>
         <w:lastRenderedPageBreak/>
         <w:t>Setting up a new team</w:t>
@@ -6008,7 +5620,7 @@
       <w:pPr>
         <w:pStyle w:val="Heading2"/>
       </w:pPr>
-      <w:bookmarkStart w:id="9" w:name="_Toc243832766"/>
+      <w:bookmarkStart w:id="9" w:name="_Toc243833144"/>
       <w:r>
         <w:t>The main window</w:t>
       </w:r>
@@ -6419,7 +6031,7 @@
       <w:pPr>
         <w:pStyle w:val="Heading2"/>
       </w:pPr>
-      <w:bookmarkStart w:id="10" w:name="_Toc243832767"/>
+      <w:bookmarkStart w:id="10" w:name="_Toc243833145"/>
       <w:r>
         <w:t>Your first part</w:t>
       </w:r>
@@ -6546,7 +6158,7 @@
       <w:pPr>
         <w:pStyle w:val="Heading1"/>
       </w:pPr>
-      <w:bookmarkStart w:id="11" w:name="_Toc243832768"/>
+      <w:bookmarkStart w:id="11" w:name="_Toc243833146"/>
       <w:r>
         <w:lastRenderedPageBreak/>
         <w:t>Everyday work</w:t>
@@ -6557,7 +6169,7 @@
       <w:pPr>
         <w:pStyle w:val="Heading2"/>
       </w:pPr>
-      <w:bookmarkStart w:id="12" w:name="_Toc243832769"/>
+      <w:bookmarkStart w:id="12" w:name="_Toc243833147"/>
       <w:r>
         <w:t>Part numbers and file names</w:t>
       </w:r>
@@ -6597,7 +6209,7 @@
       <w:pPr>
         <w:pStyle w:val="Heading2"/>
       </w:pPr>
-      <w:bookmarkStart w:id="13" w:name="_Toc243832770"/>
+      <w:bookmarkStart w:id="13" w:name="_Toc243833148"/>
       <w:r>
         <w:t>Projects</w:t>
       </w:r>
@@ -6897,7 +6509,7 @@
       <w:pPr>
         <w:pStyle w:val="Heading2"/>
       </w:pPr>
-      <w:bookmarkStart w:id="14" w:name="_Toc243832771"/>
+      <w:bookmarkStart w:id="14" w:name="_Toc243833149"/>
       <w:r>
         <w:t>Finding parts</w:t>
       </w:r>
@@ -6951,7 +6563,7 @@
       <w:pPr>
         <w:pStyle w:val="Heading2"/>
       </w:pPr>
-      <w:bookmarkStart w:id="15" w:name="_Toc243832772"/>
+      <w:bookmarkStart w:id="15" w:name="_Toc243833150"/>
       <w:r>
         <w:t>Folders</w:t>
       </w:r>
@@ -7318,7 +6930,7 @@
       <w:pPr>
         <w:pStyle w:val="Heading2"/>
       </w:pPr>
-      <w:bookmarkStart w:id="16" w:name="_Toc243832773"/>
+      <w:bookmarkStart w:id="16" w:name="_Toc243833151"/>
       <w:r>
         <w:t>Checking out and checking in</w:t>
       </w:r>
@@ -7448,7 +7060,7 @@
       <w:pPr>
         <w:pStyle w:val="Heading2"/>
       </w:pPr>
-      <w:bookmarkStart w:id="17" w:name="_Toc243832774"/>
+      <w:bookmarkStart w:id="17" w:name="_Toc243833152"/>
       <w:r>
         <w:t>Getting other people's changes</w:t>
       </w:r>
@@ -7478,7 +7090,7 @@
       <w:pPr>
         <w:pStyle w:val="Heading2"/>
       </w:pPr>
-      <w:bookmarkStart w:id="18" w:name="_Toc243832775"/>
+      <w:bookmarkStart w:id="18" w:name="_Toc243833153"/>
       <w:r>
         <w:t>Opening files</w:t>
       </w:r>
@@ -7537,7 +7149,7 @@
       <w:pPr>
         <w:pStyle w:val="Heading2"/>
       </w:pPr>
-      <w:bookmarkStart w:id="19" w:name="_Toc243832776"/>
+      <w:bookmarkStart w:id="19" w:name="_Toc243833154"/>
       <w:r>
         <w:lastRenderedPageBreak/>
         <w:t>The details pane</w:t>
@@ -7810,7 +7422,7 @@
       <w:pPr>
         <w:pStyle w:val="Heading1"/>
       </w:pPr>
-      <w:bookmarkStart w:id="20" w:name="_Toc243832777"/>
+      <w:bookmarkStart w:id="20" w:name="_Toc243833155"/>
       <w:r>
         <w:lastRenderedPageBreak/>
         <w:t>Revisions and the lifecycle</w:t>
@@ -8180,7 +7792,7 @@
       <w:pPr>
         <w:pStyle w:val="Heading2"/>
       </w:pPr>
-      <w:bookmarkStart w:id="21" w:name="_Toc243832778"/>
+      <w:bookmarkStart w:id="21" w:name="_Toc243833156"/>
       <w:r>
         <w:t>Form, Fit, Function, and Dispo</w:t>
       </w:r>
@@ -8274,7 +7886,7 @@
       <w:pPr>
         <w:pStyle w:val="Heading1"/>
       </w:pPr>
-      <w:bookmarkStart w:id="22" w:name="_Toc243832779"/>
+      <w:bookmarkStart w:id="22" w:name="_Toc243833157"/>
       <w:r>
         <w:lastRenderedPageBreak/>
         <w:t>Assemblies, references, and BOMs</w:t>
@@ -8285,7 +7897,7 @@
       <w:pPr>
         <w:pStyle w:val="Heading2"/>
       </w:pPr>
-      <w:bookmarkStart w:id="23" w:name="_Toc243832780"/>
+      <w:bookmarkStart w:id="23" w:name="_Toc243833158"/>
       <w:r>
         <w:t>Uses and where used</w:t>
       </w:r>
@@ -8338,7 +7950,7 @@
       <w:pPr>
         <w:pStyle w:val="Heading2"/>
       </w:pPr>
-      <w:bookmarkStart w:id="24" w:name="_Toc243832781"/>
+      <w:bookmarkStart w:id="24" w:name="_Toc243833159"/>
       <w:r>
         <w:t>The BOM tab</w:t>
       </w:r>
@@ -8464,7 +8076,7 @@
       <w:pPr>
         <w:pStyle w:val="Heading2"/>
       </w:pPr>
-      <w:bookmarkStart w:id="25" w:name="_Toc243832782"/>
+      <w:bookmarkStart w:id="25" w:name="_Toc243833160"/>
       <w:r>
         <w:t>Toolbox parts</w:t>
       </w:r>
@@ -8696,7 +8308,7 @@
       <w:pPr>
         <w:pStyle w:val="Heading2"/>
       </w:pPr>
-      <w:bookmarkStart w:id="26" w:name="_Toc243832783"/>
+      <w:bookmarkStart w:id="26" w:name="_Toc243833161"/>
       <w:r>
         <w:t>Non-CAD parts and kits</w:t>
       </w:r>
@@ -8766,7 +8378,7 @@
       <w:pPr>
         <w:pStyle w:val="Heading1"/>
       </w:pPr>
-      <w:bookmarkStart w:id="27" w:name="_Toc243832784"/>
+      <w:bookmarkStart w:id="27" w:name="_Toc243833162"/>
       <w:r>
         <w:lastRenderedPageBreak/>
         <w:t>Purchasing, costs, and materials</w:t>
@@ -8777,7 +8389,7 @@
       <w:pPr>
         <w:pStyle w:val="Heading2"/>
       </w:pPr>
-      <w:bookmarkStart w:id="28" w:name="_Toc243832785"/>
+      <w:bookmarkStart w:id="28" w:name="_Toc243833163"/>
       <w:r>
         <w:t>Purchasing info</w:t>
       </w:r>
@@ -8815,7 +8427,7 @@
       <w:pPr>
         <w:pStyle w:val="Heading2"/>
       </w:pPr>
-      <w:bookmarkStart w:id="29" w:name="_Toc243832786"/>
+      <w:bookmarkStart w:id="29" w:name="_Toc243833164"/>
       <w:r>
         <w:t>Materials</w:t>
       </w:r>
@@ -8853,7 +8465,7 @@
       <w:pPr>
         <w:pStyle w:val="Heading1"/>
       </w:pPr>
-      <w:bookmarkStart w:id="30" w:name="_Toc243832787"/>
+      <w:bookmarkStart w:id="30" w:name="_Toc243833165"/>
       <w:r>
         <w:lastRenderedPageBreak/>
         <w:t>Release outputs and exports</w:t>
@@ -8864,7 +8476,7 @@
       <w:pPr>
         <w:pStyle w:val="Heading2"/>
       </w:pPr>
-      <w:bookmarkStart w:id="31" w:name="_Toc243832788"/>
+      <w:bookmarkStart w:id="31" w:name="_Toc243833166"/>
       <w:r>
         <w:t>STEP and PDF files</w:t>
       </w:r>
@@ -8925,7 +8537,7 @@
       <w:pPr>
         <w:pStyle w:val="Heading2"/>
       </w:pPr>
-      <w:bookmarkStart w:id="32" w:name="_Toc243832789"/>
+      <w:bookmarkStart w:id="32" w:name="_Toc243833167"/>
       <w:r>
         <w:t>Exporting</w:t>
       </w:r>
@@ -8954,7 +8566,7 @@
       <w:pPr>
         <w:pStyle w:val="Heading1"/>
       </w:pPr>
-      <w:bookmarkStart w:id="33" w:name="_Toc243832790"/>
+      <w:bookmarkStart w:id="33" w:name="_Toc243833168"/>
       <w:r>
         <w:lastRenderedPageBreak/>
         <w:t>Documents</w:t>
@@ -9059,7 +8671,7 @@
       <w:pPr>
         <w:pStyle w:val="Heading1"/>
       </w:pPr>
-      <w:bookmarkStart w:id="34" w:name="_Toc243832791"/>
+      <w:bookmarkStart w:id="34" w:name="_Toc243833169"/>
       <w:r>
         <w:lastRenderedPageBreak/>
         <w:t>Sign-off workflows and ECOs</w:t>
@@ -9070,7 +8682,7 @@
       <w:pPr>
         <w:pStyle w:val="Heading2"/>
       </w:pPr>
-      <w:bookmarkStart w:id="35" w:name="_Toc243832792"/>
+      <w:bookmarkStart w:id="35" w:name="_Toc243833170"/>
       <w:r>
         <w:t>How workflows work</w:t>
       </w:r>
@@ -9126,7 +8738,7 @@
       <w:pPr>
         <w:pStyle w:val="Heading2"/>
       </w:pPr>
-      <w:bookmarkStart w:id="36" w:name="_Toc243832793"/>
+      <w:bookmarkStart w:id="36" w:name="_Toc243833171"/>
       <w:r>
         <w:t>Asking for sign-off</w:t>
       </w:r>
@@ -9292,7 +8904,7 @@
       <w:pPr>
         <w:pStyle w:val="Heading2"/>
       </w:pPr>
-      <w:bookmarkStart w:id="37" w:name="_Toc243832794"/>
+      <w:bookmarkStart w:id="37" w:name="_Toc243833172"/>
       <w:r>
         <w:t>Reviewing a request</w:t>
       </w:r>
@@ -9594,7 +9206,7 @@
       <w:pPr>
         <w:pStyle w:val="Heading2"/>
       </w:pPr>
-      <w:bookmarkStart w:id="38" w:name="_Toc243832795"/>
+      <w:bookmarkStart w:id="38" w:name="_Toc243833173"/>
       <w:r>
         <w:t>Rejected requests</w:t>
       </w:r>
@@ -9667,7 +9279,7 @@
       <w:pPr>
         <w:pStyle w:val="Heading2"/>
       </w:pPr>
-      <w:bookmarkStart w:id="39" w:name="_Toc243832796"/>
+      <w:bookmarkStart w:id="39" w:name="_Toc243833174"/>
       <w:r>
         <w:t>Engineering change orders</w:t>
       </w:r>
@@ -9719,7 +9331,7 @@
       <w:pPr>
         <w:pStyle w:val="Heading1"/>
       </w:pPr>
-      <w:bookmarkStart w:id="40" w:name="_Toc243832797"/>
+      <w:bookmarkStart w:id="40" w:name="_Toc243833175"/>
       <w:r>
         <w:lastRenderedPageBreak/>
         <w:t>Running the team</w:t>
@@ -9744,7 +9356,7 @@
       <w:pPr>
         <w:pStyle w:val="Heading2"/>
       </w:pPr>
-      <w:bookmarkStart w:id="41" w:name="_Toc243832798"/>
+      <w:bookmarkStart w:id="41" w:name="_Toc243833176"/>
       <w:r>
         <w:t>People and access</w:t>
       </w:r>
@@ -10042,7 +9654,7 @@
       <w:pPr>
         <w:pStyle w:val="Heading2"/>
       </w:pPr>
-      <w:bookmarkStart w:id="42" w:name="_Toc243832799"/>
+      <w:bookmarkStart w:id="42" w:name="_Toc243833177"/>
       <w:r>
         <w:t>Vault settings</w:t>
       </w:r>
@@ -10427,7 +10039,7 @@
       <w:pPr>
         <w:pStyle w:val="Heading2"/>
       </w:pPr>
-      <w:bookmarkStart w:id="43" w:name="_Toc243832800"/>
+      <w:bookmarkStart w:id="43" w:name="_Toc243833178"/>
       <w:r>
         <w:lastRenderedPageBreak/>
         <w:t>The team's Toolbox</w:t>
@@ -10535,7 +10147,7 @@
       <w:pPr>
         <w:pStyle w:val="Heading2"/>
       </w:pPr>
-      <w:bookmarkStart w:id="44" w:name="_Toc243832801"/>
+      <w:bookmarkStart w:id="44" w:name="_Toc243833179"/>
       <w:r>
         <w:t>Vault maintenance</w:t>
       </w:r>
@@ -10600,7 +10212,7 @@
       <w:pPr>
         <w:pStyle w:val="Heading1"/>
       </w:pPr>
-      <w:bookmarkStart w:id="45" w:name="_Toc243832802"/>
+      <w:bookmarkStart w:id="45" w:name="_Toc243833180"/>
       <w:r>
         <w:lastRenderedPageBreak/>
         <w:t>Importing existing CAD</w:t>
@@ -10696,7 +10308,7 @@
       <w:pPr>
         <w:pStyle w:val="Heading1"/>
       </w:pPr>
-      <w:bookmarkStart w:id="46" w:name="_Toc243832803"/>
+      <w:bookmarkStart w:id="46" w:name="_Toc243833181"/>
       <w:r>
         <w:lastRenderedPageBreak/>
         <w:t>Working with SolidWorks</w:t>
@@ -10772,7 +10384,7 @@
       <w:pPr>
         <w:pStyle w:val="Heading2"/>
       </w:pPr>
-      <w:bookmarkStart w:id="47" w:name="_Toc243832804"/>
+      <w:bookmarkStart w:id="47" w:name="_Toc243833182"/>
       <w:r>
         <w:t>Configurations</w:t>
       </w:r>
@@ -10812,7 +10424,10 @@
         <w:t>Named after the part.</w:t>
       </w:r>
       <w:r>
-        <w:t xml:space="preserve"> With SolidWorks open, Check In renames a file's configuration to the part's Name when it is the file's only configuration and is called Default, so an assembly's tree shows HCR‑100010‑001_A&lt;1&gt; (Bracket). When the Name changes, it is renamed again at the next check-in. Import does the same to the files it copies in. A file with configurations of its own is left alone, and so is a file open in SolidWorks with unsaved changes. Assemblies follow a renamed configuration. The configuration's BOM part number is set to the document name, so a SolidWorks BOM still shows the part number.</w:t>
+        <w:t xml:space="preserve"> With SolidWorks open, Check In renames a file's configuration to the part's Name when it is the file's only configuration and is called Default, so an assembly's tree shows HCR‑100010‑001_A&lt;1&gt; (Bracket). When the Name changes, it is renamed again at the next check-in. Import does the same to the files it copies in. A file with configurations of its own is left alone, and so is a file open in SolidWorks with unsaved changes. Assemblies follow a renamed configuration. The configuration's BOM part number is s</w:t>
+      </w:r>
+      <w:r>
+        <w:t>et to the document name, so a SolidWorks BOM still shows the part number.</w:t>
       </w:r>
     </w:p>
     <w:p>
@@ -10833,7 +10448,7 @@
       <w:pPr>
         <w:pStyle w:val="Heading2"/>
       </w:pPr>
-      <w:bookmarkStart w:id="48" w:name="_Toc243832805"/>
+      <w:bookmarkStart w:id="48" w:name="_Toc243833183"/>
       <w:r>
         <w:t>Templates</w:t>
       </w:r>
@@ -11111,7 +10726,7 @@
       <w:pPr>
         <w:pStyle w:val="Heading1"/>
       </w:pPr>
-      <w:bookmarkStart w:id="49" w:name="_Toc243832806"/>
+      <w:bookmarkStart w:id="49" w:name="_Toc243833184"/>
       <w:r>
         <w:lastRenderedPageBreak/>
         <w:t>How Litterbox works</w:t>
@@ -11127,7 +10742,7 @@
       <w:pPr>
         <w:pStyle w:val="Heading2"/>
       </w:pPr>
-      <w:bookmarkStart w:id="50" w:name="_Toc243832807"/>
+      <w:bookmarkStart w:id="50" w:name="_Toc243833185"/>
       <w:r>
         <w:t>The vault is a Git repository</w:t>
       </w:r>
@@ -11531,7 +11146,7 @@
       <w:pPr>
         <w:pStyle w:val="Heading2"/>
       </w:pPr>
-      <w:bookmarkStart w:id="51" w:name="_Toc243832808"/>
+      <w:bookmarkStart w:id="51" w:name="_Toc243833186"/>
       <w:r>
         <w:t>Locks, read-only files, and uploads</w:t>
       </w:r>
@@ -11632,7 +11247,7 @@
       <w:pPr>
         <w:pStyle w:val="Heading2"/>
       </w:pPr>
-      <w:bookmarkStart w:id="52" w:name="_Toc243832809"/>
+      <w:bookmarkStart w:id="52" w:name="_Toc243833187"/>
       <w:r>
         <w:t>Downloads</w:t>
       </w:r>
@@ -11656,7 +11271,7 @@
       <w:pPr>
         <w:pStyle w:val="Heading2"/>
       </w:pPr>
-      <w:bookmarkStart w:id="53" w:name="_Toc243832810"/>
+      <w:bookmarkStart w:id="53" w:name="_Toc243833188"/>
       <w:r>
         <w:t>The job queue</w:t>
       </w:r>
@@ -11805,7 +11420,7 @@
       <w:pPr>
         <w:pStyle w:val="Heading1"/>
       </w:pPr>
-      <w:bookmarkStart w:id="54" w:name="_Toc243832811"/>
+      <w:bookmarkStart w:id="54" w:name="_Toc243833189"/>
       <w:r>
         <w:lastRenderedPageBreak/>
         <w:t>Settings and troubleshooting</w:t>
@@ -11816,7 +11431,7 @@
       <w:pPr>
         <w:pStyle w:val="Heading2"/>
       </w:pPr>
-      <w:bookmarkStart w:id="55" w:name="_Toc243832812"/>
+      <w:bookmarkStart w:id="55" w:name="_Toc243833190"/>
       <w:r>
         <w:t>Your settings</w:t>
       </w:r>
@@ -12180,7 +11795,7 @@
       <w:pPr>
         <w:pStyle w:val="Heading2"/>
       </w:pPr>
-      <w:bookmarkStart w:id="56" w:name="_Toc243832813"/>
+      <w:bookmarkStart w:id="56" w:name="_Toc243833191"/>
       <w:r>
         <w:t>Problems</w:t>
       </w:r>
@@ -12297,7 +11912,7 @@
       <w:pPr>
         <w:pStyle w:val="Heading2"/>
       </w:pPr>
-      <w:bookmarkStart w:id="57" w:name="_Toc243832814"/>
+      <w:bookmarkStart w:id="57" w:name="_Toc243833192"/>
       <w:r>
         <w:lastRenderedPageBreak/>
         <w:t>The command line</w:t>
@@ -12338,7 +11953,7 @@
       <w:pPr>
         <w:pStyle w:val="Heading1"/>
       </w:pPr>
-      <w:bookmarkStart w:id="58" w:name="_Toc243832815"/>
+      <w:bookmarkStart w:id="58" w:name="_Toc243833193"/>
       <w:r>
         <w:lastRenderedPageBreak/>
         <w:t>Quick reference</w:t>
@@ -13004,76 +12619,76 @@
       </w:rPr>
     </w:lvl>
   </w:abstractNum>
-  <w:num w:numId="1" w16cid:durableId="678822297">
+  <w:num w:numId="1" w16cid:durableId="907154548">
     <w:abstractNumId w:val="8"/>
   </w:num>
-  <w:num w:numId="2" w16cid:durableId="1528103673">
+  <w:num w:numId="2" w16cid:durableId="1668945938">
     <w:abstractNumId w:val="6"/>
   </w:num>
-  <w:num w:numId="3" w16cid:durableId="376978352">
+  <w:num w:numId="3" w16cid:durableId="1420177705">
     <w:abstractNumId w:val="5"/>
   </w:num>
-  <w:num w:numId="4" w16cid:durableId="152526031">
+  <w:num w:numId="4" w16cid:durableId="73741070">
     <w:abstractNumId w:val="4"/>
   </w:num>
-  <w:num w:numId="5" w16cid:durableId="1110473387">
+  <w:num w:numId="5" w16cid:durableId="226689859">
     <w:abstractNumId w:val="7"/>
   </w:num>
-  <w:num w:numId="6" w16cid:durableId="1694499832">
+  <w:num w:numId="6" w16cid:durableId="1230650701">
     <w:abstractNumId w:val="3"/>
   </w:num>
-  <w:num w:numId="7" w16cid:durableId="1324357601">
+  <w:num w:numId="7" w16cid:durableId="412748388">
     <w:abstractNumId w:val="2"/>
   </w:num>
-  <w:num w:numId="8" w16cid:durableId="2099130808">
+  <w:num w:numId="8" w16cid:durableId="1215510416">
     <w:abstractNumId w:val="1"/>
   </w:num>
-  <w:num w:numId="9" w16cid:durableId="261769865">
+  <w:num w:numId="9" w16cid:durableId="1415320902">
     <w:abstractNumId w:val="0"/>
   </w:num>
-  <w:num w:numId="10" w16cid:durableId="1423605674">
+  <w:num w:numId="10" w16cid:durableId="1503426206">
     <w:abstractNumId w:val="7"/>
     <w:lvlOverride w:ilvl="0">
       <w:startOverride w:val="1"/>
     </w:lvlOverride>
   </w:num>
-  <w:num w:numId="11" w16cid:durableId="1967545760">
+  <w:num w:numId="11" w16cid:durableId="1746147815">
     <w:abstractNumId w:val="7"/>
     <w:lvlOverride w:ilvl="0">
       <w:startOverride w:val="1"/>
     </w:lvlOverride>
   </w:num>
-  <w:num w:numId="12" w16cid:durableId="973828653">
+  <w:num w:numId="12" w16cid:durableId="2067218865">
     <w:abstractNumId w:val="7"/>
     <w:lvlOverride w:ilvl="0">
       <w:startOverride w:val="1"/>
     </w:lvlOverride>
   </w:num>
-  <w:num w:numId="13" w16cid:durableId="304510978">
+  <w:num w:numId="13" w16cid:durableId="1403528167">
     <w:abstractNumId w:val="7"/>
     <w:lvlOverride w:ilvl="0">
       <w:startOverride w:val="1"/>
     </w:lvlOverride>
   </w:num>
-  <w:num w:numId="14" w16cid:durableId="796876633">
+  <w:num w:numId="14" w16cid:durableId="1301035953">
     <w:abstractNumId w:val="7"/>
     <w:lvlOverride w:ilvl="0">
       <w:startOverride w:val="1"/>
     </w:lvlOverride>
   </w:num>
-  <w:num w:numId="15" w16cid:durableId="481196512">
+  <w:num w:numId="15" w16cid:durableId="1292400321">
     <w:abstractNumId w:val="7"/>
     <w:lvlOverride w:ilvl="0">
       <w:startOverride w:val="1"/>
     </w:lvlOverride>
   </w:num>
-  <w:num w:numId="16" w16cid:durableId="720786855">
+  <w:num w:numId="16" w16cid:durableId="1170411891">
     <w:abstractNumId w:val="7"/>
     <w:lvlOverride w:ilvl="0">
       <w:startOverride w:val="1"/>
     </w:lvlOverride>
   </w:num>
-  <w:num w:numId="17" w16cid:durableId="1506280377">
+  <w:num w:numId="17" w16cid:durableId="1163930559">
     <w:abstractNumId w:val="7"/>
     <w:lvlOverride w:ilvl="0">
       <w:startOverride w:val="1"/>
@@ -24443,7 +24058,7 @@
     <w:autoRedefine/>
     <w:uiPriority w:val="39"/>
     <w:unhideWhenUsed/>
-    <w:rsid w:val="00DB0DD9"/>
+    <w:rsid w:val="007B630C"/>
     <w:pPr>
       <w:spacing w:after="100"/>
     </w:pPr>
@@ -24455,7 +24070,7 @@
     <w:autoRedefine/>
     <w:uiPriority w:val="39"/>
     <w:unhideWhenUsed/>
-    <w:rsid w:val="00DB0DD9"/>
+    <w:rsid w:val="007B630C"/>
     <w:pPr>
       <w:spacing w:after="100"/>
       <w:ind w:left="210"/>
@@ -24466,7 +24081,7 @@
     <w:basedOn w:val="DefaultParagraphFont"/>
     <w:uiPriority w:val="99"/>
     <w:unhideWhenUsed/>
-    <w:rsid w:val="00DB0DD9"/>
+    <w:rsid w:val="007B630C"/>
     <w:rPr>
       <w:color w:val="0000FF" w:themeColor="hyperlink"/>
       <w:u w:val="single"/>

</xml_diff>

<commit_message>
Guide: creating a new part, step by step
A new section after Your first part: making the part number, then either
the template path or saving the file yourself by pasting the copied file
name into SolidWorks' Save As, then checking it in. The .docx and PDF rebuilt.

Co-Authored-By: Claude Opus 5.5 <noreply@anthropic.com>
</commit_message>
<xml_diff>
--- a/docs/Litterbox_User_Guide.docx
+++ b/docs/Litterbox_User_Guide.docx
@@ -87,7 +87,7 @@
       <w:r>
         <w:fldChar w:fldCharType="separate"/>
       </w:r>
-      <w:hyperlink w:anchor="_Toc243833135" w:history="1">
+      <w:hyperlink w:anchor="_Toc243839871" w:history="1">
         <w:r>
           <w:rPr>
             <w:rStyle w:val="Hyperlink"/>
@@ -114,7 +114,7 @@
             <w:noProof/>
             <w:webHidden/>
           </w:rPr>
-          <w:instrText xml:space="preserve"> PAGEREF _Toc243833135 \h </w:instrText>
+          <w:instrText xml:space="preserve"> PAGEREF _Toc243839871 \h </w:instrText>
         </w:r>
         <w:r>
           <w:rPr>
@@ -155,7 +155,7 @@
           <w:noProof/>
         </w:rPr>
       </w:pPr>
-      <w:hyperlink w:anchor="_Toc243833136" w:history="1">
+      <w:hyperlink w:anchor="_Toc243839872" w:history="1">
         <w:r>
           <w:rPr>
             <w:rStyle w:val="Hyperlink"/>
@@ -182,7 +182,7 @@
             <w:noProof/>
             <w:webHidden/>
           </w:rPr>
-          <w:instrText xml:space="preserve"> PAGEREF _Toc243833136 \h </w:instrText>
+          <w:instrText xml:space="preserve"> PAGEREF _Toc243839872 \h </w:instrText>
         </w:r>
         <w:r>
           <w:rPr>
@@ -223,7 +223,7 @@
           <w:noProof/>
         </w:rPr>
       </w:pPr>
-      <w:hyperlink w:anchor="_Toc243833137" w:history="1">
+      <w:hyperlink w:anchor="_Toc243839873" w:history="1">
         <w:r>
           <w:rPr>
             <w:rStyle w:val="Hyperlink"/>
@@ -250,7 +250,7 @@
             <w:noProof/>
             <w:webHidden/>
           </w:rPr>
-          <w:instrText xml:space="preserve"> PAGEREF _Toc243833137 \h </w:instrText>
+          <w:instrText xml:space="preserve"> PAGEREF _Toc243839873 \h </w:instrText>
         </w:r>
         <w:r>
           <w:rPr>
@@ -291,7 +291,7 @@
           <w:noProof/>
         </w:rPr>
       </w:pPr>
-      <w:hyperlink w:anchor="_Toc243833138" w:history="1">
+      <w:hyperlink w:anchor="_Toc243839874" w:history="1">
         <w:r>
           <w:rPr>
             <w:rStyle w:val="Hyperlink"/>
@@ -318,7 +318,7 @@
             <w:noProof/>
             <w:webHidden/>
           </w:rPr>
-          <w:instrText xml:space="preserve"> PAGEREF _Toc243833138 \h </w:instrText>
+          <w:instrText xml:space="preserve"> PAGEREF _Toc243839874 \h </w:instrText>
         </w:r>
         <w:r>
           <w:rPr>
@@ -359,7 +359,7 @@
           <w:noProof/>
         </w:rPr>
       </w:pPr>
-      <w:hyperlink w:anchor="_Toc243833139" w:history="1">
+      <w:hyperlink w:anchor="_Toc243839875" w:history="1">
         <w:r>
           <w:rPr>
             <w:rStyle w:val="Hyperlink"/>
@@ -386,7 +386,7 @@
             <w:noProof/>
             <w:webHidden/>
           </w:rPr>
-          <w:instrText xml:space="preserve"> PAGEREF _Toc243833139 \h </w:instrText>
+          <w:instrText xml:space="preserve"> PAGEREF _Toc243839875 \h </w:instrText>
         </w:r>
         <w:r>
           <w:rPr>
@@ -427,7 +427,7 @@
           <w:noProof/>
         </w:rPr>
       </w:pPr>
-      <w:hyperlink w:anchor="_Toc243833140" w:history="1">
+      <w:hyperlink w:anchor="_Toc243839876" w:history="1">
         <w:r>
           <w:rPr>
             <w:rStyle w:val="Hyperlink"/>
@@ -454,7 +454,7 @@
             <w:noProof/>
             <w:webHidden/>
           </w:rPr>
-          <w:instrText xml:space="preserve"> PAGEREF _Toc243833140 \h </w:instrText>
+          <w:instrText xml:space="preserve"> PAGEREF _Toc243839876 \h </w:instrText>
         </w:r>
         <w:r>
           <w:rPr>
@@ -495,7 +495,7 @@
           <w:noProof/>
         </w:rPr>
       </w:pPr>
-      <w:hyperlink w:anchor="_Toc243833141" w:history="1">
+      <w:hyperlink w:anchor="_Toc243839877" w:history="1">
         <w:r>
           <w:rPr>
             <w:rStyle w:val="Hyperlink"/>
@@ -522,7 +522,7 @@
             <w:noProof/>
             <w:webHidden/>
           </w:rPr>
-          <w:instrText xml:space="preserve"> PAGEREF _Toc243833141 \h </w:instrText>
+          <w:instrText xml:space="preserve"> PAGEREF _Toc243839877 \h </w:instrText>
         </w:r>
         <w:r>
           <w:rPr>
@@ -563,7 +563,7 @@
           <w:noProof/>
         </w:rPr>
       </w:pPr>
-      <w:hyperlink w:anchor="_Toc243833142" w:history="1">
+      <w:hyperlink w:anchor="_Toc243839878" w:history="1">
         <w:r>
           <w:rPr>
             <w:rStyle w:val="Hyperlink"/>
@@ -590,7 +590,7 @@
             <w:noProof/>
             <w:webHidden/>
           </w:rPr>
-          <w:instrText xml:space="preserve"> PAGEREF _Toc243833142 \h </w:instrText>
+          <w:instrText xml:space="preserve"> PAGEREF _Toc243839878 \h </w:instrText>
         </w:r>
         <w:r>
           <w:rPr>
@@ -631,7 +631,7 @@
           <w:noProof/>
         </w:rPr>
       </w:pPr>
-      <w:hyperlink w:anchor="_Toc243833143" w:history="1">
+      <w:hyperlink w:anchor="_Toc243839879" w:history="1">
         <w:r>
           <w:rPr>
             <w:rStyle w:val="Hyperlink"/>
@@ -658,7 +658,7 @@
             <w:noProof/>
             <w:webHidden/>
           </w:rPr>
-          <w:instrText xml:space="preserve"> PAGEREF _Toc243833143 \h </w:instrText>
+          <w:instrText xml:space="preserve"> PAGEREF _Toc243839879 \h </w:instrText>
         </w:r>
         <w:r>
           <w:rPr>
@@ -699,7 +699,7 @@
           <w:noProof/>
         </w:rPr>
       </w:pPr>
-      <w:hyperlink w:anchor="_Toc243833144" w:history="1">
+      <w:hyperlink w:anchor="_Toc243839880" w:history="1">
         <w:r>
           <w:rPr>
             <w:rStyle w:val="Hyperlink"/>
@@ -726,7 +726,7 @@
             <w:noProof/>
             <w:webHidden/>
           </w:rPr>
-          <w:instrText xml:space="preserve"> PAGEREF _Toc243833144 \h </w:instrText>
+          <w:instrText xml:space="preserve"> PAGEREF _Toc243839880 \h </w:instrText>
         </w:r>
         <w:r>
           <w:rPr>
@@ -767,7 +767,7 @@
           <w:noProof/>
         </w:rPr>
       </w:pPr>
-      <w:hyperlink w:anchor="_Toc243833145" w:history="1">
+      <w:hyperlink w:anchor="_Toc243839881" w:history="1">
         <w:r>
           <w:rPr>
             <w:rStyle w:val="Hyperlink"/>
@@ -794,7 +794,75 @@
             <w:noProof/>
             <w:webHidden/>
           </w:rPr>
-          <w:instrText xml:space="preserve"> PAGEREF _Toc243833145 \h </w:instrText>
+          <w:instrText xml:space="preserve"> PAGEREF _Toc243839881 \h </w:instrText>
+        </w:r>
+        <w:r>
+          <w:rPr>
+            <w:noProof/>
+            <w:webHidden/>
+          </w:rPr>
+        </w:r>
+        <w:r>
+          <w:rPr>
+            <w:noProof/>
+            <w:webHidden/>
+          </w:rPr>
+          <w:fldChar w:fldCharType="separate"/>
+        </w:r>
+        <w:r>
+          <w:rPr>
+            <w:noProof/>
+            <w:webHidden/>
+          </w:rPr>
+          <w:t>10</w:t>
+        </w:r>
+        <w:r>
+          <w:rPr>
+            <w:noProof/>
+            <w:webHidden/>
+          </w:rPr>
+          <w:fldChar w:fldCharType="end"/>
+        </w:r>
+      </w:hyperlink>
+    </w:p>
+    <w:p>
+      <w:pPr>
+        <w:pStyle w:val="TOC2"/>
+        <w:tabs>
+          <w:tab w:val="right" w:leader="dot" w:pos="9350"/>
+        </w:tabs>
+        <w:rPr>
+          <w:noProof/>
+        </w:rPr>
+      </w:pPr>
+      <w:hyperlink w:anchor="_Toc243839882" w:history="1">
+        <w:r>
+          <w:rPr>
+            <w:rStyle w:val="Hyperlink"/>
+            <w:noProof/>
+          </w:rPr>
+          <w:t>Creating a new part, step by step</w:t>
+        </w:r>
+        <w:r>
+          <w:rPr>
+            <w:noProof/>
+            <w:webHidden/>
+          </w:rPr>
+          <w:tab/>
+        </w:r>
+        <w:r>
+          <w:rPr>
+            <w:noProof/>
+            <w:webHidden/>
+          </w:rPr>
+          <w:fldChar w:fldCharType="begin"/>
+        </w:r>
+        <w:r>
+          <w:rPr>
+            <w:noProof/>
+            <w:webHidden/>
+          </w:rPr>
+          <w:instrText xml:space="preserve"> PAGEREF _Toc243839882 \h </w:instrText>
         </w:r>
         <w:r>
           <w:rPr>
@@ -835,7 +903,7 @@
           <w:noProof/>
         </w:rPr>
       </w:pPr>
-      <w:hyperlink w:anchor="_Toc243833146" w:history="1">
+      <w:hyperlink w:anchor="_Toc243839883" w:history="1">
         <w:r>
           <w:rPr>
             <w:rStyle w:val="Hyperlink"/>
@@ -862,7 +930,7 @@
             <w:noProof/>
             <w:webHidden/>
           </w:rPr>
-          <w:instrText xml:space="preserve"> PAGEREF _Toc243833146 \h </w:instrText>
+          <w:instrText xml:space="preserve"> PAGEREF _Toc243839883 \h </w:instrText>
         </w:r>
         <w:r>
           <w:rPr>
@@ -882,7 +950,7 @@
             <w:noProof/>
             <w:webHidden/>
           </w:rPr>
-          <w:t>11</w:t>
+          <w:t>12</w:t>
         </w:r>
         <w:r>
           <w:rPr>
@@ -903,7 +971,7 @@
           <w:noProof/>
         </w:rPr>
       </w:pPr>
-      <w:hyperlink w:anchor="_Toc243833147" w:history="1">
+      <w:hyperlink w:anchor="_Toc243839884" w:history="1">
         <w:r>
           <w:rPr>
             <w:rStyle w:val="Hyperlink"/>
@@ -930,7 +998,7 @@
             <w:noProof/>
             <w:webHidden/>
           </w:rPr>
-          <w:instrText xml:space="preserve"> PAGEREF _Toc243833147 \h </w:instrText>
+          <w:instrText xml:space="preserve"> PAGEREF _Toc243839884 \h </w:instrText>
         </w:r>
         <w:r>
           <w:rPr>
@@ -950,7 +1018,7 @@
             <w:noProof/>
             <w:webHidden/>
           </w:rPr>
-          <w:t>11</w:t>
+          <w:t>12</w:t>
         </w:r>
         <w:r>
           <w:rPr>
@@ -971,7 +1039,7 @@
           <w:noProof/>
         </w:rPr>
       </w:pPr>
-      <w:hyperlink w:anchor="_Toc243833148" w:history="1">
+      <w:hyperlink w:anchor="_Toc243839885" w:history="1">
         <w:r>
           <w:rPr>
             <w:rStyle w:val="Hyperlink"/>
@@ -998,7 +1066,7 @@
             <w:noProof/>
             <w:webHidden/>
           </w:rPr>
-          <w:instrText xml:space="preserve"> PAGEREF _Toc243833148 \h </w:instrText>
+          <w:instrText xml:space="preserve"> PAGEREF _Toc243839885 \h </w:instrText>
         </w:r>
         <w:r>
           <w:rPr>
@@ -1018,7 +1086,7 @@
             <w:noProof/>
             <w:webHidden/>
           </w:rPr>
-          <w:t>11</w:t>
+          <w:t>12</w:t>
         </w:r>
         <w:r>
           <w:rPr>
@@ -1039,7 +1107,7 @@
           <w:noProof/>
         </w:rPr>
       </w:pPr>
-      <w:hyperlink w:anchor="_Toc243833149" w:history="1">
+      <w:hyperlink w:anchor="_Toc243839886" w:history="1">
         <w:r>
           <w:rPr>
             <w:rStyle w:val="Hyperlink"/>
@@ -1066,7 +1134,7 @@
             <w:noProof/>
             <w:webHidden/>
           </w:rPr>
-          <w:instrText xml:space="preserve"> PAGEREF _Toc243833149 \h </w:instrText>
+          <w:instrText xml:space="preserve"> PAGEREF _Toc243839886 \h </w:instrText>
         </w:r>
         <w:r>
           <w:rPr>
@@ -1086,7 +1154,7 @@
             <w:noProof/>
             <w:webHidden/>
           </w:rPr>
-          <w:t>12</w:t>
+          <w:t>13</w:t>
         </w:r>
         <w:r>
           <w:rPr>
@@ -1107,7 +1175,7 @@
           <w:noProof/>
         </w:rPr>
       </w:pPr>
-      <w:hyperlink w:anchor="_Toc243833150" w:history="1">
+      <w:hyperlink w:anchor="_Toc243839887" w:history="1">
         <w:r>
           <w:rPr>
             <w:rStyle w:val="Hyperlink"/>
@@ -1134,7 +1202,7 @@
             <w:noProof/>
             <w:webHidden/>
           </w:rPr>
-          <w:instrText xml:space="preserve"> PAGEREF _Toc243833150 \h </w:instrText>
+          <w:instrText xml:space="preserve"> PAGEREF _Toc243839887 \h </w:instrText>
         </w:r>
         <w:r>
           <w:rPr>
@@ -1154,7 +1222,7 @@
             <w:noProof/>
             <w:webHidden/>
           </w:rPr>
-          <w:t>12</w:t>
+          <w:t>13</w:t>
         </w:r>
         <w:r>
           <w:rPr>
@@ -1175,7 +1243,7 @@
           <w:noProof/>
         </w:rPr>
       </w:pPr>
-      <w:hyperlink w:anchor="_Toc243833151" w:history="1">
+      <w:hyperlink w:anchor="_Toc243839888" w:history="1">
         <w:r>
           <w:rPr>
             <w:rStyle w:val="Hyperlink"/>
@@ -1202,7 +1270,7 @@
             <w:noProof/>
             <w:webHidden/>
           </w:rPr>
-          <w:instrText xml:space="preserve"> PAGEREF _Toc243833151 \h </w:instrText>
+          <w:instrText xml:space="preserve"> PAGEREF _Toc243839888 \h </w:instrText>
         </w:r>
         <w:r>
           <w:rPr>
@@ -1222,7 +1290,7 @@
             <w:noProof/>
             <w:webHidden/>
           </w:rPr>
-          <w:t>13</w:t>
+          <w:t>14</w:t>
         </w:r>
         <w:r>
           <w:rPr>
@@ -1243,7 +1311,7 @@
           <w:noProof/>
         </w:rPr>
       </w:pPr>
-      <w:hyperlink w:anchor="_Toc243833152" w:history="1">
+      <w:hyperlink w:anchor="_Toc243839889" w:history="1">
         <w:r>
           <w:rPr>
             <w:rStyle w:val="Hyperlink"/>
@@ -1270,7 +1338,7 @@
             <w:noProof/>
             <w:webHidden/>
           </w:rPr>
-          <w:instrText xml:space="preserve"> PAGEREF _Toc243833152 \h </w:instrText>
+          <w:instrText xml:space="preserve"> PAGEREF _Toc243839889 \h </w:instrText>
         </w:r>
         <w:r>
           <w:rPr>
@@ -1290,7 +1358,7 @@
             <w:noProof/>
             <w:webHidden/>
           </w:rPr>
-          <w:t>13</w:t>
+          <w:t>14</w:t>
         </w:r>
         <w:r>
           <w:rPr>
@@ -1311,7 +1379,7 @@
           <w:noProof/>
         </w:rPr>
       </w:pPr>
-      <w:hyperlink w:anchor="_Toc243833153" w:history="1">
+      <w:hyperlink w:anchor="_Toc243839890" w:history="1">
         <w:r>
           <w:rPr>
             <w:rStyle w:val="Hyperlink"/>
@@ -1338,7 +1406,7 @@
             <w:noProof/>
             <w:webHidden/>
           </w:rPr>
-          <w:instrText xml:space="preserve"> PAGEREF _Toc243833153 \h </w:instrText>
+          <w:instrText xml:space="preserve"> PAGEREF _Toc243839890 \h </w:instrText>
         </w:r>
         <w:r>
           <w:rPr>
@@ -1358,7 +1426,7 @@
             <w:noProof/>
             <w:webHidden/>
           </w:rPr>
-          <w:t>13</w:t>
+          <w:t>14</w:t>
         </w:r>
         <w:r>
           <w:rPr>
@@ -1379,7 +1447,7 @@
           <w:noProof/>
         </w:rPr>
       </w:pPr>
-      <w:hyperlink w:anchor="_Toc243833154" w:history="1">
+      <w:hyperlink w:anchor="_Toc243839891" w:history="1">
         <w:r>
           <w:rPr>
             <w:rStyle w:val="Hyperlink"/>
@@ -1406,7 +1474,7 @@
             <w:noProof/>
             <w:webHidden/>
           </w:rPr>
-          <w:instrText xml:space="preserve"> PAGEREF _Toc243833154 \h </w:instrText>
+          <w:instrText xml:space="preserve"> PAGEREF _Toc243839891 \h </w:instrText>
         </w:r>
         <w:r>
           <w:rPr>
@@ -1426,7 +1494,7 @@
             <w:noProof/>
             <w:webHidden/>
           </w:rPr>
-          <w:t>14</w:t>
+          <w:t>15</w:t>
         </w:r>
         <w:r>
           <w:rPr>
@@ -1447,7 +1515,7 @@
           <w:noProof/>
         </w:rPr>
       </w:pPr>
-      <w:hyperlink w:anchor="_Toc243833155" w:history="1">
+      <w:hyperlink w:anchor="_Toc243839892" w:history="1">
         <w:r>
           <w:rPr>
             <w:rStyle w:val="Hyperlink"/>
@@ -1474,7 +1542,7 @@
             <w:noProof/>
             <w:webHidden/>
           </w:rPr>
-          <w:instrText xml:space="preserve"> PAGEREF _Toc243833155 \h </w:instrText>
+          <w:instrText xml:space="preserve"> PAGEREF _Toc243839892 \h </w:instrText>
         </w:r>
         <w:r>
           <w:rPr>
@@ -1494,7 +1562,7 @@
             <w:noProof/>
             <w:webHidden/>
           </w:rPr>
-          <w:t>15</w:t>
+          <w:t>16</w:t>
         </w:r>
         <w:r>
           <w:rPr>
@@ -1515,7 +1583,7 @@
           <w:noProof/>
         </w:rPr>
       </w:pPr>
-      <w:hyperlink w:anchor="_Toc243833156" w:history="1">
+      <w:hyperlink w:anchor="_Toc243839893" w:history="1">
         <w:r>
           <w:rPr>
             <w:rStyle w:val="Hyperlink"/>
@@ -1542,7 +1610,7 @@
             <w:noProof/>
             <w:webHidden/>
           </w:rPr>
-          <w:instrText xml:space="preserve"> PAGEREF _Toc243833156 \h </w:instrText>
+          <w:instrText xml:space="preserve"> PAGEREF _Toc243839893 \h </w:instrText>
         </w:r>
         <w:r>
           <w:rPr>
@@ -1562,7 +1630,7 @@
             <w:noProof/>
             <w:webHidden/>
           </w:rPr>
-          <w:t>15</w:t>
+          <w:t>16</w:t>
         </w:r>
         <w:r>
           <w:rPr>
@@ -1583,7 +1651,7 @@
           <w:noProof/>
         </w:rPr>
       </w:pPr>
-      <w:hyperlink w:anchor="_Toc243833157" w:history="1">
+      <w:hyperlink w:anchor="_Toc243839894" w:history="1">
         <w:r>
           <w:rPr>
             <w:rStyle w:val="Hyperlink"/>
@@ -1610,7 +1678,7 @@
             <w:noProof/>
             <w:webHidden/>
           </w:rPr>
-          <w:instrText xml:space="preserve"> PAGEREF _Toc243833157 \h </w:instrText>
+          <w:instrText xml:space="preserve"> PAGEREF _Toc243839894 \h </w:instrText>
         </w:r>
         <w:r>
           <w:rPr>
@@ -1630,7 +1698,7 @@
             <w:noProof/>
             <w:webHidden/>
           </w:rPr>
-          <w:t>16</w:t>
+          <w:t>17</w:t>
         </w:r>
         <w:r>
           <w:rPr>
@@ -1651,7 +1719,7 @@
           <w:noProof/>
         </w:rPr>
       </w:pPr>
-      <w:hyperlink w:anchor="_Toc243833158" w:history="1">
+      <w:hyperlink w:anchor="_Toc243839895" w:history="1">
         <w:r>
           <w:rPr>
             <w:rStyle w:val="Hyperlink"/>
@@ -1678,7 +1746,7 @@
             <w:noProof/>
             <w:webHidden/>
           </w:rPr>
-          <w:instrText xml:space="preserve"> PAGEREF _Toc243833158 \h </w:instrText>
+          <w:instrText xml:space="preserve"> PAGEREF _Toc243839895 \h </w:instrText>
         </w:r>
         <w:r>
           <w:rPr>
@@ -1698,7 +1766,7 @@
             <w:noProof/>
             <w:webHidden/>
           </w:rPr>
-          <w:t>16</w:t>
+          <w:t>17</w:t>
         </w:r>
         <w:r>
           <w:rPr>
@@ -1719,7 +1787,7 @@
           <w:noProof/>
         </w:rPr>
       </w:pPr>
-      <w:hyperlink w:anchor="_Toc243833159" w:history="1">
+      <w:hyperlink w:anchor="_Toc243839896" w:history="1">
         <w:r>
           <w:rPr>
             <w:rStyle w:val="Hyperlink"/>
@@ -1746,7 +1814,7 @@
             <w:noProof/>
             <w:webHidden/>
           </w:rPr>
-          <w:instrText xml:space="preserve"> PAGEREF _Toc243833159 \h </w:instrText>
+          <w:instrText xml:space="preserve"> PAGEREF _Toc243839896 \h </w:instrText>
         </w:r>
         <w:r>
           <w:rPr>
@@ -1766,7 +1834,7 @@
             <w:noProof/>
             <w:webHidden/>
           </w:rPr>
-          <w:t>16</w:t>
+          <w:t>17</w:t>
         </w:r>
         <w:r>
           <w:rPr>
@@ -1787,7 +1855,7 @@
           <w:noProof/>
         </w:rPr>
       </w:pPr>
-      <w:hyperlink w:anchor="_Toc243833160" w:history="1">
+      <w:hyperlink w:anchor="_Toc243839897" w:history="1">
         <w:r>
           <w:rPr>
             <w:rStyle w:val="Hyperlink"/>
@@ -1814,7 +1882,7 @@
             <w:noProof/>
             <w:webHidden/>
           </w:rPr>
-          <w:instrText xml:space="preserve"> PAGEREF _Toc243833160 \h </w:instrText>
+          <w:instrText xml:space="preserve"> PAGEREF _Toc243839897 \h </w:instrText>
         </w:r>
         <w:r>
           <w:rPr>
@@ -1834,7 +1902,7 @@
             <w:noProof/>
             <w:webHidden/>
           </w:rPr>
-          <w:t>16</w:t>
+          <w:t>17</w:t>
         </w:r>
         <w:r>
           <w:rPr>
@@ -1855,7 +1923,7 @@
           <w:noProof/>
         </w:rPr>
       </w:pPr>
-      <w:hyperlink w:anchor="_Toc243833161" w:history="1">
+      <w:hyperlink w:anchor="_Toc243839898" w:history="1">
         <w:r>
           <w:rPr>
             <w:rStyle w:val="Hyperlink"/>
@@ -1882,7 +1950,7 @@
             <w:noProof/>
             <w:webHidden/>
           </w:rPr>
-          <w:instrText xml:space="preserve"> PAGEREF _Toc243833161 \h </w:instrText>
+          <w:instrText xml:space="preserve"> PAGEREF _Toc243839898 \h </w:instrText>
         </w:r>
         <w:r>
           <w:rPr>
@@ -1902,7 +1970,7 @@
             <w:noProof/>
             <w:webHidden/>
           </w:rPr>
-          <w:t>17</w:t>
+          <w:t>18</w:t>
         </w:r>
         <w:r>
           <w:rPr>
@@ -1923,7 +1991,7 @@
           <w:noProof/>
         </w:rPr>
       </w:pPr>
-      <w:hyperlink w:anchor="_Toc243833162" w:history="1">
+      <w:hyperlink w:anchor="_Toc243839899" w:history="1">
         <w:r>
           <w:rPr>
             <w:rStyle w:val="Hyperlink"/>
@@ -1950,7 +2018,7 @@
             <w:noProof/>
             <w:webHidden/>
           </w:rPr>
-          <w:instrText xml:space="preserve"> PAGEREF _Toc243833162 \h </w:instrText>
+          <w:instrText xml:space="preserve"> PAGEREF _Toc243839899 \h </w:instrText>
         </w:r>
         <w:r>
           <w:rPr>
@@ -1970,7 +2038,7 @@
             <w:noProof/>
             <w:webHidden/>
           </w:rPr>
-          <w:t>18</w:t>
+          <w:t>19</w:t>
         </w:r>
         <w:r>
           <w:rPr>
@@ -1991,7 +2059,7 @@
           <w:noProof/>
         </w:rPr>
       </w:pPr>
-      <w:hyperlink w:anchor="_Toc243833163" w:history="1">
+      <w:hyperlink w:anchor="_Toc243839900" w:history="1">
         <w:r>
           <w:rPr>
             <w:rStyle w:val="Hyperlink"/>
@@ -2018,7 +2086,7 @@
             <w:noProof/>
             <w:webHidden/>
           </w:rPr>
-          <w:instrText xml:space="preserve"> PAGEREF _Toc243833163 \h </w:instrText>
+          <w:instrText xml:space="preserve"> PAGEREF _Toc243839900 \h </w:instrText>
         </w:r>
         <w:r>
           <w:rPr>
@@ -2038,7 +2106,7 @@
             <w:noProof/>
             <w:webHidden/>
           </w:rPr>
-          <w:t>18</w:t>
+          <w:t>19</w:t>
         </w:r>
         <w:r>
           <w:rPr>
@@ -2059,7 +2127,7 @@
           <w:noProof/>
         </w:rPr>
       </w:pPr>
-      <w:hyperlink w:anchor="_Toc243833164" w:history="1">
+      <w:hyperlink w:anchor="_Toc243839901" w:history="1">
         <w:r>
           <w:rPr>
             <w:rStyle w:val="Hyperlink"/>
@@ -2086,7 +2154,7 @@
             <w:noProof/>
             <w:webHidden/>
           </w:rPr>
-          <w:instrText xml:space="preserve"> PAGEREF _Toc243833164 \h </w:instrText>
+          <w:instrText xml:space="preserve"> PAGEREF _Toc243839901 \h </w:instrText>
         </w:r>
         <w:r>
           <w:rPr>
@@ -2106,7 +2174,7 @@
             <w:noProof/>
             <w:webHidden/>
           </w:rPr>
-          <w:t>18</w:t>
+          <w:t>19</w:t>
         </w:r>
         <w:r>
           <w:rPr>
@@ -2127,7 +2195,7 @@
           <w:noProof/>
         </w:rPr>
       </w:pPr>
-      <w:hyperlink w:anchor="_Toc243833165" w:history="1">
+      <w:hyperlink w:anchor="_Toc243839902" w:history="1">
         <w:r>
           <w:rPr>
             <w:rStyle w:val="Hyperlink"/>
@@ -2154,7 +2222,7 @@
             <w:noProof/>
             <w:webHidden/>
           </w:rPr>
-          <w:instrText xml:space="preserve"> PAGEREF _Toc243833165 \h </w:instrText>
+          <w:instrText xml:space="preserve"> PAGEREF _Toc243839902 \h </w:instrText>
         </w:r>
         <w:r>
           <w:rPr>
@@ -2174,7 +2242,7 @@
             <w:noProof/>
             <w:webHidden/>
           </w:rPr>
-          <w:t>19</w:t>
+          <w:t>20</w:t>
         </w:r>
         <w:r>
           <w:rPr>
@@ -2195,7 +2263,7 @@
           <w:noProof/>
         </w:rPr>
       </w:pPr>
-      <w:hyperlink w:anchor="_Toc243833166" w:history="1">
+      <w:hyperlink w:anchor="_Toc243839903" w:history="1">
         <w:r>
           <w:rPr>
             <w:rStyle w:val="Hyperlink"/>
@@ -2222,7 +2290,7 @@
             <w:noProof/>
             <w:webHidden/>
           </w:rPr>
-          <w:instrText xml:space="preserve"> PAGEREF _Toc243833166 \h </w:instrText>
+          <w:instrText xml:space="preserve"> PAGEREF _Toc243839903 \h </w:instrText>
         </w:r>
         <w:r>
           <w:rPr>
@@ -2242,7 +2310,7 @@
             <w:noProof/>
             <w:webHidden/>
           </w:rPr>
-          <w:t>19</w:t>
+          <w:t>20</w:t>
         </w:r>
         <w:r>
           <w:rPr>
@@ -2263,7 +2331,7 @@
           <w:noProof/>
         </w:rPr>
       </w:pPr>
-      <w:hyperlink w:anchor="_Toc243833167" w:history="1">
+      <w:hyperlink w:anchor="_Toc243839904" w:history="1">
         <w:r>
           <w:rPr>
             <w:rStyle w:val="Hyperlink"/>
@@ -2290,7 +2358,7 @@
             <w:noProof/>
             <w:webHidden/>
           </w:rPr>
-          <w:instrText xml:space="preserve"> PAGEREF _Toc243833167 \h </w:instrText>
+          <w:instrText xml:space="preserve"> PAGEREF _Toc243839904 \h </w:instrText>
         </w:r>
         <w:r>
           <w:rPr>
@@ -2310,7 +2378,7 @@
             <w:noProof/>
             <w:webHidden/>
           </w:rPr>
-          <w:t>19</w:t>
+          <w:t>20</w:t>
         </w:r>
         <w:r>
           <w:rPr>
@@ -2331,7 +2399,7 @@
           <w:noProof/>
         </w:rPr>
       </w:pPr>
-      <w:hyperlink w:anchor="_Toc243833168" w:history="1">
+      <w:hyperlink w:anchor="_Toc243839905" w:history="1">
         <w:r>
           <w:rPr>
             <w:rStyle w:val="Hyperlink"/>
@@ -2358,7 +2426,7 @@
             <w:noProof/>
             <w:webHidden/>
           </w:rPr>
-          <w:instrText xml:space="preserve"> PAGEREF _Toc243833168 \h </w:instrText>
+          <w:instrText xml:space="preserve"> PAGEREF _Toc243839905 \h </w:instrText>
         </w:r>
         <w:r>
           <w:rPr>
@@ -2378,7 +2446,7 @@
             <w:noProof/>
             <w:webHidden/>
           </w:rPr>
-          <w:t>20</w:t>
+          <w:t>21</w:t>
         </w:r>
         <w:r>
           <w:rPr>
@@ -2399,7 +2467,7 @@
           <w:noProof/>
         </w:rPr>
       </w:pPr>
-      <w:hyperlink w:anchor="_Toc243833169" w:history="1">
+      <w:hyperlink w:anchor="_Toc243839906" w:history="1">
         <w:r>
           <w:rPr>
             <w:rStyle w:val="Hyperlink"/>
@@ -2426,7 +2494,7 @@
             <w:noProof/>
             <w:webHidden/>
           </w:rPr>
-          <w:instrText xml:space="preserve"> PAGEREF _Toc243833169 \h </w:instrText>
+          <w:instrText xml:space="preserve"> PAGEREF _Toc243839906 \h </w:instrText>
         </w:r>
         <w:r>
           <w:rPr>
@@ -2446,7 +2514,7 @@
             <w:noProof/>
             <w:webHidden/>
           </w:rPr>
-          <w:t>21</w:t>
+          <w:t>22</w:t>
         </w:r>
         <w:r>
           <w:rPr>
@@ -2467,7 +2535,7 @@
           <w:noProof/>
         </w:rPr>
       </w:pPr>
-      <w:hyperlink w:anchor="_Toc243833170" w:history="1">
+      <w:hyperlink w:anchor="_Toc243839907" w:history="1">
         <w:r>
           <w:rPr>
             <w:rStyle w:val="Hyperlink"/>
@@ -2494,7 +2562,7 @@
             <w:noProof/>
             <w:webHidden/>
           </w:rPr>
-          <w:instrText xml:space="preserve"> PAGEREF _Toc243833170 \h </w:instrText>
+          <w:instrText xml:space="preserve"> PAGEREF _Toc243839907 \h </w:instrText>
         </w:r>
         <w:r>
           <w:rPr>
@@ -2514,7 +2582,7 @@
             <w:noProof/>
             <w:webHidden/>
           </w:rPr>
-          <w:t>21</w:t>
+          <w:t>22</w:t>
         </w:r>
         <w:r>
           <w:rPr>
@@ -2535,7 +2603,7 @@
           <w:noProof/>
         </w:rPr>
       </w:pPr>
-      <w:hyperlink w:anchor="_Toc243833171" w:history="1">
+      <w:hyperlink w:anchor="_Toc243839908" w:history="1">
         <w:r>
           <w:rPr>
             <w:rStyle w:val="Hyperlink"/>
@@ -2562,7 +2630,7 @@
             <w:noProof/>
             <w:webHidden/>
           </w:rPr>
-          <w:instrText xml:space="preserve"> PAGEREF _Toc243833171 \h </w:instrText>
+          <w:instrText xml:space="preserve"> PAGEREF _Toc243839908 \h </w:instrText>
         </w:r>
         <w:r>
           <w:rPr>
@@ -2582,7 +2650,7 @@
             <w:noProof/>
             <w:webHidden/>
           </w:rPr>
-          <w:t>21</w:t>
+          <w:t>22</w:t>
         </w:r>
         <w:r>
           <w:rPr>
@@ -2603,7 +2671,7 @@
           <w:noProof/>
         </w:rPr>
       </w:pPr>
-      <w:hyperlink w:anchor="_Toc243833172" w:history="1">
+      <w:hyperlink w:anchor="_Toc243839909" w:history="1">
         <w:r>
           <w:rPr>
             <w:rStyle w:val="Hyperlink"/>
@@ -2630,7 +2698,7 @@
             <w:noProof/>
             <w:webHidden/>
           </w:rPr>
-          <w:instrText xml:space="preserve"> PAGEREF _Toc243833172 \h </w:instrText>
+          <w:instrText xml:space="preserve"> PAGEREF _Toc243839909 \h </w:instrText>
         </w:r>
         <w:r>
           <w:rPr>
@@ -2650,7 +2718,7 @@
             <w:noProof/>
             <w:webHidden/>
           </w:rPr>
-          <w:t>21</w:t>
+          <w:t>22</w:t>
         </w:r>
         <w:r>
           <w:rPr>
@@ -2671,7 +2739,7 @@
           <w:noProof/>
         </w:rPr>
       </w:pPr>
-      <w:hyperlink w:anchor="_Toc243833173" w:history="1">
+      <w:hyperlink w:anchor="_Toc243839910" w:history="1">
         <w:r>
           <w:rPr>
             <w:rStyle w:val="Hyperlink"/>
@@ -2698,7 +2766,7 @@
             <w:noProof/>
             <w:webHidden/>
           </w:rPr>
-          <w:instrText xml:space="preserve"> PAGEREF _Toc243833173 \h </w:instrText>
+          <w:instrText xml:space="preserve"> PAGEREF _Toc243839910 \h </w:instrText>
         </w:r>
         <w:r>
           <w:rPr>
@@ -2718,7 +2786,7 @@
             <w:noProof/>
             <w:webHidden/>
           </w:rPr>
-          <w:t>22</w:t>
+          <w:t>23</w:t>
         </w:r>
         <w:r>
           <w:rPr>
@@ -2739,7 +2807,7 @@
           <w:noProof/>
         </w:rPr>
       </w:pPr>
-      <w:hyperlink w:anchor="_Toc243833174" w:history="1">
+      <w:hyperlink w:anchor="_Toc243839911" w:history="1">
         <w:r>
           <w:rPr>
             <w:rStyle w:val="Hyperlink"/>
@@ -2766,7 +2834,7 @@
             <w:noProof/>
             <w:webHidden/>
           </w:rPr>
-          <w:instrText xml:space="preserve"> PAGEREF _Toc243833174 \h </w:instrText>
+          <w:instrText xml:space="preserve"> PAGEREF _Toc243839911 \h </w:instrText>
         </w:r>
         <w:r>
           <w:rPr>
@@ -2786,7 +2854,7 @@
             <w:noProof/>
             <w:webHidden/>
           </w:rPr>
-          <w:t>22</w:t>
+          <w:t>23</w:t>
         </w:r>
         <w:r>
           <w:rPr>
@@ -2807,7 +2875,7 @@
           <w:noProof/>
         </w:rPr>
       </w:pPr>
-      <w:hyperlink w:anchor="_Toc243833175" w:history="1">
+      <w:hyperlink w:anchor="_Toc243839912" w:history="1">
         <w:r>
           <w:rPr>
             <w:rStyle w:val="Hyperlink"/>
@@ -2834,7 +2902,7 @@
             <w:noProof/>
             <w:webHidden/>
           </w:rPr>
-          <w:instrText xml:space="preserve"> PAGEREF _Toc243833175 \h </w:instrText>
+          <w:instrText xml:space="preserve"> PAGEREF _Toc243839912 \h </w:instrText>
         </w:r>
         <w:r>
           <w:rPr>
@@ -2854,7 +2922,7 @@
             <w:noProof/>
             <w:webHidden/>
           </w:rPr>
-          <w:t>23</w:t>
+          <w:t>24</w:t>
         </w:r>
         <w:r>
           <w:rPr>
@@ -2875,7 +2943,7 @@
           <w:noProof/>
         </w:rPr>
       </w:pPr>
-      <w:hyperlink w:anchor="_Toc243833176" w:history="1">
+      <w:hyperlink w:anchor="_Toc243839913" w:history="1">
         <w:r>
           <w:rPr>
             <w:rStyle w:val="Hyperlink"/>
@@ -2902,7 +2970,7 @@
             <w:noProof/>
             <w:webHidden/>
           </w:rPr>
-          <w:instrText xml:space="preserve"> PAGEREF _Toc243833176 \h </w:instrText>
+          <w:instrText xml:space="preserve"> PAGEREF _Toc243839913 \h </w:instrText>
         </w:r>
         <w:r>
           <w:rPr>
@@ -2922,7 +2990,7 @@
             <w:noProof/>
             <w:webHidden/>
           </w:rPr>
-          <w:t>23</w:t>
+          <w:t>24</w:t>
         </w:r>
         <w:r>
           <w:rPr>
@@ -2943,7 +3011,7 @@
           <w:noProof/>
         </w:rPr>
       </w:pPr>
-      <w:hyperlink w:anchor="_Toc243833177" w:history="1">
+      <w:hyperlink w:anchor="_Toc243839914" w:history="1">
         <w:r>
           <w:rPr>
             <w:rStyle w:val="Hyperlink"/>
@@ -2970,7 +3038,7 @@
             <w:noProof/>
             <w:webHidden/>
           </w:rPr>
-          <w:instrText xml:space="preserve"> PAGEREF _Toc243833177 \h </w:instrText>
+          <w:instrText xml:space="preserve"> PAGEREF _Toc243839914 \h </w:instrText>
         </w:r>
         <w:r>
           <w:rPr>
@@ -2990,7 +3058,7 @@
             <w:noProof/>
             <w:webHidden/>
           </w:rPr>
-          <w:t>23</w:t>
+          <w:t>24</w:t>
         </w:r>
         <w:r>
           <w:rPr>
@@ -3011,7 +3079,7 @@
           <w:noProof/>
         </w:rPr>
       </w:pPr>
-      <w:hyperlink w:anchor="_Toc243833178" w:history="1">
+      <w:hyperlink w:anchor="_Toc243839915" w:history="1">
         <w:r>
           <w:rPr>
             <w:rStyle w:val="Hyperlink"/>
@@ -3038,7 +3106,7 @@
             <w:noProof/>
             <w:webHidden/>
           </w:rPr>
-          <w:instrText xml:space="preserve"> PAGEREF _Toc243833178 \h </w:instrText>
+          <w:instrText xml:space="preserve"> PAGEREF _Toc243839915 \h </w:instrText>
         </w:r>
         <w:r>
           <w:rPr>
@@ -3058,7 +3126,7 @@
             <w:noProof/>
             <w:webHidden/>
           </w:rPr>
-          <w:t>24</w:t>
+          <w:t>25</w:t>
         </w:r>
         <w:r>
           <w:rPr>
@@ -3079,7 +3147,7 @@
           <w:noProof/>
         </w:rPr>
       </w:pPr>
-      <w:hyperlink w:anchor="_Toc243833179" w:history="1">
+      <w:hyperlink w:anchor="_Toc243839916" w:history="1">
         <w:r>
           <w:rPr>
             <w:rStyle w:val="Hyperlink"/>
@@ -3106,7 +3174,7 @@
             <w:noProof/>
             <w:webHidden/>
           </w:rPr>
-          <w:instrText xml:space="preserve"> PAGEREF _Toc243833179 \h </w:instrText>
+          <w:instrText xml:space="preserve"> PAGEREF _Toc243839916 \h </w:instrText>
         </w:r>
         <w:r>
           <w:rPr>
@@ -3126,7 +3194,7 @@
             <w:noProof/>
             <w:webHidden/>
           </w:rPr>
-          <w:t>24</w:t>
+          <w:t>25</w:t>
         </w:r>
         <w:r>
           <w:rPr>
@@ -3147,7 +3215,7 @@
           <w:noProof/>
         </w:rPr>
       </w:pPr>
-      <w:hyperlink w:anchor="_Toc243833180" w:history="1">
+      <w:hyperlink w:anchor="_Toc243839917" w:history="1">
         <w:r>
           <w:rPr>
             <w:rStyle w:val="Hyperlink"/>
@@ -3174,7 +3242,7 @@
             <w:noProof/>
             <w:webHidden/>
           </w:rPr>
-          <w:instrText xml:space="preserve"> PAGEREF _Toc243833180 \h </w:instrText>
+          <w:instrText xml:space="preserve"> PAGEREF _Toc243839917 \h </w:instrText>
         </w:r>
         <w:r>
           <w:rPr>
@@ -3194,7 +3262,7 @@
             <w:noProof/>
             <w:webHidden/>
           </w:rPr>
-          <w:t>25</w:t>
+          <w:t>26</w:t>
         </w:r>
         <w:r>
           <w:rPr>
@@ -3215,7 +3283,7 @@
           <w:noProof/>
         </w:rPr>
       </w:pPr>
-      <w:hyperlink w:anchor="_Toc243833181" w:history="1">
+      <w:hyperlink w:anchor="_Toc243839918" w:history="1">
         <w:r>
           <w:rPr>
             <w:rStyle w:val="Hyperlink"/>
@@ -3242,7 +3310,7 @@
             <w:noProof/>
             <w:webHidden/>
           </w:rPr>
-          <w:instrText xml:space="preserve"> PAGEREF _Toc243833181 \h </w:instrText>
+          <w:instrText xml:space="preserve"> PAGEREF _Toc243839918 \h </w:instrText>
         </w:r>
         <w:r>
           <w:rPr>
@@ -3262,7 +3330,7 @@
             <w:noProof/>
             <w:webHidden/>
           </w:rPr>
-          <w:t>26</w:t>
+          <w:t>27</w:t>
         </w:r>
         <w:r>
           <w:rPr>
@@ -3283,7 +3351,7 @@
           <w:noProof/>
         </w:rPr>
       </w:pPr>
-      <w:hyperlink w:anchor="_Toc243833182" w:history="1">
+      <w:hyperlink w:anchor="_Toc243839919" w:history="1">
         <w:r>
           <w:rPr>
             <w:rStyle w:val="Hyperlink"/>
@@ -3310,7 +3378,7 @@
             <w:noProof/>
             <w:webHidden/>
           </w:rPr>
-          <w:instrText xml:space="preserve"> PAGEREF _Toc243833182 \h </w:instrText>
+          <w:instrText xml:space="preserve"> PAGEREF _Toc243839919 \h </w:instrText>
         </w:r>
         <w:r>
           <w:rPr>
@@ -3330,7 +3398,7 @@
             <w:noProof/>
             <w:webHidden/>
           </w:rPr>
-          <w:t>26</w:t>
+          <w:t>27</w:t>
         </w:r>
         <w:r>
           <w:rPr>
@@ -3351,7 +3419,7 @@
           <w:noProof/>
         </w:rPr>
       </w:pPr>
-      <w:hyperlink w:anchor="_Toc243833183" w:history="1">
+      <w:hyperlink w:anchor="_Toc243839920" w:history="1">
         <w:r>
           <w:rPr>
             <w:rStyle w:val="Hyperlink"/>
@@ -3378,7 +3446,7 @@
             <w:noProof/>
             <w:webHidden/>
           </w:rPr>
-          <w:instrText xml:space="preserve"> PAGEREF _Toc243833183 \h </w:instrText>
+          <w:instrText xml:space="preserve"> PAGEREF _Toc243839920 \h </w:instrText>
         </w:r>
         <w:r>
           <w:rPr>
@@ -3398,7 +3466,7 @@
             <w:noProof/>
             <w:webHidden/>
           </w:rPr>
-          <w:t>26</w:t>
+          <w:t>27</w:t>
         </w:r>
         <w:r>
           <w:rPr>
@@ -3419,7 +3487,7 @@
           <w:noProof/>
         </w:rPr>
       </w:pPr>
-      <w:hyperlink w:anchor="_Toc243833184" w:history="1">
+      <w:hyperlink w:anchor="_Toc243839921" w:history="1">
         <w:r>
           <w:rPr>
             <w:rStyle w:val="Hyperlink"/>
@@ -3446,7 +3514,7 @@
             <w:noProof/>
             <w:webHidden/>
           </w:rPr>
-          <w:instrText xml:space="preserve"> PAGEREF _Toc243833184 \h </w:instrText>
+          <w:instrText xml:space="preserve"> PAGEREF _Toc243839921 \h </w:instrText>
         </w:r>
         <w:r>
           <w:rPr>
@@ -3466,7 +3534,7 @@
             <w:noProof/>
             <w:webHidden/>
           </w:rPr>
-          <w:t>28</w:t>
+          <w:t>29</w:t>
         </w:r>
         <w:r>
           <w:rPr>
@@ -3487,7 +3555,7 @@
           <w:noProof/>
         </w:rPr>
       </w:pPr>
-      <w:hyperlink w:anchor="_Toc243833185" w:history="1">
+      <w:hyperlink w:anchor="_Toc243839922" w:history="1">
         <w:r>
           <w:rPr>
             <w:rStyle w:val="Hyperlink"/>
@@ -3514,7 +3582,7 @@
             <w:noProof/>
             <w:webHidden/>
           </w:rPr>
-          <w:instrText xml:space="preserve"> PAGEREF _Toc243833185 \h </w:instrText>
+          <w:instrText xml:space="preserve"> PAGEREF _Toc243839922 \h </w:instrText>
         </w:r>
         <w:r>
           <w:rPr>
@@ -3534,7 +3602,7 @@
             <w:noProof/>
             <w:webHidden/>
           </w:rPr>
-          <w:t>28</w:t>
+          <w:t>29</w:t>
         </w:r>
         <w:r>
           <w:rPr>
@@ -3555,7 +3623,7 @@
           <w:noProof/>
         </w:rPr>
       </w:pPr>
-      <w:hyperlink w:anchor="_Toc243833186" w:history="1">
+      <w:hyperlink w:anchor="_Toc243839923" w:history="1">
         <w:r>
           <w:rPr>
             <w:rStyle w:val="Hyperlink"/>
@@ -3582,7 +3650,7 @@
             <w:noProof/>
             <w:webHidden/>
           </w:rPr>
-          <w:instrText xml:space="preserve"> PAGEREF _Toc243833186 \h </w:instrText>
+          <w:instrText xml:space="preserve"> PAGEREF _Toc243839923 \h </w:instrText>
         </w:r>
         <w:r>
           <w:rPr>
@@ -3602,7 +3670,7 @@
             <w:noProof/>
             <w:webHidden/>
           </w:rPr>
-          <w:t>28</w:t>
+          <w:t>29</w:t>
         </w:r>
         <w:r>
           <w:rPr>
@@ -3623,7 +3691,7 @@
           <w:noProof/>
         </w:rPr>
       </w:pPr>
-      <w:hyperlink w:anchor="_Toc243833187" w:history="1">
+      <w:hyperlink w:anchor="_Toc243839924" w:history="1">
         <w:r>
           <w:rPr>
             <w:rStyle w:val="Hyperlink"/>
@@ -3650,7 +3718,7 @@
             <w:noProof/>
             <w:webHidden/>
           </w:rPr>
-          <w:instrText xml:space="preserve"> PAGEREF _Toc243833187 \h </w:instrText>
+          <w:instrText xml:space="preserve"> PAGEREF _Toc243839924 \h </w:instrText>
         </w:r>
         <w:r>
           <w:rPr>
@@ -3670,7 +3738,7 @@
             <w:noProof/>
             <w:webHidden/>
           </w:rPr>
-          <w:t>29</w:t>
+          <w:t>30</w:t>
         </w:r>
         <w:r>
           <w:rPr>
@@ -3691,7 +3759,7 @@
           <w:noProof/>
         </w:rPr>
       </w:pPr>
-      <w:hyperlink w:anchor="_Toc243833188" w:history="1">
+      <w:hyperlink w:anchor="_Toc243839925" w:history="1">
         <w:r>
           <w:rPr>
             <w:rStyle w:val="Hyperlink"/>
@@ -3718,7 +3786,7 @@
             <w:noProof/>
             <w:webHidden/>
           </w:rPr>
-          <w:instrText xml:space="preserve"> PAGEREF _Toc243833188 \h </w:instrText>
+          <w:instrText xml:space="preserve"> PAGEREF _Toc243839925 \h </w:instrText>
         </w:r>
         <w:r>
           <w:rPr>
@@ -3738,7 +3806,7 @@
             <w:noProof/>
             <w:webHidden/>
           </w:rPr>
-          <w:t>29</w:t>
+          <w:t>30</w:t>
         </w:r>
         <w:r>
           <w:rPr>
@@ -3759,7 +3827,7 @@
           <w:noProof/>
         </w:rPr>
       </w:pPr>
-      <w:hyperlink w:anchor="_Toc243833189" w:history="1">
+      <w:hyperlink w:anchor="_Toc243839926" w:history="1">
         <w:r>
           <w:rPr>
             <w:rStyle w:val="Hyperlink"/>
@@ -3786,7 +3854,7 @@
             <w:noProof/>
             <w:webHidden/>
           </w:rPr>
-          <w:instrText xml:space="preserve"> PAGEREF _Toc243833189 \h </w:instrText>
+          <w:instrText xml:space="preserve"> PAGEREF _Toc243839926 \h </w:instrText>
         </w:r>
         <w:r>
           <w:rPr>
@@ -3806,7 +3874,7 @@
             <w:noProof/>
             <w:webHidden/>
           </w:rPr>
-          <w:t>30</w:t>
+          <w:t>31</w:t>
         </w:r>
         <w:r>
           <w:rPr>
@@ -3827,7 +3895,7 @@
           <w:noProof/>
         </w:rPr>
       </w:pPr>
-      <w:hyperlink w:anchor="_Toc243833190" w:history="1">
+      <w:hyperlink w:anchor="_Toc243839927" w:history="1">
         <w:r>
           <w:rPr>
             <w:rStyle w:val="Hyperlink"/>
@@ -3854,7 +3922,7 @@
             <w:noProof/>
             <w:webHidden/>
           </w:rPr>
-          <w:instrText xml:space="preserve"> PAGEREF _Toc243833190 \h </w:instrText>
+          <w:instrText xml:space="preserve"> PAGEREF _Toc243839927 \h </w:instrText>
         </w:r>
         <w:r>
           <w:rPr>
@@ -3874,7 +3942,7 @@
             <w:noProof/>
             <w:webHidden/>
           </w:rPr>
-          <w:t>30</w:t>
+          <w:t>31</w:t>
         </w:r>
         <w:r>
           <w:rPr>
@@ -3895,7 +3963,7 @@
           <w:noProof/>
         </w:rPr>
       </w:pPr>
-      <w:hyperlink w:anchor="_Toc243833191" w:history="1">
+      <w:hyperlink w:anchor="_Toc243839928" w:history="1">
         <w:r>
           <w:rPr>
             <w:rStyle w:val="Hyperlink"/>
@@ -3922,7 +3990,7 @@
             <w:noProof/>
             <w:webHidden/>
           </w:rPr>
-          <w:instrText xml:space="preserve"> PAGEREF _Toc243833191 \h </w:instrText>
+          <w:instrText xml:space="preserve"> PAGEREF _Toc243839928 \h </w:instrText>
         </w:r>
         <w:r>
           <w:rPr>
@@ -3942,7 +4010,7 @@
             <w:noProof/>
             <w:webHidden/>
           </w:rPr>
-          <w:t>30</w:t>
+          <w:t>31</w:t>
         </w:r>
         <w:r>
           <w:rPr>
@@ -3963,7 +4031,7 @@
           <w:noProof/>
         </w:rPr>
       </w:pPr>
-      <w:hyperlink w:anchor="_Toc243833192" w:history="1">
+      <w:hyperlink w:anchor="_Toc243839929" w:history="1">
         <w:r>
           <w:rPr>
             <w:rStyle w:val="Hyperlink"/>
@@ -3990,7 +4058,7 @@
             <w:noProof/>
             <w:webHidden/>
           </w:rPr>
-          <w:instrText xml:space="preserve"> PAGEREF _Toc243833192 \h </w:instrText>
+          <w:instrText xml:space="preserve"> PAGEREF _Toc243839929 \h </w:instrText>
         </w:r>
         <w:r>
           <w:rPr>
@@ -4010,7 +4078,7 @@
             <w:noProof/>
             <w:webHidden/>
           </w:rPr>
-          <w:t>31</w:t>
+          <w:t>32</w:t>
         </w:r>
         <w:r>
           <w:rPr>
@@ -4031,7 +4099,7 @@
           <w:noProof/>
         </w:rPr>
       </w:pPr>
-      <w:hyperlink w:anchor="_Toc243833193" w:history="1">
+      <w:hyperlink w:anchor="_Toc243839930" w:history="1">
         <w:r>
           <w:rPr>
             <w:rStyle w:val="Hyperlink"/>
@@ -4058,7 +4126,7 @@
             <w:noProof/>
             <w:webHidden/>
           </w:rPr>
-          <w:instrText xml:space="preserve"> PAGEREF _Toc243833193 \h </w:instrText>
+          <w:instrText xml:space="preserve"> PAGEREF _Toc243839930 \h </w:instrText>
         </w:r>
         <w:r>
           <w:rPr>
@@ -4078,7 +4146,7 @@
             <w:noProof/>
             <w:webHidden/>
           </w:rPr>
-          <w:t>32</w:t>
+          <w:t>33</w:t>
         </w:r>
         <w:r>
           <w:rPr>
@@ -4103,7 +4171,7 @@
       <w:pPr>
         <w:pStyle w:val="Heading1"/>
       </w:pPr>
-      <w:bookmarkStart w:id="0" w:name="_Toc243833135"/>
+      <w:bookmarkStart w:id="0" w:name="_Toc243839871"/>
       <w:r>
         <w:lastRenderedPageBreak/>
         <w:t>Foreword</w:t>
@@ -4137,7 +4205,7 @@
       <w:pPr>
         <w:pStyle w:val="Heading1"/>
       </w:pPr>
-      <w:bookmarkStart w:id="1" w:name="_Toc243833136"/>
+      <w:bookmarkStart w:id="1" w:name="_Toc243839872"/>
       <w:r>
         <w:lastRenderedPageBreak/>
         <w:t>What Litterbox is</w:t>
@@ -4233,7 +4301,7 @@
       <w:pPr>
         <w:pStyle w:val="Heading2"/>
       </w:pPr>
-      <w:bookmarkStart w:id="2" w:name="_Toc243833137"/>
+      <w:bookmarkStart w:id="2" w:name="_Toc243839873"/>
       <w:r>
         <w:t>Terms</w:t>
       </w:r>
@@ -4740,7 +4808,7 @@
       <w:pPr>
         <w:pStyle w:val="Heading1"/>
       </w:pPr>
-      <w:bookmarkStart w:id="3" w:name="_Toc243833138"/>
+      <w:bookmarkStart w:id="3" w:name="_Toc243839874"/>
       <w:r>
         <w:lastRenderedPageBreak/>
         <w:t>Getting started</w:t>
@@ -4756,7 +4824,7 @@
       <w:pPr>
         <w:pStyle w:val="Heading2"/>
       </w:pPr>
-      <w:bookmarkStart w:id="4" w:name="_Toc243833139"/>
+      <w:bookmarkStart w:id="4" w:name="_Toc243839875"/>
       <w:r>
         <w:t>What you need</w:t>
       </w:r>
@@ -4841,7 +4909,7 @@
       <w:pPr>
         <w:pStyle w:val="Heading2"/>
       </w:pPr>
-      <w:bookmarkStart w:id="5" w:name="_Toc243833140"/>
+      <w:bookmarkStart w:id="5" w:name="_Toc243839876"/>
       <w:r>
         <w:t>Installing Litterbox</w:t>
       </w:r>
@@ -4971,7 +5039,7 @@
       <w:pPr>
         <w:pStyle w:val="Heading2"/>
       </w:pPr>
-      <w:bookmarkStart w:id="6" w:name="_Toc243833141"/>
+      <w:bookmarkStart w:id="6" w:name="_Toc243839877"/>
       <w:r>
         <w:lastRenderedPageBreak/>
         <w:t>Joining your team's vault</w:t>
@@ -5078,7 +5146,7 @@
       <w:pPr>
         <w:pStyle w:val="Heading2"/>
       </w:pPr>
-      <w:bookmarkStart w:id="7" w:name="_Toc243833142"/>
+      <w:bookmarkStart w:id="7" w:name="_Toc243839878"/>
       <w:r>
         <w:t>Decisions to make first</w:t>
       </w:r>
@@ -5350,7 +5418,7 @@
       <w:pPr>
         <w:pStyle w:val="Heading2"/>
       </w:pPr>
-      <w:bookmarkStart w:id="8" w:name="_Toc243833143"/>
+      <w:bookmarkStart w:id="8" w:name="_Toc243839879"/>
       <w:r>
         <w:lastRenderedPageBreak/>
         <w:t>Setting up a new team</w:t>
@@ -5620,7 +5688,7 @@
       <w:pPr>
         <w:pStyle w:val="Heading2"/>
       </w:pPr>
-      <w:bookmarkStart w:id="9" w:name="_Toc243833144"/>
+      <w:bookmarkStart w:id="9" w:name="_Toc243839880"/>
       <w:r>
         <w:t>The main window</w:t>
       </w:r>
@@ -6031,7 +6099,7 @@
       <w:pPr>
         <w:pStyle w:val="Heading2"/>
       </w:pPr>
-      <w:bookmarkStart w:id="10" w:name="_Toc243833145"/>
+      <w:bookmarkStart w:id="10" w:name="_Toc243839881"/>
       <w:r>
         <w:t>Your first part</w:t>
       </w:r>
@@ -6150,6 +6218,498 @@
       </w:r>
     </w:p>
     <w:p>
+      <w:pPr>
+        <w:pStyle w:val="Heading2"/>
+      </w:pPr>
+      <w:bookmarkStart w:id="11" w:name="_Toc243839882"/>
+      <w:r>
+        <w:t>Creating a new part, step by step</w:t>
+      </w:r>
+      <w:bookmarkEnd w:id="11"/>
+    </w:p>
+    <w:p>
+      <w:r>
+        <w:t>The same steps in full, for when you want to follow them one by one. The first part is the same either way; the second depends on whether Litterbox makes the model from a template or you save it yourself.</w:t>
+      </w:r>
+    </w:p>
+    <w:p>
+      <w:pPr>
+        <w:pStyle w:val="Heading3"/>
+      </w:pPr>
+      <w:r>
+        <w:t>Creating the part number</w:t>
+      </w:r>
+    </w:p>
+    <w:p>
+      <w:pPr>
+        <w:pStyle w:val="ListNumber"/>
+        <w:numPr>
+          <w:ilvl w:val="0"/>
+          <w:numId w:val="14"/>
+        </w:numPr>
+      </w:pPr>
+      <w:r>
+        <w:t xml:space="preserve">In Litterbox, choose Create &gt; </w:t>
+      </w:r>
+      <w:r>
+        <w:rPr>
+          <w:b/>
+        </w:rPr>
+        <w:t>New Part</w:t>
+      </w:r>
+      <w:r>
+        <w:t xml:space="preserve"> (or </w:t>
+      </w:r>
+      <w:r>
+        <w:rPr>
+          <w:b/>
+        </w:rPr>
+        <w:t>New Assembly</w:t>
+      </w:r>
+      <w:r>
+        <w:t xml:space="preserve"> for an assembly).</w:t>
+      </w:r>
+    </w:p>
+    <w:p>
+      <w:pPr>
+        <w:pStyle w:val="ListNumber"/>
+        <w:numPr>
+          <w:ilvl w:val="0"/>
+          <w:numId w:val="14"/>
+        </w:numPr>
+      </w:pPr>
+      <w:r>
+        <w:t xml:space="preserve">Type a </w:t>
+      </w:r>
+      <w:r>
+        <w:rPr>
+          <w:b/>
+        </w:rPr>
+        <w:t>Name</w:t>
+      </w:r>
+      <w:r>
+        <w:t xml:space="preserve">: a short, plain name such as Motor Mount Bracket. Add a </w:t>
+      </w:r>
+      <w:r>
+        <w:rPr>
+          <w:b/>
+        </w:rPr>
+        <w:t>Description</w:t>
+      </w:r>
+      <w:r>
+        <w:t xml:space="preserve"> if it helps.</w:t>
+      </w:r>
+    </w:p>
+    <w:p>
+      <w:pPr>
+        <w:pStyle w:val="ListNumber"/>
+        <w:numPr>
+          <w:ilvl w:val="0"/>
+          <w:numId w:val="14"/>
+        </w:numPr>
+      </w:pPr>
+      <w:r>
+        <w:t xml:space="preserve">Choose a </w:t>
+      </w:r>
+      <w:r>
+        <w:rPr>
+          <w:b/>
+        </w:rPr>
+        <w:t>Project</w:t>
+      </w:r>
+      <w:r>
+        <w:t xml:space="preserve"> if the part belongs to one, so its number comes from the project's block.</w:t>
+      </w:r>
+    </w:p>
+    <w:p>
+      <w:pPr>
+        <w:pStyle w:val="ListNumber"/>
+        <w:numPr>
+          <w:ilvl w:val="0"/>
+          <w:numId w:val="14"/>
+        </w:numPr>
+      </w:pPr>
+      <w:r>
+        <w:t xml:space="preserve">Choose a </w:t>
+      </w:r>
+      <w:r>
+        <w:rPr>
+          <w:b/>
+        </w:rPr>
+        <w:t>Template</w:t>
+      </w:r>
+      <w:r>
+        <w:t xml:space="preserve">: the default is already chosen. Choose </w:t>
+      </w:r>
+      <w:r>
+        <w:rPr>
+          <w:b/>
+        </w:rPr>
+        <w:t>None: I'll save the file myself</w:t>
+      </w:r>
+      <w:r>
+        <w:t xml:space="preserve"> if you have already modelled the part, or want to start the file in SolidWorks yourself.</w:t>
+      </w:r>
+    </w:p>
+    <w:p>
+      <w:pPr>
+        <w:pStyle w:val="ListNumber"/>
+        <w:numPr>
+          <w:ilvl w:val="0"/>
+          <w:numId w:val="14"/>
+        </w:numPr>
+      </w:pPr>
+      <w:r>
+        <w:t xml:space="preserve">Leave the </w:t>
+      </w:r>
+      <w:r>
+        <w:rPr>
+          <w:b/>
+        </w:rPr>
+        <w:t>Part number</w:t>
+      </w:r>
+      <w:r>
+        <w:t xml:space="preserve"> boxes empty to take the number Litterbox suggests (shown in grey), or type another. The line under the boxes says whether the number is free.</w:t>
+      </w:r>
+    </w:p>
+    <w:p>
+      <w:pPr>
+        <w:pStyle w:val="ListNumber"/>
+        <w:numPr>
+          <w:ilvl w:val="0"/>
+          <w:numId w:val="14"/>
+        </w:numPr>
+      </w:pPr>
+      <w:r>
+        <w:t xml:space="preserve">Press </w:t>
+      </w:r>
+      <w:r>
+        <w:rPr>
+          <w:b/>
+        </w:rPr>
+        <w:t>Create</w:t>
+      </w:r>
+      <w:r>
+        <w:t>. Litterbox creates the part, checks it out to you, and selects it in the parts list.</w:t>
+      </w:r>
+    </w:p>
+    <w:p>
+      <w:pPr>
+        <w:pStyle w:val="Heading3"/>
+      </w:pPr>
+      <w:r>
+        <w:t>With a template</w:t>
+      </w:r>
+    </w:p>
+    <w:p>
+      <w:pPr>
+        <w:pStyle w:val="ListNumber"/>
+        <w:numPr>
+          <w:ilvl w:val="0"/>
+          <w:numId w:val="15"/>
+        </w:numPr>
+      </w:pPr>
+      <w:r>
+        <w:t>Litterbox makes the model from the template under the right name and opens it in SolidWorks.</w:t>
+      </w:r>
+    </w:p>
+    <w:p>
+      <w:pPr>
+        <w:pStyle w:val="ListNumber"/>
+        <w:numPr>
+          <w:ilvl w:val="0"/>
+          <w:numId w:val="15"/>
+        </w:numPr>
+      </w:pPr>
+      <w:r>
+        <w:t xml:space="preserve">Model the part, and save it with </w:t>
+      </w:r>
+      <w:r>
+        <w:rPr>
+          <w:b/>
+        </w:rPr>
+        <w:t>Save</w:t>
+      </w:r>
+      <w:r>
+        <w:t xml:space="preserve"> (Ctrl+S). Don't use Save As or change the name.</w:t>
+      </w:r>
+    </w:p>
+    <w:p>
+      <w:pPr>
+        <w:pStyle w:val="ListNumber"/>
+        <w:numPr>
+          <w:ilvl w:val="0"/>
+          <w:numId w:val="15"/>
+        </w:numPr>
+      </w:pPr>
+      <w:r>
+        <w:lastRenderedPageBreak/>
+        <w:t xml:space="preserve">For a drawing, choose Create &gt; </w:t>
+      </w:r>
+      <w:r>
+        <w:rPr>
+          <w:b/>
+        </w:rPr>
+        <w:t>New Drawing...</w:t>
+      </w:r>
+      <w:r>
+        <w:t xml:space="preserve"> in Litterbox, then add the views in SolidWorks and save.</w:t>
+      </w:r>
+    </w:p>
+    <w:p>
+      <w:pPr>
+        <w:pStyle w:val="ListNumber"/>
+        <w:numPr>
+          <w:ilvl w:val="0"/>
+          <w:numId w:val="15"/>
+        </w:numPr>
+      </w:pPr>
+      <w:r>
+        <w:t xml:space="preserve">Go to </w:t>
+      </w:r>
+      <w:r>
+        <w:rPr>
+          <w:b/>
+        </w:rPr>
+        <w:t>Checking the part in</w:t>
+      </w:r>
+      <w:r>
+        <w:t>, below.</w:t>
+      </w:r>
+    </w:p>
+    <w:p>
+      <w:pPr>
+        <w:pStyle w:val="Heading3"/>
+      </w:pPr>
+      <w:r>
+        <w:t>Saving the file yourself (pasting the part number)</w:t>
+      </w:r>
+    </w:p>
+    <w:p>
+      <w:r>
+        <w:t xml:space="preserve">With None as the template, Litterbox shows a </w:t>
+      </w:r>
+      <w:r>
+        <w:rPr>
+          <w:b/>
+        </w:rPr>
+        <w:t>Part created</w:t>
+      </w:r>
+      <w:r>
+        <w:t xml:space="preserve"> window with the file name the model must have, for example HCR‑100010‑001_A: the part number, then _ and the revision. It has no extension; SolidWorks adds it.</w:t>
+      </w:r>
+    </w:p>
+    <w:p>
+      <w:pPr>
+        <w:pStyle w:val="ListNumber"/>
+        <w:numPr>
+          <w:ilvl w:val="0"/>
+          <w:numId w:val="16"/>
+        </w:numPr>
+      </w:pPr>
+      <w:r>
+        <w:t xml:space="preserve">Press </w:t>
+      </w:r>
+      <w:r>
+        <w:rPr>
+          <w:b/>
+        </w:rPr>
+        <w:t>Copy filename</w:t>
+      </w:r>
+      <w:r>
+        <w:t xml:space="preserve"> (or Enter). The button changes to Copied. You can close the window now.</w:t>
+      </w:r>
+    </w:p>
+    <w:p>
+      <w:pPr>
+        <w:pStyle w:val="ListNumber"/>
+        <w:numPr>
+          <w:ilvl w:val="0"/>
+          <w:numId w:val="16"/>
+        </w:numPr>
+      </w:pPr>
+      <w:r>
+        <w:t xml:space="preserve">In SolidWorks, with the part open, choose File &gt; </w:t>
+      </w:r>
+      <w:r>
+        <w:rPr>
+          <w:b/>
+        </w:rPr>
+        <w:t>Save As</w:t>
+      </w:r>
+      <w:r>
+        <w:t>.</w:t>
+      </w:r>
+    </w:p>
+    <w:p>
+      <w:pPr>
+        <w:pStyle w:val="ListNumber"/>
+        <w:numPr>
+          <w:ilvl w:val="0"/>
+          <w:numId w:val="16"/>
+        </w:numPr>
+      </w:pPr>
+      <w:r>
+        <w:t>Go to the vault's cad folder: C:\Litterbox\&lt;vault&gt;\cad\ (with your vault's folder name).</w:t>
+      </w:r>
+    </w:p>
+    <w:p>
+      <w:pPr>
+        <w:pStyle w:val="ListNumber"/>
+        <w:numPr>
+          <w:ilvl w:val="0"/>
+          <w:numId w:val="16"/>
+        </w:numPr>
+      </w:pPr>
+      <w:r>
+        <w:t xml:space="preserve">Click in the </w:t>
+      </w:r>
+      <w:r>
+        <w:rPr>
+          <w:b/>
+        </w:rPr>
+        <w:t>File name</w:t>
+      </w:r>
+      <w:r>
+        <w:t xml:space="preserve"> box, select everything in it (Ctrl+A), and paste (Ctrl+V). The box now holds exactly HCR‑100010‑001_A, with nothing before or after it.</w:t>
+      </w:r>
+    </w:p>
+    <w:p>
+      <w:pPr>
+        <w:pStyle w:val="ListNumber"/>
+        <w:numPr>
+          <w:ilvl w:val="0"/>
+          <w:numId w:val="16"/>
+        </w:numPr>
+      </w:pPr>
+      <w:r>
+        <w:t xml:space="preserve">Leave </w:t>
+      </w:r>
+      <w:r>
+        <w:rPr>
+          <w:b/>
+        </w:rPr>
+        <w:t>Save as type</w:t>
+      </w:r>
+      <w:r>
+        <w:t xml:space="preserve"> as Part (*.prt;*.sldprt), or Assembly for an assembly, and press </w:t>
+      </w:r>
+      <w:r>
+        <w:rPr>
+          <w:b/>
+        </w:rPr>
+        <w:t>Save</w:t>
+      </w:r>
+      <w:r>
+        <w:t>.</w:t>
+      </w:r>
+    </w:p>
+    <w:p>
+      <w:pPr>
+        <w:pStyle w:val="ListNumber"/>
+        <w:numPr>
+          <w:ilvl w:val="0"/>
+          <w:numId w:val="16"/>
+        </w:numPr>
+      </w:pPr>
+      <w:r>
+        <w:t xml:space="preserve">For a drawing, open or make it in SolidWorks, choose File &gt; </w:t>
+      </w:r>
+      <w:r>
+        <w:rPr>
+          <w:b/>
+        </w:rPr>
+        <w:t>Save As</w:t>
+      </w:r>
+      <w:r>
+        <w:t xml:space="preserve">, go to the same cad folder, paste the same name, choose Drawing (*.drw;*.slddrw) as the type, and press </w:t>
+      </w:r>
+      <w:r>
+        <w:rPr>
+          <w:b/>
+        </w:rPr>
+        <w:t>Save</w:t>
+      </w:r>
+      <w:r>
+        <w:t>. The drawing gets the same name as its model, with .SLDDRW.</w:t>
+      </w:r>
+    </w:p>
+    <w:p>
+      <w:pPr>
+        <w:pBdr>
+          <w:left w:val="single" w:sz="18" w:space="8" w:color="1F5F8B"/>
+        </w:pBdr>
+        <w:shd w:val="clear" w:color="auto" w:fill="EEF3F7"/>
+        <w:spacing w:before="80" w:after="200"/>
+        <w:ind w:left="144"/>
+      </w:pPr>
+      <w:r>
+        <w:t>If the name or folder is not exactly right (a different folder, an extra space, or a missing _A), Litterbox can't match the file to the part and ignores it. If you closed the window before copying, the name is the part number from the parts list, then _A for a new part.</w:t>
+      </w:r>
+    </w:p>
+    <w:p>
+      <w:pPr>
+        <w:pStyle w:val="Heading3"/>
+      </w:pPr>
+      <w:r>
+        <w:t>Checking the part in</w:t>
+      </w:r>
+    </w:p>
+    <w:p>
+      <w:pPr>
+        <w:pStyle w:val="ListNumber"/>
+        <w:numPr>
+          <w:ilvl w:val="0"/>
+          <w:numId w:val="17"/>
+        </w:numPr>
+      </w:pPr>
+      <w:r>
+        <w:t xml:space="preserve">In Litterbox, tick the part's box in the parts list. Its </w:t>
+      </w:r>
+      <w:r>
+        <w:rPr>
+          <w:b/>
+        </w:rPr>
+        <w:t>Files</w:t>
+      </w:r>
+      <w:r>
+        <w:t xml:space="preserve"> column should show the files you saved.</w:t>
+      </w:r>
+    </w:p>
+    <w:p>
+      <w:pPr>
+        <w:pStyle w:val="ListNumber"/>
+        <w:numPr>
+          <w:ilvl w:val="0"/>
+          <w:numId w:val="17"/>
+        </w:numPr>
+      </w:pPr>
+      <w:r>
+        <w:t xml:space="preserve">Press </w:t>
+      </w:r>
+      <w:r>
+        <w:rPr>
+          <w:b/>
+        </w:rPr>
+        <w:t>Check In</w:t>
+      </w:r>
+      <w:r>
+        <w:t xml:space="preserve"> and add a comment if you like, such as First model.</w:t>
+      </w:r>
+    </w:p>
+    <w:p>
+      <w:pPr>
+        <w:pStyle w:val="ListNumber"/>
+        <w:numPr>
+          <w:ilvl w:val="0"/>
+          <w:numId w:val="17"/>
+        </w:numPr>
+      </w:pPr>
+      <w:r>
+        <w:t>Litterbox uploads the files and the record and releases the lock. Other people see the part after their next Get Latest.</w:t>
+      </w:r>
+    </w:p>
+    <w:p>
       <w:r>
         <w:br w:type="page"/>
       </w:r>
@@ -6158,22 +6718,22 @@
       <w:pPr>
         <w:pStyle w:val="Heading1"/>
       </w:pPr>
-      <w:bookmarkStart w:id="11" w:name="_Toc243833146"/>
+      <w:bookmarkStart w:id="12" w:name="_Toc243839883"/>
       <w:r>
         <w:lastRenderedPageBreak/>
         <w:t>Everyday work</w:t>
       </w:r>
-      <w:bookmarkEnd w:id="11"/>
+      <w:bookmarkEnd w:id="12"/>
     </w:p>
     <w:p>
       <w:pPr>
         <w:pStyle w:val="Heading2"/>
       </w:pPr>
-      <w:bookmarkStart w:id="12" w:name="_Toc243833147"/>
+      <w:bookmarkStart w:id="13" w:name="_Toc243839884"/>
       <w:r>
         <w:t>Part numbers and file names</w:t>
       </w:r>
-      <w:bookmarkEnd w:id="12"/>
+      <w:bookmarkEnd w:id="13"/>
     </w:p>
     <w:p>
       <w:r>
@@ -6209,11 +6769,11 @@
       <w:pPr>
         <w:pStyle w:val="Heading2"/>
       </w:pPr>
-      <w:bookmarkStart w:id="13" w:name="_Toc243833148"/>
+      <w:bookmarkStart w:id="14" w:name="_Toc243839885"/>
       <w:r>
         <w:t>Projects</w:t>
       </w:r>
-      <w:bookmarkEnd w:id="13"/>
+      <w:bookmarkEnd w:id="14"/>
     </w:p>
     <w:p>
       <w:r>
@@ -6509,11 +7069,11 @@
       <w:pPr>
         <w:pStyle w:val="Heading2"/>
       </w:pPr>
-      <w:bookmarkStart w:id="14" w:name="_Toc243833149"/>
+      <w:bookmarkStart w:id="15" w:name="_Toc243839886"/>
       <w:r>
         <w:t>Finding parts</w:t>
       </w:r>
-      <w:bookmarkEnd w:id="14"/>
+      <w:bookmarkEnd w:id="15"/>
     </w:p>
     <w:p>
       <w:pPr>
@@ -6563,11 +7123,11 @@
       <w:pPr>
         <w:pStyle w:val="Heading2"/>
       </w:pPr>
-      <w:bookmarkStart w:id="15" w:name="_Toc243833150"/>
+      <w:bookmarkStart w:id="16" w:name="_Toc243839887"/>
       <w:r>
         <w:t>Folders</w:t>
       </w:r>
-      <w:bookmarkEnd w:id="15"/>
+      <w:bookmarkEnd w:id="16"/>
     </w:p>
     <w:p>
       <w:r>
@@ -6930,11 +7490,11 @@
       <w:pPr>
         <w:pStyle w:val="Heading2"/>
       </w:pPr>
-      <w:bookmarkStart w:id="16" w:name="_Toc243833151"/>
+      <w:bookmarkStart w:id="17" w:name="_Toc243839888"/>
       <w:r>
         <w:t>Checking out and checking in</w:t>
       </w:r>
-      <w:bookmarkEnd w:id="16"/>
+      <w:bookmarkEnd w:id="17"/>
     </w:p>
     <w:p>
       <w:r>
@@ -6955,7 +7515,7 @@
         <w:pStyle w:val="ListNumber"/>
         <w:numPr>
           <w:ilvl w:val="0"/>
-          <w:numId w:val="14"/>
+          <w:numId w:val="18"/>
         </w:numPr>
       </w:pPr>
       <w:r>
@@ -6976,7 +7536,7 @@
         <w:pStyle w:val="ListNumber"/>
         <w:numPr>
           <w:ilvl w:val="0"/>
-          <w:numId w:val="14"/>
+          <w:numId w:val="18"/>
         </w:numPr>
       </w:pPr>
       <w:r>
@@ -6988,7 +7548,7 @@
         <w:pStyle w:val="ListNumber"/>
         <w:numPr>
           <w:ilvl w:val="0"/>
-          <w:numId w:val="14"/>
+          <w:numId w:val="18"/>
         </w:numPr>
       </w:pPr>
       <w:r>
@@ -7060,11 +7620,11 @@
       <w:pPr>
         <w:pStyle w:val="Heading2"/>
       </w:pPr>
-      <w:bookmarkStart w:id="17" w:name="_Toc243833152"/>
+      <w:bookmarkStart w:id="18" w:name="_Toc243839889"/>
       <w:r>
         <w:t>Getting other people's changes</w:t>
       </w:r>
-      <w:bookmarkEnd w:id="17"/>
+      <w:bookmarkEnd w:id="18"/>
     </w:p>
     <w:p>
       <w:r>
@@ -7090,11 +7650,11 @@
       <w:pPr>
         <w:pStyle w:val="Heading2"/>
       </w:pPr>
-      <w:bookmarkStart w:id="18" w:name="_Toc243833153"/>
+      <w:bookmarkStart w:id="19" w:name="_Toc243839890"/>
       <w:r>
         <w:t>Opening files</w:t>
       </w:r>
-      <w:bookmarkEnd w:id="18"/>
+      <w:bookmarkEnd w:id="19"/>
     </w:p>
     <w:p>
       <w:r>
@@ -7149,12 +7709,12 @@
       <w:pPr>
         <w:pStyle w:val="Heading2"/>
       </w:pPr>
-      <w:bookmarkStart w:id="19" w:name="_Toc243833154"/>
+      <w:bookmarkStart w:id="20" w:name="_Toc243839891"/>
       <w:r>
         <w:lastRenderedPageBreak/>
         <w:t>The details pane</w:t>
       </w:r>
-      <w:bookmarkEnd w:id="19"/>
+      <w:bookmarkEnd w:id="20"/>
     </w:p>
     <w:tbl>
       <w:tblPr>
@@ -7422,12 +7982,12 @@
       <w:pPr>
         <w:pStyle w:val="Heading1"/>
       </w:pPr>
-      <w:bookmarkStart w:id="20" w:name="_Toc243833155"/>
+      <w:bookmarkStart w:id="21" w:name="_Toc243839892"/>
       <w:r>
         <w:lastRenderedPageBreak/>
         <w:t>Revisions and the lifecycle</w:t>
       </w:r>
-      <w:bookmarkEnd w:id="20"/>
+      <w:bookmarkEnd w:id="21"/>
     </w:p>
     <w:p>
       <w:r>
@@ -7792,11 +8352,11 @@
       <w:pPr>
         <w:pStyle w:val="Heading2"/>
       </w:pPr>
-      <w:bookmarkStart w:id="21" w:name="_Toc243833156"/>
+      <w:bookmarkStart w:id="22" w:name="_Toc243839893"/>
       <w:r>
         <w:t>Form, Fit, Function, and Dispo</w:t>
       </w:r>
-      <w:bookmarkEnd w:id="21"/>
+      <w:bookmarkEnd w:id="22"/>
     </w:p>
     <w:p>
       <w:r>
@@ -7886,22 +8446,22 @@
       <w:pPr>
         <w:pStyle w:val="Heading1"/>
       </w:pPr>
-      <w:bookmarkStart w:id="22" w:name="_Toc243833157"/>
+      <w:bookmarkStart w:id="23" w:name="_Toc243839894"/>
       <w:r>
         <w:lastRenderedPageBreak/>
         <w:t>Assemblies, references, and BOMs</w:t>
       </w:r>
-      <w:bookmarkEnd w:id="22"/>
+      <w:bookmarkEnd w:id="23"/>
     </w:p>
     <w:p>
       <w:pPr>
         <w:pStyle w:val="Heading2"/>
       </w:pPr>
-      <w:bookmarkStart w:id="23" w:name="_Toc243833158"/>
+      <w:bookmarkStart w:id="24" w:name="_Toc243839895"/>
       <w:r>
         <w:t>Uses and where used</w:t>
       </w:r>
-      <w:bookmarkEnd w:id="23"/>
+      <w:bookmarkEnd w:id="24"/>
     </w:p>
     <w:p>
       <w:r>
@@ -7950,11 +8510,11 @@
       <w:pPr>
         <w:pStyle w:val="Heading2"/>
       </w:pPr>
-      <w:bookmarkStart w:id="24" w:name="_Toc243833159"/>
+      <w:bookmarkStart w:id="25" w:name="_Toc243839896"/>
       <w:r>
         <w:t>The BOM tab</w:t>
       </w:r>
-      <w:bookmarkEnd w:id="24"/>
+      <w:bookmarkEnd w:id="25"/>
     </w:p>
     <w:p>
       <w:r>
@@ -8076,11 +8636,11 @@
       <w:pPr>
         <w:pStyle w:val="Heading2"/>
       </w:pPr>
-      <w:bookmarkStart w:id="25" w:name="_Toc243833160"/>
+      <w:bookmarkStart w:id="26" w:name="_Toc243839897"/>
       <w:r>
         <w:t>Toolbox parts</w:t>
       </w:r>
-      <w:bookmarkEnd w:id="25"/>
+      <w:bookmarkEnd w:id="26"/>
     </w:p>
     <w:p>
       <w:r>
@@ -8308,11 +8868,11 @@
       <w:pPr>
         <w:pStyle w:val="Heading2"/>
       </w:pPr>
-      <w:bookmarkStart w:id="26" w:name="_Toc243833161"/>
+      <w:bookmarkStart w:id="27" w:name="_Toc243839898"/>
       <w:r>
         <w:t>Non-CAD parts and kits</w:t>
       </w:r>
-      <w:bookmarkEnd w:id="26"/>
+      <w:bookmarkEnd w:id="27"/>
     </w:p>
     <w:p>
       <w:r>
@@ -8378,22 +8938,22 @@
       <w:pPr>
         <w:pStyle w:val="Heading1"/>
       </w:pPr>
-      <w:bookmarkStart w:id="27" w:name="_Toc243833162"/>
+      <w:bookmarkStart w:id="28" w:name="_Toc243839899"/>
       <w:r>
         <w:lastRenderedPageBreak/>
         <w:t>Purchasing, costs, and materials</w:t>
       </w:r>
-      <w:bookmarkEnd w:id="27"/>
+      <w:bookmarkEnd w:id="28"/>
     </w:p>
     <w:p>
       <w:pPr>
         <w:pStyle w:val="Heading2"/>
       </w:pPr>
-      <w:bookmarkStart w:id="28" w:name="_Toc243833163"/>
+      <w:bookmarkStart w:id="29" w:name="_Toc243839900"/>
       <w:r>
         <w:t>Purchasing info</w:t>
       </w:r>
-      <w:bookmarkEnd w:id="28"/>
+      <w:bookmarkEnd w:id="29"/>
     </w:p>
     <w:p>
       <w:r>
@@ -8427,11 +8987,11 @@
       <w:pPr>
         <w:pStyle w:val="Heading2"/>
       </w:pPr>
-      <w:bookmarkStart w:id="29" w:name="_Toc243833164"/>
+      <w:bookmarkStart w:id="30" w:name="_Toc243839901"/>
       <w:r>
         <w:t>Materials</w:t>
       </w:r>
-      <w:bookmarkEnd w:id="29"/>
+      <w:bookmarkEnd w:id="30"/>
     </w:p>
     <w:p>
       <w:r>
@@ -8465,22 +9025,22 @@
       <w:pPr>
         <w:pStyle w:val="Heading1"/>
       </w:pPr>
-      <w:bookmarkStart w:id="30" w:name="_Toc243833165"/>
+      <w:bookmarkStart w:id="31" w:name="_Toc243839902"/>
       <w:r>
         <w:lastRenderedPageBreak/>
         <w:t>Release outputs and exports</w:t>
       </w:r>
-      <w:bookmarkEnd w:id="30"/>
+      <w:bookmarkEnd w:id="31"/>
     </w:p>
     <w:p>
       <w:pPr>
         <w:pStyle w:val="Heading2"/>
       </w:pPr>
-      <w:bookmarkStart w:id="31" w:name="_Toc243833166"/>
+      <w:bookmarkStart w:id="32" w:name="_Toc243839903"/>
       <w:r>
         <w:t>STEP and PDF files</w:t>
       </w:r>
-      <w:bookmarkEnd w:id="31"/>
+      <w:bookmarkEnd w:id="32"/>
     </w:p>
     <w:p>
       <w:pPr>
@@ -8537,11 +9097,11 @@
       <w:pPr>
         <w:pStyle w:val="Heading2"/>
       </w:pPr>
-      <w:bookmarkStart w:id="32" w:name="_Toc243833167"/>
+      <w:bookmarkStart w:id="33" w:name="_Toc243839904"/>
       <w:r>
         <w:t>Exporting</w:t>
       </w:r>
-      <w:bookmarkEnd w:id="32"/>
+      <w:bookmarkEnd w:id="33"/>
     </w:p>
     <w:p>
       <w:r>
@@ -8566,12 +9126,12 @@
       <w:pPr>
         <w:pStyle w:val="Heading1"/>
       </w:pPr>
-      <w:bookmarkStart w:id="33" w:name="_Toc243833168"/>
+      <w:bookmarkStart w:id="34" w:name="_Toc243839905"/>
       <w:r>
         <w:lastRenderedPageBreak/>
         <w:t>Documents</w:t>
       </w:r>
-      <w:bookmarkEnd w:id="33"/>
+      <w:bookmarkEnd w:id="34"/>
     </w:p>
     <w:p>
       <w:r>
@@ -8671,22 +9231,22 @@
       <w:pPr>
         <w:pStyle w:val="Heading1"/>
       </w:pPr>
-      <w:bookmarkStart w:id="34" w:name="_Toc243833169"/>
+      <w:bookmarkStart w:id="35" w:name="_Toc243839906"/>
       <w:r>
         <w:lastRenderedPageBreak/>
         <w:t>Sign-off workflows and ECOs</w:t>
       </w:r>
-      <w:bookmarkEnd w:id="34"/>
+      <w:bookmarkEnd w:id="35"/>
     </w:p>
     <w:p>
       <w:pPr>
         <w:pStyle w:val="Heading2"/>
       </w:pPr>
-      <w:bookmarkStart w:id="35" w:name="_Toc243833170"/>
+      <w:bookmarkStart w:id="36" w:name="_Toc243839907"/>
       <w:r>
         <w:t>How workflows work</w:t>
       </w:r>
-      <w:bookmarkEnd w:id="35"/>
+      <w:bookmarkEnd w:id="36"/>
     </w:p>
     <w:p>
       <w:r>
@@ -8738,18 +9298,18 @@
       <w:pPr>
         <w:pStyle w:val="Heading2"/>
       </w:pPr>
-      <w:bookmarkStart w:id="36" w:name="_Toc243833171"/>
+      <w:bookmarkStart w:id="37" w:name="_Toc243839908"/>
       <w:r>
         <w:t>Asking for sign-off</w:t>
       </w:r>
-      <w:bookmarkEnd w:id="36"/>
+      <w:bookmarkEnd w:id="37"/>
     </w:p>
     <w:p>
       <w:pPr>
         <w:pStyle w:val="ListNumber"/>
         <w:numPr>
           <w:ilvl w:val="0"/>
-          <w:numId w:val="15"/>
+          <w:numId w:val="19"/>
         </w:numPr>
       </w:pPr>
       <w:r>
@@ -8761,7 +9321,7 @@
         <w:pStyle w:val="ListNumber"/>
         <w:numPr>
           <w:ilvl w:val="0"/>
-          <w:numId w:val="15"/>
+          <w:numId w:val="19"/>
         </w:numPr>
       </w:pPr>
       <w:r>
@@ -8809,7 +9369,7 @@
         <w:pStyle w:val="ListNumber"/>
         <w:numPr>
           <w:ilvl w:val="0"/>
-          <w:numId w:val="15"/>
+          <w:numId w:val="19"/>
         </w:numPr>
       </w:pPr>
       <w:r>
@@ -8821,7 +9381,7 @@
         <w:pStyle w:val="ListNumber"/>
         <w:numPr>
           <w:ilvl w:val="0"/>
-          <w:numId w:val="15"/>
+          <w:numId w:val="19"/>
         </w:numPr>
       </w:pPr>
       <w:r>
@@ -8842,7 +9402,7 @@
         <w:pStyle w:val="ListNumber"/>
         <w:numPr>
           <w:ilvl w:val="0"/>
-          <w:numId w:val="15"/>
+          <w:numId w:val="19"/>
         </w:numPr>
       </w:pPr>
       <w:r>
@@ -8904,11 +9464,11 @@
       <w:pPr>
         <w:pStyle w:val="Heading2"/>
       </w:pPr>
-      <w:bookmarkStart w:id="37" w:name="_Toc243833172"/>
+      <w:bookmarkStart w:id="38" w:name="_Toc243839909"/>
       <w:r>
         <w:t>Reviewing a request</w:t>
       </w:r>
-      <w:bookmarkEnd w:id="37"/>
+      <w:bookmarkEnd w:id="38"/>
     </w:p>
     <w:p>
       <w:r>
@@ -9206,11 +9766,11 @@
       <w:pPr>
         <w:pStyle w:val="Heading2"/>
       </w:pPr>
-      <w:bookmarkStart w:id="38" w:name="_Toc243833173"/>
+      <w:bookmarkStart w:id="39" w:name="_Toc243839910"/>
       <w:r>
         <w:t>Rejected requests</w:t>
       </w:r>
-      <w:bookmarkEnd w:id="38"/>
+      <w:bookmarkEnd w:id="39"/>
     </w:p>
     <w:p>
       <w:r>
@@ -9279,11 +9839,11 @@
       <w:pPr>
         <w:pStyle w:val="Heading2"/>
       </w:pPr>
-      <w:bookmarkStart w:id="39" w:name="_Toc243833174"/>
+      <w:bookmarkStart w:id="40" w:name="_Toc243839911"/>
       <w:r>
         <w:t>Engineering change orders</w:t>
       </w:r>
-      <w:bookmarkEnd w:id="39"/>
+      <w:bookmarkEnd w:id="40"/>
     </w:p>
     <w:p>
       <w:r>
@@ -9331,12 +9891,12 @@
       <w:pPr>
         <w:pStyle w:val="Heading1"/>
       </w:pPr>
-      <w:bookmarkStart w:id="40" w:name="_Toc243833175"/>
+      <w:bookmarkStart w:id="41" w:name="_Toc243839912"/>
       <w:r>
         <w:lastRenderedPageBreak/>
         <w:t>Running the team</w:t>
       </w:r>
-      <w:bookmarkEnd w:id="40"/>
+      <w:bookmarkEnd w:id="41"/>
     </w:p>
     <w:p>
       <w:r>
@@ -9356,11 +9916,11 @@
       <w:pPr>
         <w:pStyle w:val="Heading2"/>
       </w:pPr>
-      <w:bookmarkStart w:id="41" w:name="_Toc243833176"/>
+      <w:bookmarkStart w:id="42" w:name="_Toc243839913"/>
       <w:r>
         <w:t>People and access</w:t>
       </w:r>
-      <w:bookmarkEnd w:id="41"/>
+      <w:bookmarkEnd w:id="42"/>
     </w:p>
     <w:tbl>
       <w:tblPr>
@@ -9654,11 +10214,11 @@
       <w:pPr>
         <w:pStyle w:val="Heading2"/>
       </w:pPr>
-      <w:bookmarkStart w:id="42" w:name="_Toc243833177"/>
+      <w:bookmarkStart w:id="43" w:name="_Toc243839914"/>
       <w:r>
         <w:t>Vault settings</w:t>
       </w:r>
-      <w:bookmarkEnd w:id="42"/>
+      <w:bookmarkEnd w:id="43"/>
     </w:p>
     <w:tbl>
       <w:tblPr>
@@ -10039,12 +10599,12 @@
       <w:pPr>
         <w:pStyle w:val="Heading2"/>
       </w:pPr>
-      <w:bookmarkStart w:id="43" w:name="_Toc243833178"/>
+      <w:bookmarkStart w:id="44" w:name="_Toc243839915"/>
       <w:r>
         <w:lastRenderedPageBreak/>
         <w:t>The team's Toolbox</w:t>
       </w:r>
-      <w:bookmarkEnd w:id="43"/>
+      <w:bookmarkEnd w:id="44"/>
     </w:p>
     <w:p>
       <w:r>
@@ -10083,7 +10643,7 @@
         <w:pStyle w:val="ListNumber"/>
         <w:numPr>
           <w:ilvl w:val="0"/>
-          <w:numId w:val="16"/>
+          <w:numId w:val="20"/>
         </w:numPr>
       </w:pPr>
       <w:r>
@@ -10101,7 +10661,7 @@
         <w:pStyle w:val="ListNumber"/>
         <w:numPr>
           <w:ilvl w:val="0"/>
-          <w:numId w:val="16"/>
+          <w:numId w:val="20"/>
         </w:numPr>
       </w:pPr>
       <w:r>
@@ -10113,7 +10673,7 @@
         <w:pStyle w:val="ListNumber"/>
         <w:numPr>
           <w:ilvl w:val="0"/>
-          <w:numId w:val="16"/>
+          <w:numId w:val="20"/>
         </w:numPr>
       </w:pPr>
       <w:r>
@@ -10147,11 +10707,11 @@
       <w:pPr>
         <w:pStyle w:val="Heading2"/>
       </w:pPr>
-      <w:bookmarkStart w:id="44" w:name="_Toc243833179"/>
+      <w:bookmarkStart w:id="45" w:name="_Toc243839916"/>
       <w:r>
         <w:t>Vault maintenance</w:t>
       </w:r>
-      <w:bookmarkEnd w:id="44"/>
+      <w:bookmarkEnd w:id="45"/>
     </w:p>
     <w:p>
       <w:pPr>
@@ -10212,12 +10772,12 @@
       <w:pPr>
         <w:pStyle w:val="Heading1"/>
       </w:pPr>
-      <w:bookmarkStart w:id="45" w:name="_Toc243833180"/>
+      <w:bookmarkStart w:id="46" w:name="_Toc243839917"/>
       <w:r>
         <w:lastRenderedPageBreak/>
         <w:t>Importing existing CAD</w:t>
       </w:r>
-      <w:bookmarkEnd w:id="45"/>
+      <w:bookmarkEnd w:id="46"/>
     </w:p>
     <w:p>
       <w:r>
@@ -10238,7 +10798,7 @@
         <w:pStyle w:val="ListNumber"/>
         <w:numPr>
           <w:ilvl w:val="0"/>
-          <w:numId w:val="17"/>
+          <w:numId w:val="21"/>
         </w:numPr>
       </w:pPr>
       <w:r>
@@ -10250,7 +10810,7 @@
         <w:pStyle w:val="ListNumber"/>
         <w:numPr>
           <w:ilvl w:val="0"/>
-          <w:numId w:val="17"/>
+          <w:numId w:val="21"/>
         </w:numPr>
       </w:pPr>
       <w:r>
@@ -10262,7 +10822,7 @@
         <w:pStyle w:val="ListNumber"/>
         <w:numPr>
           <w:ilvl w:val="0"/>
-          <w:numId w:val="17"/>
+          <w:numId w:val="21"/>
         </w:numPr>
       </w:pPr>
       <w:r>
@@ -10308,12 +10868,12 @@
       <w:pPr>
         <w:pStyle w:val="Heading1"/>
       </w:pPr>
-      <w:bookmarkStart w:id="46" w:name="_Toc243833181"/>
+      <w:bookmarkStart w:id="47" w:name="_Toc243839918"/>
       <w:r>
         <w:lastRenderedPageBreak/>
         <w:t>Working with SolidWorks</w:t>
       </w:r>
-      <w:bookmarkEnd w:id="46"/>
+      <w:bookmarkEnd w:id="47"/>
     </w:p>
     <w:p>
       <w:r>
@@ -10384,11 +10944,11 @@
       <w:pPr>
         <w:pStyle w:val="Heading2"/>
       </w:pPr>
-      <w:bookmarkStart w:id="47" w:name="_Toc243833182"/>
+      <w:bookmarkStart w:id="48" w:name="_Toc243839919"/>
       <w:r>
         <w:t>Configurations</w:t>
       </w:r>
-      <w:bookmarkEnd w:id="47"/>
+      <w:bookmarkEnd w:id="48"/>
     </w:p>
     <w:p>
       <w:r>
@@ -10448,11 +11008,11 @@
       <w:pPr>
         <w:pStyle w:val="Heading2"/>
       </w:pPr>
-      <w:bookmarkStart w:id="48" w:name="_Toc243833183"/>
+      <w:bookmarkStart w:id="49" w:name="_Toc243839920"/>
       <w:r>
         <w:t>Templates</w:t>
       </w:r>
-      <w:bookmarkEnd w:id="48"/>
+      <w:bookmarkEnd w:id="49"/>
     </w:p>
     <w:p>
       <w:r>
@@ -10726,12 +11286,12 @@
       <w:pPr>
         <w:pStyle w:val="Heading1"/>
       </w:pPr>
-      <w:bookmarkStart w:id="49" w:name="_Toc243833184"/>
+      <w:bookmarkStart w:id="50" w:name="_Toc243839921"/>
       <w:r>
         <w:lastRenderedPageBreak/>
         <w:t>How Litterbox works</w:t>
       </w:r>
-      <w:bookmarkEnd w:id="49"/>
+      <w:bookmarkEnd w:id="50"/>
     </w:p>
     <w:p>
       <w:r>
@@ -10742,11 +11302,11 @@
       <w:pPr>
         <w:pStyle w:val="Heading2"/>
       </w:pPr>
-      <w:bookmarkStart w:id="50" w:name="_Toc243833185"/>
+      <w:bookmarkStart w:id="51" w:name="_Toc243839922"/>
       <w:r>
         <w:t>The vault is a Git repository</w:t>
       </w:r>
-      <w:bookmarkEnd w:id="50"/>
+      <w:bookmarkEnd w:id="51"/>
     </w:p>
     <w:p>
       <w:r>
@@ -11146,11 +11706,11 @@
       <w:pPr>
         <w:pStyle w:val="Heading2"/>
       </w:pPr>
-      <w:bookmarkStart w:id="51" w:name="_Toc243833186"/>
+      <w:bookmarkStart w:id="52" w:name="_Toc243839923"/>
       <w:r>
         <w:t>Locks, read-only files, and uploads</w:t>
       </w:r>
-      <w:bookmarkEnd w:id="51"/>
+      <w:bookmarkEnd w:id="52"/>
     </w:p>
     <w:p>
       <w:pPr>
@@ -11247,11 +11807,11 @@
       <w:pPr>
         <w:pStyle w:val="Heading2"/>
       </w:pPr>
-      <w:bookmarkStart w:id="52" w:name="_Toc243833187"/>
+      <w:bookmarkStart w:id="53" w:name="_Toc243839924"/>
       <w:r>
         <w:t>Downloads</w:t>
       </w:r>
-      <w:bookmarkEnd w:id="52"/>
+      <w:bookmarkEnd w:id="53"/>
     </w:p>
     <w:p>
       <w:r>
@@ -11271,11 +11831,11 @@
       <w:pPr>
         <w:pStyle w:val="Heading2"/>
       </w:pPr>
-      <w:bookmarkStart w:id="53" w:name="_Toc243833188"/>
+      <w:bookmarkStart w:id="54" w:name="_Toc243839925"/>
       <w:r>
         <w:t>The job queue</w:t>
       </w:r>
-      <w:bookmarkEnd w:id="53"/>
+      <w:bookmarkEnd w:id="54"/>
     </w:p>
     <w:p>
       <w:r>
@@ -11420,22 +11980,22 @@
       <w:pPr>
         <w:pStyle w:val="Heading1"/>
       </w:pPr>
-      <w:bookmarkStart w:id="54" w:name="_Toc243833189"/>
+      <w:bookmarkStart w:id="55" w:name="_Toc243839926"/>
       <w:r>
         <w:lastRenderedPageBreak/>
         <w:t>Settings and troubleshooting</w:t>
       </w:r>
-      <w:bookmarkEnd w:id="54"/>
+      <w:bookmarkEnd w:id="55"/>
     </w:p>
     <w:p>
       <w:pPr>
         <w:pStyle w:val="Heading2"/>
       </w:pPr>
-      <w:bookmarkStart w:id="55" w:name="_Toc243833190"/>
+      <w:bookmarkStart w:id="56" w:name="_Toc243839927"/>
       <w:r>
         <w:t>Your settings</w:t>
       </w:r>
-      <w:bookmarkEnd w:id="55"/>
+      <w:bookmarkEnd w:id="56"/>
     </w:p>
     <w:p>
       <w:r>
@@ -11795,11 +12355,11 @@
       <w:pPr>
         <w:pStyle w:val="Heading2"/>
       </w:pPr>
-      <w:bookmarkStart w:id="56" w:name="_Toc243833191"/>
+      <w:bookmarkStart w:id="57" w:name="_Toc243839928"/>
       <w:r>
         <w:t>Problems</w:t>
       </w:r>
-      <w:bookmarkEnd w:id="56"/>
+      <w:bookmarkEnd w:id="57"/>
     </w:p>
     <w:p>
       <w:pPr>
@@ -11912,12 +12472,12 @@
       <w:pPr>
         <w:pStyle w:val="Heading2"/>
       </w:pPr>
-      <w:bookmarkStart w:id="57" w:name="_Toc243833192"/>
+      <w:bookmarkStart w:id="58" w:name="_Toc243839929"/>
       <w:r>
         <w:lastRenderedPageBreak/>
         <w:t>The command line</w:t>
       </w:r>
-      <w:bookmarkEnd w:id="57"/>
+      <w:bookmarkEnd w:id="58"/>
     </w:p>
     <w:p>
       <w:r>
@@ -11953,12 +12513,12 @@
       <w:pPr>
         <w:pStyle w:val="Heading1"/>
       </w:pPr>
-      <w:bookmarkStart w:id="58" w:name="_Toc243833193"/>
+      <w:bookmarkStart w:id="59" w:name="_Toc243839930"/>
       <w:r>
         <w:lastRenderedPageBreak/>
         <w:t>Quick reference</w:t>
       </w:r>
-      <w:bookmarkEnd w:id="58"/>
+      <w:bookmarkEnd w:id="59"/>
     </w:p>
     <w:tbl>
       <w:tblPr>
@@ -12619,76 +13179,100 @@
       </w:rPr>
     </w:lvl>
   </w:abstractNum>
-  <w:num w:numId="1" w16cid:durableId="907154548">
+  <w:num w:numId="1" w16cid:durableId="1824656225">
     <w:abstractNumId w:val="8"/>
   </w:num>
-  <w:num w:numId="2" w16cid:durableId="1668945938">
+  <w:num w:numId="2" w16cid:durableId="49109677">
     <w:abstractNumId w:val="6"/>
   </w:num>
-  <w:num w:numId="3" w16cid:durableId="1420177705">
+  <w:num w:numId="3" w16cid:durableId="1072968833">
     <w:abstractNumId w:val="5"/>
   </w:num>
-  <w:num w:numId="4" w16cid:durableId="73741070">
+  <w:num w:numId="4" w16cid:durableId="1745641158">
     <w:abstractNumId w:val="4"/>
   </w:num>
-  <w:num w:numId="5" w16cid:durableId="226689859">
+  <w:num w:numId="5" w16cid:durableId="1930381109">
     <w:abstractNumId w:val="7"/>
   </w:num>
-  <w:num w:numId="6" w16cid:durableId="1230650701">
+  <w:num w:numId="6" w16cid:durableId="860901473">
     <w:abstractNumId w:val="3"/>
   </w:num>
-  <w:num w:numId="7" w16cid:durableId="412748388">
+  <w:num w:numId="7" w16cid:durableId="1318651095">
     <w:abstractNumId w:val="2"/>
   </w:num>
-  <w:num w:numId="8" w16cid:durableId="1215510416">
+  <w:num w:numId="8" w16cid:durableId="1021008513">
     <w:abstractNumId w:val="1"/>
   </w:num>
-  <w:num w:numId="9" w16cid:durableId="1415320902">
+  <w:num w:numId="9" w16cid:durableId="1598975430">
     <w:abstractNumId w:val="0"/>
   </w:num>
-  <w:num w:numId="10" w16cid:durableId="1503426206">
+  <w:num w:numId="10" w16cid:durableId="545873026">
     <w:abstractNumId w:val="7"/>
     <w:lvlOverride w:ilvl="0">
       <w:startOverride w:val="1"/>
     </w:lvlOverride>
   </w:num>
-  <w:num w:numId="11" w16cid:durableId="1746147815">
+  <w:num w:numId="11" w16cid:durableId="354623806">
     <w:abstractNumId w:val="7"/>
     <w:lvlOverride w:ilvl="0">
       <w:startOverride w:val="1"/>
     </w:lvlOverride>
   </w:num>
-  <w:num w:numId="12" w16cid:durableId="2067218865">
+  <w:num w:numId="12" w16cid:durableId="410976576">
     <w:abstractNumId w:val="7"/>
     <w:lvlOverride w:ilvl="0">
       <w:startOverride w:val="1"/>
     </w:lvlOverride>
   </w:num>
-  <w:num w:numId="13" w16cid:durableId="1403528167">
+  <w:num w:numId="13" w16cid:durableId="749735281">
     <w:abstractNumId w:val="7"/>
     <w:lvlOverride w:ilvl="0">
       <w:startOverride w:val="1"/>
     </w:lvlOverride>
   </w:num>
-  <w:num w:numId="14" w16cid:durableId="1301035953">
+  <w:num w:numId="14" w16cid:durableId="749740800">
     <w:abstractNumId w:val="7"/>
     <w:lvlOverride w:ilvl="0">
       <w:startOverride w:val="1"/>
     </w:lvlOverride>
   </w:num>
-  <w:num w:numId="15" w16cid:durableId="1292400321">
+  <w:num w:numId="15" w16cid:durableId="1618876406">
     <w:abstractNumId w:val="7"/>
     <w:lvlOverride w:ilvl="0">
       <w:startOverride w:val="1"/>
     </w:lvlOverride>
   </w:num>
-  <w:num w:numId="16" w16cid:durableId="1170411891">
+  <w:num w:numId="16" w16cid:durableId="1649244218">
     <w:abstractNumId w:val="7"/>
     <w:lvlOverride w:ilvl="0">
       <w:startOverride w:val="1"/>
     </w:lvlOverride>
   </w:num>
-  <w:num w:numId="17" w16cid:durableId="1163930559">
+  <w:num w:numId="17" w16cid:durableId="1407343658">
+    <w:abstractNumId w:val="7"/>
+    <w:lvlOverride w:ilvl="0">
+      <w:startOverride w:val="1"/>
+    </w:lvlOverride>
+  </w:num>
+  <w:num w:numId="18" w16cid:durableId="513423258">
+    <w:abstractNumId w:val="7"/>
+    <w:lvlOverride w:ilvl="0">
+      <w:startOverride w:val="1"/>
+    </w:lvlOverride>
+  </w:num>
+  <w:num w:numId="19" w16cid:durableId="1358778575">
+    <w:abstractNumId w:val="7"/>
+    <w:lvlOverride w:ilvl="0">
+      <w:startOverride w:val="1"/>
+    </w:lvlOverride>
+  </w:num>
+  <w:num w:numId="20" w16cid:durableId="294793413">
+    <w:abstractNumId w:val="7"/>
+    <w:lvlOverride w:ilvl="0">
+      <w:startOverride w:val="1"/>
+    </w:lvlOverride>
+  </w:num>
+  <w:num w:numId="21" w16cid:durableId="1648315724">
     <w:abstractNumId w:val="7"/>
     <w:lvlOverride w:ilvl="0">
       <w:startOverride w:val="1"/>
@@ -24058,7 +24642,7 @@
     <w:autoRedefine/>
     <w:uiPriority w:val="39"/>
     <w:unhideWhenUsed/>
-    <w:rsid w:val="007B630C"/>
+    <w:rsid w:val="001669DE"/>
     <w:pPr>
       <w:spacing w:after="100"/>
     </w:pPr>
@@ -24070,7 +24654,7 @@
     <w:autoRedefine/>
     <w:uiPriority w:val="39"/>
     <w:unhideWhenUsed/>
-    <w:rsid w:val="007B630C"/>
+    <w:rsid w:val="001669DE"/>
     <w:pPr>
       <w:spacing w:after="100"/>
       <w:ind w:left="210"/>
@@ -24081,7 +24665,7 @@
     <w:basedOn w:val="DefaultParagraphFont"/>
     <w:uiPriority w:val="99"/>
     <w:unhideWhenUsed/>
-    <w:rsid w:val="007B630C"/>
+    <w:rsid w:val="001669DE"/>
     <w:rPr>
       <w:color w:val="0000FF" w:themeColor="hyperlink"/>
       <w:u w:val="single"/>

</xml_diff>

<commit_message>
1.0.2: the Workflows table scrolls sideways, with notes for cut-off cells
A horizontal scrollbar under the My Tasks and All Workflows tables. The
columns keep their widths (Status takes any room left over), and resting the
mouse on a cell that doesn't fully show, or is scrolled partly out of sight,
shows all of its text. VERSION 1.0.2, the CHANGELOG, and the guide rebuilt.

Co-Authored-By: Claude Opus 5.5 <noreply@anthropic.com>
</commit_message>
<xml_diff>
--- a/docs/Litterbox_User_Guide.docx
+++ b/docs/Litterbox_User_Guide.docx
@@ -46,7 +46,7 @@
         <w:rPr>
           <w:color w:val="666666"/>
         </w:rPr>
-        <w:t>For Litterbox 1.0.1  ·  October 2026</w:t>
+        <w:t>For Litterbox 1.0.2  ·  October 2026</w:t>
       </w:r>
     </w:p>
     <w:p>
@@ -87,7 +87,7 @@
       <w:r>
         <w:fldChar w:fldCharType="separate"/>
       </w:r>
-      <w:hyperlink w:anchor="_Toc243839871" w:history="1">
+      <w:hyperlink w:anchor="_Toc243841955" w:history="1">
         <w:r>
           <w:rPr>
             <w:rStyle w:val="Hyperlink"/>
@@ -114,7 +114,7 @@
             <w:noProof/>
             <w:webHidden/>
           </w:rPr>
-          <w:instrText xml:space="preserve"> PAGEREF _Toc243839871 \h </w:instrText>
+          <w:instrText xml:space="preserve"> PAGEREF _Toc243841955 \h </w:instrText>
         </w:r>
         <w:r>
           <w:rPr>
@@ -155,7 +155,7 @@
           <w:noProof/>
         </w:rPr>
       </w:pPr>
-      <w:hyperlink w:anchor="_Toc243839872" w:history="1">
+      <w:hyperlink w:anchor="_Toc243841956" w:history="1">
         <w:r>
           <w:rPr>
             <w:rStyle w:val="Hyperlink"/>
@@ -182,7 +182,7 @@
             <w:noProof/>
             <w:webHidden/>
           </w:rPr>
-          <w:instrText xml:space="preserve"> PAGEREF _Toc243839872 \h </w:instrText>
+          <w:instrText xml:space="preserve"> PAGEREF _Toc243841956 \h </w:instrText>
         </w:r>
         <w:r>
           <w:rPr>
@@ -223,7 +223,7 @@
           <w:noProof/>
         </w:rPr>
       </w:pPr>
-      <w:hyperlink w:anchor="_Toc243839873" w:history="1">
+      <w:hyperlink w:anchor="_Toc243841957" w:history="1">
         <w:r>
           <w:rPr>
             <w:rStyle w:val="Hyperlink"/>
@@ -250,7 +250,7 @@
             <w:noProof/>
             <w:webHidden/>
           </w:rPr>
-          <w:instrText xml:space="preserve"> PAGEREF _Toc243839873 \h </w:instrText>
+          <w:instrText xml:space="preserve"> PAGEREF _Toc243841957 \h </w:instrText>
         </w:r>
         <w:r>
           <w:rPr>
@@ -291,7 +291,7 @@
           <w:noProof/>
         </w:rPr>
       </w:pPr>
-      <w:hyperlink w:anchor="_Toc243839874" w:history="1">
+      <w:hyperlink w:anchor="_Toc243841958" w:history="1">
         <w:r>
           <w:rPr>
             <w:rStyle w:val="Hyperlink"/>
@@ -318,7 +318,7 @@
             <w:noProof/>
             <w:webHidden/>
           </w:rPr>
-          <w:instrText xml:space="preserve"> PAGEREF _Toc243839874 \h </w:instrText>
+          <w:instrText xml:space="preserve"> PAGEREF _Toc243841958 \h </w:instrText>
         </w:r>
         <w:r>
           <w:rPr>
@@ -359,7 +359,7 @@
           <w:noProof/>
         </w:rPr>
       </w:pPr>
-      <w:hyperlink w:anchor="_Toc243839875" w:history="1">
+      <w:hyperlink w:anchor="_Toc243841959" w:history="1">
         <w:r>
           <w:rPr>
             <w:rStyle w:val="Hyperlink"/>
@@ -386,7 +386,7 @@
             <w:noProof/>
             <w:webHidden/>
           </w:rPr>
-          <w:instrText xml:space="preserve"> PAGEREF _Toc243839875 \h </w:instrText>
+          <w:instrText xml:space="preserve"> PAGEREF _Toc243841959 \h </w:instrText>
         </w:r>
         <w:r>
           <w:rPr>
@@ -427,7 +427,7 @@
           <w:noProof/>
         </w:rPr>
       </w:pPr>
-      <w:hyperlink w:anchor="_Toc243839876" w:history="1">
+      <w:hyperlink w:anchor="_Toc243841960" w:history="1">
         <w:r>
           <w:rPr>
             <w:rStyle w:val="Hyperlink"/>
@@ -454,7 +454,7 @@
             <w:noProof/>
             <w:webHidden/>
           </w:rPr>
-          <w:instrText xml:space="preserve"> PAGEREF _Toc243839876 \h </w:instrText>
+          <w:instrText xml:space="preserve"> PAGEREF _Toc243841960 \h </w:instrText>
         </w:r>
         <w:r>
           <w:rPr>
@@ -495,7 +495,7 @@
           <w:noProof/>
         </w:rPr>
       </w:pPr>
-      <w:hyperlink w:anchor="_Toc243839877" w:history="1">
+      <w:hyperlink w:anchor="_Toc243841961" w:history="1">
         <w:r>
           <w:rPr>
             <w:rStyle w:val="Hyperlink"/>
@@ -522,7 +522,7 @@
             <w:noProof/>
             <w:webHidden/>
           </w:rPr>
-          <w:instrText xml:space="preserve"> PAGEREF _Toc243839877 \h </w:instrText>
+          <w:instrText xml:space="preserve"> PAGEREF _Toc243841961 \h </w:instrText>
         </w:r>
         <w:r>
           <w:rPr>
@@ -563,7 +563,7 @@
           <w:noProof/>
         </w:rPr>
       </w:pPr>
-      <w:hyperlink w:anchor="_Toc243839878" w:history="1">
+      <w:hyperlink w:anchor="_Toc243841962" w:history="1">
         <w:r>
           <w:rPr>
             <w:rStyle w:val="Hyperlink"/>
@@ -590,7 +590,7 @@
             <w:noProof/>
             <w:webHidden/>
           </w:rPr>
-          <w:instrText xml:space="preserve"> PAGEREF _Toc243839878 \h </w:instrText>
+          <w:instrText xml:space="preserve"> PAGEREF _Toc243841962 \h </w:instrText>
         </w:r>
         <w:r>
           <w:rPr>
@@ -631,7 +631,7 @@
           <w:noProof/>
         </w:rPr>
       </w:pPr>
-      <w:hyperlink w:anchor="_Toc243839879" w:history="1">
+      <w:hyperlink w:anchor="_Toc243841963" w:history="1">
         <w:r>
           <w:rPr>
             <w:rStyle w:val="Hyperlink"/>
@@ -658,7 +658,7 @@
             <w:noProof/>
             <w:webHidden/>
           </w:rPr>
-          <w:instrText xml:space="preserve"> PAGEREF _Toc243839879 \h </w:instrText>
+          <w:instrText xml:space="preserve"> PAGEREF _Toc243841963 \h </w:instrText>
         </w:r>
         <w:r>
           <w:rPr>
@@ -699,7 +699,7 @@
           <w:noProof/>
         </w:rPr>
       </w:pPr>
-      <w:hyperlink w:anchor="_Toc243839880" w:history="1">
+      <w:hyperlink w:anchor="_Toc243841964" w:history="1">
         <w:r>
           <w:rPr>
             <w:rStyle w:val="Hyperlink"/>
@@ -726,7 +726,7 @@
             <w:noProof/>
             <w:webHidden/>
           </w:rPr>
-          <w:instrText xml:space="preserve"> PAGEREF _Toc243839880 \h </w:instrText>
+          <w:instrText xml:space="preserve"> PAGEREF _Toc243841964 \h </w:instrText>
         </w:r>
         <w:r>
           <w:rPr>
@@ -767,7 +767,7 @@
           <w:noProof/>
         </w:rPr>
       </w:pPr>
-      <w:hyperlink w:anchor="_Toc243839881" w:history="1">
+      <w:hyperlink w:anchor="_Toc243841965" w:history="1">
         <w:r>
           <w:rPr>
             <w:rStyle w:val="Hyperlink"/>
@@ -794,7 +794,7 @@
             <w:noProof/>
             <w:webHidden/>
           </w:rPr>
-          <w:instrText xml:space="preserve"> PAGEREF _Toc243839881 \h </w:instrText>
+          <w:instrText xml:space="preserve"> PAGEREF _Toc243841965 \h </w:instrText>
         </w:r>
         <w:r>
           <w:rPr>
@@ -835,7 +835,7 @@
           <w:noProof/>
         </w:rPr>
       </w:pPr>
-      <w:hyperlink w:anchor="_Toc243839882" w:history="1">
+      <w:hyperlink w:anchor="_Toc243841966" w:history="1">
         <w:r>
           <w:rPr>
             <w:rStyle w:val="Hyperlink"/>
@@ -862,7 +862,7 @@
             <w:noProof/>
             <w:webHidden/>
           </w:rPr>
-          <w:instrText xml:space="preserve"> PAGEREF _Toc243839882 \h </w:instrText>
+          <w:instrText xml:space="preserve"> PAGEREF _Toc243841966 \h </w:instrText>
         </w:r>
         <w:r>
           <w:rPr>
@@ -903,7 +903,7 @@
           <w:noProof/>
         </w:rPr>
       </w:pPr>
-      <w:hyperlink w:anchor="_Toc243839883" w:history="1">
+      <w:hyperlink w:anchor="_Toc243841967" w:history="1">
         <w:r>
           <w:rPr>
             <w:rStyle w:val="Hyperlink"/>
@@ -930,7 +930,7 @@
             <w:noProof/>
             <w:webHidden/>
           </w:rPr>
-          <w:instrText xml:space="preserve"> PAGEREF _Toc243839883 \h </w:instrText>
+          <w:instrText xml:space="preserve"> PAGEREF _Toc243841967 \h </w:instrText>
         </w:r>
         <w:r>
           <w:rPr>
@@ -971,7 +971,7 @@
           <w:noProof/>
         </w:rPr>
       </w:pPr>
-      <w:hyperlink w:anchor="_Toc243839884" w:history="1">
+      <w:hyperlink w:anchor="_Toc243841968" w:history="1">
         <w:r>
           <w:rPr>
             <w:rStyle w:val="Hyperlink"/>
@@ -998,7 +998,7 @@
             <w:noProof/>
             <w:webHidden/>
           </w:rPr>
-          <w:instrText xml:space="preserve"> PAGEREF _Toc243839884 \h </w:instrText>
+          <w:instrText xml:space="preserve"> PAGEREF _Toc243841968 \h </w:instrText>
         </w:r>
         <w:r>
           <w:rPr>
@@ -1039,7 +1039,7 @@
           <w:noProof/>
         </w:rPr>
       </w:pPr>
-      <w:hyperlink w:anchor="_Toc243839885" w:history="1">
+      <w:hyperlink w:anchor="_Toc243841969" w:history="1">
         <w:r>
           <w:rPr>
             <w:rStyle w:val="Hyperlink"/>
@@ -1066,7 +1066,7 @@
             <w:noProof/>
             <w:webHidden/>
           </w:rPr>
-          <w:instrText xml:space="preserve"> PAGEREF _Toc243839885 \h </w:instrText>
+          <w:instrText xml:space="preserve"> PAGEREF _Toc243841969 \h </w:instrText>
         </w:r>
         <w:r>
           <w:rPr>
@@ -1107,7 +1107,7 @@
           <w:noProof/>
         </w:rPr>
       </w:pPr>
-      <w:hyperlink w:anchor="_Toc243839886" w:history="1">
+      <w:hyperlink w:anchor="_Toc243841970" w:history="1">
         <w:r>
           <w:rPr>
             <w:rStyle w:val="Hyperlink"/>
@@ -1134,7 +1134,7 @@
             <w:noProof/>
             <w:webHidden/>
           </w:rPr>
-          <w:instrText xml:space="preserve"> PAGEREF _Toc243839886 \h </w:instrText>
+          <w:instrText xml:space="preserve"> PAGEREF _Toc243841970 \h </w:instrText>
         </w:r>
         <w:r>
           <w:rPr>
@@ -1175,7 +1175,7 @@
           <w:noProof/>
         </w:rPr>
       </w:pPr>
-      <w:hyperlink w:anchor="_Toc243839887" w:history="1">
+      <w:hyperlink w:anchor="_Toc243841971" w:history="1">
         <w:r>
           <w:rPr>
             <w:rStyle w:val="Hyperlink"/>
@@ -1202,7 +1202,7 @@
             <w:noProof/>
             <w:webHidden/>
           </w:rPr>
-          <w:instrText xml:space="preserve"> PAGEREF _Toc243839887 \h </w:instrText>
+          <w:instrText xml:space="preserve"> PAGEREF _Toc243841971 \h </w:instrText>
         </w:r>
         <w:r>
           <w:rPr>
@@ -1243,7 +1243,7 @@
           <w:noProof/>
         </w:rPr>
       </w:pPr>
-      <w:hyperlink w:anchor="_Toc243839888" w:history="1">
+      <w:hyperlink w:anchor="_Toc243841972" w:history="1">
         <w:r>
           <w:rPr>
             <w:rStyle w:val="Hyperlink"/>
@@ -1270,7 +1270,7 @@
             <w:noProof/>
             <w:webHidden/>
           </w:rPr>
-          <w:instrText xml:space="preserve"> PAGEREF _Toc243839888 \h </w:instrText>
+          <w:instrText xml:space="preserve"> PAGEREF _Toc243841972 \h </w:instrText>
         </w:r>
         <w:r>
           <w:rPr>
@@ -1311,7 +1311,7 @@
           <w:noProof/>
         </w:rPr>
       </w:pPr>
-      <w:hyperlink w:anchor="_Toc243839889" w:history="1">
+      <w:hyperlink w:anchor="_Toc243841973" w:history="1">
         <w:r>
           <w:rPr>
             <w:rStyle w:val="Hyperlink"/>
@@ -1338,7 +1338,7 @@
             <w:noProof/>
             <w:webHidden/>
           </w:rPr>
-          <w:instrText xml:space="preserve"> PAGEREF _Toc243839889 \h </w:instrText>
+          <w:instrText xml:space="preserve"> PAGEREF _Toc243841973 \h </w:instrText>
         </w:r>
         <w:r>
           <w:rPr>
@@ -1379,7 +1379,7 @@
           <w:noProof/>
         </w:rPr>
       </w:pPr>
-      <w:hyperlink w:anchor="_Toc243839890" w:history="1">
+      <w:hyperlink w:anchor="_Toc243841974" w:history="1">
         <w:r>
           <w:rPr>
             <w:rStyle w:val="Hyperlink"/>
@@ -1406,7 +1406,7 @@
             <w:noProof/>
             <w:webHidden/>
           </w:rPr>
-          <w:instrText xml:space="preserve"> PAGEREF _Toc243839890 \h </w:instrText>
+          <w:instrText xml:space="preserve"> PAGEREF _Toc243841974 \h </w:instrText>
         </w:r>
         <w:r>
           <w:rPr>
@@ -1447,7 +1447,7 @@
           <w:noProof/>
         </w:rPr>
       </w:pPr>
-      <w:hyperlink w:anchor="_Toc243839891" w:history="1">
+      <w:hyperlink w:anchor="_Toc243841975" w:history="1">
         <w:r>
           <w:rPr>
             <w:rStyle w:val="Hyperlink"/>
@@ -1474,7 +1474,7 @@
             <w:noProof/>
             <w:webHidden/>
           </w:rPr>
-          <w:instrText xml:space="preserve"> PAGEREF _Toc243839891 \h </w:instrText>
+          <w:instrText xml:space="preserve"> PAGEREF _Toc243841975 \h </w:instrText>
         </w:r>
         <w:r>
           <w:rPr>
@@ -1515,7 +1515,7 @@
           <w:noProof/>
         </w:rPr>
       </w:pPr>
-      <w:hyperlink w:anchor="_Toc243839892" w:history="1">
+      <w:hyperlink w:anchor="_Toc243841976" w:history="1">
         <w:r>
           <w:rPr>
             <w:rStyle w:val="Hyperlink"/>
@@ -1542,7 +1542,7 @@
             <w:noProof/>
             <w:webHidden/>
           </w:rPr>
-          <w:instrText xml:space="preserve"> PAGEREF _Toc243839892 \h </w:instrText>
+          <w:instrText xml:space="preserve"> PAGEREF _Toc243841976 \h </w:instrText>
         </w:r>
         <w:r>
           <w:rPr>
@@ -1583,7 +1583,7 @@
           <w:noProof/>
         </w:rPr>
       </w:pPr>
-      <w:hyperlink w:anchor="_Toc243839893" w:history="1">
+      <w:hyperlink w:anchor="_Toc243841977" w:history="1">
         <w:r>
           <w:rPr>
             <w:rStyle w:val="Hyperlink"/>
@@ -1610,7 +1610,7 @@
             <w:noProof/>
             <w:webHidden/>
           </w:rPr>
-          <w:instrText xml:space="preserve"> PAGEREF _Toc243839893 \h </w:instrText>
+          <w:instrText xml:space="preserve"> PAGEREF _Toc243841977 \h </w:instrText>
         </w:r>
         <w:r>
           <w:rPr>
@@ -1651,7 +1651,7 @@
           <w:noProof/>
         </w:rPr>
       </w:pPr>
-      <w:hyperlink w:anchor="_Toc243839894" w:history="1">
+      <w:hyperlink w:anchor="_Toc243841978" w:history="1">
         <w:r>
           <w:rPr>
             <w:rStyle w:val="Hyperlink"/>
@@ -1678,7 +1678,7 @@
             <w:noProof/>
             <w:webHidden/>
           </w:rPr>
-          <w:instrText xml:space="preserve"> PAGEREF _Toc243839894 \h </w:instrText>
+          <w:instrText xml:space="preserve"> PAGEREF _Toc243841978 \h </w:instrText>
         </w:r>
         <w:r>
           <w:rPr>
@@ -1719,7 +1719,7 @@
           <w:noProof/>
         </w:rPr>
       </w:pPr>
-      <w:hyperlink w:anchor="_Toc243839895" w:history="1">
+      <w:hyperlink w:anchor="_Toc243841979" w:history="1">
         <w:r>
           <w:rPr>
             <w:rStyle w:val="Hyperlink"/>
@@ -1746,7 +1746,7 @@
             <w:noProof/>
             <w:webHidden/>
           </w:rPr>
-          <w:instrText xml:space="preserve"> PAGEREF _Toc243839895 \h </w:instrText>
+          <w:instrText xml:space="preserve"> PAGEREF _Toc243841979 \h </w:instrText>
         </w:r>
         <w:r>
           <w:rPr>
@@ -1787,7 +1787,7 @@
           <w:noProof/>
         </w:rPr>
       </w:pPr>
-      <w:hyperlink w:anchor="_Toc243839896" w:history="1">
+      <w:hyperlink w:anchor="_Toc243841980" w:history="1">
         <w:r>
           <w:rPr>
             <w:rStyle w:val="Hyperlink"/>
@@ -1814,7 +1814,7 @@
             <w:noProof/>
             <w:webHidden/>
           </w:rPr>
-          <w:instrText xml:space="preserve"> PAGEREF _Toc243839896 \h </w:instrText>
+          <w:instrText xml:space="preserve"> PAGEREF _Toc243841980 \h </w:instrText>
         </w:r>
         <w:r>
           <w:rPr>
@@ -1855,7 +1855,7 @@
           <w:noProof/>
         </w:rPr>
       </w:pPr>
-      <w:hyperlink w:anchor="_Toc243839897" w:history="1">
+      <w:hyperlink w:anchor="_Toc243841981" w:history="1">
         <w:r>
           <w:rPr>
             <w:rStyle w:val="Hyperlink"/>
@@ -1882,7 +1882,7 @@
             <w:noProof/>
             <w:webHidden/>
           </w:rPr>
-          <w:instrText xml:space="preserve"> PAGEREF _Toc243839897 \h </w:instrText>
+          <w:instrText xml:space="preserve"> PAGEREF _Toc243841981 \h </w:instrText>
         </w:r>
         <w:r>
           <w:rPr>
@@ -1923,7 +1923,7 @@
           <w:noProof/>
         </w:rPr>
       </w:pPr>
-      <w:hyperlink w:anchor="_Toc243839898" w:history="1">
+      <w:hyperlink w:anchor="_Toc243841982" w:history="1">
         <w:r>
           <w:rPr>
             <w:rStyle w:val="Hyperlink"/>
@@ -1950,7 +1950,7 @@
             <w:noProof/>
             <w:webHidden/>
           </w:rPr>
-          <w:instrText xml:space="preserve"> PAGEREF _Toc243839898 \h </w:instrText>
+          <w:instrText xml:space="preserve"> PAGEREF _Toc243841982 \h </w:instrText>
         </w:r>
         <w:r>
           <w:rPr>
@@ -1991,7 +1991,7 @@
           <w:noProof/>
         </w:rPr>
       </w:pPr>
-      <w:hyperlink w:anchor="_Toc243839899" w:history="1">
+      <w:hyperlink w:anchor="_Toc243841983" w:history="1">
         <w:r>
           <w:rPr>
             <w:rStyle w:val="Hyperlink"/>
@@ -2018,7 +2018,7 @@
             <w:noProof/>
             <w:webHidden/>
           </w:rPr>
-          <w:instrText xml:space="preserve"> PAGEREF _Toc243839899 \h </w:instrText>
+          <w:instrText xml:space="preserve"> PAGEREF _Toc243841983 \h </w:instrText>
         </w:r>
         <w:r>
           <w:rPr>
@@ -2059,7 +2059,7 @@
           <w:noProof/>
         </w:rPr>
       </w:pPr>
-      <w:hyperlink w:anchor="_Toc243839900" w:history="1">
+      <w:hyperlink w:anchor="_Toc243841984" w:history="1">
         <w:r>
           <w:rPr>
             <w:rStyle w:val="Hyperlink"/>
@@ -2086,7 +2086,7 @@
             <w:noProof/>
             <w:webHidden/>
           </w:rPr>
-          <w:instrText xml:space="preserve"> PAGEREF _Toc243839900 \h </w:instrText>
+          <w:instrText xml:space="preserve"> PAGEREF _Toc243841984 \h </w:instrText>
         </w:r>
         <w:r>
           <w:rPr>
@@ -2127,7 +2127,7 @@
           <w:noProof/>
         </w:rPr>
       </w:pPr>
-      <w:hyperlink w:anchor="_Toc243839901" w:history="1">
+      <w:hyperlink w:anchor="_Toc243841985" w:history="1">
         <w:r>
           <w:rPr>
             <w:rStyle w:val="Hyperlink"/>
@@ -2154,7 +2154,7 @@
             <w:noProof/>
             <w:webHidden/>
           </w:rPr>
-          <w:instrText xml:space="preserve"> PAGEREF _Toc243839901 \h </w:instrText>
+          <w:instrText xml:space="preserve"> PAGEREF _Toc243841985 \h </w:instrText>
         </w:r>
         <w:r>
           <w:rPr>
@@ -2195,7 +2195,7 @@
           <w:noProof/>
         </w:rPr>
       </w:pPr>
-      <w:hyperlink w:anchor="_Toc243839902" w:history="1">
+      <w:hyperlink w:anchor="_Toc243841986" w:history="1">
         <w:r>
           <w:rPr>
             <w:rStyle w:val="Hyperlink"/>
@@ -2222,7 +2222,7 @@
             <w:noProof/>
             <w:webHidden/>
           </w:rPr>
-          <w:instrText xml:space="preserve"> PAGEREF _Toc243839902 \h </w:instrText>
+          <w:instrText xml:space="preserve"> PAGEREF _Toc243841986 \h </w:instrText>
         </w:r>
         <w:r>
           <w:rPr>
@@ -2263,7 +2263,7 @@
           <w:noProof/>
         </w:rPr>
       </w:pPr>
-      <w:hyperlink w:anchor="_Toc243839903" w:history="1">
+      <w:hyperlink w:anchor="_Toc243841987" w:history="1">
         <w:r>
           <w:rPr>
             <w:rStyle w:val="Hyperlink"/>
@@ -2290,7 +2290,7 @@
             <w:noProof/>
             <w:webHidden/>
           </w:rPr>
-          <w:instrText xml:space="preserve"> PAGEREF _Toc243839903 \h </w:instrText>
+          <w:instrText xml:space="preserve"> PAGEREF _Toc243841987 \h </w:instrText>
         </w:r>
         <w:r>
           <w:rPr>
@@ -2331,7 +2331,7 @@
           <w:noProof/>
         </w:rPr>
       </w:pPr>
-      <w:hyperlink w:anchor="_Toc243839904" w:history="1">
+      <w:hyperlink w:anchor="_Toc243841988" w:history="1">
         <w:r>
           <w:rPr>
             <w:rStyle w:val="Hyperlink"/>
@@ -2358,7 +2358,7 @@
             <w:noProof/>
             <w:webHidden/>
           </w:rPr>
-          <w:instrText xml:space="preserve"> PAGEREF _Toc243839904 \h </w:instrText>
+          <w:instrText xml:space="preserve"> PAGEREF _Toc243841988 \h </w:instrText>
         </w:r>
         <w:r>
           <w:rPr>
@@ -2399,7 +2399,7 @@
           <w:noProof/>
         </w:rPr>
       </w:pPr>
-      <w:hyperlink w:anchor="_Toc243839905" w:history="1">
+      <w:hyperlink w:anchor="_Toc243841989" w:history="1">
         <w:r>
           <w:rPr>
             <w:rStyle w:val="Hyperlink"/>
@@ -2426,7 +2426,7 @@
             <w:noProof/>
             <w:webHidden/>
           </w:rPr>
-          <w:instrText xml:space="preserve"> PAGEREF _Toc243839905 \h </w:instrText>
+          <w:instrText xml:space="preserve"> PAGEREF _Toc243841989 \h </w:instrText>
         </w:r>
         <w:r>
           <w:rPr>
@@ -2467,7 +2467,7 @@
           <w:noProof/>
         </w:rPr>
       </w:pPr>
-      <w:hyperlink w:anchor="_Toc243839906" w:history="1">
+      <w:hyperlink w:anchor="_Toc243841990" w:history="1">
         <w:r>
           <w:rPr>
             <w:rStyle w:val="Hyperlink"/>
@@ -2494,7 +2494,7 @@
             <w:noProof/>
             <w:webHidden/>
           </w:rPr>
-          <w:instrText xml:space="preserve"> PAGEREF _Toc243839906 \h </w:instrText>
+          <w:instrText xml:space="preserve"> PAGEREF _Toc243841990 \h </w:instrText>
         </w:r>
         <w:r>
           <w:rPr>
@@ -2535,7 +2535,7 @@
           <w:noProof/>
         </w:rPr>
       </w:pPr>
-      <w:hyperlink w:anchor="_Toc243839907" w:history="1">
+      <w:hyperlink w:anchor="_Toc243841991" w:history="1">
         <w:r>
           <w:rPr>
             <w:rStyle w:val="Hyperlink"/>
@@ -2562,7 +2562,7 @@
             <w:noProof/>
             <w:webHidden/>
           </w:rPr>
-          <w:instrText xml:space="preserve"> PAGEREF _Toc243839907 \h </w:instrText>
+          <w:instrText xml:space="preserve"> PAGEREF _Toc243841991 \h </w:instrText>
         </w:r>
         <w:r>
           <w:rPr>
@@ -2603,7 +2603,7 @@
           <w:noProof/>
         </w:rPr>
       </w:pPr>
-      <w:hyperlink w:anchor="_Toc243839908" w:history="1">
+      <w:hyperlink w:anchor="_Toc243841992" w:history="1">
         <w:r>
           <w:rPr>
             <w:rStyle w:val="Hyperlink"/>
@@ -2630,7 +2630,7 @@
             <w:noProof/>
             <w:webHidden/>
           </w:rPr>
-          <w:instrText xml:space="preserve"> PAGEREF _Toc243839908 \h </w:instrText>
+          <w:instrText xml:space="preserve"> PAGEREF _Toc243841992 \h </w:instrText>
         </w:r>
         <w:r>
           <w:rPr>
@@ -2671,7 +2671,7 @@
           <w:noProof/>
         </w:rPr>
       </w:pPr>
-      <w:hyperlink w:anchor="_Toc243839909" w:history="1">
+      <w:hyperlink w:anchor="_Toc243841993" w:history="1">
         <w:r>
           <w:rPr>
             <w:rStyle w:val="Hyperlink"/>
@@ -2698,7 +2698,7 @@
             <w:noProof/>
             <w:webHidden/>
           </w:rPr>
-          <w:instrText xml:space="preserve"> PAGEREF _Toc243839909 \h </w:instrText>
+          <w:instrText xml:space="preserve"> PAGEREF _Toc243841993 \h </w:instrText>
         </w:r>
         <w:r>
           <w:rPr>
@@ -2739,7 +2739,7 @@
           <w:noProof/>
         </w:rPr>
       </w:pPr>
-      <w:hyperlink w:anchor="_Toc243839910" w:history="1">
+      <w:hyperlink w:anchor="_Toc243841994" w:history="1">
         <w:r>
           <w:rPr>
             <w:rStyle w:val="Hyperlink"/>
@@ -2766,7 +2766,7 @@
             <w:noProof/>
             <w:webHidden/>
           </w:rPr>
-          <w:instrText xml:space="preserve"> PAGEREF _Toc243839910 \h </w:instrText>
+          <w:instrText xml:space="preserve"> PAGEREF _Toc243841994 \h </w:instrText>
         </w:r>
         <w:r>
           <w:rPr>
@@ -2807,7 +2807,7 @@
           <w:noProof/>
         </w:rPr>
       </w:pPr>
-      <w:hyperlink w:anchor="_Toc243839911" w:history="1">
+      <w:hyperlink w:anchor="_Toc243841995" w:history="1">
         <w:r>
           <w:rPr>
             <w:rStyle w:val="Hyperlink"/>
@@ -2834,7 +2834,7 @@
             <w:noProof/>
             <w:webHidden/>
           </w:rPr>
-          <w:instrText xml:space="preserve"> PAGEREF _Toc243839911 \h </w:instrText>
+          <w:instrText xml:space="preserve"> PAGEREF _Toc243841995 \h </w:instrText>
         </w:r>
         <w:r>
           <w:rPr>
@@ -2875,7 +2875,7 @@
           <w:noProof/>
         </w:rPr>
       </w:pPr>
-      <w:hyperlink w:anchor="_Toc243839912" w:history="1">
+      <w:hyperlink w:anchor="_Toc243841996" w:history="1">
         <w:r>
           <w:rPr>
             <w:rStyle w:val="Hyperlink"/>
@@ -2902,7 +2902,7 @@
             <w:noProof/>
             <w:webHidden/>
           </w:rPr>
-          <w:instrText xml:space="preserve"> PAGEREF _Toc243839912 \h </w:instrText>
+          <w:instrText xml:space="preserve"> PAGEREF _Toc243841996 \h </w:instrText>
         </w:r>
         <w:r>
           <w:rPr>
@@ -2943,7 +2943,7 @@
           <w:noProof/>
         </w:rPr>
       </w:pPr>
-      <w:hyperlink w:anchor="_Toc243839913" w:history="1">
+      <w:hyperlink w:anchor="_Toc243841997" w:history="1">
         <w:r>
           <w:rPr>
             <w:rStyle w:val="Hyperlink"/>
@@ -2970,7 +2970,7 @@
             <w:noProof/>
             <w:webHidden/>
           </w:rPr>
-          <w:instrText xml:space="preserve"> PAGEREF _Toc243839913 \h </w:instrText>
+          <w:instrText xml:space="preserve"> PAGEREF _Toc243841997 \h </w:instrText>
         </w:r>
         <w:r>
           <w:rPr>
@@ -3011,7 +3011,7 @@
           <w:noProof/>
         </w:rPr>
       </w:pPr>
-      <w:hyperlink w:anchor="_Toc243839914" w:history="1">
+      <w:hyperlink w:anchor="_Toc243841998" w:history="1">
         <w:r>
           <w:rPr>
             <w:rStyle w:val="Hyperlink"/>
@@ -3038,7 +3038,7 @@
             <w:noProof/>
             <w:webHidden/>
           </w:rPr>
-          <w:instrText xml:space="preserve"> PAGEREF _Toc243839914 \h </w:instrText>
+          <w:instrText xml:space="preserve"> PAGEREF _Toc243841998 \h </w:instrText>
         </w:r>
         <w:r>
           <w:rPr>
@@ -3079,7 +3079,7 @@
           <w:noProof/>
         </w:rPr>
       </w:pPr>
-      <w:hyperlink w:anchor="_Toc243839915" w:history="1">
+      <w:hyperlink w:anchor="_Toc243841999" w:history="1">
         <w:r>
           <w:rPr>
             <w:rStyle w:val="Hyperlink"/>
@@ -3106,7 +3106,7 @@
             <w:noProof/>
             <w:webHidden/>
           </w:rPr>
-          <w:instrText xml:space="preserve"> PAGEREF _Toc243839915 \h </w:instrText>
+          <w:instrText xml:space="preserve"> PAGEREF _Toc243841999 \h </w:instrText>
         </w:r>
         <w:r>
           <w:rPr>
@@ -3147,7 +3147,7 @@
           <w:noProof/>
         </w:rPr>
       </w:pPr>
-      <w:hyperlink w:anchor="_Toc243839916" w:history="1">
+      <w:hyperlink w:anchor="_Toc243842000" w:history="1">
         <w:r>
           <w:rPr>
             <w:rStyle w:val="Hyperlink"/>
@@ -3174,7 +3174,7 @@
             <w:noProof/>
             <w:webHidden/>
           </w:rPr>
-          <w:instrText xml:space="preserve"> PAGEREF _Toc243839916 \h </w:instrText>
+          <w:instrText xml:space="preserve"> PAGEREF _Toc243842000 \h </w:instrText>
         </w:r>
         <w:r>
           <w:rPr>
@@ -3215,7 +3215,7 @@
           <w:noProof/>
         </w:rPr>
       </w:pPr>
-      <w:hyperlink w:anchor="_Toc243839917" w:history="1">
+      <w:hyperlink w:anchor="_Toc243842001" w:history="1">
         <w:r>
           <w:rPr>
             <w:rStyle w:val="Hyperlink"/>
@@ -3242,7 +3242,7 @@
             <w:noProof/>
             <w:webHidden/>
           </w:rPr>
-          <w:instrText xml:space="preserve"> PAGEREF _Toc243839917 \h </w:instrText>
+          <w:instrText xml:space="preserve"> PAGEREF _Toc243842001 \h </w:instrText>
         </w:r>
         <w:r>
           <w:rPr>
@@ -3283,7 +3283,7 @@
           <w:noProof/>
         </w:rPr>
       </w:pPr>
-      <w:hyperlink w:anchor="_Toc243839918" w:history="1">
+      <w:hyperlink w:anchor="_Toc243842002" w:history="1">
         <w:r>
           <w:rPr>
             <w:rStyle w:val="Hyperlink"/>
@@ -3310,7 +3310,7 @@
             <w:noProof/>
             <w:webHidden/>
           </w:rPr>
-          <w:instrText xml:space="preserve"> PAGEREF _Toc243839918 \h </w:instrText>
+          <w:instrText xml:space="preserve"> PAGEREF _Toc243842002 \h </w:instrText>
         </w:r>
         <w:r>
           <w:rPr>
@@ -3351,7 +3351,7 @@
           <w:noProof/>
         </w:rPr>
       </w:pPr>
-      <w:hyperlink w:anchor="_Toc243839919" w:history="1">
+      <w:hyperlink w:anchor="_Toc243842003" w:history="1">
         <w:r>
           <w:rPr>
             <w:rStyle w:val="Hyperlink"/>
@@ -3378,7 +3378,7 @@
             <w:noProof/>
             <w:webHidden/>
           </w:rPr>
-          <w:instrText xml:space="preserve"> PAGEREF _Toc243839919 \h </w:instrText>
+          <w:instrText xml:space="preserve"> PAGEREF _Toc243842003 \h </w:instrText>
         </w:r>
         <w:r>
           <w:rPr>
@@ -3419,7 +3419,7 @@
           <w:noProof/>
         </w:rPr>
       </w:pPr>
-      <w:hyperlink w:anchor="_Toc243839920" w:history="1">
+      <w:hyperlink w:anchor="_Toc243842004" w:history="1">
         <w:r>
           <w:rPr>
             <w:rStyle w:val="Hyperlink"/>
@@ -3446,7 +3446,7 @@
             <w:noProof/>
             <w:webHidden/>
           </w:rPr>
-          <w:instrText xml:space="preserve"> PAGEREF _Toc243839920 \h </w:instrText>
+          <w:instrText xml:space="preserve"> PAGEREF _Toc243842004 \h </w:instrText>
         </w:r>
         <w:r>
           <w:rPr>
@@ -3487,7 +3487,7 @@
           <w:noProof/>
         </w:rPr>
       </w:pPr>
-      <w:hyperlink w:anchor="_Toc243839921" w:history="1">
+      <w:hyperlink w:anchor="_Toc243842005" w:history="1">
         <w:r>
           <w:rPr>
             <w:rStyle w:val="Hyperlink"/>
@@ -3514,7 +3514,7 @@
             <w:noProof/>
             <w:webHidden/>
           </w:rPr>
-          <w:instrText xml:space="preserve"> PAGEREF _Toc243839921 \h </w:instrText>
+          <w:instrText xml:space="preserve"> PAGEREF _Toc243842005 \h </w:instrText>
         </w:r>
         <w:r>
           <w:rPr>
@@ -3555,7 +3555,7 @@
           <w:noProof/>
         </w:rPr>
       </w:pPr>
-      <w:hyperlink w:anchor="_Toc243839922" w:history="1">
+      <w:hyperlink w:anchor="_Toc243842006" w:history="1">
         <w:r>
           <w:rPr>
             <w:rStyle w:val="Hyperlink"/>
@@ -3582,7 +3582,7 @@
             <w:noProof/>
             <w:webHidden/>
           </w:rPr>
-          <w:instrText xml:space="preserve"> PAGEREF _Toc243839922 \h </w:instrText>
+          <w:instrText xml:space="preserve"> PAGEREF _Toc243842006 \h </w:instrText>
         </w:r>
         <w:r>
           <w:rPr>
@@ -3623,7 +3623,7 @@
           <w:noProof/>
         </w:rPr>
       </w:pPr>
-      <w:hyperlink w:anchor="_Toc243839923" w:history="1">
+      <w:hyperlink w:anchor="_Toc243842007" w:history="1">
         <w:r>
           <w:rPr>
             <w:rStyle w:val="Hyperlink"/>
@@ -3650,7 +3650,7 @@
             <w:noProof/>
             <w:webHidden/>
           </w:rPr>
-          <w:instrText xml:space="preserve"> PAGEREF _Toc243839923 \h </w:instrText>
+          <w:instrText xml:space="preserve"> PAGEREF _Toc243842007 \h </w:instrText>
         </w:r>
         <w:r>
           <w:rPr>
@@ -3691,7 +3691,7 @@
           <w:noProof/>
         </w:rPr>
       </w:pPr>
-      <w:hyperlink w:anchor="_Toc243839924" w:history="1">
+      <w:hyperlink w:anchor="_Toc243842008" w:history="1">
         <w:r>
           <w:rPr>
             <w:rStyle w:val="Hyperlink"/>
@@ -3718,7 +3718,7 @@
             <w:noProof/>
             <w:webHidden/>
           </w:rPr>
-          <w:instrText xml:space="preserve"> PAGEREF _Toc243839924 \h </w:instrText>
+          <w:instrText xml:space="preserve"> PAGEREF _Toc243842008 \h </w:instrText>
         </w:r>
         <w:r>
           <w:rPr>
@@ -3759,7 +3759,7 @@
           <w:noProof/>
         </w:rPr>
       </w:pPr>
-      <w:hyperlink w:anchor="_Toc243839925" w:history="1">
+      <w:hyperlink w:anchor="_Toc243842009" w:history="1">
         <w:r>
           <w:rPr>
             <w:rStyle w:val="Hyperlink"/>
@@ -3786,7 +3786,7 @@
             <w:noProof/>
             <w:webHidden/>
           </w:rPr>
-          <w:instrText xml:space="preserve"> PAGEREF _Toc243839925 \h </w:instrText>
+          <w:instrText xml:space="preserve"> PAGEREF _Toc243842009 \h </w:instrText>
         </w:r>
         <w:r>
           <w:rPr>
@@ -3827,7 +3827,7 @@
           <w:noProof/>
         </w:rPr>
       </w:pPr>
-      <w:hyperlink w:anchor="_Toc243839926" w:history="1">
+      <w:hyperlink w:anchor="_Toc243842010" w:history="1">
         <w:r>
           <w:rPr>
             <w:rStyle w:val="Hyperlink"/>
@@ -3854,7 +3854,7 @@
             <w:noProof/>
             <w:webHidden/>
           </w:rPr>
-          <w:instrText xml:space="preserve"> PAGEREF _Toc243839926 \h </w:instrText>
+          <w:instrText xml:space="preserve"> PAGEREF _Toc243842010 \h </w:instrText>
         </w:r>
         <w:r>
           <w:rPr>
@@ -3895,7 +3895,7 @@
           <w:noProof/>
         </w:rPr>
       </w:pPr>
-      <w:hyperlink w:anchor="_Toc243839927" w:history="1">
+      <w:hyperlink w:anchor="_Toc243842011" w:history="1">
         <w:r>
           <w:rPr>
             <w:rStyle w:val="Hyperlink"/>
@@ -3922,7 +3922,7 @@
             <w:noProof/>
             <w:webHidden/>
           </w:rPr>
-          <w:instrText xml:space="preserve"> PAGEREF _Toc243839927 \h </w:instrText>
+          <w:instrText xml:space="preserve"> PAGEREF _Toc243842011 \h </w:instrText>
         </w:r>
         <w:r>
           <w:rPr>
@@ -3963,7 +3963,7 @@
           <w:noProof/>
         </w:rPr>
       </w:pPr>
-      <w:hyperlink w:anchor="_Toc243839928" w:history="1">
+      <w:hyperlink w:anchor="_Toc243842012" w:history="1">
         <w:r>
           <w:rPr>
             <w:rStyle w:val="Hyperlink"/>
@@ -3990,7 +3990,7 @@
             <w:noProof/>
             <w:webHidden/>
           </w:rPr>
-          <w:instrText xml:space="preserve"> PAGEREF _Toc243839928 \h </w:instrText>
+          <w:instrText xml:space="preserve"> PAGEREF _Toc243842012 \h </w:instrText>
         </w:r>
         <w:r>
           <w:rPr>
@@ -4031,7 +4031,7 @@
           <w:noProof/>
         </w:rPr>
       </w:pPr>
-      <w:hyperlink w:anchor="_Toc243839929" w:history="1">
+      <w:hyperlink w:anchor="_Toc243842013" w:history="1">
         <w:r>
           <w:rPr>
             <w:rStyle w:val="Hyperlink"/>
@@ -4058,7 +4058,7 @@
             <w:noProof/>
             <w:webHidden/>
           </w:rPr>
-          <w:instrText xml:space="preserve"> PAGEREF _Toc243839929 \h </w:instrText>
+          <w:instrText xml:space="preserve"> PAGEREF _Toc243842013 \h </w:instrText>
         </w:r>
         <w:r>
           <w:rPr>
@@ -4099,7 +4099,7 @@
           <w:noProof/>
         </w:rPr>
       </w:pPr>
-      <w:hyperlink w:anchor="_Toc243839930" w:history="1">
+      <w:hyperlink w:anchor="_Toc243842014" w:history="1">
         <w:r>
           <w:rPr>
             <w:rStyle w:val="Hyperlink"/>
@@ -4126,7 +4126,7 @@
             <w:noProof/>
             <w:webHidden/>
           </w:rPr>
-          <w:instrText xml:space="preserve"> PAGEREF _Toc243839930 \h </w:instrText>
+          <w:instrText xml:space="preserve"> PAGEREF _Toc243842014 \h </w:instrText>
         </w:r>
         <w:r>
           <w:rPr>
@@ -4171,7 +4171,7 @@
       <w:pPr>
         <w:pStyle w:val="Heading1"/>
       </w:pPr>
-      <w:bookmarkStart w:id="0" w:name="_Toc243839871"/>
+      <w:bookmarkStart w:id="0" w:name="_Toc243841955"/>
       <w:r>
         <w:lastRenderedPageBreak/>
         <w:t>Foreword</w:t>
@@ -4205,7 +4205,7 @@
       <w:pPr>
         <w:pStyle w:val="Heading1"/>
       </w:pPr>
-      <w:bookmarkStart w:id="1" w:name="_Toc243839872"/>
+      <w:bookmarkStart w:id="1" w:name="_Toc243841956"/>
       <w:r>
         <w:lastRenderedPageBreak/>
         <w:t>What Litterbox is</w:t>
@@ -4301,7 +4301,7 @@
       <w:pPr>
         <w:pStyle w:val="Heading2"/>
       </w:pPr>
-      <w:bookmarkStart w:id="2" w:name="_Toc243839873"/>
+      <w:bookmarkStart w:id="2" w:name="_Toc243841957"/>
       <w:r>
         <w:t>Terms</w:t>
       </w:r>
@@ -4808,7 +4808,7 @@
       <w:pPr>
         <w:pStyle w:val="Heading1"/>
       </w:pPr>
-      <w:bookmarkStart w:id="3" w:name="_Toc243839874"/>
+      <w:bookmarkStart w:id="3" w:name="_Toc243841958"/>
       <w:r>
         <w:lastRenderedPageBreak/>
         <w:t>Getting started</w:t>
@@ -4824,7 +4824,7 @@
       <w:pPr>
         <w:pStyle w:val="Heading2"/>
       </w:pPr>
-      <w:bookmarkStart w:id="4" w:name="_Toc243839875"/>
+      <w:bookmarkStart w:id="4" w:name="_Toc243841959"/>
       <w:r>
         <w:t>What you need</w:t>
       </w:r>
@@ -4909,7 +4909,7 @@
       <w:pPr>
         <w:pStyle w:val="Heading2"/>
       </w:pPr>
-      <w:bookmarkStart w:id="5" w:name="_Toc243839876"/>
+      <w:bookmarkStart w:id="5" w:name="_Toc243841960"/>
       <w:r>
         <w:t>Installing Litterbox</w:t>
       </w:r>
@@ -5039,7 +5039,7 @@
       <w:pPr>
         <w:pStyle w:val="Heading2"/>
       </w:pPr>
-      <w:bookmarkStart w:id="6" w:name="_Toc243839877"/>
+      <w:bookmarkStart w:id="6" w:name="_Toc243841961"/>
       <w:r>
         <w:lastRenderedPageBreak/>
         <w:t>Joining your team's vault</w:t>
@@ -5146,7 +5146,7 @@
       <w:pPr>
         <w:pStyle w:val="Heading2"/>
       </w:pPr>
-      <w:bookmarkStart w:id="7" w:name="_Toc243839878"/>
+      <w:bookmarkStart w:id="7" w:name="_Toc243841962"/>
       <w:r>
         <w:t>Decisions to make first</w:t>
       </w:r>
@@ -5418,7 +5418,7 @@
       <w:pPr>
         <w:pStyle w:val="Heading2"/>
       </w:pPr>
-      <w:bookmarkStart w:id="8" w:name="_Toc243839879"/>
+      <w:bookmarkStart w:id="8" w:name="_Toc243841963"/>
       <w:r>
         <w:lastRenderedPageBreak/>
         <w:t>Setting up a new team</w:t>
@@ -5688,7 +5688,7 @@
       <w:pPr>
         <w:pStyle w:val="Heading2"/>
       </w:pPr>
-      <w:bookmarkStart w:id="9" w:name="_Toc243839880"/>
+      <w:bookmarkStart w:id="9" w:name="_Toc243841964"/>
       <w:r>
         <w:t>The main window</w:t>
       </w:r>
@@ -6099,7 +6099,7 @@
       <w:pPr>
         <w:pStyle w:val="Heading2"/>
       </w:pPr>
-      <w:bookmarkStart w:id="10" w:name="_Toc243839881"/>
+      <w:bookmarkStart w:id="10" w:name="_Toc243841965"/>
       <w:r>
         <w:t>Your first part</w:t>
       </w:r>
@@ -6221,7 +6221,7 @@
       <w:pPr>
         <w:pStyle w:val="Heading2"/>
       </w:pPr>
-      <w:bookmarkStart w:id="11" w:name="_Toc243839882"/>
+      <w:bookmarkStart w:id="11" w:name="_Toc243841966"/>
       <w:r>
         <w:t>Creating a new part, step by step</w:t>
       </w:r>
@@ -6718,7 +6718,7 @@
       <w:pPr>
         <w:pStyle w:val="Heading1"/>
       </w:pPr>
-      <w:bookmarkStart w:id="12" w:name="_Toc243839883"/>
+      <w:bookmarkStart w:id="12" w:name="_Toc243841967"/>
       <w:r>
         <w:lastRenderedPageBreak/>
         <w:t>Everyday work</w:t>
@@ -6729,7 +6729,7 @@
       <w:pPr>
         <w:pStyle w:val="Heading2"/>
       </w:pPr>
-      <w:bookmarkStart w:id="13" w:name="_Toc243839884"/>
+      <w:bookmarkStart w:id="13" w:name="_Toc243841968"/>
       <w:r>
         <w:t>Part numbers and file names</w:t>
       </w:r>
@@ -6769,7 +6769,7 @@
       <w:pPr>
         <w:pStyle w:val="Heading2"/>
       </w:pPr>
-      <w:bookmarkStart w:id="14" w:name="_Toc243839885"/>
+      <w:bookmarkStart w:id="14" w:name="_Toc243841969"/>
       <w:r>
         <w:t>Projects</w:t>
       </w:r>
@@ -7069,7 +7069,7 @@
       <w:pPr>
         <w:pStyle w:val="Heading2"/>
       </w:pPr>
-      <w:bookmarkStart w:id="15" w:name="_Toc243839886"/>
+      <w:bookmarkStart w:id="15" w:name="_Toc243841970"/>
       <w:r>
         <w:t>Finding parts</w:t>
       </w:r>
@@ -7123,7 +7123,7 @@
       <w:pPr>
         <w:pStyle w:val="Heading2"/>
       </w:pPr>
-      <w:bookmarkStart w:id="16" w:name="_Toc243839887"/>
+      <w:bookmarkStart w:id="16" w:name="_Toc243841971"/>
       <w:r>
         <w:t>Folders</w:t>
       </w:r>
@@ -7490,7 +7490,7 @@
       <w:pPr>
         <w:pStyle w:val="Heading2"/>
       </w:pPr>
-      <w:bookmarkStart w:id="17" w:name="_Toc243839888"/>
+      <w:bookmarkStart w:id="17" w:name="_Toc243841972"/>
       <w:r>
         <w:t>Checking out and checking in</w:t>
       </w:r>
@@ -7620,7 +7620,7 @@
       <w:pPr>
         <w:pStyle w:val="Heading2"/>
       </w:pPr>
-      <w:bookmarkStart w:id="18" w:name="_Toc243839889"/>
+      <w:bookmarkStart w:id="18" w:name="_Toc243841973"/>
       <w:r>
         <w:t>Getting other people's changes</w:t>
       </w:r>
@@ -7650,7 +7650,7 @@
       <w:pPr>
         <w:pStyle w:val="Heading2"/>
       </w:pPr>
-      <w:bookmarkStart w:id="19" w:name="_Toc243839890"/>
+      <w:bookmarkStart w:id="19" w:name="_Toc243841974"/>
       <w:r>
         <w:t>Opening files</w:t>
       </w:r>
@@ -7709,7 +7709,7 @@
       <w:pPr>
         <w:pStyle w:val="Heading2"/>
       </w:pPr>
-      <w:bookmarkStart w:id="20" w:name="_Toc243839891"/>
+      <w:bookmarkStart w:id="20" w:name="_Toc243841975"/>
       <w:r>
         <w:lastRenderedPageBreak/>
         <w:t>The details pane</w:t>
@@ -7982,7 +7982,7 @@
       <w:pPr>
         <w:pStyle w:val="Heading1"/>
       </w:pPr>
-      <w:bookmarkStart w:id="21" w:name="_Toc243839892"/>
+      <w:bookmarkStart w:id="21" w:name="_Toc243841976"/>
       <w:r>
         <w:lastRenderedPageBreak/>
         <w:t>Revisions and the lifecycle</w:t>
@@ -8352,7 +8352,7 @@
       <w:pPr>
         <w:pStyle w:val="Heading2"/>
       </w:pPr>
-      <w:bookmarkStart w:id="22" w:name="_Toc243839893"/>
+      <w:bookmarkStart w:id="22" w:name="_Toc243841977"/>
       <w:r>
         <w:t>Form, Fit, Function, and Dispo</w:t>
       </w:r>
@@ -8446,7 +8446,7 @@
       <w:pPr>
         <w:pStyle w:val="Heading1"/>
       </w:pPr>
-      <w:bookmarkStart w:id="23" w:name="_Toc243839894"/>
+      <w:bookmarkStart w:id="23" w:name="_Toc243841978"/>
       <w:r>
         <w:lastRenderedPageBreak/>
         <w:t>Assemblies, references, and BOMs</w:t>
@@ -8457,7 +8457,7 @@
       <w:pPr>
         <w:pStyle w:val="Heading2"/>
       </w:pPr>
-      <w:bookmarkStart w:id="24" w:name="_Toc243839895"/>
+      <w:bookmarkStart w:id="24" w:name="_Toc243841979"/>
       <w:r>
         <w:t>Uses and where used</w:t>
       </w:r>
@@ -8510,7 +8510,7 @@
       <w:pPr>
         <w:pStyle w:val="Heading2"/>
       </w:pPr>
-      <w:bookmarkStart w:id="25" w:name="_Toc243839896"/>
+      <w:bookmarkStart w:id="25" w:name="_Toc243841980"/>
       <w:r>
         <w:t>The BOM tab</w:t>
       </w:r>
@@ -8636,7 +8636,7 @@
       <w:pPr>
         <w:pStyle w:val="Heading2"/>
       </w:pPr>
-      <w:bookmarkStart w:id="26" w:name="_Toc243839897"/>
+      <w:bookmarkStart w:id="26" w:name="_Toc243841981"/>
       <w:r>
         <w:t>Toolbox parts</w:t>
       </w:r>
@@ -8868,7 +8868,7 @@
       <w:pPr>
         <w:pStyle w:val="Heading2"/>
       </w:pPr>
-      <w:bookmarkStart w:id="27" w:name="_Toc243839898"/>
+      <w:bookmarkStart w:id="27" w:name="_Toc243841982"/>
       <w:r>
         <w:t>Non-CAD parts and kits</w:t>
       </w:r>
@@ -8938,7 +8938,7 @@
       <w:pPr>
         <w:pStyle w:val="Heading1"/>
       </w:pPr>
-      <w:bookmarkStart w:id="28" w:name="_Toc243839899"/>
+      <w:bookmarkStart w:id="28" w:name="_Toc243841983"/>
       <w:r>
         <w:lastRenderedPageBreak/>
         <w:t>Purchasing, costs, and materials</w:t>
@@ -8949,7 +8949,7 @@
       <w:pPr>
         <w:pStyle w:val="Heading2"/>
       </w:pPr>
-      <w:bookmarkStart w:id="29" w:name="_Toc243839900"/>
+      <w:bookmarkStart w:id="29" w:name="_Toc243841984"/>
       <w:r>
         <w:t>Purchasing info</w:t>
       </w:r>
@@ -8987,7 +8987,7 @@
       <w:pPr>
         <w:pStyle w:val="Heading2"/>
       </w:pPr>
-      <w:bookmarkStart w:id="30" w:name="_Toc243839901"/>
+      <w:bookmarkStart w:id="30" w:name="_Toc243841985"/>
       <w:r>
         <w:t>Materials</w:t>
       </w:r>
@@ -9025,7 +9025,7 @@
       <w:pPr>
         <w:pStyle w:val="Heading1"/>
       </w:pPr>
-      <w:bookmarkStart w:id="31" w:name="_Toc243839902"/>
+      <w:bookmarkStart w:id="31" w:name="_Toc243841986"/>
       <w:r>
         <w:lastRenderedPageBreak/>
         <w:t>Release outputs and exports</w:t>
@@ -9036,7 +9036,7 @@
       <w:pPr>
         <w:pStyle w:val="Heading2"/>
       </w:pPr>
-      <w:bookmarkStart w:id="32" w:name="_Toc243839903"/>
+      <w:bookmarkStart w:id="32" w:name="_Toc243841987"/>
       <w:r>
         <w:t>STEP and PDF files</w:t>
       </w:r>
@@ -9097,7 +9097,7 @@
       <w:pPr>
         <w:pStyle w:val="Heading2"/>
       </w:pPr>
-      <w:bookmarkStart w:id="33" w:name="_Toc243839904"/>
+      <w:bookmarkStart w:id="33" w:name="_Toc243841988"/>
       <w:r>
         <w:t>Exporting</w:t>
       </w:r>
@@ -9126,7 +9126,7 @@
       <w:pPr>
         <w:pStyle w:val="Heading1"/>
       </w:pPr>
-      <w:bookmarkStart w:id="34" w:name="_Toc243839905"/>
+      <w:bookmarkStart w:id="34" w:name="_Toc243841989"/>
       <w:r>
         <w:lastRenderedPageBreak/>
         <w:t>Documents</w:t>
@@ -9231,7 +9231,7 @@
       <w:pPr>
         <w:pStyle w:val="Heading1"/>
       </w:pPr>
-      <w:bookmarkStart w:id="35" w:name="_Toc243839906"/>
+      <w:bookmarkStart w:id="35" w:name="_Toc243841990"/>
       <w:r>
         <w:lastRenderedPageBreak/>
         <w:t>Sign-off workflows and ECOs</w:t>
@@ -9242,7 +9242,7 @@
       <w:pPr>
         <w:pStyle w:val="Heading2"/>
       </w:pPr>
-      <w:bookmarkStart w:id="36" w:name="_Toc243839907"/>
+      <w:bookmarkStart w:id="36" w:name="_Toc243841991"/>
       <w:r>
         <w:t>How workflows work</w:t>
       </w:r>
@@ -9298,7 +9298,7 @@
       <w:pPr>
         <w:pStyle w:val="Heading2"/>
       </w:pPr>
-      <w:bookmarkStart w:id="37" w:name="_Toc243839908"/>
+      <w:bookmarkStart w:id="37" w:name="_Toc243841992"/>
       <w:r>
         <w:t>Asking for sign-off</w:t>
       </w:r>
@@ -9464,7 +9464,7 @@
       <w:pPr>
         <w:pStyle w:val="Heading2"/>
       </w:pPr>
-      <w:bookmarkStart w:id="38" w:name="_Toc243839909"/>
+      <w:bookmarkStart w:id="38" w:name="_Toc243841993"/>
       <w:r>
         <w:t>Reviewing a request</w:t>
       </w:r>
@@ -9766,7 +9766,7 @@
       <w:pPr>
         <w:pStyle w:val="Heading2"/>
       </w:pPr>
-      <w:bookmarkStart w:id="39" w:name="_Toc243839910"/>
+      <w:bookmarkStart w:id="39" w:name="_Toc243841994"/>
       <w:r>
         <w:t>Rejected requests</w:t>
       </w:r>
@@ -9839,7 +9839,7 @@
       <w:pPr>
         <w:pStyle w:val="Heading2"/>
       </w:pPr>
-      <w:bookmarkStart w:id="40" w:name="_Toc243839911"/>
+      <w:bookmarkStart w:id="40" w:name="_Toc243841995"/>
       <w:r>
         <w:t>Engineering change orders</w:t>
       </w:r>
@@ -9891,7 +9891,7 @@
       <w:pPr>
         <w:pStyle w:val="Heading1"/>
       </w:pPr>
-      <w:bookmarkStart w:id="41" w:name="_Toc243839912"/>
+      <w:bookmarkStart w:id="41" w:name="_Toc243841996"/>
       <w:r>
         <w:lastRenderedPageBreak/>
         <w:t>Running the team</w:t>
@@ -9916,7 +9916,7 @@
       <w:pPr>
         <w:pStyle w:val="Heading2"/>
       </w:pPr>
-      <w:bookmarkStart w:id="42" w:name="_Toc243839913"/>
+      <w:bookmarkStart w:id="42" w:name="_Toc243841997"/>
       <w:r>
         <w:t>People and access</w:t>
       </w:r>
@@ -10214,7 +10214,7 @@
       <w:pPr>
         <w:pStyle w:val="Heading2"/>
       </w:pPr>
-      <w:bookmarkStart w:id="43" w:name="_Toc243839914"/>
+      <w:bookmarkStart w:id="43" w:name="_Toc243841998"/>
       <w:r>
         <w:t>Vault settings</w:t>
       </w:r>
@@ -10599,7 +10599,7 @@
       <w:pPr>
         <w:pStyle w:val="Heading2"/>
       </w:pPr>
-      <w:bookmarkStart w:id="44" w:name="_Toc243839915"/>
+      <w:bookmarkStart w:id="44" w:name="_Toc243841999"/>
       <w:r>
         <w:lastRenderedPageBreak/>
         <w:t>The team's Toolbox</w:t>
@@ -10707,7 +10707,7 @@
       <w:pPr>
         <w:pStyle w:val="Heading2"/>
       </w:pPr>
-      <w:bookmarkStart w:id="45" w:name="_Toc243839916"/>
+      <w:bookmarkStart w:id="45" w:name="_Toc243842000"/>
       <w:r>
         <w:t>Vault maintenance</w:t>
       </w:r>
@@ -10772,7 +10772,7 @@
       <w:pPr>
         <w:pStyle w:val="Heading1"/>
       </w:pPr>
-      <w:bookmarkStart w:id="46" w:name="_Toc243839917"/>
+      <w:bookmarkStart w:id="46" w:name="_Toc243842001"/>
       <w:r>
         <w:lastRenderedPageBreak/>
         <w:t>Importing existing CAD</w:t>
@@ -10868,7 +10868,7 @@
       <w:pPr>
         <w:pStyle w:val="Heading1"/>
       </w:pPr>
-      <w:bookmarkStart w:id="47" w:name="_Toc243839918"/>
+      <w:bookmarkStart w:id="47" w:name="_Toc243842002"/>
       <w:r>
         <w:lastRenderedPageBreak/>
         <w:t>Working with SolidWorks</w:t>
@@ -10944,7 +10944,7 @@
       <w:pPr>
         <w:pStyle w:val="Heading2"/>
       </w:pPr>
-      <w:bookmarkStart w:id="48" w:name="_Toc243839919"/>
+      <w:bookmarkStart w:id="48" w:name="_Toc243842003"/>
       <w:r>
         <w:t>Configurations</w:t>
       </w:r>
@@ -11008,7 +11008,7 @@
       <w:pPr>
         <w:pStyle w:val="Heading2"/>
       </w:pPr>
-      <w:bookmarkStart w:id="49" w:name="_Toc243839920"/>
+      <w:bookmarkStart w:id="49" w:name="_Toc243842004"/>
       <w:r>
         <w:t>Templates</w:t>
       </w:r>
@@ -11286,7 +11286,7 @@
       <w:pPr>
         <w:pStyle w:val="Heading1"/>
       </w:pPr>
-      <w:bookmarkStart w:id="50" w:name="_Toc243839921"/>
+      <w:bookmarkStart w:id="50" w:name="_Toc243842005"/>
       <w:r>
         <w:lastRenderedPageBreak/>
         <w:t>How Litterbox works</w:t>
@@ -11302,7 +11302,7 @@
       <w:pPr>
         <w:pStyle w:val="Heading2"/>
       </w:pPr>
-      <w:bookmarkStart w:id="51" w:name="_Toc243839922"/>
+      <w:bookmarkStart w:id="51" w:name="_Toc243842006"/>
       <w:r>
         <w:t>The vault is a Git repository</w:t>
       </w:r>
@@ -11706,7 +11706,7 @@
       <w:pPr>
         <w:pStyle w:val="Heading2"/>
       </w:pPr>
-      <w:bookmarkStart w:id="52" w:name="_Toc243839923"/>
+      <w:bookmarkStart w:id="52" w:name="_Toc243842007"/>
       <w:r>
         <w:t>Locks, read-only files, and uploads</w:t>
       </w:r>
@@ -11807,7 +11807,7 @@
       <w:pPr>
         <w:pStyle w:val="Heading2"/>
       </w:pPr>
-      <w:bookmarkStart w:id="53" w:name="_Toc243839924"/>
+      <w:bookmarkStart w:id="53" w:name="_Toc243842008"/>
       <w:r>
         <w:t>Downloads</w:t>
       </w:r>
@@ -11831,7 +11831,7 @@
       <w:pPr>
         <w:pStyle w:val="Heading2"/>
       </w:pPr>
-      <w:bookmarkStart w:id="54" w:name="_Toc243839925"/>
+      <w:bookmarkStart w:id="54" w:name="_Toc243842009"/>
       <w:r>
         <w:t>The job queue</w:t>
       </w:r>
@@ -11980,7 +11980,7 @@
       <w:pPr>
         <w:pStyle w:val="Heading1"/>
       </w:pPr>
-      <w:bookmarkStart w:id="55" w:name="_Toc243839926"/>
+      <w:bookmarkStart w:id="55" w:name="_Toc243842010"/>
       <w:r>
         <w:lastRenderedPageBreak/>
         <w:t>Settings and troubleshooting</w:t>
@@ -11991,7 +11991,7 @@
       <w:pPr>
         <w:pStyle w:val="Heading2"/>
       </w:pPr>
-      <w:bookmarkStart w:id="56" w:name="_Toc243839927"/>
+      <w:bookmarkStart w:id="56" w:name="_Toc243842011"/>
       <w:r>
         <w:t>Your settings</w:t>
       </w:r>
@@ -12355,7 +12355,7 @@
       <w:pPr>
         <w:pStyle w:val="Heading2"/>
       </w:pPr>
-      <w:bookmarkStart w:id="57" w:name="_Toc243839928"/>
+      <w:bookmarkStart w:id="57" w:name="_Toc243842012"/>
       <w:r>
         <w:t>Problems</w:t>
       </w:r>
@@ -12472,7 +12472,7 @@
       <w:pPr>
         <w:pStyle w:val="Heading2"/>
       </w:pPr>
-      <w:bookmarkStart w:id="58" w:name="_Toc243839929"/>
+      <w:bookmarkStart w:id="58" w:name="_Toc243842013"/>
       <w:r>
         <w:lastRenderedPageBreak/>
         <w:t>The command line</w:t>
@@ -12513,7 +12513,7 @@
       <w:pPr>
         <w:pStyle w:val="Heading1"/>
       </w:pPr>
-      <w:bookmarkStart w:id="59" w:name="_Toc243839930"/>
+      <w:bookmarkStart w:id="59" w:name="_Toc243842014"/>
       <w:r>
         <w:lastRenderedPageBreak/>
         <w:t>Quick reference</w:t>
@@ -13179,100 +13179,100 @@
       </w:rPr>
     </w:lvl>
   </w:abstractNum>
-  <w:num w:numId="1" w16cid:durableId="1824656225">
+  <w:num w:numId="1" w16cid:durableId="286857652">
     <w:abstractNumId w:val="8"/>
   </w:num>
-  <w:num w:numId="2" w16cid:durableId="49109677">
+  <w:num w:numId="2" w16cid:durableId="717821715">
     <w:abstractNumId w:val="6"/>
   </w:num>
-  <w:num w:numId="3" w16cid:durableId="1072968833">
+  <w:num w:numId="3" w16cid:durableId="193345887">
     <w:abstractNumId w:val="5"/>
   </w:num>
-  <w:num w:numId="4" w16cid:durableId="1745641158">
+  <w:num w:numId="4" w16cid:durableId="1128473105">
     <w:abstractNumId w:val="4"/>
   </w:num>
-  <w:num w:numId="5" w16cid:durableId="1930381109">
+  <w:num w:numId="5" w16cid:durableId="1633555688">
     <w:abstractNumId w:val="7"/>
   </w:num>
-  <w:num w:numId="6" w16cid:durableId="860901473">
+  <w:num w:numId="6" w16cid:durableId="551380224">
     <w:abstractNumId w:val="3"/>
   </w:num>
-  <w:num w:numId="7" w16cid:durableId="1318651095">
+  <w:num w:numId="7" w16cid:durableId="625697974">
     <w:abstractNumId w:val="2"/>
   </w:num>
-  <w:num w:numId="8" w16cid:durableId="1021008513">
+  <w:num w:numId="8" w16cid:durableId="1561357415">
     <w:abstractNumId w:val="1"/>
   </w:num>
-  <w:num w:numId="9" w16cid:durableId="1598975430">
+  <w:num w:numId="9" w16cid:durableId="424420307">
     <w:abstractNumId w:val="0"/>
   </w:num>
-  <w:num w:numId="10" w16cid:durableId="545873026">
+  <w:num w:numId="10" w16cid:durableId="497960138">
     <w:abstractNumId w:val="7"/>
     <w:lvlOverride w:ilvl="0">
       <w:startOverride w:val="1"/>
     </w:lvlOverride>
   </w:num>
-  <w:num w:numId="11" w16cid:durableId="354623806">
+  <w:num w:numId="11" w16cid:durableId="157431160">
     <w:abstractNumId w:val="7"/>
     <w:lvlOverride w:ilvl="0">
       <w:startOverride w:val="1"/>
     </w:lvlOverride>
   </w:num>
-  <w:num w:numId="12" w16cid:durableId="410976576">
+  <w:num w:numId="12" w16cid:durableId="672608510">
     <w:abstractNumId w:val="7"/>
     <w:lvlOverride w:ilvl="0">
       <w:startOverride w:val="1"/>
     </w:lvlOverride>
   </w:num>
-  <w:num w:numId="13" w16cid:durableId="749735281">
+  <w:num w:numId="13" w16cid:durableId="1017774753">
     <w:abstractNumId w:val="7"/>
     <w:lvlOverride w:ilvl="0">
       <w:startOverride w:val="1"/>
     </w:lvlOverride>
   </w:num>
-  <w:num w:numId="14" w16cid:durableId="749740800">
+  <w:num w:numId="14" w16cid:durableId="1611088033">
     <w:abstractNumId w:val="7"/>
     <w:lvlOverride w:ilvl="0">
       <w:startOverride w:val="1"/>
     </w:lvlOverride>
   </w:num>
-  <w:num w:numId="15" w16cid:durableId="1618876406">
+  <w:num w:numId="15" w16cid:durableId="1135441819">
     <w:abstractNumId w:val="7"/>
     <w:lvlOverride w:ilvl="0">
       <w:startOverride w:val="1"/>
     </w:lvlOverride>
   </w:num>
-  <w:num w:numId="16" w16cid:durableId="1649244218">
+  <w:num w:numId="16" w16cid:durableId="1614365961">
     <w:abstractNumId w:val="7"/>
     <w:lvlOverride w:ilvl="0">
       <w:startOverride w:val="1"/>
     </w:lvlOverride>
   </w:num>
-  <w:num w:numId="17" w16cid:durableId="1407343658">
+  <w:num w:numId="17" w16cid:durableId="640235266">
     <w:abstractNumId w:val="7"/>
     <w:lvlOverride w:ilvl="0">
       <w:startOverride w:val="1"/>
     </w:lvlOverride>
   </w:num>
-  <w:num w:numId="18" w16cid:durableId="513423258">
+  <w:num w:numId="18" w16cid:durableId="1598445597">
     <w:abstractNumId w:val="7"/>
     <w:lvlOverride w:ilvl="0">
       <w:startOverride w:val="1"/>
     </w:lvlOverride>
   </w:num>
-  <w:num w:numId="19" w16cid:durableId="1358778575">
+  <w:num w:numId="19" w16cid:durableId="1991254542">
     <w:abstractNumId w:val="7"/>
     <w:lvlOverride w:ilvl="0">
       <w:startOverride w:val="1"/>
     </w:lvlOverride>
   </w:num>
-  <w:num w:numId="20" w16cid:durableId="294793413">
+  <w:num w:numId="20" w16cid:durableId="1205560011">
     <w:abstractNumId w:val="7"/>
     <w:lvlOverride w:ilvl="0">
       <w:startOverride w:val="1"/>
     </w:lvlOverride>
   </w:num>
-  <w:num w:numId="21" w16cid:durableId="1648315724">
+  <w:num w:numId="21" w16cid:durableId="1183475092">
     <w:abstractNumId w:val="7"/>
     <w:lvlOverride w:ilvl="0">
       <w:startOverride w:val="1"/>
@@ -24642,7 +24642,7 @@
     <w:autoRedefine/>
     <w:uiPriority w:val="39"/>
     <w:unhideWhenUsed/>
-    <w:rsid w:val="001669DE"/>
+    <w:rsid w:val="00E93DF0"/>
     <w:pPr>
       <w:spacing w:after="100"/>
     </w:pPr>
@@ -24654,7 +24654,7 @@
     <w:autoRedefine/>
     <w:uiPriority w:val="39"/>
     <w:unhideWhenUsed/>
-    <w:rsid w:val="001669DE"/>
+    <w:rsid w:val="00E93DF0"/>
     <w:pPr>
       <w:spacing w:after="100"/>
       <w:ind w:left="210"/>
@@ -24665,7 +24665,7 @@
     <w:basedOn w:val="DefaultParagraphFont"/>
     <w:uiPriority w:val="99"/>
     <w:unhideWhenUsed/>
-    <w:rsid w:val="001669DE"/>
+    <w:rsid w:val="00E93DF0"/>
     <w:rPr>
       <w:color w:val="0000FF" w:themeColor="hyperlink"/>
       <w:u w:val="single"/>

</xml_diff>

<commit_message>
1.0.3: syncs leave your own changed files alone
A sync used `git rebase --autostash`, which rewrites every changed file even
when nothing is new, so a part saved but open in SolidWorks stopped it with
"unable to unlink old ...". Now nothing is done when nothing is new, a
fast-forward brings in what is, and the autostash rebase is only the fallback.

- _abort_rebase falls back to `git rebase --quit`, so a rebase that failed
  before it began can't leave the vault stuck.
- "Are you online?" only when the fetch fails (UnreachableError); a file
  another program has open is named, with "close it and try again".
- Version 1.0.3, changelog, and the guide rebuilt.

Co-Authored-By: Claude Opus 5.5 <noreply@anthropic.com>
</commit_message>
<xml_diff>
--- a/docs/Litterbox_User_Guide.docx
+++ b/docs/Litterbox_User_Guide.docx
@@ -46,7 +46,7 @@
         <w:rPr>
           <w:color w:val="666666"/>
         </w:rPr>
-        <w:t>For Litterbox 1.0.2  ·  October 2026</w:t>
+        <w:t>For Litterbox 1.0.3  ·  October 2026</w:t>
       </w:r>
     </w:p>
     <w:p>
@@ -87,7 +87,7 @@
       <w:r>
         <w:fldChar w:fldCharType="separate"/>
       </w:r>
-      <w:hyperlink w:anchor="_Toc243841955" w:history="1">
+      <w:hyperlink w:anchor="_Toc244298263" w:history="1">
         <w:r>
           <w:rPr>
             <w:rStyle w:val="Hyperlink"/>
@@ -114,7 +114,7 @@
             <w:noProof/>
             <w:webHidden/>
           </w:rPr>
-          <w:instrText xml:space="preserve"> PAGEREF _Toc243841955 \h </w:instrText>
+          <w:instrText xml:space="preserve"> PAGEREF _Toc244298263 \h </w:instrText>
         </w:r>
         <w:r>
           <w:rPr>
@@ -155,7 +155,7 @@
           <w:noProof/>
         </w:rPr>
       </w:pPr>
-      <w:hyperlink w:anchor="_Toc243841956" w:history="1">
+      <w:hyperlink w:anchor="_Toc244298264" w:history="1">
         <w:r>
           <w:rPr>
             <w:rStyle w:val="Hyperlink"/>
@@ -182,7 +182,7 @@
             <w:noProof/>
             <w:webHidden/>
           </w:rPr>
-          <w:instrText xml:space="preserve"> PAGEREF _Toc243841956 \h </w:instrText>
+          <w:instrText xml:space="preserve"> PAGEREF _Toc244298264 \h </w:instrText>
         </w:r>
         <w:r>
           <w:rPr>
@@ -223,7 +223,7 @@
           <w:noProof/>
         </w:rPr>
       </w:pPr>
-      <w:hyperlink w:anchor="_Toc243841957" w:history="1">
+      <w:hyperlink w:anchor="_Toc244298265" w:history="1">
         <w:r>
           <w:rPr>
             <w:rStyle w:val="Hyperlink"/>
@@ -250,7 +250,7 @@
             <w:noProof/>
             <w:webHidden/>
           </w:rPr>
-          <w:instrText xml:space="preserve"> PAGEREF _Toc243841957 \h </w:instrText>
+          <w:instrText xml:space="preserve"> PAGEREF _Toc244298265 \h </w:instrText>
         </w:r>
         <w:r>
           <w:rPr>
@@ -291,7 +291,7 @@
           <w:noProof/>
         </w:rPr>
       </w:pPr>
-      <w:hyperlink w:anchor="_Toc243841958" w:history="1">
+      <w:hyperlink w:anchor="_Toc244298266" w:history="1">
         <w:r>
           <w:rPr>
             <w:rStyle w:val="Hyperlink"/>
@@ -318,7 +318,7 @@
             <w:noProof/>
             <w:webHidden/>
           </w:rPr>
-          <w:instrText xml:space="preserve"> PAGEREF _Toc243841958 \h </w:instrText>
+          <w:instrText xml:space="preserve"> PAGEREF _Toc244298266 \h </w:instrText>
         </w:r>
         <w:r>
           <w:rPr>
@@ -359,7 +359,7 @@
           <w:noProof/>
         </w:rPr>
       </w:pPr>
-      <w:hyperlink w:anchor="_Toc243841959" w:history="1">
+      <w:hyperlink w:anchor="_Toc244298267" w:history="1">
         <w:r>
           <w:rPr>
             <w:rStyle w:val="Hyperlink"/>
@@ -386,7 +386,7 @@
             <w:noProof/>
             <w:webHidden/>
           </w:rPr>
-          <w:instrText xml:space="preserve"> PAGEREF _Toc243841959 \h </w:instrText>
+          <w:instrText xml:space="preserve"> PAGEREF _Toc244298267 \h </w:instrText>
         </w:r>
         <w:r>
           <w:rPr>
@@ -427,7 +427,7 @@
           <w:noProof/>
         </w:rPr>
       </w:pPr>
-      <w:hyperlink w:anchor="_Toc243841960" w:history="1">
+      <w:hyperlink w:anchor="_Toc244298268" w:history="1">
         <w:r>
           <w:rPr>
             <w:rStyle w:val="Hyperlink"/>
@@ -454,7 +454,7 @@
             <w:noProof/>
             <w:webHidden/>
           </w:rPr>
-          <w:instrText xml:space="preserve"> PAGEREF _Toc243841960 \h </w:instrText>
+          <w:instrText xml:space="preserve"> PAGEREF _Toc244298268 \h </w:instrText>
         </w:r>
         <w:r>
           <w:rPr>
@@ -495,7 +495,7 @@
           <w:noProof/>
         </w:rPr>
       </w:pPr>
-      <w:hyperlink w:anchor="_Toc243841961" w:history="1">
+      <w:hyperlink w:anchor="_Toc244298269" w:history="1">
         <w:r>
           <w:rPr>
             <w:rStyle w:val="Hyperlink"/>
@@ -522,7 +522,7 @@
             <w:noProof/>
             <w:webHidden/>
           </w:rPr>
-          <w:instrText xml:space="preserve"> PAGEREF _Toc243841961 \h </w:instrText>
+          <w:instrText xml:space="preserve"> PAGEREF _Toc244298269 \h </w:instrText>
         </w:r>
         <w:r>
           <w:rPr>
@@ -563,7 +563,7 @@
           <w:noProof/>
         </w:rPr>
       </w:pPr>
-      <w:hyperlink w:anchor="_Toc243841962" w:history="1">
+      <w:hyperlink w:anchor="_Toc244298270" w:history="1">
         <w:r>
           <w:rPr>
             <w:rStyle w:val="Hyperlink"/>
@@ -590,7 +590,7 @@
             <w:noProof/>
             <w:webHidden/>
           </w:rPr>
-          <w:instrText xml:space="preserve"> PAGEREF _Toc243841962 \h </w:instrText>
+          <w:instrText xml:space="preserve"> PAGEREF _Toc244298270 \h </w:instrText>
         </w:r>
         <w:r>
           <w:rPr>
@@ -631,7 +631,7 @@
           <w:noProof/>
         </w:rPr>
       </w:pPr>
-      <w:hyperlink w:anchor="_Toc243841963" w:history="1">
+      <w:hyperlink w:anchor="_Toc244298271" w:history="1">
         <w:r>
           <w:rPr>
             <w:rStyle w:val="Hyperlink"/>
@@ -658,7 +658,7 @@
             <w:noProof/>
             <w:webHidden/>
           </w:rPr>
-          <w:instrText xml:space="preserve"> PAGEREF _Toc243841963 \h </w:instrText>
+          <w:instrText xml:space="preserve"> PAGEREF _Toc244298271 \h </w:instrText>
         </w:r>
         <w:r>
           <w:rPr>
@@ -699,7 +699,7 @@
           <w:noProof/>
         </w:rPr>
       </w:pPr>
-      <w:hyperlink w:anchor="_Toc243841964" w:history="1">
+      <w:hyperlink w:anchor="_Toc244298272" w:history="1">
         <w:r>
           <w:rPr>
             <w:rStyle w:val="Hyperlink"/>
@@ -726,7 +726,7 @@
             <w:noProof/>
             <w:webHidden/>
           </w:rPr>
-          <w:instrText xml:space="preserve"> PAGEREF _Toc243841964 \h </w:instrText>
+          <w:instrText xml:space="preserve"> PAGEREF _Toc244298272 \h </w:instrText>
         </w:r>
         <w:r>
           <w:rPr>
@@ -767,7 +767,7 @@
           <w:noProof/>
         </w:rPr>
       </w:pPr>
-      <w:hyperlink w:anchor="_Toc243841965" w:history="1">
+      <w:hyperlink w:anchor="_Toc244298273" w:history="1">
         <w:r>
           <w:rPr>
             <w:rStyle w:val="Hyperlink"/>
@@ -794,7 +794,7 @@
             <w:noProof/>
             <w:webHidden/>
           </w:rPr>
-          <w:instrText xml:space="preserve"> PAGEREF _Toc243841965 \h </w:instrText>
+          <w:instrText xml:space="preserve"> PAGEREF _Toc244298273 \h </w:instrText>
         </w:r>
         <w:r>
           <w:rPr>
@@ -835,7 +835,7 @@
           <w:noProof/>
         </w:rPr>
       </w:pPr>
-      <w:hyperlink w:anchor="_Toc243841966" w:history="1">
+      <w:hyperlink w:anchor="_Toc244298274" w:history="1">
         <w:r>
           <w:rPr>
             <w:rStyle w:val="Hyperlink"/>
@@ -862,7 +862,7 @@
             <w:noProof/>
             <w:webHidden/>
           </w:rPr>
-          <w:instrText xml:space="preserve"> PAGEREF _Toc243841966 \h </w:instrText>
+          <w:instrText xml:space="preserve"> PAGEREF _Toc244298274 \h </w:instrText>
         </w:r>
         <w:r>
           <w:rPr>
@@ -903,7 +903,7 @@
           <w:noProof/>
         </w:rPr>
       </w:pPr>
-      <w:hyperlink w:anchor="_Toc243841967" w:history="1">
+      <w:hyperlink w:anchor="_Toc244298275" w:history="1">
         <w:r>
           <w:rPr>
             <w:rStyle w:val="Hyperlink"/>
@@ -930,7 +930,7 @@
             <w:noProof/>
             <w:webHidden/>
           </w:rPr>
-          <w:instrText xml:space="preserve"> PAGEREF _Toc243841967 \h </w:instrText>
+          <w:instrText xml:space="preserve"> PAGEREF _Toc244298275 \h </w:instrText>
         </w:r>
         <w:r>
           <w:rPr>
@@ -971,7 +971,7 @@
           <w:noProof/>
         </w:rPr>
       </w:pPr>
-      <w:hyperlink w:anchor="_Toc243841968" w:history="1">
+      <w:hyperlink w:anchor="_Toc244298276" w:history="1">
         <w:r>
           <w:rPr>
             <w:rStyle w:val="Hyperlink"/>
@@ -998,7 +998,7 @@
             <w:noProof/>
             <w:webHidden/>
           </w:rPr>
-          <w:instrText xml:space="preserve"> PAGEREF _Toc243841968 \h </w:instrText>
+          <w:instrText xml:space="preserve"> PAGEREF _Toc244298276 \h </w:instrText>
         </w:r>
         <w:r>
           <w:rPr>
@@ -1039,7 +1039,7 @@
           <w:noProof/>
         </w:rPr>
       </w:pPr>
-      <w:hyperlink w:anchor="_Toc243841969" w:history="1">
+      <w:hyperlink w:anchor="_Toc244298277" w:history="1">
         <w:r>
           <w:rPr>
             <w:rStyle w:val="Hyperlink"/>
@@ -1066,7 +1066,7 @@
             <w:noProof/>
             <w:webHidden/>
           </w:rPr>
-          <w:instrText xml:space="preserve"> PAGEREF _Toc243841969 \h </w:instrText>
+          <w:instrText xml:space="preserve"> PAGEREF _Toc244298277 \h </w:instrText>
         </w:r>
         <w:r>
           <w:rPr>
@@ -1107,7 +1107,7 @@
           <w:noProof/>
         </w:rPr>
       </w:pPr>
-      <w:hyperlink w:anchor="_Toc243841970" w:history="1">
+      <w:hyperlink w:anchor="_Toc244298278" w:history="1">
         <w:r>
           <w:rPr>
             <w:rStyle w:val="Hyperlink"/>
@@ -1134,7 +1134,7 @@
             <w:noProof/>
             <w:webHidden/>
           </w:rPr>
-          <w:instrText xml:space="preserve"> PAGEREF _Toc243841970 \h </w:instrText>
+          <w:instrText xml:space="preserve"> PAGEREF _Toc244298278 \h </w:instrText>
         </w:r>
         <w:r>
           <w:rPr>
@@ -1175,7 +1175,7 @@
           <w:noProof/>
         </w:rPr>
       </w:pPr>
-      <w:hyperlink w:anchor="_Toc243841971" w:history="1">
+      <w:hyperlink w:anchor="_Toc244298279" w:history="1">
         <w:r>
           <w:rPr>
             <w:rStyle w:val="Hyperlink"/>
@@ -1202,7 +1202,7 @@
             <w:noProof/>
             <w:webHidden/>
           </w:rPr>
-          <w:instrText xml:space="preserve"> PAGEREF _Toc243841971 \h </w:instrText>
+          <w:instrText xml:space="preserve"> PAGEREF _Toc244298279 \h </w:instrText>
         </w:r>
         <w:r>
           <w:rPr>
@@ -1243,7 +1243,7 @@
           <w:noProof/>
         </w:rPr>
       </w:pPr>
-      <w:hyperlink w:anchor="_Toc243841972" w:history="1">
+      <w:hyperlink w:anchor="_Toc244298280" w:history="1">
         <w:r>
           <w:rPr>
             <w:rStyle w:val="Hyperlink"/>
@@ -1270,7 +1270,7 @@
             <w:noProof/>
             <w:webHidden/>
           </w:rPr>
-          <w:instrText xml:space="preserve"> PAGEREF _Toc243841972 \h </w:instrText>
+          <w:instrText xml:space="preserve"> PAGEREF _Toc244298280 \h </w:instrText>
         </w:r>
         <w:r>
           <w:rPr>
@@ -1311,7 +1311,7 @@
           <w:noProof/>
         </w:rPr>
       </w:pPr>
-      <w:hyperlink w:anchor="_Toc243841973" w:history="1">
+      <w:hyperlink w:anchor="_Toc244298281" w:history="1">
         <w:r>
           <w:rPr>
             <w:rStyle w:val="Hyperlink"/>
@@ -1338,7 +1338,7 @@
             <w:noProof/>
             <w:webHidden/>
           </w:rPr>
-          <w:instrText xml:space="preserve"> PAGEREF _Toc243841973 \h </w:instrText>
+          <w:instrText xml:space="preserve"> PAGEREF _Toc244298281 \h </w:instrText>
         </w:r>
         <w:r>
           <w:rPr>
@@ -1379,7 +1379,7 @@
           <w:noProof/>
         </w:rPr>
       </w:pPr>
-      <w:hyperlink w:anchor="_Toc243841974" w:history="1">
+      <w:hyperlink w:anchor="_Toc244298282" w:history="1">
         <w:r>
           <w:rPr>
             <w:rStyle w:val="Hyperlink"/>
@@ -1406,7 +1406,7 @@
             <w:noProof/>
             <w:webHidden/>
           </w:rPr>
-          <w:instrText xml:space="preserve"> PAGEREF _Toc243841974 \h </w:instrText>
+          <w:instrText xml:space="preserve"> PAGEREF _Toc244298282 \h </w:instrText>
         </w:r>
         <w:r>
           <w:rPr>
@@ -1447,7 +1447,7 @@
           <w:noProof/>
         </w:rPr>
       </w:pPr>
-      <w:hyperlink w:anchor="_Toc243841975" w:history="1">
+      <w:hyperlink w:anchor="_Toc244298283" w:history="1">
         <w:r>
           <w:rPr>
             <w:rStyle w:val="Hyperlink"/>
@@ -1474,7 +1474,7 @@
             <w:noProof/>
             <w:webHidden/>
           </w:rPr>
-          <w:instrText xml:space="preserve"> PAGEREF _Toc243841975 \h </w:instrText>
+          <w:instrText xml:space="preserve"> PAGEREF _Toc244298283 \h </w:instrText>
         </w:r>
         <w:r>
           <w:rPr>
@@ -1515,7 +1515,7 @@
           <w:noProof/>
         </w:rPr>
       </w:pPr>
-      <w:hyperlink w:anchor="_Toc243841976" w:history="1">
+      <w:hyperlink w:anchor="_Toc244298284" w:history="1">
         <w:r>
           <w:rPr>
             <w:rStyle w:val="Hyperlink"/>
@@ -1542,7 +1542,7 @@
             <w:noProof/>
             <w:webHidden/>
           </w:rPr>
-          <w:instrText xml:space="preserve"> PAGEREF _Toc243841976 \h </w:instrText>
+          <w:instrText xml:space="preserve"> PAGEREF _Toc244298284 \h </w:instrText>
         </w:r>
         <w:r>
           <w:rPr>
@@ -1583,7 +1583,7 @@
           <w:noProof/>
         </w:rPr>
       </w:pPr>
-      <w:hyperlink w:anchor="_Toc243841977" w:history="1">
+      <w:hyperlink w:anchor="_Toc244298285" w:history="1">
         <w:r>
           <w:rPr>
             <w:rStyle w:val="Hyperlink"/>
@@ -1610,7 +1610,7 @@
             <w:noProof/>
             <w:webHidden/>
           </w:rPr>
-          <w:instrText xml:space="preserve"> PAGEREF _Toc243841977 \h </w:instrText>
+          <w:instrText xml:space="preserve"> PAGEREF _Toc244298285 \h </w:instrText>
         </w:r>
         <w:r>
           <w:rPr>
@@ -1651,7 +1651,7 @@
           <w:noProof/>
         </w:rPr>
       </w:pPr>
-      <w:hyperlink w:anchor="_Toc243841978" w:history="1">
+      <w:hyperlink w:anchor="_Toc244298286" w:history="1">
         <w:r>
           <w:rPr>
             <w:rStyle w:val="Hyperlink"/>
@@ -1678,7 +1678,7 @@
             <w:noProof/>
             <w:webHidden/>
           </w:rPr>
-          <w:instrText xml:space="preserve"> PAGEREF _Toc243841978 \h </w:instrText>
+          <w:instrText xml:space="preserve"> PAGEREF _Toc244298286 \h </w:instrText>
         </w:r>
         <w:r>
           <w:rPr>
@@ -1719,7 +1719,7 @@
           <w:noProof/>
         </w:rPr>
       </w:pPr>
-      <w:hyperlink w:anchor="_Toc243841979" w:history="1">
+      <w:hyperlink w:anchor="_Toc244298287" w:history="1">
         <w:r>
           <w:rPr>
             <w:rStyle w:val="Hyperlink"/>
@@ -1746,7 +1746,7 @@
             <w:noProof/>
             <w:webHidden/>
           </w:rPr>
-          <w:instrText xml:space="preserve"> PAGEREF _Toc243841979 \h </w:instrText>
+          <w:instrText xml:space="preserve"> PAGEREF _Toc244298287 \h </w:instrText>
         </w:r>
         <w:r>
           <w:rPr>
@@ -1787,7 +1787,7 @@
           <w:noProof/>
         </w:rPr>
       </w:pPr>
-      <w:hyperlink w:anchor="_Toc243841980" w:history="1">
+      <w:hyperlink w:anchor="_Toc244298288" w:history="1">
         <w:r>
           <w:rPr>
             <w:rStyle w:val="Hyperlink"/>
@@ -1814,7 +1814,7 @@
             <w:noProof/>
             <w:webHidden/>
           </w:rPr>
-          <w:instrText xml:space="preserve"> PAGEREF _Toc243841980 \h </w:instrText>
+          <w:instrText xml:space="preserve"> PAGEREF _Toc244298288 \h </w:instrText>
         </w:r>
         <w:r>
           <w:rPr>
@@ -1855,7 +1855,7 @@
           <w:noProof/>
         </w:rPr>
       </w:pPr>
-      <w:hyperlink w:anchor="_Toc243841981" w:history="1">
+      <w:hyperlink w:anchor="_Toc244298289" w:history="1">
         <w:r>
           <w:rPr>
             <w:rStyle w:val="Hyperlink"/>
@@ -1882,7 +1882,7 @@
             <w:noProof/>
             <w:webHidden/>
           </w:rPr>
-          <w:instrText xml:space="preserve"> PAGEREF _Toc243841981 \h </w:instrText>
+          <w:instrText xml:space="preserve"> PAGEREF _Toc244298289 \h </w:instrText>
         </w:r>
         <w:r>
           <w:rPr>
@@ -1923,7 +1923,7 @@
           <w:noProof/>
         </w:rPr>
       </w:pPr>
-      <w:hyperlink w:anchor="_Toc243841982" w:history="1">
+      <w:hyperlink w:anchor="_Toc244298290" w:history="1">
         <w:r>
           <w:rPr>
             <w:rStyle w:val="Hyperlink"/>
@@ -1950,7 +1950,7 @@
             <w:noProof/>
             <w:webHidden/>
           </w:rPr>
-          <w:instrText xml:space="preserve"> PAGEREF _Toc243841982 \h </w:instrText>
+          <w:instrText xml:space="preserve"> PAGEREF _Toc244298290 \h </w:instrText>
         </w:r>
         <w:r>
           <w:rPr>
@@ -1991,7 +1991,7 @@
           <w:noProof/>
         </w:rPr>
       </w:pPr>
-      <w:hyperlink w:anchor="_Toc243841983" w:history="1">
+      <w:hyperlink w:anchor="_Toc244298291" w:history="1">
         <w:r>
           <w:rPr>
             <w:rStyle w:val="Hyperlink"/>
@@ -2018,7 +2018,7 @@
             <w:noProof/>
             <w:webHidden/>
           </w:rPr>
-          <w:instrText xml:space="preserve"> PAGEREF _Toc243841983 \h </w:instrText>
+          <w:instrText xml:space="preserve"> PAGEREF _Toc244298291 \h </w:instrText>
         </w:r>
         <w:r>
           <w:rPr>
@@ -2059,7 +2059,7 @@
           <w:noProof/>
         </w:rPr>
       </w:pPr>
-      <w:hyperlink w:anchor="_Toc243841984" w:history="1">
+      <w:hyperlink w:anchor="_Toc244298292" w:history="1">
         <w:r>
           <w:rPr>
             <w:rStyle w:val="Hyperlink"/>
@@ -2086,7 +2086,7 @@
             <w:noProof/>
             <w:webHidden/>
           </w:rPr>
-          <w:instrText xml:space="preserve"> PAGEREF _Toc243841984 \h </w:instrText>
+          <w:instrText xml:space="preserve"> PAGEREF _Toc244298292 \h </w:instrText>
         </w:r>
         <w:r>
           <w:rPr>
@@ -2127,7 +2127,7 @@
           <w:noProof/>
         </w:rPr>
       </w:pPr>
-      <w:hyperlink w:anchor="_Toc243841985" w:history="1">
+      <w:hyperlink w:anchor="_Toc244298293" w:history="1">
         <w:r>
           <w:rPr>
             <w:rStyle w:val="Hyperlink"/>
@@ -2154,7 +2154,7 @@
             <w:noProof/>
             <w:webHidden/>
           </w:rPr>
-          <w:instrText xml:space="preserve"> PAGEREF _Toc243841985 \h </w:instrText>
+          <w:instrText xml:space="preserve"> PAGEREF _Toc244298293 \h </w:instrText>
         </w:r>
         <w:r>
           <w:rPr>
@@ -2195,7 +2195,7 @@
           <w:noProof/>
         </w:rPr>
       </w:pPr>
-      <w:hyperlink w:anchor="_Toc243841986" w:history="1">
+      <w:hyperlink w:anchor="_Toc244298294" w:history="1">
         <w:r>
           <w:rPr>
             <w:rStyle w:val="Hyperlink"/>
@@ -2222,7 +2222,7 @@
             <w:noProof/>
             <w:webHidden/>
           </w:rPr>
-          <w:instrText xml:space="preserve"> PAGEREF _Toc243841986 \h </w:instrText>
+          <w:instrText xml:space="preserve"> PAGEREF _Toc244298294 \h </w:instrText>
         </w:r>
         <w:r>
           <w:rPr>
@@ -2263,7 +2263,7 @@
           <w:noProof/>
         </w:rPr>
       </w:pPr>
-      <w:hyperlink w:anchor="_Toc243841987" w:history="1">
+      <w:hyperlink w:anchor="_Toc244298295" w:history="1">
         <w:r>
           <w:rPr>
             <w:rStyle w:val="Hyperlink"/>
@@ -2290,7 +2290,7 @@
             <w:noProof/>
             <w:webHidden/>
           </w:rPr>
-          <w:instrText xml:space="preserve"> PAGEREF _Toc243841987 \h </w:instrText>
+          <w:instrText xml:space="preserve"> PAGEREF _Toc244298295 \h </w:instrText>
         </w:r>
         <w:r>
           <w:rPr>
@@ -2331,7 +2331,7 @@
           <w:noProof/>
         </w:rPr>
       </w:pPr>
-      <w:hyperlink w:anchor="_Toc243841988" w:history="1">
+      <w:hyperlink w:anchor="_Toc244298296" w:history="1">
         <w:r>
           <w:rPr>
             <w:rStyle w:val="Hyperlink"/>
@@ -2358,7 +2358,7 @@
             <w:noProof/>
             <w:webHidden/>
           </w:rPr>
-          <w:instrText xml:space="preserve"> PAGEREF _Toc243841988 \h </w:instrText>
+          <w:instrText xml:space="preserve"> PAGEREF _Toc244298296 \h </w:instrText>
         </w:r>
         <w:r>
           <w:rPr>
@@ -2399,7 +2399,7 @@
           <w:noProof/>
         </w:rPr>
       </w:pPr>
-      <w:hyperlink w:anchor="_Toc243841989" w:history="1">
+      <w:hyperlink w:anchor="_Toc244298297" w:history="1">
         <w:r>
           <w:rPr>
             <w:rStyle w:val="Hyperlink"/>
@@ -2426,7 +2426,7 @@
             <w:noProof/>
             <w:webHidden/>
           </w:rPr>
-          <w:instrText xml:space="preserve"> PAGEREF _Toc243841989 \h </w:instrText>
+          <w:instrText xml:space="preserve"> PAGEREF _Toc244298297 \h </w:instrText>
         </w:r>
         <w:r>
           <w:rPr>
@@ -2467,7 +2467,7 @@
           <w:noProof/>
         </w:rPr>
       </w:pPr>
-      <w:hyperlink w:anchor="_Toc243841990" w:history="1">
+      <w:hyperlink w:anchor="_Toc244298298" w:history="1">
         <w:r>
           <w:rPr>
             <w:rStyle w:val="Hyperlink"/>
@@ -2494,7 +2494,7 @@
             <w:noProof/>
             <w:webHidden/>
           </w:rPr>
-          <w:instrText xml:space="preserve"> PAGEREF _Toc243841990 \h </w:instrText>
+          <w:instrText xml:space="preserve"> PAGEREF _Toc244298298 \h </w:instrText>
         </w:r>
         <w:r>
           <w:rPr>
@@ -2535,7 +2535,7 @@
           <w:noProof/>
         </w:rPr>
       </w:pPr>
-      <w:hyperlink w:anchor="_Toc243841991" w:history="1">
+      <w:hyperlink w:anchor="_Toc244298299" w:history="1">
         <w:r>
           <w:rPr>
             <w:rStyle w:val="Hyperlink"/>
@@ -2562,7 +2562,7 @@
             <w:noProof/>
             <w:webHidden/>
           </w:rPr>
-          <w:instrText xml:space="preserve"> PAGEREF _Toc243841991 \h </w:instrText>
+          <w:instrText xml:space="preserve"> PAGEREF _Toc244298299 \h </w:instrText>
         </w:r>
         <w:r>
           <w:rPr>
@@ -2603,7 +2603,7 @@
           <w:noProof/>
         </w:rPr>
       </w:pPr>
-      <w:hyperlink w:anchor="_Toc243841992" w:history="1">
+      <w:hyperlink w:anchor="_Toc244298300" w:history="1">
         <w:r>
           <w:rPr>
             <w:rStyle w:val="Hyperlink"/>
@@ -2630,7 +2630,7 @@
             <w:noProof/>
             <w:webHidden/>
           </w:rPr>
-          <w:instrText xml:space="preserve"> PAGEREF _Toc243841992 \h </w:instrText>
+          <w:instrText xml:space="preserve"> PAGEREF _Toc244298300 \h </w:instrText>
         </w:r>
         <w:r>
           <w:rPr>
@@ -2671,7 +2671,7 @@
           <w:noProof/>
         </w:rPr>
       </w:pPr>
-      <w:hyperlink w:anchor="_Toc243841993" w:history="1">
+      <w:hyperlink w:anchor="_Toc244298301" w:history="1">
         <w:r>
           <w:rPr>
             <w:rStyle w:val="Hyperlink"/>
@@ -2698,7 +2698,7 @@
             <w:noProof/>
             <w:webHidden/>
           </w:rPr>
-          <w:instrText xml:space="preserve"> PAGEREF _Toc243841993 \h </w:instrText>
+          <w:instrText xml:space="preserve"> PAGEREF _Toc244298301 \h </w:instrText>
         </w:r>
         <w:r>
           <w:rPr>
@@ -2739,7 +2739,7 @@
           <w:noProof/>
         </w:rPr>
       </w:pPr>
-      <w:hyperlink w:anchor="_Toc243841994" w:history="1">
+      <w:hyperlink w:anchor="_Toc244298302" w:history="1">
         <w:r>
           <w:rPr>
             <w:rStyle w:val="Hyperlink"/>
@@ -2766,7 +2766,7 @@
             <w:noProof/>
             <w:webHidden/>
           </w:rPr>
-          <w:instrText xml:space="preserve"> PAGEREF _Toc243841994 \h </w:instrText>
+          <w:instrText xml:space="preserve"> PAGEREF _Toc244298302 \h </w:instrText>
         </w:r>
         <w:r>
           <w:rPr>
@@ -2807,7 +2807,7 @@
           <w:noProof/>
         </w:rPr>
       </w:pPr>
-      <w:hyperlink w:anchor="_Toc243841995" w:history="1">
+      <w:hyperlink w:anchor="_Toc244298303" w:history="1">
         <w:r>
           <w:rPr>
             <w:rStyle w:val="Hyperlink"/>
@@ -2834,7 +2834,7 @@
             <w:noProof/>
             <w:webHidden/>
           </w:rPr>
-          <w:instrText xml:space="preserve"> PAGEREF _Toc243841995 \h </w:instrText>
+          <w:instrText xml:space="preserve"> PAGEREF _Toc244298303 \h </w:instrText>
         </w:r>
         <w:r>
           <w:rPr>
@@ -2875,7 +2875,7 @@
           <w:noProof/>
         </w:rPr>
       </w:pPr>
-      <w:hyperlink w:anchor="_Toc243841996" w:history="1">
+      <w:hyperlink w:anchor="_Toc244298304" w:history="1">
         <w:r>
           <w:rPr>
             <w:rStyle w:val="Hyperlink"/>
@@ -2902,7 +2902,7 @@
             <w:noProof/>
             <w:webHidden/>
           </w:rPr>
-          <w:instrText xml:space="preserve"> PAGEREF _Toc243841996 \h </w:instrText>
+          <w:instrText xml:space="preserve"> PAGEREF _Toc244298304 \h </w:instrText>
         </w:r>
         <w:r>
           <w:rPr>
@@ -2943,7 +2943,7 @@
           <w:noProof/>
         </w:rPr>
       </w:pPr>
-      <w:hyperlink w:anchor="_Toc243841997" w:history="1">
+      <w:hyperlink w:anchor="_Toc244298305" w:history="1">
         <w:r>
           <w:rPr>
             <w:rStyle w:val="Hyperlink"/>
@@ -2970,7 +2970,7 @@
             <w:noProof/>
             <w:webHidden/>
           </w:rPr>
-          <w:instrText xml:space="preserve"> PAGEREF _Toc243841997 \h </w:instrText>
+          <w:instrText xml:space="preserve"> PAGEREF _Toc244298305 \h </w:instrText>
         </w:r>
         <w:r>
           <w:rPr>
@@ -3011,7 +3011,7 @@
           <w:noProof/>
         </w:rPr>
       </w:pPr>
-      <w:hyperlink w:anchor="_Toc243841998" w:history="1">
+      <w:hyperlink w:anchor="_Toc244298306" w:history="1">
         <w:r>
           <w:rPr>
             <w:rStyle w:val="Hyperlink"/>
@@ -3038,7 +3038,7 @@
             <w:noProof/>
             <w:webHidden/>
           </w:rPr>
-          <w:instrText xml:space="preserve"> PAGEREF _Toc243841998 \h </w:instrText>
+          <w:instrText xml:space="preserve"> PAGEREF _Toc244298306 \h </w:instrText>
         </w:r>
         <w:r>
           <w:rPr>
@@ -3079,7 +3079,7 @@
           <w:noProof/>
         </w:rPr>
       </w:pPr>
-      <w:hyperlink w:anchor="_Toc243841999" w:history="1">
+      <w:hyperlink w:anchor="_Toc244298307" w:history="1">
         <w:r>
           <w:rPr>
             <w:rStyle w:val="Hyperlink"/>
@@ -3106,7 +3106,7 @@
             <w:noProof/>
             <w:webHidden/>
           </w:rPr>
-          <w:instrText xml:space="preserve"> PAGEREF _Toc243841999 \h </w:instrText>
+          <w:instrText xml:space="preserve"> PAGEREF _Toc244298307 \h </w:instrText>
         </w:r>
         <w:r>
           <w:rPr>
@@ -3147,7 +3147,7 @@
           <w:noProof/>
         </w:rPr>
       </w:pPr>
-      <w:hyperlink w:anchor="_Toc243842000" w:history="1">
+      <w:hyperlink w:anchor="_Toc244298308" w:history="1">
         <w:r>
           <w:rPr>
             <w:rStyle w:val="Hyperlink"/>
@@ -3174,7 +3174,7 @@
             <w:noProof/>
             <w:webHidden/>
           </w:rPr>
-          <w:instrText xml:space="preserve"> PAGEREF _Toc243842000 \h </w:instrText>
+          <w:instrText xml:space="preserve"> PAGEREF _Toc244298308 \h </w:instrText>
         </w:r>
         <w:r>
           <w:rPr>
@@ -3215,7 +3215,7 @@
           <w:noProof/>
         </w:rPr>
       </w:pPr>
-      <w:hyperlink w:anchor="_Toc243842001" w:history="1">
+      <w:hyperlink w:anchor="_Toc244298309" w:history="1">
         <w:r>
           <w:rPr>
             <w:rStyle w:val="Hyperlink"/>
@@ -3242,7 +3242,7 @@
             <w:noProof/>
             <w:webHidden/>
           </w:rPr>
-          <w:instrText xml:space="preserve"> PAGEREF _Toc243842001 \h </w:instrText>
+          <w:instrText xml:space="preserve"> PAGEREF _Toc244298309 \h </w:instrText>
         </w:r>
         <w:r>
           <w:rPr>
@@ -3283,7 +3283,7 @@
           <w:noProof/>
         </w:rPr>
       </w:pPr>
-      <w:hyperlink w:anchor="_Toc243842002" w:history="1">
+      <w:hyperlink w:anchor="_Toc244298310" w:history="1">
         <w:r>
           <w:rPr>
             <w:rStyle w:val="Hyperlink"/>
@@ -3310,7 +3310,7 @@
             <w:noProof/>
             <w:webHidden/>
           </w:rPr>
-          <w:instrText xml:space="preserve"> PAGEREF _Toc243842002 \h </w:instrText>
+          <w:instrText xml:space="preserve"> PAGEREF _Toc244298310 \h </w:instrText>
         </w:r>
         <w:r>
           <w:rPr>
@@ -3351,7 +3351,7 @@
           <w:noProof/>
         </w:rPr>
       </w:pPr>
-      <w:hyperlink w:anchor="_Toc243842003" w:history="1">
+      <w:hyperlink w:anchor="_Toc244298311" w:history="1">
         <w:r>
           <w:rPr>
             <w:rStyle w:val="Hyperlink"/>
@@ -3378,7 +3378,7 @@
             <w:noProof/>
             <w:webHidden/>
           </w:rPr>
-          <w:instrText xml:space="preserve"> PAGEREF _Toc243842003 \h </w:instrText>
+          <w:instrText xml:space="preserve"> PAGEREF _Toc244298311 \h </w:instrText>
         </w:r>
         <w:r>
           <w:rPr>
@@ -3419,7 +3419,7 @@
           <w:noProof/>
         </w:rPr>
       </w:pPr>
-      <w:hyperlink w:anchor="_Toc243842004" w:history="1">
+      <w:hyperlink w:anchor="_Toc244298312" w:history="1">
         <w:r>
           <w:rPr>
             <w:rStyle w:val="Hyperlink"/>
@@ -3446,7 +3446,7 @@
             <w:noProof/>
             <w:webHidden/>
           </w:rPr>
-          <w:instrText xml:space="preserve"> PAGEREF _Toc243842004 \h </w:instrText>
+          <w:instrText xml:space="preserve"> PAGEREF _Toc244298312 \h </w:instrText>
         </w:r>
         <w:r>
           <w:rPr>
@@ -3487,7 +3487,7 @@
           <w:noProof/>
         </w:rPr>
       </w:pPr>
-      <w:hyperlink w:anchor="_Toc243842005" w:history="1">
+      <w:hyperlink w:anchor="_Toc244298313" w:history="1">
         <w:r>
           <w:rPr>
             <w:rStyle w:val="Hyperlink"/>
@@ -3514,7 +3514,7 @@
             <w:noProof/>
             <w:webHidden/>
           </w:rPr>
-          <w:instrText xml:space="preserve"> PAGEREF _Toc243842005 \h </w:instrText>
+          <w:instrText xml:space="preserve"> PAGEREF _Toc244298313 \h </w:instrText>
         </w:r>
         <w:r>
           <w:rPr>
@@ -3555,7 +3555,7 @@
           <w:noProof/>
         </w:rPr>
       </w:pPr>
-      <w:hyperlink w:anchor="_Toc243842006" w:history="1">
+      <w:hyperlink w:anchor="_Toc244298314" w:history="1">
         <w:r>
           <w:rPr>
             <w:rStyle w:val="Hyperlink"/>
@@ -3582,7 +3582,7 @@
             <w:noProof/>
             <w:webHidden/>
           </w:rPr>
-          <w:instrText xml:space="preserve"> PAGEREF _Toc243842006 \h </w:instrText>
+          <w:instrText xml:space="preserve"> PAGEREF _Toc244298314 \h </w:instrText>
         </w:r>
         <w:r>
           <w:rPr>
@@ -3623,7 +3623,7 @@
           <w:noProof/>
         </w:rPr>
       </w:pPr>
-      <w:hyperlink w:anchor="_Toc243842007" w:history="1">
+      <w:hyperlink w:anchor="_Toc244298315" w:history="1">
         <w:r>
           <w:rPr>
             <w:rStyle w:val="Hyperlink"/>
@@ -3650,7 +3650,7 @@
             <w:noProof/>
             <w:webHidden/>
           </w:rPr>
-          <w:instrText xml:space="preserve"> PAGEREF _Toc243842007 \h </w:instrText>
+          <w:instrText xml:space="preserve"> PAGEREF _Toc244298315 \h </w:instrText>
         </w:r>
         <w:r>
           <w:rPr>
@@ -3691,7 +3691,7 @@
           <w:noProof/>
         </w:rPr>
       </w:pPr>
-      <w:hyperlink w:anchor="_Toc243842008" w:history="1">
+      <w:hyperlink w:anchor="_Toc244298316" w:history="1">
         <w:r>
           <w:rPr>
             <w:rStyle w:val="Hyperlink"/>
@@ -3718,7 +3718,7 @@
             <w:noProof/>
             <w:webHidden/>
           </w:rPr>
-          <w:instrText xml:space="preserve"> PAGEREF _Toc243842008 \h </w:instrText>
+          <w:instrText xml:space="preserve"> PAGEREF _Toc244298316 \h </w:instrText>
         </w:r>
         <w:r>
           <w:rPr>
@@ -3759,7 +3759,7 @@
           <w:noProof/>
         </w:rPr>
       </w:pPr>
-      <w:hyperlink w:anchor="_Toc243842009" w:history="1">
+      <w:hyperlink w:anchor="_Toc244298317" w:history="1">
         <w:r>
           <w:rPr>
             <w:rStyle w:val="Hyperlink"/>
@@ -3786,7 +3786,7 @@
             <w:noProof/>
             <w:webHidden/>
           </w:rPr>
-          <w:instrText xml:space="preserve"> PAGEREF _Toc243842009 \h </w:instrText>
+          <w:instrText xml:space="preserve"> PAGEREF _Toc244298317 \h </w:instrText>
         </w:r>
         <w:r>
           <w:rPr>
@@ -3827,7 +3827,7 @@
           <w:noProof/>
         </w:rPr>
       </w:pPr>
-      <w:hyperlink w:anchor="_Toc243842010" w:history="1">
+      <w:hyperlink w:anchor="_Toc244298318" w:history="1">
         <w:r>
           <w:rPr>
             <w:rStyle w:val="Hyperlink"/>
@@ -3854,7 +3854,7 @@
             <w:noProof/>
             <w:webHidden/>
           </w:rPr>
-          <w:instrText xml:space="preserve"> PAGEREF _Toc243842010 \h </w:instrText>
+          <w:instrText xml:space="preserve"> PAGEREF _Toc244298318 \h </w:instrText>
         </w:r>
         <w:r>
           <w:rPr>
@@ -3895,7 +3895,7 @@
           <w:noProof/>
         </w:rPr>
       </w:pPr>
-      <w:hyperlink w:anchor="_Toc243842011" w:history="1">
+      <w:hyperlink w:anchor="_Toc244298319" w:history="1">
         <w:r>
           <w:rPr>
             <w:rStyle w:val="Hyperlink"/>
@@ -3922,7 +3922,7 @@
             <w:noProof/>
             <w:webHidden/>
           </w:rPr>
-          <w:instrText xml:space="preserve"> PAGEREF _Toc243842011 \h </w:instrText>
+          <w:instrText xml:space="preserve"> PAGEREF _Toc244298319 \h </w:instrText>
         </w:r>
         <w:r>
           <w:rPr>
@@ -3963,7 +3963,7 @@
           <w:noProof/>
         </w:rPr>
       </w:pPr>
-      <w:hyperlink w:anchor="_Toc243842012" w:history="1">
+      <w:hyperlink w:anchor="_Toc244298320" w:history="1">
         <w:r>
           <w:rPr>
             <w:rStyle w:val="Hyperlink"/>
@@ -3990,7 +3990,7 @@
             <w:noProof/>
             <w:webHidden/>
           </w:rPr>
-          <w:instrText xml:space="preserve"> PAGEREF _Toc243842012 \h </w:instrText>
+          <w:instrText xml:space="preserve"> PAGEREF _Toc244298320 \h </w:instrText>
         </w:r>
         <w:r>
           <w:rPr>
@@ -4031,7 +4031,7 @@
           <w:noProof/>
         </w:rPr>
       </w:pPr>
-      <w:hyperlink w:anchor="_Toc243842013" w:history="1">
+      <w:hyperlink w:anchor="_Toc244298321" w:history="1">
         <w:r>
           <w:rPr>
             <w:rStyle w:val="Hyperlink"/>
@@ -4058,7 +4058,7 @@
             <w:noProof/>
             <w:webHidden/>
           </w:rPr>
-          <w:instrText xml:space="preserve"> PAGEREF _Toc243842013 \h </w:instrText>
+          <w:instrText xml:space="preserve"> PAGEREF _Toc244298321 \h </w:instrText>
         </w:r>
         <w:r>
           <w:rPr>
@@ -4099,7 +4099,7 @@
           <w:noProof/>
         </w:rPr>
       </w:pPr>
-      <w:hyperlink w:anchor="_Toc243842014" w:history="1">
+      <w:hyperlink w:anchor="_Toc244298322" w:history="1">
         <w:r>
           <w:rPr>
             <w:rStyle w:val="Hyperlink"/>
@@ -4126,7 +4126,7 @@
             <w:noProof/>
             <w:webHidden/>
           </w:rPr>
-          <w:instrText xml:space="preserve"> PAGEREF _Toc243842014 \h </w:instrText>
+          <w:instrText xml:space="preserve"> PAGEREF _Toc244298322 \h </w:instrText>
         </w:r>
         <w:r>
           <w:rPr>
@@ -4171,7 +4171,7 @@
       <w:pPr>
         <w:pStyle w:val="Heading1"/>
       </w:pPr>
-      <w:bookmarkStart w:id="0" w:name="_Toc243841955"/>
+      <w:bookmarkStart w:id="0" w:name="_Toc244298263"/>
       <w:r>
         <w:lastRenderedPageBreak/>
         <w:t>Foreword</w:t>
@@ -4205,7 +4205,7 @@
       <w:pPr>
         <w:pStyle w:val="Heading1"/>
       </w:pPr>
-      <w:bookmarkStart w:id="1" w:name="_Toc243841956"/>
+      <w:bookmarkStart w:id="1" w:name="_Toc244298264"/>
       <w:r>
         <w:lastRenderedPageBreak/>
         <w:t>What Litterbox is</w:t>
@@ -4301,7 +4301,7 @@
       <w:pPr>
         <w:pStyle w:val="Heading2"/>
       </w:pPr>
-      <w:bookmarkStart w:id="2" w:name="_Toc243841957"/>
+      <w:bookmarkStart w:id="2" w:name="_Toc244298265"/>
       <w:r>
         <w:t>Terms</w:t>
       </w:r>
@@ -4808,7 +4808,7 @@
       <w:pPr>
         <w:pStyle w:val="Heading1"/>
       </w:pPr>
-      <w:bookmarkStart w:id="3" w:name="_Toc243841958"/>
+      <w:bookmarkStart w:id="3" w:name="_Toc244298266"/>
       <w:r>
         <w:lastRenderedPageBreak/>
         <w:t>Getting started</w:t>
@@ -4824,7 +4824,7 @@
       <w:pPr>
         <w:pStyle w:val="Heading2"/>
       </w:pPr>
-      <w:bookmarkStart w:id="4" w:name="_Toc243841959"/>
+      <w:bookmarkStart w:id="4" w:name="_Toc244298267"/>
       <w:r>
         <w:t>What you need</w:t>
       </w:r>
@@ -4909,7 +4909,7 @@
       <w:pPr>
         <w:pStyle w:val="Heading2"/>
       </w:pPr>
-      <w:bookmarkStart w:id="5" w:name="_Toc243841960"/>
+      <w:bookmarkStart w:id="5" w:name="_Toc244298268"/>
       <w:r>
         <w:t>Installing Litterbox</w:t>
       </w:r>
@@ -5039,7 +5039,7 @@
       <w:pPr>
         <w:pStyle w:val="Heading2"/>
       </w:pPr>
-      <w:bookmarkStart w:id="6" w:name="_Toc243841961"/>
+      <w:bookmarkStart w:id="6" w:name="_Toc244298269"/>
       <w:r>
         <w:lastRenderedPageBreak/>
         <w:t>Joining your team's vault</w:t>
@@ -5146,7 +5146,7 @@
       <w:pPr>
         <w:pStyle w:val="Heading2"/>
       </w:pPr>
-      <w:bookmarkStart w:id="7" w:name="_Toc243841962"/>
+      <w:bookmarkStart w:id="7" w:name="_Toc244298270"/>
       <w:r>
         <w:t>Decisions to make first</w:t>
       </w:r>
@@ -5418,7 +5418,7 @@
       <w:pPr>
         <w:pStyle w:val="Heading2"/>
       </w:pPr>
-      <w:bookmarkStart w:id="8" w:name="_Toc243841963"/>
+      <w:bookmarkStart w:id="8" w:name="_Toc244298271"/>
       <w:r>
         <w:lastRenderedPageBreak/>
         <w:t>Setting up a new team</w:t>
@@ -5688,7 +5688,7 @@
       <w:pPr>
         <w:pStyle w:val="Heading2"/>
       </w:pPr>
-      <w:bookmarkStart w:id="9" w:name="_Toc243841964"/>
+      <w:bookmarkStart w:id="9" w:name="_Toc244298272"/>
       <w:r>
         <w:t>The main window</w:t>
       </w:r>
@@ -6099,7 +6099,7 @@
       <w:pPr>
         <w:pStyle w:val="Heading2"/>
       </w:pPr>
-      <w:bookmarkStart w:id="10" w:name="_Toc243841965"/>
+      <w:bookmarkStart w:id="10" w:name="_Toc244298273"/>
       <w:r>
         <w:t>Your first part</w:t>
       </w:r>
@@ -6221,7 +6221,7 @@
       <w:pPr>
         <w:pStyle w:val="Heading2"/>
       </w:pPr>
-      <w:bookmarkStart w:id="11" w:name="_Toc243841966"/>
+      <w:bookmarkStart w:id="11" w:name="_Toc244298274"/>
       <w:r>
         <w:t>Creating a new part, step by step</w:t>
       </w:r>
@@ -6718,7 +6718,7 @@
       <w:pPr>
         <w:pStyle w:val="Heading1"/>
       </w:pPr>
-      <w:bookmarkStart w:id="12" w:name="_Toc243841967"/>
+      <w:bookmarkStart w:id="12" w:name="_Toc244298275"/>
       <w:r>
         <w:lastRenderedPageBreak/>
         <w:t>Everyday work</w:t>
@@ -6729,7 +6729,7 @@
       <w:pPr>
         <w:pStyle w:val="Heading2"/>
       </w:pPr>
-      <w:bookmarkStart w:id="13" w:name="_Toc243841968"/>
+      <w:bookmarkStart w:id="13" w:name="_Toc244298276"/>
       <w:r>
         <w:t>Part numbers and file names</w:t>
       </w:r>
@@ -6769,7 +6769,7 @@
       <w:pPr>
         <w:pStyle w:val="Heading2"/>
       </w:pPr>
-      <w:bookmarkStart w:id="14" w:name="_Toc243841969"/>
+      <w:bookmarkStart w:id="14" w:name="_Toc244298277"/>
       <w:r>
         <w:t>Projects</w:t>
       </w:r>
@@ -7069,7 +7069,7 @@
       <w:pPr>
         <w:pStyle w:val="Heading2"/>
       </w:pPr>
-      <w:bookmarkStart w:id="15" w:name="_Toc243841970"/>
+      <w:bookmarkStart w:id="15" w:name="_Toc244298278"/>
       <w:r>
         <w:t>Finding parts</w:t>
       </w:r>
@@ -7123,7 +7123,7 @@
       <w:pPr>
         <w:pStyle w:val="Heading2"/>
       </w:pPr>
-      <w:bookmarkStart w:id="16" w:name="_Toc243841971"/>
+      <w:bookmarkStart w:id="16" w:name="_Toc244298279"/>
       <w:r>
         <w:t>Folders</w:t>
       </w:r>
@@ -7490,7 +7490,7 @@
       <w:pPr>
         <w:pStyle w:val="Heading2"/>
       </w:pPr>
-      <w:bookmarkStart w:id="17" w:name="_Toc243841972"/>
+      <w:bookmarkStart w:id="17" w:name="_Toc244298280"/>
       <w:r>
         <w:t>Checking out and checking in</w:t>
       </w:r>
@@ -7620,7 +7620,7 @@
       <w:pPr>
         <w:pStyle w:val="Heading2"/>
       </w:pPr>
-      <w:bookmarkStart w:id="18" w:name="_Toc243841973"/>
+      <w:bookmarkStart w:id="18" w:name="_Toc244298281"/>
       <w:r>
         <w:t>Getting other people's changes</w:t>
       </w:r>
@@ -7650,7 +7650,7 @@
       <w:pPr>
         <w:pStyle w:val="Heading2"/>
       </w:pPr>
-      <w:bookmarkStart w:id="19" w:name="_Toc243841974"/>
+      <w:bookmarkStart w:id="19" w:name="_Toc244298282"/>
       <w:r>
         <w:t>Opening files</w:t>
       </w:r>
@@ -7709,7 +7709,7 @@
       <w:pPr>
         <w:pStyle w:val="Heading2"/>
       </w:pPr>
-      <w:bookmarkStart w:id="20" w:name="_Toc243841975"/>
+      <w:bookmarkStart w:id="20" w:name="_Toc244298283"/>
       <w:r>
         <w:lastRenderedPageBreak/>
         <w:t>The details pane</w:t>
@@ -7982,7 +7982,7 @@
       <w:pPr>
         <w:pStyle w:val="Heading1"/>
       </w:pPr>
-      <w:bookmarkStart w:id="21" w:name="_Toc243841976"/>
+      <w:bookmarkStart w:id="21" w:name="_Toc244298284"/>
       <w:r>
         <w:lastRenderedPageBreak/>
         <w:t>Revisions and the lifecycle</w:t>
@@ -8352,7 +8352,7 @@
       <w:pPr>
         <w:pStyle w:val="Heading2"/>
       </w:pPr>
-      <w:bookmarkStart w:id="22" w:name="_Toc243841977"/>
+      <w:bookmarkStart w:id="22" w:name="_Toc244298285"/>
       <w:r>
         <w:t>Form, Fit, Function, and Dispo</w:t>
       </w:r>
@@ -8446,7 +8446,7 @@
       <w:pPr>
         <w:pStyle w:val="Heading1"/>
       </w:pPr>
-      <w:bookmarkStart w:id="23" w:name="_Toc243841978"/>
+      <w:bookmarkStart w:id="23" w:name="_Toc244298286"/>
       <w:r>
         <w:lastRenderedPageBreak/>
         <w:t>Assemblies, references, and BOMs</w:t>
@@ -8457,7 +8457,7 @@
       <w:pPr>
         <w:pStyle w:val="Heading2"/>
       </w:pPr>
-      <w:bookmarkStart w:id="24" w:name="_Toc243841979"/>
+      <w:bookmarkStart w:id="24" w:name="_Toc244298287"/>
       <w:r>
         <w:t>Uses and where used</w:t>
       </w:r>
@@ -8510,7 +8510,7 @@
       <w:pPr>
         <w:pStyle w:val="Heading2"/>
       </w:pPr>
-      <w:bookmarkStart w:id="25" w:name="_Toc243841980"/>
+      <w:bookmarkStart w:id="25" w:name="_Toc244298288"/>
       <w:r>
         <w:t>The BOM tab</w:t>
       </w:r>
@@ -8636,7 +8636,7 @@
       <w:pPr>
         <w:pStyle w:val="Heading2"/>
       </w:pPr>
-      <w:bookmarkStart w:id="26" w:name="_Toc243841981"/>
+      <w:bookmarkStart w:id="26" w:name="_Toc244298289"/>
       <w:r>
         <w:t>Toolbox parts</w:t>
       </w:r>
@@ -8868,7 +8868,7 @@
       <w:pPr>
         <w:pStyle w:val="Heading2"/>
       </w:pPr>
-      <w:bookmarkStart w:id="27" w:name="_Toc243841982"/>
+      <w:bookmarkStart w:id="27" w:name="_Toc244298290"/>
       <w:r>
         <w:t>Non-CAD parts and kits</w:t>
       </w:r>
@@ -8938,7 +8938,7 @@
       <w:pPr>
         <w:pStyle w:val="Heading1"/>
       </w:pPr>
-      <w:bookmarkStart w:id="28" w:name="_Toc243841983"/>
+      <w:bookmarkStart w:id="28" w:name="_Toc244298291"/>
       <w:r>
         <w:lastRenderedPageBreak/>
         <w:t>Purchasing, costs, and materials</w:t>
@@ -8949,7 +8949,7 @@
       <w:pPr>
         <w:pStyle w:val="Heading2"/>
       </w:pPr>
-      <w:bookmarkStart w:id="29" w:name="_Toc243841984"/>
+      <w:bookmarkStart w:id="29" w:name="_Toc244298292"/>
       <w:r>
         <w:t>Purchasing info</w:t>
       </w:r>
@@ -8987,7 +8987,7 @@
       <w:pPr>
         <w:pStyle w:val="Heading2"/>
       </w:pPr>
-      <w:bookmarkStart w:id="30" w:name="_Toc243841985"/>
+      <w:bookmarkStart w:id="30" w:name="_Toc244298293"/>
       <w:r>
         <w:t>Materials</w:t>
       </w:r>
@@ -9025,7 +9025,7 @@
       <w:pPr>
         <w:pStyle w:val="Heading1"/>
       </w:pPr>
-      <w:bookmarkStart w:id="31" w:name="_Toc243841986"/>
+      <w:bookmarkStart w:id="31" w:name="_Toc244298294"/>
       <w:r>
         <w:lastRenderedPageBreak/>
         <w:t>Release outputs and exports</w:t>
@@ -9036,7 +9036,7 @@
       <w:pPr>
         <w:pStyle w:val="Heading2"/>
       </w:pPr>
-      <w:bookmarkStart w:id="32" w:name="_Toc243841987"/>
+      <w:bookmarkStart w:id="32" w:name="_Toc244298295"/>
       <w:r>
         <w:t>STEP and PDF files</w:t>
       </w:r>
@@ -9097,7 +9097,7 @@
       <w:pPr>
         <w:pStyle w:val="Heading2"/>
       </w:pPr>
-      <w:bookmarkStart w:id="33" w:name="_Toc243841988"/>
+      <w:bookmarkStart w:id="33" w:name="_Toc244298296"/>
       <w:r>
         <w:t>Exporting</w:t>
       </w:r>
@@ -9126,7 +9126,7 @@
       <w:pPr>
         <w:pStyle w:val="Heading1"/>
       </w:pPr>
-      <w:bookmarkStart w:id="34" w:name="_Toc243841989"/>
+      <w:bookmarkStart w:id="34" w:name="_Toc244298297"/>
       <w:r>
         <w:lastRenderedPageBreak/>
         <w:t>Documents</w:t>
@@ -9231,7 +9231,7 @@
       <w:pPr>
         <w:pStyle w:val="Heading1"/>
       </w:pPr>
-      <w:bookmarkStart w:id="35" w:name="_Toc243841990"/>
+      <w:bookmarkStart w:id="35" w:name="_Toc244298298"/>
       <w:r>
         <w:lastRenderedPageBreak/>
         <w:t>Sign-off workflows and ECOs</w:t>
@@ -9242,7 +9242,7 @@
       <w:pPr>
         <w:pStyle w:val="Heading2"/>
       </w:pPr>
-      <w:bookmarkStart w:id="36" w:name="_Toc243841991"/>
+      <w:bookmarkStart w:id="36" w:name="_Toc244298299"/>
       <w:r>
         <w:t>How workflows work</w:t>
       </w:r>
@@ -9298,7 +9298,7 @@
       <w:pPr>
         <w:pStyle w:val="Heading2"/>
       </w:pPr>
-      <w:bookmarkStart w:id="37" w:name="_Toc243841992"/>
+      <w:bookmarkStart w:id="37" w:name="_Toc244298300"/>
       <w:r>
         <w:t>Asking for sign-off</w:t>
       </w:r>
@@ -9464,7 +9464,7 @@
       <w:pPr>
         <w:pStyle w:val="Heading2"/>
       </w:pPr>
-      <w:bookmarkStart w:id="38" w:name="_Toc243841993"/>
+      <w:bookmarkStart w:id="38" w:name="_Toc244298301"/>
       <w:r>
         <w:t>Reviewing a request</w:t>
       </w:r>
@@ -9766,7 +9766,7 @@
       <w:pPr>
         <w:pStyle w:val="Heading2"/>
       </w:pPr>
-      <w:bookmarkStart w:id="39" w:name="_Toc243841994"/>
+      <w:bookmarkStart w:id="39" w:name="_Toc244298302"/>
       <w:r>
         <w:t>Rejected requests</w:t>
       </w:r>
@@ -9839,7 +9839,7 @@
       <w:pPr>
         <w:pStyle w:val="Heading2"/>
       </w:pPr>
-      <w:bookmarkStart w:id="40" w:name="_Toc243841995"/>
+      <w:bookmarkStart w:id="40" w:name="_Toc244298303"/>
       <w:r>
         <w:t>Engineering change orders</w:t>
       </w:r>
@@ -9891,7 +9891,7 @@
       <w:pPr>
         <w:pStyle w:val="Heading1"/>
       </w:pPr>
-      <w:bookmarkStart w:id="41" w:name="_Toc243841996"/>
+      <w:bookmarkStart w:id="41" w:name="_Toc244298304"/>
       <w:r>
         <w:lastRenderedPageBreak/>
         <w:t>Running the team</w:t>
@@ -9916,7 +9916,7 @@
       <w:pPr>
         <w:pStyle w:val="Heading2"/>
       </w:pPr>
-      <w:bookmarkStart w:id="42" w:name="_Toc243841997"/>
+      <w:bookmarkStart w:id="42" w:name="_Toc244298305"/>
       <w:r>
         <w:t>People and access</w:t>
       </w:r>
@@ -10214,7 +10214,7 @@
       <w:pPr>
         <w:pStyle w:val="Heading2"/>
       </w:pPr>
-      <w:bookmarkStart w:id="43" w:name="_Toc243841998"/>
+      <w:bookmarkStart w:id="43" w:name="_Toc244298306"/>
       <w:r>
         <w:t>Vault settings</w:t>
       </w:r>
@@ -10599,7 +10599,7 @@
       <w:pPr>
         <w:pStyle w:val="Heading2"/>
       </w:pPr>
-      <w:bookmarkStart w:id="44" w:name="_Toc243841999"/>
+      <w:bookmarkStart w:id="44" w:name="_Toc244298307"/>
       <w:r>
         <w:lastRenderedPageBreak/>
         <w:t>The team's Toolbox</w:t>
@@ -10707,7 +10707,7 @@
       <w:pPr>
         <w:pStyle w:val="Heading2"/>
       </w:pPr>
-      <w:bookmarkStart w:id="45" w:name="_Toc243842000"/>
+      <w:bookmarkStart w:id="45" w:name="_Toc244298308"/>
       <w:r>
         <w:t>Vault maintenance</w:t>
       </w:r>
@@ -10772,7 +10772,7 @@
       <w:pPr>
         <w:pStyle w:val="Heading1"/>
       </w:pPr>
-      <w:bookmarkStart w:id="46" w:name="_Toc243842001"/>
+      <w:bookmarkStart w:id="46" w:name="_Toc244298309"/>
       <w:r>
         <w:lastRenderedPageBreak/>
         <w:t>Importing existing CAD</w:t>
@@ -10868,7 +10868,7 @@
       <w:pPr>
         <w:pStyle w:val="Heading1"/>
       </w:pPr>
-      <w:bookmarkStart w:id="47" w:name="_Toc243842002"/>
+      <w:bookmarkStart w:id="47" w:name="_Toc244298310"/>
       <w:r>
         <w:lastRenderedPageBreak/>
         <w:t>Working with SolidWorks</w:t>
@@ -10944,7 +10944,7 @@
       <w:pPr>
         <w:pStyle w:val="Heading2"/>
       </w:pPr>
-      <w:bookmarkStart w:id="48" w:name="_Toc243842003"/>
+      <w:bookmarkStart w:id="48" w:name="_Toc244298311"/>
       <w:r>
         <w:t>Configurations</w:t>
       </w:r>
@@ -11008,7 +11008,7 @@
       <w:pPr>
         <w:pStyle w:val="Heading2"/>
       </w:pPr>
-      <w:bookmarkStart w:id="49" w:name="_Toc243842004"/>
+      <w:bookmarkStart w:id="49" w:name="_Toc244298312"/>
       <w:r>
         <w:t>Templates</w:t>
       </w:r>
@@ -11286,7 +11286,7 @@
       <w:pPr>
         <w:pStyle w:val="Heading1"/>
       </w:pPr>
-      <w:bookmarkStart w:id="50" w:name="_Toc243842005"/>
+      <w:bookmarkStart w:id="50" w:name="_Toc244298313"/>
       <w:r>
         <w:lastRenderedPageBreak/>
         <w:t>How Litterbox works</w:t>
@@ -11302,7 +11302,7 @@
       <w:pPr>
         <w:pStyle w:val="Heading2"/>
       </w:pPr>
-      <w:bookmarkStart w:id="51" w:name="_Toc243842006"/>
+      <w:bookmarkStart w:id="51" w:name="_Toc244298314"/>
       <w:r>
         <w:t>The vault is a Git repository</w:t>
       </w:r>
@@ -11706,7 +11706,7 @@
       <w:pPr>
         <w:pStyle w:val="Heading2"/>
       </w:pPr>
-      <w:bookmarkStart w:id="52" w:name="_Toc243842007"/>
+      <w:bookmarkStart w:id="52" w:name="_Toc244298315"/>
       <w:r>
         <w:t>Locks, read-only files, and uploads</w:t>
       </w:r>
@@ -11807,7 +11807,7 @@
       <w:pPr>
         <w:pStyle w:val="Heading2"/>
       </w:pPr>
-      <w:bookmarkStart w:id="53" w:name="_Toc243842008"/>
+      <w:bookmarkStart w:id="53" w:name="_Toc244298316"/>
       <w:r>
         <w:t>Downloads</w:t>
       </w:r>
@@ -11831,7 +11831,7 @@
       <w:pPr>
         <w:pStyle w:val="Heading2"/>
       </w:pPr>
-      <w:bookmarkStart w:id="54" w:name="_Toc243842009"/>
+      <w:bookmarkStart w:id="54" w:name="_Toc244298317"/>
       <w:r>
         <w:t>The job queue</w:t>
       </w:r>
@@ -11980,7 +11980,7 @@
       <w:pPr>
         <w:pStyle w:val="Heading1"/>
       </w:pPr>
-      <w:bookmarkStart w:id="55" w:name="_Toc243842010"/>
+      <w:bookmarkStart w:id="55" w:name="_Toc244298318"/>
       <w:r>
         <w:lastRenderedPageBreak/>
         <w:t>Settings and troubleshooting</w:t>
@@ -11991,7 +11991,7 @@
       <w:pPr>
         <w:pStyle w:val="Heading2"/>
       </w:pPr>
-      <w:bookmarkStart w:id="56" w:name="_Toc243842011"/>
+      <w:bookmarkStart w:id="56" w:name="_Toc244298319"/>
       <w:r>
         <w:t>Your settings</w:t>
       </w:r>
@@ -12355,7 +12355,7 @@
       <w:pPr>
         <w:pStyle w:val="Heading2"/>
       </w:pPr>
-      <w:bookmarkStart w:id="57" w:name="_Toc243842012"/>
+      <w:bookmarkStart w:id="57" w:name="_Toc244298320"/>
       <w:r>
         <w:t>Problems</w:t>
       </w:r>
@@ -12472,7 +12472,7 @@
       <w:pPr>
         <w:pStyle w:val="Heading2"/>
       </w:pPr>
-      <w:bookmarkStart w:id="58" w:name="_Toc243842013"/>
+      <w:bookmarkStart w:id="58" w:name="_Toc244298321"/>
       <w:r>
         <w:lastRenderedPageBreak/>
         <w:t>The command line</w:t>
@@ -12513,7 +12513,7 @@
       <w:pPr>
         <w:pStyle w:val="Heading1"/>
       </w:pPr>
-      <w:bookmarkStart w:id="59" w:name="_Toc243842014"/>
+      <w:bookmarkStart w:id="59" w:name="_Toc244298322"/>
       <w:r>
         <w:lastRenderedPageBreak/>
         <w:t>Quick reference</w:t>
@@ -13179,100 +13179,100 @@
       </w:rPr>
     </w:lvl>
   </w:abstractNum>
-  <w:num w:numId="1" w16cid:durableId="286857652">
+  <w:num w:numId="1" w16cid:durableId="1830435962">
     <w:abstractNumId w:val="8"/>
   </w:num>
-  <w:num w:numId="2" w16cid:durableId="717821715">
+  <w:num w:numId="2" w16cid:durableId="695159786">
     <w:abstractNumId w:val="6"/>
   </w:num>
-  <w:num w:numId="3" w16cid:durableId="193345887">
+  <w:num w:numId="3" w16cid:durableId="1923222570">
     <w:abstractNumId w:val="5"/>
   </w:num>
-  <w:num w:numId="4" w16cid:durableId="1128473105">
+  <w:num w:numId="4" w16cid:durableId="188839508">
     <w:abstractNumId w:val="4"/>
   </w:num>
-  <w:num w:numId="5" w16cid:durableId="1633555688">
+  <w:num w:numId="5" w16cid:durableId="2084836599">
     <w:abstractNumId w:val="7"/>
   </w:num>
-  <w:num w:numId="6" w16cid:durableId="551380224">
+  <w:num w:numId="6" w16cid:durableId="540869314">
     <w:abstractNumId w:val="3"/>
   </w:num>
-  <w:num w:numId="7" w16cid:durableId="625697974">
+  <w:num w:numId="7" w16cid:durableId="2030377038">
     <w:abstractNumId w:val="2"/>
   </w:num>
-  <w:num w:numId="8" w16cid:durableId="1561357415">
+  <w:num w:numId="8" w16cid:durableId="2055107471">
     <w:abstractNumId w:val="1"/>
   </w:num>
-  <w:num w:numId="9" w16cid:durableId="424420307">
+  <w:num w:numId="9" w16cid:durableId="1573462261">
     <w:abstractNumId w:val="0"/>
   </w:num>
-  <w:num w:numId="10" w16cid:durableId="497960138">
+  <w:num w:numId="10" w16cid:durableId="1473017938">
     <w:abstractNumId w:val="7"/>
     <w:lvlOverride w:ilvl="0">
       <w:startOverride w:val="1"/>
     </w:lvlOverride>
   </w:num>
-  <w:num w:numId="11" w16cid:durableId="157431160">
+  <w:num w:numId="11" w16cid:durableId="120541536">
     <w:abstractNumId w:val="7"/>
     <w:lvlOverride w:ilvl="0">
       <w:startOverride w:val="1"/>
     </w:lvlOverride>
   </w:num>
-  <w:num w:numId="12" w16cid:durableId="672608510">
+  <w:num w:numId="12" w16cid:durableId="358429532">
     <w:abstractNumId w:val="7"/>
     <w:lvlOverride w:ilvl="0">
       <w:startOverride w:val="1"/>
     </w:lvlOverride>
   </w:num>
-  <w:num w:numId="13" w16cid:durableId="1017774753">
+  <w:num w:numId="13" w16cid:durableId="491214809">
     <w:abstractNumId w:val="7"/>
     <w:lvlOverride w:ilvl="0">
       <w:startOverride w:val="1"/>
     </w:lvlOverride>
   </w:num>
-  <w:num w:numId="14" w16cid:durableId="1611088033">
+  <w:num w:numId="14" w16cid:durableId="756439023">
     <w:abstractNumId w:val="7"/>
     <w:lvlOverride w:ilvl="0">
       <w:startOverride w:val="1"/>
     </w:lvlOverride>
   </w:num>
-  <w:num w:numId="15" w16cid:durableId="1135441819">
+  <w:num w:numId="15" w16cid:durableId="1592666162">
     <w:abstractNumId w:val="7"/>
     <w:lvlOverride w:ilvl="0">
       <w:startOverride w:val="1"/>
     </w:lvlOverride>
   </w:num>
-  <w:num w:numId="16" w16cid:durableId="1614365961">
+  <w:num w:numId="16" w16cid:durableId="205214450">
     <w:abstractNumId w:val="7"/>
     <w:lvlOverride w:ilvl="0">
       <w:startOverride w:val="1"/>
     </w:lvlOverride>
   </w:num>
-  <w:num w:numId="17" w16cid:durableId="640235266">
+  <w:num w:numId="17" w16cid:durableId="269435422">
     <w:abstractNumId w:val="7"/>
     <w:lvlOverride w:ilvl="0">
       <w:startOverride w:val="1"/>
     </w:lvlOverride>
   </w:num>
-  <w:num w:numId="18" w16cid:durableId="1598445597">
+  <w:num w:numId="18" w16cid:durableId="1912080334">
     <w:abstractNumId w:val="7"/>
     <w:lvlOverride w:ilvl="0">
       <w:startOverride w:val="1"/>
     </w:lvlOverride>
   </w:num>
-  <w:num w:numId="19" w16cid:durableId="1991254542">
+  <w:num w:numId="19" w16cid:durableId="1944342082">
     <w:abstractNumId w:val="7"/>
     <w:lvlOverride w:ilvl="0">
       <w:startOverride w:val="1"/>
     </w:lvlOverride>
   </w:num>
-  <w:num w:numId="20" w16cid:durableId="1205560011">
+  <w:num w:numId="20" w16cid:durableId="1175726775">
     <w:abstractNumId w:val="7"/>
     <w:lvlOverride w:ilvl="0">
       <w:startOverride w:val="1"/>
     </w:lvlOverride>
   </w:num>
-  <w:num w:numId="21" w16cid:durableId="1183475092">
+  <w:num w:numId="21" w16cid:durableId="623923980">
     <w:abstractNumId w:val="7"/>
     <w:lvlOverride w:ilvl="0">
       <w:startOverride w:val="1"/>
@@ -24642,7 +24642,7 @@
     <w:autoRedefine/>
     <w:uiPriority w:val="39"/>
     <w:unhideWhenUsed/>
-    <w:rsid w:val="00E93DF0"/>
+    <w:rsid w:val="008706AA"/>
     <w:pPr>
       <w:spacing w:after="100"/>
     </w:pPr>
@@ -24654,7 +24654,7 @@
     <w:autoRedefine/>
     <w:uiPriority w:val="39"/>
     <w:unhideWhenUsed/>
-    <w:rsid w:val="00E93DF0"/>
+    <w:rsid w:val="008706AA"/>
     <w:pPr>
       <w:spacing w:after="100"/>
       <w:ind w:left="210"/>
@@ -24665,7 +24665,7 @@
     <w:basedOn w:val="DefaultParagraphFont"/>
     <w:uiPriority w:val="99"/>
     <w:unhideWhenUsed/>
-    <w:rsid w:val="00E93DF0"/>
+    <w:rsid w:val="008706AA"/>
     <w:rPr>
       <w:color w:val="0000FF" w:themeColor="hyperlink"/>
       <w:u w:val="single"/>

</xml_diff>

<commit_message>
Update changelog n stuff
</commit_message>
<xml_diff>
--- a/docs/Litterbox_User_Guide.docx
+++ b/docs/Litterbox_User_Guide.docx
@@ -46,7 +46,7 @@
         <w:rPr>
           <w:color w:val="666666"/>
         </w:rPr>
-        <w:t>For Litterbox 1.0.3  ·  October 2026</w:t>
+        <w:t>For Litterbox 1.0.4  ·  October 2026</w:t>
       </w:r>
     </w:p>
     <w:p>
@@ -87,7 +87,7 @@
       <w:r>
         <w:fldChar w:fldCharType="separate"/>
       </w:r>
-      <w:hyperlink w:anchor="_Toc244298263" w:history="1">
+      <w:hyperlink w:anchor="_Toc244300229" w:history="1">
         <w:r>
           <w:rPr>
             <w:rStyle w:val="Hyperlink"/>
@@ -114,7 +114,7 @@
             <w:noProof/>
             <w:webHidden/>
           </w:rPr>
-          <w:instrText xml:space="preserve"> PAGEREF _Toc244298263 \h </w:instrText>
+          <w:instrText xml:space="preserve"> PAGEREF _Toc244300229 \h </w:instrText>
         </w:r>
         <w:r>
           <w:rPr>
@@ -155,7 +155,7 @@
           <w:noProof/>
         </w:rPr>
       </w:pPr>
-      <w:hyperlink w:anchor="_Toc244298264" w:history="1">
+      <w:hyperlink w:anchor="_Toc244300230" w:history="1">
         <w:r>
           <w:rPr>
             <w:rStyle w:val="Hyperlink"/>
@@ -182,7 +182,7 @@
             <w:noProof/>
             <w:webHidden/>
           </w:rPr>
-          <w:instrText xml:space="preserve"> PAGEREF _Toc244298264 \h </w:instrText>
+          <w:instrText xml:space="preserve"> PAGEREF _Toc244300230 \h </w:instrText>
         </w:r>
         <w:r>
           <w:rPr>
@@ -223,7 +223,7 @@
           <w:noProof/>
         </w:rPr>
       </w:pPr>
-      <w:hyperlink w:anchor="_Toc244298265" w:history="1">
+      <w:hyperlink w:anchor="_Toc244300231" w:history="1">
         <w:r>
           <w:rPr>
             <w:rStyle w:val="Hyperlink"/>
@@ -250,7 +250,7 @@
             <w:noProof/>
             <w:webHidden/>
           </w:rPr>
-          <w:instrText xml:space="preserve"> PAGEREF _Toc244298265 \h </w:instrText>
+          <w:instrText xml:space="preserve"> PAGEREF _Toc244300231 \h </w:instrText>
         </w:r>
         <w:r>
           <w:rPr>
@@ -291,7 +291,7 @@
           <w:noProof/>
         </w:rPr>
       </w:pPr>
-      <w:hyperlink w:anchor="_Toc244298266" w:history="1">
+      <w:hyperlink w:anchor="_Toc244300232" w:history="1">
         <w:r>
           <w:rPr>
             <w:rStyle w:val="Hyperlink"/>
@@ -318,7 +318,7 @@
             <w:noProof/>
             <w:webHidden/>
           </w:rPr>
-          <w:instrText xml:space="preserve"> PAGEREF _Toc244298266 \h </w:instrText>
+          <w:instrText xml:space="preserve"> PAGEREF _Toc244300232 \h </w:instrText>
         </w:r>
         <w:r>
           <w:rPr>
@@ -359,7 +359,7 @@
           <w:noProof/>
         </w:rPr>
       </w:pPr>
-      <w:hyperlink w:anchor="_Toc244298267" w:history="1">
+      <w:hyperlink w:anchor="_Toc244300233" w:history="1">
         <w:r>
           <w:rPr>
             <w:rStyle w:val="Hyperlink"/>
@@ -386,7 +386,7 @@
             <w:noProof/>
             <w:webHidden/>
           </w:rPr>
-          <w:instrText xml:space="preserve"> PAGEREF _Toc244298267 \h </w:instrText>
+          <w:instrText xml:space="preserve"> PAGEREF _Toc244300233 \h </w:instrText>
         </w:r>
         <w:r>
           <w:rPr>
@@ -427,7 +427,7 @@
           <w:noProof/>
         </w:rPr>
       </w:pPr>
-      <w:hyperlink w:anchor="_Toc244298268" w:history="1">
+      <w:hyperlink w:anchor="_Toc244300234" w:history="1">
         <w:r>
           <w:rPr>
             <w:rStyle w:val="Hyperlink"/>
@@ -454,7 +454,7 @@
             <w:noProof/>
             <w:webHidden/>
           </w:rPr>
-          <w:instrText xml:space="preserve"> PAGEREF _Toc244298268 \h </w:instrText>
+          <w:instrText xml:space="preserve"> PAGEREF _Toc244300234 \h </w:instrText>
         </w:r>
         <w:r>
           <w:rPr>
@@ -495,7 +495,7 @@
           <w:noProof/>
         </w:rPr>
       </w:pPr>
-      <w:hyperlink w:anchor="_Toc244298269" w:history="1">
+      <w:hyperlink w:anchor="_Toc244300235" w:history="1">
         <w:r>
           <w:rPr>
             <w:rStyle w:val="Hyperlink"/>
@@ -522,7 +522,7 @@
             <w:noProof/>
             <w:webHidden/>
           </w:rPr>
-          <w:instrText xml:space="preserve"> PAGEREF _Toc244298269 \h </w:instrText>
+          <w:instrText xml:space="preserve"> PAGEREF _Toc244300235 \h </w:instrText>
         </w:r>
         <w:r>
           <w:rPr>
@@ -563,7 +563,7 @@
           <w:noProof/>
         </w:rPr>
       </w:pPr>
-      <w:hyperlink w:anchor="_Toc244298270" w:history="1">
+      <w:hyperlink w:anchor="_Toc244300236" w:history="1">
         <w:r>
           <w:rPr>
             <w:rStyle w:val="Hyperlink"/>
@@ -590,7 +590,7 @@
             <w:noProof/>
             <w:webHidden/>
           </w:rPr>
-          <w:instrText xml:space="preserve"> PAGEREF _Toc244298270 \h </w:instrText>
+          <w:instrText xml:space="preserve"> PAGEREF _Toc244300236 \h </w:instrText>
         </w:r>
         <w:r>
           <w:rPr>
@@ -631,7 +631,7 @@
           <w:noProof/>
         </w:rPr>
       </w:pPr>
-      <w:hyperlink w:anchor="_Toc244298271" w:history="1">
+      <w:hyperlink w:anchor="_Toc244300237" w:history="1">
         <w:r>
           <w:rPr>
             <w:rStyle w:val="Hyperlink"/>
@@ -658,7 +658,7 @@
             <w:noProof/>
             <w:webHidden/>
           </w:rPr>
-          <w:instrText xml:space="preserve"> PAGEREF _Toc244298271 \h </w:instrText>
+          <w:instrText xml:space="preserve"> PAGEREF _Toc244300237 \h </w:instrText>
         </w:r>
         <w:r>
           <w:rPr>
@@ -699,7 +699,7 @@
           <w:noProof/>
         </w:rPr>
       </w:pPr>
-      <w:hyperlink w:anchor="_Toc244298272" w:history="1">
+      <w:hyperlink w:anchor="_Toc244300238" w:history="1">
         <w:r>
           <w:rPr>
             <w:rStyle w:val="Hyperlink"/>
@@ -726,7 +726,7 @@
             <w:noProof/>
             <w:webHidden/>
           </w:rPr>
-          <w:instrText xml:space="preserve"> PAGEREF _Toc244298272 \h </w:instrText>
+          <w:instrText xml:space="preserve"> PAGEREF _Toc244300238 \h </w:instrText>
         </w:r>
         <w:r>
           <w:rPr>
@@ -767,7 +767,7 @@
           <w:noProof/>
         </w:rPr>
       </w:pPr>
-      <w:hyperlink w:anchor="_Toc244298273" w:history="1">
+      <w:hyperlink w:anchor="_Toc244300239" w:history="1">
         <w:r>
           <w:rPr>
             <w:rStyle w:val="Hyperlink"/>
@@ -794,7 +794,7 @@
             <w:noProof/>
             <w:webHidden/>
           </w:rPr>
-          <w:instrText xml:space="preserve"> PAGEREF _Toc244298273 \h </w:instrText>
+          <w:instrText xml:space="preserve"> PAGEREF _Toc244300239 \h </w:instrText>
         </w:r>
         <w:r>
           <w:rPr>
@@ -835,7 +835,7 @@
           <w:noProof/>
         </w:rPr>
       </w:pPr>
-      <w:hyperlink w:anchor="_Toc244298274" w:history="1">
+      <w:hyperlink w:anchor="_Toc244300240" w:history="1">
         <w:r>
           <w:rPr>
             <w:rStyle w:val="Hyperlink"/>
@@ -862,7 +862,7 @@
             <w:noProof/>
             <w:webHidden/>
           </w:rPr>
-          <w:instrText xml:space="preserve"> PAGEREF _Toc244298274 \h </w:instrText>
+          <w:instrText xml:space="preserve"> PAGEREF _Toc244300240 \h </w:instrText>
         </w:r>
         <w:r>
           <w:rPr>
@@ -903,7 +903,7 @@
           <w:noProof/>
         </w:rPr>
       </w:pPr>
-      <w:hyperlink w:anchor="_Toc244298275" w:history="1">
+      <w:hyperlink w:anchor="_Toc244300241" w:history="1">
         <w:r>
           <w:rPr>
             <w:rStyle w:val="Hyperlink"/>
@@ -930,7 +930,7 @@
             <w:noProof/>
             <w:webHidden/>
           </w:rPr>
-          <w:instrText xml:space="preserve"> PAGEREF _Toc244298275 \h </w:instrText>
+          <w:instrText xml:space="preserve"> PAGEREF _Toc244300241 \h </w:instrText>
         </w:r>
         <w:r>
           <w:rPr>
@@ -971,7 +971,7 @@
           <w:noProof/>
         </w:rPr>
       </w:pPr>
-      <w:hyperlink w:anchor="_Toc244298276" w:history="1">
+      <w:hyperlink w:anchor="_Toc244300242" w:history="1">
         <w:r>
           <w:rPr>
             <w:rStyle w:val="Hyperlink"/>
@@ -998,7 +998,7 @@
             <w:noProof/>
             <w:webHidden/>
           </w:rPr>
-          <w:instrText xml:space="preserve"> PAGEREF _Toc244298276 \h </w:instrText>
+          <w:instrText xml:space="preserve"> PAGEREF _Toc244300242 \h </w:instrText>
         </w:r>
         <w:r>
           <w:rPr>
@@ -1039,7 +1039,7 @@
           <w:noProof/>
         </w:rPr>
       </w:pPr>
-      <w:hyperlink w:anchor="_Toc244298277" w:history="1">
+      <w:hyperlink w:anchor="_Toc244300243" w:history="1">
         <w:r>
           <w:rPr>
             <w:rStyle w:val="Hyperlink"/>
@@ -1066,7 +1066,7 @@
             <w:noProof/>
             <w:webHidden/>
           </w:rPr>
-          <w:instrText xml:space="preserve"> PAGEREF _Toc244298277 \h </w:instrText>
+          <w:instrText xml:space="preserve"> PAGEREF _Toc244300243 \h </w:instrText>
         </w:r>
         <w:r>
           <w:rPr>
@@ -1107,7 +1107,7 @@
           <w:noProof/>
         </w:rPr>
       </w:pPr>
-      <w:hyperlink w:anchor="_Toc244298278" w:history="1">
+      <w:hyperlink w:anchor="_Toc244300244" w:history="1">
         <w:r>
           <w:rPr>
             <w:rStyle w:val="Hyperlink"/>
@@ -1134,7 +1134,7 @@
             <w:noProof/>
             <w:webHidden/>
           </w:rPr>
-          <w:instrText xml:space="preserve"> PAGEREF _Toc244298278 \h </w:instrText>
+          <w:instrText xml:space="preserve"> PAGEREF _Toc244300244 \h </w:instrText>
         </w:r>
         <w:r>
           <w:rPr>
@@ -1175,7 +1175,7 @@
           <w:noProof/>
         </w:rPr>
       </w:pPr>
-      <w:hyperlink w:anchor="_Toc244298279" w:history="1">
+      <w:hyperlink w:anchor="_Toc244300245" w:history="1">
         <w:r>
           <w:rPr>
             <w:rStyle w:val="Hyperlink"/>
@@ -1202,7 +1202,7 @@
             <w:noProof/>
             <w:webHidden/>
           </w:rPr>
-          <w:instrText xml:space="preserve"> PAGEREF _Toc244298279 \h </w:instrText>
+          <w:instrText xml:space="preserve"> PAGEREF _Toc244300245 \h </w:instrText>
         </w:r>
         <w:r>
           <w:rPr>
@@ -1243,7 +1243,7 @@
           <w:noProof/>
         </w:rPr>
       </w:pPr>
-      <w:hyperlink w:anchor="_Toc244298280" w:history="1">
+      <w:hyperlink w:anchor="_Toc244300246" w:history="1">
         <w:r>
           <w:rPr>
             <w:rStyle w:val="Hyperlink"/>
@@ -1270,7 +1270,7 @@
             <w:noProof/>
             <w:webHidden/>
           </w:rPr>
-          <w:instrText xml:space="preserve"> PAGEREF _Toc244298280 \h </w:instrText>
+          <w:instrText xml:space="preserve"> PAGEREF _Toc244300246 \h </w:instrText>
         </w:r>
         <w:r>
           <w:rPr>
@@ -1311,7 +1311,7 @@
           <w:noProof/>
         </w:rPr>
       </w:pPr>
-      <w:hyperlink w:anchor="_Toc244298281" w:history="1">
+      <w:hyperlink w:anchor="_Toc244300247" w:history="1">
         <w:r>
           <w:rPr>
             <w:rStyle w:val="Hyperlink"/>
@@ -1338,7 +1338,7 @@
             <w:noProof/>
             <w:webHidden/>
           </w:rPr>
-          <w:instrText xml:space="preserve"> PAGEREF _Toc244298281 \h </w:instrText>
+          <w:instrText xml:space="preserve"> PAGEREF _Toc244300247 \h </w:instrText>
         </w:r>
         <w:r>
           <w:rPr>
@@ -1379,7 +1379,7 @@
           <w:noProof/>
         </w:rPr>
       </w:pPr>
-      <w:hyperlink w:anchor="_Toc244298282" w:history="1">
+      <w:hyperlink w:anchor="_Toc244300248" w:history="1">
         <w:r>
           <w:rPr>
             <w:rStyle w:val="Hyperlink"/>
@@ -1406,7 +1406,7 @@
             <w:noProof/>
             <w:webHidden/>
           </w:rPr>
-          <w:instrText xml:space="preserve"> PAGEREF _Toc244298282 \h </w:instrText>
+          <w:instrText xml:space="preserve"> PAGEREF _Toc244300248 \h </w:instrText>
         </w:r>
         <w:r>
           <w:rPr>
@@ -1447,7 +1447,7 @@
           <w:noProof/>
         </w:rPr>
       </w:pPr>
-      <w:hyperlink w:anchor="_Toc244298283" w:history="1">
+      <w:hyperlink w:anchor="_Toc244300249" w:history="1">
         <w:r>
           <w:rPr>
             <w:rStyle w:val="Hyperlink"/>
@@ -1474,7 +1474,7 @@
             <w:noProof/>
             <w:webHidden/>
           </w:rPr>
-          <w:instrText xml:space="preserve"> PAGEREF _Toc244298283 \h </w:instrText>
+          <w:instrText xml:space="preserve"> PAGEREF _Toc244300249 \h </w:instrText>
         </w:r>
         <w:r>
           <w:rPr>
@@ -1515,7 +1515,7 @@
           <w:noProof/>
         </w:rPr>
       </w:pPr>
-      <w:hyperlink w:anchor="_Toc244298284" w:history="1">
+      <w:hyperlink w:anchor="_Toc244300250" w:history="1">
         <w:r>
           <w:rPr>
             <w:rStyle w:val="Hyperlink"/>
@@ -1542,7 +1542,7 @@
             <w:noProof/>
             <w:webHidden/>
           </w:rPr>
-          <w:instrText xml:space="preserve"> PAGEREF _Toc244298284 \h </w:instrText>
+          <w:instrText xml:space="preserve"> PAGEREF _Toc244300250 \h </w:instrText>
         </w:r>
         <w:r>
           <w:rPr>
@@ -1583,7 +1583,7 @@
           <w:noProof/>
         </w:rPr>
       </w:pPr>
-      <w:hyperlink w:anchor="_Toc244298285" w:history="1">
+      <w:hyperlink w:anchor="_Toc244300251" w:history="1">
         <w:r>
           <w:rPr>
             <w:rStyle w:val="Hyperlink"/>
@@ -1610,7 +1610,7 @@
             <w:noProof/>
             <w:webHidden/>
           </w:rPr>
-          <w:instrText xml:space="preserve"> PAGEREF _Toc244298285 \h </w:instrText>
+          <w:instrText xml:space="preserve"> PAGEREF _Toc244300251 \h </w:instrText>
         </w:r>
         <w:r>
           <w:rPr>
@@ -1651,7 +1651,7 @@
           <w:noProof/>
         </w:rPr>
       </w:pPr>
-      <w:hyperlink w:anchor="_Toc244298286" w:history="1">
+      <w:hyperlink w:anchor="_Toc244300252" w:history="1">
         <w:r>
           <w:rPr>
             <w:rStyle w:val="Hyperlink"/>
@@ -1678,7 +1678,7 @@
             <w:noProof/>
             <w:webHidden/>
           </w:rPr>
-          <w:instrText xml:space="preserve"> PAGEREF _Toc244298286 \h </w:instrText>
+          <w:instrText xml:space="preserve"> PAGEREF _Toc244300252 \h </w:instrText>
         </w:r>
         <w:r>
           <w:rPr>
@@ -1719,7 +1719,7 @@
           <w:noProof/>
         </w:rPr>
       </w:pPr>
-      <w:hyperlink w:anchor="_Toc244298287" w:history="1">
+      <w:hyperlink w:anchor="_Toc244300253" w:history="1">
         <w:r>
           <w:rPr>
             <w:rStyle w:val="Hyperlink"/>
@@ -1746,7 +1746,7 @@
             <w:noProof/>
             <w:webHidden/>
           </w:rPr>
-          <w:instrText xml:space="preserve"> PAGEREF _Toc244298287 \h </w:instrText>
+          <w:instrText xml:space="preserve"> PAGEREF _Toc244300253 \h </w:instrText>
         </w:r>
         <w:r>
           <w:rPr>
@@ -1787,7 +1787,7 @@
           <w:noProof/>
         </w:rPr>
       </w:pPr>
-      <w:hyperlink w:anchor="_Toc244298288" w:history="1">
+      <w:hyperlink w:anchor="_Toc244300254" w:history="1">
         <w:r>
           <w:rPr>
             <w:rStyle w:val="Hyperlink"/>
@@ -1814,7 +1814,7 @@
             <w:noProof/>
             <w:webHidden/>
           </w:rPr>
-          <w:instrText xml:space="preserve"> PAGEREF _Toc244298288 \h </w:instrText>
+          <w:instrText xml:space="preserve"> PAGEREF _Toc244300254 \h </w:instrText>
         </w:r>
         <w:r>
           <w:rPr>
@@ -1855,7 +1855,7 @@
           <w:noProof/>
         </w:rPr>
       </w:pPr>
-      <w:hyperlink w:anchor="_Toc244298289" w:history="1">
+      <w:hyperlink w:anchor="_Toc244300255" w:history="1">
         <w:r>
           <w:rPr>
             <w:rStyle w:val="Hyperlink"/>
@@ -1882,7 +1882,7 @@
             <w:noProof/>
             <w:webHidden/>
           </w:rPr>
-          <w:instrText xml:space="preserve"> PAGEREF _Toc244298289 \h </w:instrText>
+          <w:instrText xml:space="preserve"> PAGEREF _Toc244300255 \h </w:instrText>
         </w:r>
         <w:r>
           <w:rPr>
@@ -1923,7 +1923,7 @@
           <w:noProof/>
         </w:rPr>
       </w:pPr>
-      <w:hyperlink w:anchor="_Toc244298290" w:history="1">
+      <w:hyperlink w:anchor="_Toc244300256" w:history="1">
         <w:r>
           <w:rPr>
             <w:rStyle w:val="Hyperlink"/>
@@ -1950,7 +1950,7 @@
             <w:noProof/>
             <w:webHidden/>
           </w:rPr>
-          <w:instrText xml:space="preserve"> PAGEREF _Toc244298290 \h </w:instrText>
+          <w:instrText xml:space="preserve"> PAGEREF _Toc244300256 \h </w:instrText>
         </w:r>
         <w:r>
           <w:rPr>
@@ -1991,7 +1991,7 @@
           <w:noProof/>
         </w:rPr>
       </w:pPr>
-      <w:hyperlink w:anchor="_Toc244298291" w:history="1">
+      <w:hyperlink w:anchor="_Toc244300257" w:history="1">
         <w:r>
           <w:rPr>
             <w:rStyle w:val="Hyperlink"/>
@@ -2018,7 +2018,7 @@
             <w:noProof/>
             <w:webHidden/>
           </w:rPr>
-          <w:instrText xml:space="preserve"> PAGEREF _Toc244298291 \h </w:instrText>
+          <w:instrText xml:space="preserve"> PAGEREF _Toc244300257 \h </w:instrText>
         </w:r>
         <w:r>
           <w:rPr>
@@ -2059,7 +2059,7 @@
           <w:noProof/>
         </w:rPr>
       </w:pPr>
-      <w:hyperlink w:anchor="_Toc244298292" w:history="1">
+      <w:hyperlink w:anchor="_Toc244300258" w:history="1">
         <w:r>
           <w:rPr>
             <w:rStyle w:val="Hyperlink"/>
@@ -2086,7 +2086,7 @@
             <w:noProof/>
             <w:webHidden/>
           </w:rPr>
-          <w:instrText xml:space="preserve"> PAGEREF _Toc244298292 \h </w:instrText>
+          <w:instrText xml:space="preserve"> PAGEREF _Toc244300258 \h </w:instrText>
         </w:r>
         <w:r>
           <w:rPr>
@@ -2127,7 +2127,7 @@
           <w:noProof/>
         </w:rPr>
       </w:pPr>
-      <w:hyperlink w:anchor="_Toc244298293" w:history="1">
+      <w:hyperlink w:anchor="_Toc244300259" w:history="1">
         <w:r>
           <w:rPr>
             <w:rStyle w:val="Hyperlink"/>
@@ -2154,7 +2154,7 @@
             <w:noProof/>
             <w:webHidden/>
           </w:rPr>
-          <w:instrText xml:space="preserve"> PAGEREF _Toc244298293 \h </w:instrText>
+          <w:instrText xml:space="preserve"> PAGEREF _Toc244300259 \h </w:instrText>
         </w:r>
         <w:r>
           <w:rPr>
@@ -2195,7 +2195,7 @@
           <w:noProof/>
         </w:rPr>
       </w:pPr>
-      <w:hyperlink w:anchor="_Toc244298294" w:history="1">
+      <w:hyperlink w:anchor="_Toc244300260" w:history="1">
         <w:r>
           <w:rPr>
             <w:rStyle w:val="Hyperlink"/>
@@ -2222,7 +2222,7 @@
             <w:noProof/>
             <w:webHidden/>
           </w:rPr>
-          <w:instrText xml:space="preserve"> PAGEREF _Toc244298294 \h </w:instrText>
+          <w:instrText xml:space="preserve"> PAGEREF _Toc244300260 \h </w:instrText>
         </w:r>
         <w:r>
           <w:rPr>
@@ -2263,7 +2263,7 @@
           <w:noProof/>
         </w:rPr>
       </w:pPr>
-      <w:hyperlink w:anchor="_Toc244298295" w:history="1">
+      <w:hyperlink w:anchor="_Toc244300261" w:history="1">
         <w:r>
           <w:rPr>
             <w:rStyle w:val="Hyperlink"/>
@@ -2290,7 +2290,7 @@
             <w:noProof/>
             <w:webHidden/>
           </w:rPr>
-          <w:instrText xml:space="preserve"> PAGEREF _Toc244298295 \h </w:instrText>
+          <w:instrText xml:space="preserve"> PAGEREF _Toc244300261 \h </w:instrText>
         </w:r>
         <w:r>
           <w:rPr>
@@ -2331,7 +2331,7 @@
           <w:noProof/>
         </w:rPr>
       </w:pPr>
-      <w:hyperlink w:anchor="_Toc244298296" w:history="1">
+      <w:hyperlink w:anchor="_Toc244300262" w:history="1">
         <w:r>
           <w:rPr>
             <w:rStyle w:val="Hyperlink"/>
@@ -2358,7 +2358,7 @@
             <w:noProof/>
             <w:webHidden/>
           </w:rPr>
-          <w:instrText xml:space="preserve"> PAGEREF _Toc244298296 \h </w:instrText>
+          <w:instrText xml:space="preserve"> PAGEREF _Toc244300262 \h </w:instrText>
         </w:r>
         <w:r>
           <w:rPr>
@@ -2399,7 +2399,7 @@
           <w:noProof/>
         </w:rPr>
       </w:pPr>
-      <w:hyperlink w:anchor="_Toc244298297" w:history="1">
+      <w:hyperlink w:anchor="_Toc244300263" w:history="1">
         <w:r>
           <w:rPr>
             <w:rStyle w:val="Hyperlink"/>
@@ -2426,7 +2426,7 @@
             <w:noProof/>
             <w:webHidden/>
           </w:rPr>
-          <w:instrText xml:space="preserve"> PAGEREF _Toc244298297 \h </w:instrText>
+          <w:instrText xml:space="preserve"> PAGEREF _Toc244300263 \h </w:instrText>
         </w:r>
         <w:r>
           <w:rPr>
@@ -2467,7 +2467,7 @@
           <w:noProof/>
         </w:rPr>
       </w:pPr>
-      <w:hyperlink w:anchor="_Toc244298298" w:history="1">
+      <w:hyperlink w:anchor="_Toc244300264" w:history="1">
         <w:r>
           <w:rPr>
             <w:rStyle w:val="Hyperlink"/>
@@ -2494,7 +2494,7 @@
             <w:noProof/>
             <w:webHidden/>
           </w:rPr>
-          <w:instrText xml:space="preserve"> PAGEREF _Toc244298298 \h </w:instrText>
+          <w:instrText xml:space="preserve"> PAGEREF _Toc244300264 \h </w:instrText>
         </w:r>
         <w:r>
           <w:rPr>
@@ -2535,7 +2535,7 @@
           <w:noProof/>
         </w:rPr>
       </w:pPr>
-      <w:hyperlink w:anchor="_Toc244298299" w:history="1">
+      <w:hyperlink w:anchor="_Toc244300265" w:history="1">
         <w:r>
           <w:rPr>
             <w:rStyle w:val="Hyperlink"/>
@@ -2562,7 +2562,7 @@
             <w:noProof/>
             <w:webHidden/>
           </w:rPr>
-          <w:instrText xml:space="preserve"> PAGEREF _Toc244298299 \h </w:instrText>
+          <w:instrText xml:space="preserve"> PAGEREF _Toc244300265 \h </w:instrText>
         </w:r>
         <w:r>
           <w:rPr>
@@ -2603,7 +2603,7 @@
           <w:noProof/>
         </w:rPr>
       </w:pPr>
-      <w:hyperlink w:anchor="_Toc244298300" w:history="1">
+      <w:hyperlink w:anchor="_Toc244300266" w:history="1">
         <w:r>
           <w:rPr>
             <w:rStyle w:val="Hyperlink"/>
@@ -2630,7 +2630,7 @@
             <w:noProof/>
             <w:webHidden/>
           </w:rPr>
-          <w:instrText xml:space="preserve"> PAGEREF _Toc244298300 \h </w:instrText>
+          <w:instrText xml:space="preserve"> PAGEREF _Toc244300266 \h </w:instrText>
         </w:r>
         <w:r>
           <w:rPr>
@@ -2671,7 +2671,7 @@
           <w:noProof/>
         </w:rPr>
       </w:pPr>
-      <w:hyperlink w:anchor="_Toc244298301" w:history="1">
+      <w:hyperlink w:anchor="_Toc244300267" w:history="1">
         <w:r>
           <w:rPr>
             <w:rStyle w:val="Hyperlink"/>
@@ -2698,7 +2698,7 @@
             <w:noProof/>
             <w:webHidden/>
           </w:rPr>
-          <w:instrText xml:space="preserve"> PAGEREF _Toc244298301 \h </w:instrText>
+          <w:instrText xml:space="preserve"> PAGEREF _Toc244300267 \h </w:instrText>
         </w:r>
         <w:r>
           <w:rPr>
@@ -2739,7 +2739,7 @@
           <w:noProof/>
         </w:rPr>
       </w:pPr>
-      <w:hyperlink w:anchor="_Toc244298302" w:history="1">
+      <w:hyperlink w:anchor="_Toc244300268" w:history="1">
         <w:r>
           <w:rPr>
             <w:rStyle w:val="Hyperlink"/>
@@ -2766,7 +2766,7 @@
             <w:noProof/>
             <w:webHidden/>
           </w:rPr>
-          <w:instrText xml:space="preserve"> PAGEREF _Toc244298302 \h </w:instrText>
+          <w:instrText xml:space="preserve"> PAGEREF _Toc244300268 \h </w:instrText>
         </w:r>
         <w:r>
           <w:rPr>
@@ -2807,7 +2807,7 @@
           <w:noProof/>
         </w:rPr>
       </w:pPr>
-      <w:hyperlink w:anchor="_Toc244298303" w:history="1">
+      <w:hyperlink w:anchor="_Toc244300269" w:history="1">
         <w:r>
           <w:rPr>
             <w:rStyle w:val="Hyperlink"/>
@@ -2834,7 +2834,7 @@
             <w:noProof/>
             <w:webHidden/>
           </w:rPr>
-          <w:instrText xml:space="preserve"> PAGEREF _Toc244298303 \h </w:instrText>
+          <w:instrText xml:space="preserve"> PAGEREF _Toc244300269 \h </w:instrText>
         </w:r>
         <w:r>
           <w:rPr>
@@ -2875,7 +2875,7 @@
           <w:noProof/>
         </w:rPr>
       </w:pPr>
-      <w:hyperlink w:anchor="_Toc244298304" w:history="1">
+      <w:hyperlink w:anchor="_Toc244300270" w:history="1">
         <w:r>
           <w:rPr>
             <w:rStyle w:val="Hyperlink"/>
@@ -2902,7 +2902,7 @@
             <w:noProof/>
             <w:webHidden/>
           </w:rPr>
-          <w:instrText xml:space="preserve"> PAGEREF _Toc244298304 \h </w:instrText>
+          <w:instrText xml:space="preserve"> PAGEREF _Toc244300270 \h </w:instrText>
         </w:r>
         <w:r>
           <w:rPr>
@@ -2943,7 +2943,7 @@
           <w:noProof/>
         </w:rPr>
       </w:pPr>
-      <w:hyperlink w:anchor="_Toc244298305" w:history="1">
+      <w:hyperlink w:anchor="_Toc244300271" w:history="1">
         <w:r>
           <w:rPr>
             <w:rStyle w:val="Hyperlink"/>
@@ -2970,7 +2970,7 @@
             <w:noProof/>
             <w:webHidden/>
           </w:rPr>
-          <w:instrText xml:space="preserve"> PAGEREF _Toc244298305 \h </w:instrText>
+          <w:instrText xml:space="preserve"> PAGEREF _Toc244300271 \h </w:instrText>
         </w:r>
         <w:r>
           <w:rPr>
@@ -3011,7 +3011,7 @@
           <w:noProof/>
         </w:rPr>
       </w:pPr>
-      <w:hyperlink w:anchor="_Toc244298306" w:history="1">
+      <w:hyperlink w:anchor="_Toc244300272" w:history="1">
         <w:r>
           <w:rPr>
             <w:rStyle w:val="Hyperlink"/>
@@ -3038,7 +3038,7 @@
             <w:noProof/>
             <w:webHidden/>
           </w:rPr>
-          <w:instrText xml:space="preserve"> PAGEREF _Toc244298306 \h </w:instrText>
+          <w:instrText xml:space="preserve"> PAGEREF _Toc244300272 \h </w:instrText>
         </w:r>
         <w:r>
           <w:rPr>
@@ -3079,7 +3079,7 @@
           <w:noProof/>
         </w:rPr>
       </w:pPr>
-      <w:hyperlink w:anchor="_Toc244298307" w:history="1">
+      <w:hyperlink w:anchor="_Toc244300273" w:history="1">
         <w:r>
           <w:rPr>
             <w:rStyle w:val="Hyperlink"/>
@@ -3106,7 +3106,7 @@
             <w:noProof/>
             <w:webHidden/>
           </w:rPr>
-          <w:instrText xml:space="preserve"> PAGEREF _Toc244298307 \h </w:instrText>
+          <w:instrText xml:space="preserve"> PAGEREF _Toc244300273 \h </w:instrText>
         </w:r>
         <w:r>
           <w:rPr>
@@ -3147,7 +3147,7 @@
           <w:noProof/>
         </w:rPr>
       </w:pPr>
-      <w:hyperlink w:anchor="_Toc244298308" w:history="1">
+      <w:hyperlink w:anchor="_Toc244300274" w:history="1">
         <w:r>
           <w:rPr>
             <w:rStyle w:val="Hyperlink"/>
@@ -3174,7 +3174,7 @@
             <w:noProof/>
             <w:webHidden/>
           </w:rPr>
-          <w:instrText xml:space="preserve"> PAGEREF _Toc244298308 \h </w:instrText>
+          <w:instrText xml:space="preserve"> PAGEREF _Toc244300274 \h </w:instrText>
         </w:r>
         <w:r>
           <w:rPr>
@@ -3215,7 +3215,7 @@
           <w:noProof/>
         </w:rPr>
       </w:pPr>
-      <w:hyperlink w:anchor="_Toc244298309" w:history="1">
+      <w:hyperlink w:anchor="_Toc244300275" w:history="1">
         <w:r>
           <w:rPr>
             <w:rStyle w:val="Hyperlink"/>
@@ -3242,7 +3242,7 @@
             <w:noProof/>
             <w:webHidden/>
           </w:rPr>
-          <w:instrText xml:space="preserve"> PAGEREF _Toc244298309 \h </w:instrText>
+          <w:instrText xml:space="preserve"> PAGEREF _Toc244300275 \h </w:instrText>
         </w:r>
         <w:r>
           <w:rPr>
@@ -3283,7 +3283,7 @@
           <w:noProof/>
         </w:rPr>
       </w:pPr>
-      <w:hyperlink w:anchor="_Toc244298310" w:history="1">
+      <w:hyperlink w:anchor="_Toc244300276" w:history="1">
         <w:r>
           <w:rPr>
             <w:rStyle w:val="Hyperlink"/>
@@ -3310,7 +3310,7 @@
             <w:noProof/>
             <w:webHidden/>
           </w:rPr>
-          <w:instrText xml:space="preserve"> PAGEREF _Toc244298310 \h </w:instrText>
+          <w:instrText xml:space="preserve"> PAGEREF _Toc244300276 \h </w:instrText>
         </w:r>
         <w:r>
           <w:rPr>
@@ -3351,7 +3351,7 @@
           <w:noProof/>
         </w:rPr>
       </w:pPr>
-      <w:hyperlink w:anchor="_Toc244298311" w:history="1">
+      <w:hyperlink w:anchor="_Toc244300277" w:history="1">
         <w:r>
           <w:rPr>
             <w:rStyle w:val="Hyperlink"/>
@@ -3378,7 +3378,7 @@
             <w:noProof/>
             <w:webHidden/>
           </w:rPr>
-          <w:instrText xml:space="preserve"> PAGEREF _Toc244298311 \h </w:instrText>
+          <w:instrText xml:space="preserve"> PAGEREF _Toc244300277 \h </w:instrText>
         </w:r>
         <w:r>
           <w:rPr>
@@ -3419,7 +3419,7 @@
           <w:noProof/>
         </w:rPr>
       </w:pPr>
-      <w:hyperlink w:anchor="_Toc244298312" w:history="1">
+      <w:hyperlink w:anchor="_Toc244300278" w:history="1">
         <w:r>
           <w:rPr>
             <w:rStyle w:val="Hyperlink"/>
@@ -3446,7 +3446,7 @@
             <w:noProof/>
             <w:webHidden/>
           </w:rPr>
-          <w:instrText xml:space="preserve"> PAGEREF _Toc244298312 \h </w:instrText>
+          <w:instrText xml:space="preserve"> PAGEREF _Toc244300278 \h </w:instrText>
         </w:r>
         <w:r>
           <w:rPr>
@@ -3487,7 +3487,7 @@
           <w:noProof/>
         </w:rPr>
       </w:pPr>
-      <w:hyperlink w:anchor="_Toc244298313" w:history="1">
+      <w:hyperlink w:anchor="_Toc244300279" w:history="1">
         <w:r>
           <w:rPr>
             <w:rStyle w:val="Hyperlink"/>
@@ -3514,7 +3514,7 @@
             <w:noProof/>
             <w:webHidden/>
           </w:rPr>
-          <w:instrText xml:space="preserve"> PAGEREF _Toc244298313 \h </w:instrText>
+          <w:instrText xml:space="preserve"> PAGEREF _Toc244300279 \h </w:instrText>
         </w:r>
         <w:r>
           <w:rPr>
@@ -3555,7 +3555,7 @@
           <w:noProof/>
         </w:rPr>
       </w:pPr>
-      <w:hyperlink w:anchor="_Toc244298314" w:history="1">
+      <w:hyperlink w:anchor="_Toc244300280" w:history="1">
         <w:r>
           <w:rPr>
             <w:rStyle w:val="Hyperlink"/>
@@ -3582,7 +3582,7 @@
             <w:noProof/>
             <w:webHidden/>
           </w:rPr>
-          <w:instrText xml:space="preserve"> PAGEREF _Toc244298314 \h </w:instrText>
+          <w:instrText xml:space="preserve"> PAGEREF _Toc244300280 \h </w:instrText>
         </w:r>
         <w:r>
           <w:rPr>
@@ -3623,7 +3623,7 @@
           <w:noProof/>
         </w:rPr>
       </w:pPr>
-      <w:hyperlink w:anchor="_Toc244298315" w:history="1">
+      <w:hyperlink w:anchor="_Toc244300281" w:history="1">
         <w:r>
           <w:rPr>
             <w:rStyle w:val="Hyperlink"/>
@@ -3650,7 +3650,7 @@
             <w:noProof/>
             <w:webHidden/>
           </w:rPr>
-          <w:instrText xml:space="preserve"> PAGEREF _Toc244298315 \h </w:instrText>
+          <w:instrText xml:space="preserve"> PAGEREF _Toc244300281 \h </w:instrText>
         </w:r>
         <w:r>
           <w:rPr>
@@ -3691,7 +3691,7 @@
           <w:noProof/>
         </w:rPr>
       </w:pPr>
-      <w:hyperlink w:anchor="_Toc244298316" w:history="1">
+      <w:hyperlink w:anchor="_Toc244300282" w:history="1">
         <w:r>
           <w:rPr>
             <w:rStyle w:val="Hyperlink"/>
@@ -3718,7 +3718,7 @@
             <w:noProof/>
             <w:webHidden/>
           </w:rPr>
-          <w:instrText xml:space="preserve"> PAGEREF _Toc244298316 \h </w:instrText>
+          <w:instrText xml:space="preserve"> PAGEREF _Toc244300282 \h </w:instrText>
         </w:r>
         <w:r>
           <w:rPr>
@@ -3759,7 +3759,7 @@
           <w:noProof/>
         </w:rPr>
       </w:pPr>
-      <w:hyperlink w:anchor="_Toc244298317" w:history="1">
+      <w:hyperlink w:anchor="_Toc244300283" w:history="1">
         <w:r>
           <w:rPr>
             <w:rStyle w:val="Hyperlink"/>
@@ -3786,7 +3786,7 @@
             <w:noProof/>
             <w:webHidden/>
           </w:rPr>
-          <w:instrText xml:space="preserve"> PAGEREF _Toc244298317 \h </w:instrText>
+          <w:instrText xml:space="preserve"> PAGEREF _Toc244300283 \h </w:instrText>
         </w:r>
         <w:r>
           <w:rPr>
@@ -3827,7 +3827,7 @@
           <w:noProof/>
         </w:rPr>
       </w:pPr>
-      <w:hyperlink w:anchor="_Toc244298318" w:history="1">
+      <w:hyperlink w:anchor="_Toc244300284" w:history="1">
         <w:r>
           <w:rPr>
             <w:rStyle w:val="Hyperlink"/>
@@ -3854,7 +3854,7 @@
             <w:noProof/>
             <w:webHidden/>
           </w:rPr>
-          <w:instrText xml:space="preserve"> PAGEREF _Toc244298318 \h </w:instrText>
+          <w:instrText xml:space="preserve"> PAGEREF _Toc244300284 \h </w:instrText>
         </w:r>
         <w:r>
           <w:rPr>
@@ -3895,7 +3895,7 @@
           <w:noProof/>
         </w:rPr>
       </w:pPr>
-      <w:hyperlink w:anchor="_Toc244298319" w:history="1">
+      <w:hyperlink w:anchor="_Toc244300285" w:history="1">
         <w:r>
           <w:rPr>
             <w:rStyle w:val="Hyperlink"/>
@@ -3922,7 +3922,7 @@
             <w:noProof/>
             <w:webHidden/>
           </w:rPr>
-          <w:instrText xml:space="preserve"> PAGEREF _Toc244298319 \h </w:instrText>
+          <w:instrText xml:space="preserve"> PAGEREF _Toc244300285 \h </w:instrText>
         </w:r>
         <w:r>
           <w:rPr>
@@ -3963,7 +3963,7 @@
           <w:noProof/>
         </w:rPr>
       </w:pPr>
-      <w:hyperlink w:anchor="_Toc244298320" w:history="1">
+      <w:hyperlink w:anchor="_Toc244300286" w:history="1">
         <w:r>
           <w:rPr>
             <w:rStyle w:val="Hyperlink"/>
@@ -3990,7 +3990,7 @@
             <w:noProof/>
             <w:webHidden/>
           </w:rPr>
-          <w:instrText xml:space="preserve"> PAGEREF _Toc244298320 \h </w:instrText>
+          <w:instrText xml:space="preserve"> PAGEREF _Toc244300286 \h </w:instrText>
         </w:r>
         <w:r>
           <w:rPr>
@@ -4031,7 +4031,7 @@
           <w:noProof/>
         </w:rPr>
       </w:pPr>
-      <w:hyperlink w:anchor="_Toc244298321" w:history="1">
+      <w:hyperlink w:anchor="_Toc244300287" w:history="1">
         <w:r>
           <w:rPr>
             <w:rStyle w:val="Hyperlink"/>
@@ -4058,7 +4058,7 @@
             <w:noProof/>
             <w:webHidden/>
           </w:rPr>
-          <w:instrText xml:space="preserve"> PAGEREF _Toc244298321 \h </w:instrText>
+          <w:instrText xml:space="preserve"> PAGEREF _Toc244300287 \h </w:instrText>
         </w:r>
         <w:r>
           <w:rPr>
@@ -4099,7 +4099,7 @@
           <w:noProof/>
         </w:rPr>
       </w:pPr>
-      <w:hyperlink w:anchor="_Toc244298322" w:history="1">
+      <w:hyperlink w:anchor="_Toc244300288" w:history="1">
         <w:r>
           <w:rPr>
             <w:rStyle w:val="Hyperlink"/>
@@ -4126,7 +4126,7 @@
             <w:noProof/>
             <w:webHidden/>
           </w:rPr>
-          <w:instrText xml:space="preserve"> PAGEREF _Toc244298322 \h </w:instrText>
+          <w:instrText xml:space="preserve"> PAGEREF _Toc244300288 \h </w:instrText>
         </w:r>
         <w:r>
           <w:rPr>
@@ -4171,7 +4171,7 @@
       <w:pPr>
         <w:pStyle w:val="Heading1"/>
       </w:pPr>
-      <w:bookmarkStart w:id="0" w:name="_Toc244298263"/>
+      <w:bookmarkStart w:id="0" w:name="_Toc244300229"/>
       <w:r>
         <w:lastRenderedPageBreak/>
         <w:t>Foreword</w:t>
@@ -4205,7 +4205,7 @@
       <w:pPr>
         <w:pStyle w:val="Heading1"/>
       </w:pPr>
-      <w:bookmarkStart w:id="1" w:name="_Toc244298264"/>
+      <w:bookmarkStart w:id="1" w:name="_Toc244300230"/>
       <w:r>
         <w:lastRenderedPageBreak/>
         <w:t>What Litterbox is</w:t>
@@ -4301,7 +4301,7 @@
       <w:pPr>
         <w:pStyle w:val="Heading2"/>
       </w:pPr>
-      <w:bookmarkStart w:id="2" w:name="_Toc244298265"/>
+      <w:bookmarkStart w:id="2" w:name="_Toc244300231"/>
       <w:r>
         <w:t>Terms</w:t>
       </w:r>
@@ -4808,7 +4808,7 @@
       <w:pPr>
         <w:pStyle w:val="Heading1"/>
       </w:pPr>
-      <w:bookmarkStart w:id="3" w:name="_Toc244298266"/>
+      <w:bookmarkStart w:id="3" w:name="_Toc244300232"/>
       <w:r>
         <w:lastRenderedPageBreak/>
         <w:t>Getting started</w:t>
@@ -4824,7 +4824,7 @@
       <w:pPr>
         <w:pStyle w:val="Heading2"/>
       </w:pPr>
-      <w:bookmarkStart w:id="4" w:name="_Toc244298267"/>
+      <w:bookmarkStart w:id="4" w:name="_Toc244300233"/>
       <w:r>
         <w:t>What you need</w:t>
       </w:r>
@@ -4909,7 +4909,7 @@
       <w:pPr>
         <w:pStyle w:val="Heading2"/>
       </w:pPr>
-      <w:bookmarkStart w:id="5" w:name="_Toc244298268"/>
+      <w:bookmarkStart w:id="5" w:name="_Toc244300234"/>
       <w:r>
         <w:t>Installing Litterbox</w:t>
       </w:r>
@@ -5039,7 +5039,7 @@
       <w:pPr>
         <w:pStyle w:val="Heading2"/>
       </w:pPr>
-      <w:bookmarkStart w:id="6" w:name="_Toc244298269"/>
+      <w:bookmarkStart w:id="6" w:name="_Toc244300235"/>
       <w:r>
         <w:lastRenderedPageBreak/>
         <w:t>Joining your team's vault</w:t>
@@ -5146,7 +5146,7 @@
       <w:pPr>
         <w:pStyle w:val="Heading2"/>
       </w:pPr>
-      <w:bookmarkStart w:id="7" w:name="_Toc244298270"/>
+      <w:bookmarkStart w:id="7" w:name="_Toc244300236"/>
       <w:r>
         <w:t>Decisions to make first</w:t>
       </w:r>
@@ -5418,7 +5418,7 @@
       <w:pPr>
         <w:pStyle w:val="Heading2"/>
       </w:pPr>
-      <w:bookmarkStart w:id="8" w:name="_Toc244298271"/>
+      <w:bookmarkStart w:id="8" w:name="_Toc244300237"/>
       <w:r>
         <w:lastRenderedPageBreak/>
         <w:t>Setting up a new team</w:t>
@@ -5688,7 +5688,7 @@
       <w:pPr>
         <w:pStyle w:val="Heading2"/>
       </w:pPr>
-      <w:bookmarkStart w:id="9" w:name="_Toc244298272"/>
+      <w:bookmarkStart w:id="9" w:name="_Toc244300238"/>
       <w:r>
         <w:t>The main window</w:t>
       </w:r>
@@ -6099,7 +6099,7 @@
       <w:pPr>
         <w:pStyle w:val="Heading2"/>
       </w:pPr>
-      <w:bookmarkStart w:id="10" w:name="_Toc244298273"/>
+      <w:bookmarkStart w:id="10" w:name="_Toc244300239"/>
       <w:r>
         <w:t>Your first part</w:t>
       </w:r>
@@ -6221,7 +6221,7 @@
       <w:pPr>
         <w:pStyle w:val="Heading2"/>
       </w:pPr>
-      <w:bookmarkStart w:id="11" w:name="_Toc244298274"/>
+      <w:bookmarkStart w:id="11" w:name="_Toc244300240"/>
       <w:r>
         <w:t>Creating a new part, step by step</w:t>
       </w:r>
@@ -6718,7 +6718,7 @@
       <w:pPr>
         <w:pStyle w:val="Heading1"/>
       </w:pPr>
-      <w:bookmarkStart w:id="12" w:name="_Toc244298275"/>
+      <w:bookmarkStart w:id="12" w:name="_Toc244300241"/>
       <w:r>
         <w:lastRenderedPageBreak/>
         <w:t>Everyday work</w:t>
@@ -6729,7 +6729,7 @@
       <w:pPr>
         <w:pStyle w:val="Heading2"/>
       </w:pPr>
-      <w:bookmarkStart w:id="13" w:name="_Toc244298276"/>
+      <w:bookmarkStart w:id="13" w:name="_Toc244300242"/>
       <w:r>
         <w:t>Part numbers and file names</w:t>
       </w:r>
@@ -6769,7 +6769,7 @@
       <w:pPr>
         <w:pStyle w:val="Heading2"/>
       </w:pPr>
-      <w:bookmarkStart w:id="14" w:name="_Toc244298277"/>
+      <w:bookmarkStart w:id="14" w:name="_Toc244300243"/>
       <w:r>
         <w:t>Projects</w:t>
       </w:r>
@@ -7069,7 +7069,7 @@
       <w:pPr>
         <w:pStyle w:val="Heading2"/>
       </w:pPr>
-      <w:bookmarkStart w:id="15" w:name="_Toc244298278"/>
+      <w:bookmarkStart w:id="15" w:name="_Toc244300244"/>
       <w:r>
         <w:t>Finding parts</w:t>
       </w:r>
@@ -7123,7 +7123,7 @@
       <w:pPr>
         <w:pStyle w:val="Heading2"/>
       </w:pPr>
-      <w:bookmarkStart w:id="16" w:name="_Toc244298279"/>
+      <w:bookmarkStart w:id="16" w:name="_Toc244300245"/>
       <w:r>
         <w:t>Folders</w:t>
       </w:r>
@@ -7490,7 +7490,7 @@
       <w:pPr>
         <w:pStyle w:val="Heading2"/>
       </w:pPr>
-      <w:bookmarkStart w:id="17" w:name="_Toc244298280"/>
+      <w:bookmarkStart w:id="17" w:name="_Toc244300246"/>
       <w:r>
         <w:t>Checking out and checking in</w:t>
       </w:r>
@@ -7620,7 +7620,7 @@
       <w:pPr>
         <w:pStyle w:val="Heading2"/>
       </w:pPr>
-      <w:bookmarkStart w:id="18" w:name="_Toc244298281"/>
+      <w:bookmarkStart w:id="18" w:name="_Toc244300247"/>
       <w:r>
         <w:t>Getting other people's changes</w:t>
       </w:r>
@@ -7650,7 +7650,7 @@
       <w:pPr>
         <w:pStyle w:val="Heading2"/>
       </w:pPr>
-      <w:bookmarkStart w:id="19" w:name="_Toc244298282"/>
+      <w:bookmarkStart w:id="19" w:name="_Toc244300248"/>
       <w:r>
         <w:t>Opening files</w:t>
       </w:r>
@@ -7709,7 +7709,7 @@
       <w:pPr>
         <w:pStyle w:val="Heading2"/>
       </w:pPr>
-      <w:bookmarkStart w:id="20" w:name="_Toc244298283"/>
+      <w:bookmarkStart w:id="20" w:name="_Toc244300249"/>
       <w:r>
         <w:lastRenderedPageBreak/>
         <w:t>The details pane</w:t>
@@ -7982,7 +7982,7 @@
       <w:pPr>
         <w:pStyle w:val="Heading1"/>
       </w:pPr>
-      <w:bookmarkStart w:id="21" w:name="_Toc244298284"/>
+      <w:bookmarkStart w:id="21" w:name="_Toc244300250"/>
       <w:r>
         <w:lastRenderedPageBreak/>
         <w:t>Revisions and the lifecycle</w:t>
@@ -8352,7 +8352,7 @@
       <w:pPr>
         <w:pStyle w:val="Heading2"/>
       </w:pPr>
-      <w:bookmarkStart w:id="22" w:name="_Toc244298285"/>
+      <w:bookmarkStart w:id="22" w:name="_Toc244300251"/>
       <w:r>
         <w:t>Form, Fit, Function, and Dispo</w:t>
       </w:r>
@@ -8446,7 +8446,7 @@
       <w:pPr>
         <w:pStyle w:val="Heading1"/>
       </w:pPr>
-      <w:bookmarkStart w:id="23" w:name="_Toc244298286"/>
+      <w:bookmarkStart w:id="23" w:name="_Toc244300252"/>
       <w:r>
         <w:lastRenderedPageBreak/>
         <w:t>Assemblies, references, and BOMs</w:t>
@@ -8457,7 +8457,7 @@
       <w:pPr>
         <w:pStyle w:val="Heading2"/>
       </w:pPr>
-      <w:bookmarkStart w:id="24" w:name="_Toc244298287"/>
+      <w:bookmarkStart w:id="24" w:name="_Toc244300253"/>
       <w:r>
         <w:t>Uses and where used</w:t>
       </w:r>
@@ -8510,7 +8510,7 @@
       <w:pPr>
         <w:pStyle w:val="Heading2"/>
       </w:pPr>
-      <w:bookmarkStart w:id="25" w:name="_Toc244298288"/>
+      <w:bookmarkStart w:id="25" w:name="_Toc244300254"/>
       <w:r>
         <w:t>The BOM tab</w:t>
       </w:r>
@@ -8636,7 +8636,7 @@
       <w:pPr>
         <w:pStyle w:val="Heading2"/>
       </w:pPr>
-      <w:bookmarkStart w:id="26" w:name="_Toc244298289"/>
+      <w:bookmarkStart w:id="26" w:name="_Toc244300255"/>
       <w:r>
         <w:t>Toolbox parts</w:t>
       </w:r>
@@ -8868,7 +8868,7 @@
       <w:pPr>
         <w:pStyle w:val="Heading2"/>
       </w:pPr>
-      <w:bookmarkStart w:id="27" w:name="_Toc244298290"/>
+      <w:bookmarkStart w:id="27" w:name="_Toc244300256"/>
       <w:r>
         <w:t>Non-CAD parts and kits</w:t>
       </w:r>
@@ -8938,7 +8938,7 @@
       <w:pPr>
         <w:pStyle w:val="Heading1"/>
       </w:pPr>
-      <w:bookmarkStart w:id="28" w:name="_Toc244298291"/>
+      <w:bookmarkStart w:id="28" w:name="_Toc244300257"/>
       <w:r>
         <w:lastRenderedPageBreak/>
         <w:t>Purchasing, costs, and materials</w:t>
@@ -8949,7 +8949,7 @@
       <w:pPr>
         <w:pStyle w:val="Heading2"/>
       </w:pPr>
-      <w:bookmarkStart w:id="29" w:name="_Toc244298292"/>
+      <w:bookmarkStart w:id="29" w:name="_Toc244300258"/>
       <w:r>
         <w:t>Purchasing info</w:t>
       </w:r>
@@ -8987,7 +8987,7 @@
       <w:pPr>
         <w:pStyle w:val="Heading2"/>
       </w:pPr>
-      <w:bookmarkStart w:id="30" w:name="_Toc244298293"/>
+      <w:bookmarkStart w:id="30" w:name="_Toc244300259"/>
       <w:r>
         <w:t>Materials</w:t>
       </w:r>
@@ -9025,7 +9025,7 @@
       <w:pPr>
         <w:pStyle w:val="Heading1"/>
       </w:pPr>
-      <w:bookmarkStart w:id="31" w:name="_Toc244298294"/>
+      <w:bookmarkStart w:id="31" w:name="_Toc244300260"/>
       <w:r>
         <w:lastRenderedPageBreak/>
         <w:t>Release outputs and exports</w:t>
@@ -9036,7 +9036,7 @@
       <w:pPr>
         <w:pStyle w:val="Heading2"/>
       </w:pPr>
-      <w:bookmarkStart w:id="32" w:name="_Toc244298295"/>
+      <w:bookmarkStart w:id="32" w:name="_Toc244300261"/>
       <w:r>
         <w:t>STEP and PDF files</w:t>
       </w:r>
@@ -9097,7 +9097,7 @@
       <w:pPr>
         <w:pStyle w:val="Heading2"/>
       </w:pPr>
-      <w:bookmarkStart w:id="33" w:name="_Toc244298296"/>
+      <w:bookmarkStart w:id="33" w:name="_Toc244300262"/>
       <w:r>
         <w:t>Exporting</w:t>
       </w:r>
@@ -9126,7 +9126,7 @@
       <w:pPr>
         <w:pStyle w:val="Heading1"/>
       </w:pPr>
-      <w:bookmarkStart w:id="34" w:name="_Toc244298297"/>
+      <w:bookmarkStart w:id="34" w:name="_Toc244300263"/>
       <w:r>
         <w:lastRenderedPageBreak/>
         <w:t>Documents</w:t>
@@ -9231,7 +9231,7 @@
       <w:pPr>
         <w:pStyle w:val="Heading1"/>
       </w:pPr>
-      <w:bookmarkStart w:id="35" w:name="_Toc244298298"/>
+      <w:bookmarkStart w:id="35" w:name="_Toc244300264"/>
       <w:r>
         <w:lastRenderedPageBreak/>
         <w:t>Sign-off workflows and ECOs</w:t>
@@ -9242,7 +9242,7 @@
       <w:pPr>
         <w:pStyle w:val="Heading2"/>
       </w:pPr>
-      <w:bookmarkStart w:id="36" w:name="_Toc244298299"/>
+      <w:bookmarkStart w:id="36" w:name="_Toc244300265"/>
       <w:r>
         <w:t>How workflows work</w:t>
       </w:r>
@@ -9298,7 +9298,7 @@
       <w:pPr>
         <w:pStyle w:val="Heading2"/>
       </w:pPr>
-      <w:bookmarkStart w:id="37" w:name="_Toc244298300"/>
+      <w:bookmarkStart w:id="37" w:name="_Toc244300266"/>
       <w:r>
         <w:t>Asking for sign-off</w:t>
       </w:r>
@@ -9464,7 +9464,7 @@
       <w:pPr>
         <w:pStyle w:val="Heading2"/>
       </w:pPr>
-      <w:bookmarkStart w:id="38" w:name="_Toc244298301"/>
+      <w:bookmarkStart w:id="38" w:name="_Toc244300267"/>
       <w:r>
         <w:t>Reviewing a request</w:t>
       </w:r>
@@ -9766,7 +9766,7 @@
       <w:pPr>
         <w:pStyle w:val="Heading2"/>
       </w:pPr>
-      <w:bookmarkStart w:id="39" w:name="_Toc244298302"/>
+      <w:bookmarkStart w:id="39" w:name="_Toc244300268"/>
       <w:r>
         <w:t>Rejected requests</w:t>
       </w:r>
@@ -9839,7 +9839,7 @@
       <w:pPr>
         <w:pStyle w:val="Heading2"/>
       </w:pPr>
-      <w:bookmarkStart w:id="40" w:name="_Toc244298303"/>
+      <w:bookmarkStart w:id="40" w:name="_Toc244300269"/>
       <w:r>
         <w:t>Engineering change orders</w:t>
       </w:r>
@@ -9891,7 +9891,7 @@
       <w:pPr>
         <w:pStyle w:val="Heading1"/>
       </w:pPr>
-      <w:bookmarkStart w:id="41" w:name="_Toc244298304"/>
+      <w:bookmarkStart w:id="41" w:name="_Toc244300270"/>
       <w:r>
         <w:lastRenderedPageBreak/>
         <w:t>Running the team</w:t>
@@ -9916,7 +9916,7 @@
       <w:pPr>
         <w:pStyle w:val="Heading2"/>
       </w:pPr>
-      <w:bookmarkStart w:id="42" w:name="_Toc244298305"/>
+      <w:bookmarkStart w:id="42" w:name="_Toc244300271"/>
       <w:r>
         <w:t>People and access</w:t>
       </w:r>
@@ -10214,7 +10214,7 @@
       <w:pPr>
         <w:pStyle w:val="Heading2"/>
       </w:pPr>
-      <w:bookmarkStart w:id="43" w:name="_Toc244298306"/>
+      <w:bookmarkStart w:id="43" w:name="_Toc244300272"/>
       <w:r>
         <w:t>Vault settings</w:t>
       </w:r>
@@ -10599,7 +10599,7 @@
       <w:pPr>
         <w:pStyle w:val="Heading2"/>
       </w:pPr>
-      <w:bookmarkStart w:id="44" w:name="_Toc244298307"/>
+      <w:bookmarkStart w:id="44" w:name="_Toc244300273"/>
       <w:r>
         <w:lastRenderedPageBreak/>
         <w:t>The team's Toolbox</w:t>
@@ -10707,7 +10707,7 @@
       <w:pPr>
         <w:pStyle w:val="Heading2"/>
       </w:pPr>
-      <w:bookmarkStart w:id="45" w:name="_Toc244298308"/>
+      <w:bookmarkStart w:id="45" w:name="_Toc244300274"/>
       <w:r>
         <w:t>Vault maintenance</w:t>
       </w:r>
@@ -10772,7 +10772,7 @@
       <w:pPr>
         <w:pStyle w:val="Heading1"/>
       </w:pPr>
-      <w:bookmarkStart w:id="46" w:name="_Toc244298309"/>
+      <w:bookmarkStart w:id="46" w:name="_Toc244300275"/>
       <w:r>
         <w:lastRenderedPageBreak/>
         <w:t>Importing existing CAD</w:t>
@@ -10868,7 +10868,7 @@
       <w:pPr>
         <w:pStyle w:val="Heading1"/>
       </w:pPr>
-      <w:bookmarkStart w:id="47" w:name="_Toc244298310"/>
+      <w:bookmarkStart w:id="47" w:name="_Toc244300276"/>
       <w:r>
         <w:lastRenderedPageBreak/>
         <w:t>Working with SolidWorks</w:t>
@@ -10944,7 +10944,7 @@
       <w:pPr>
         <w:pStyle w:val="Heading2"/>
       </w:pPr>
-      <w:bookmarkStart w:id="48" w:name="_Toc244298311"/>
+      <w:bookmarkStart w:id="48" w:name="_Toc244300277"/>
       <w:r>
         <w:t>Configurations</w:t>
       </w:r>
@@ -11008,7 +11008,7 @@
       <w:pPr>
         <w:pStyle w:val="Heading2"/>
       </w:pPr>
-      <w:bookmarkStart w:id="49" w:name="_Toc244298312"/>
+      <w:bookmarkStart w:id="49" w:name="_Toc244300278"/>
       <w:r>
         <w:t>Templates</w:t>
       </w:r>
@@ -11286,7 +11286,7 @@
       <w:pPr>
         <w:pStyle w:val="Heading1"/>
       </w:pPr>
-      <w:bookmarkStart w:id="50" w:name="_Toc244298313"/>
+      <w:bookmarkStart w:id="50" w:name="_Toc244300279"/>
       <w:r>
         <w:lastRenderedPageBreak/>
         <w:t>How Litterbox works</w:t>
@@ -11302,7 +11302,7 @@
       <w:pPr>
         <w:pStyle w:val="Heading2"/>
       </w:pPr>
-      <w:bookmarkStart w:id="51" w:name="_Toc244298314"/>
+      <w:bookmarkStart w:id="51" w:name="_Toc244300280"/>
       <w:r>
         <w:t>The vault is a Git repository</w:t>
       </w:r>
@@ -11706,7 +11706,7 @@
       <w:pPr>
         <w:pStyle w:val="Heading2"/>
       </w:pPr>
-      <w:bookmarkStart w:id="52" w:name="_Toc244298315"/>
+      <w:bookmarkStart w:id="52" w:name="_Toc244300281"/>
       <w:r>
         <w:t>Locks, read-only files, and uploads</w:t>
       </w:r>
@@ -11807,7 +11807,7 @@
       <w:pPr>
         <w:pStyle w:val="Heading2"/>
       </w:pPr>
-      <w:bookmarkStart w:id="53" w:name="_Toc244298316"/>
+      <w:bookmarkStart w:id="53" w:name="_Toc244300282"/>
       <w:r>
         <w:t>Downloads</w:t>
       </w:r>
@@ -11831,7 +11831,7 @@
       <w:pPr>
         <w:pStyle w:val="Heading2"/>
       </w:pPr>
-      <w:bookmarkStart w:id="54" w:name="_Toc244298317"/>
+      <w:bookmarkStart w:id="54" w:name="_Toc244300283"/>
       <w:r>
         <w:t>The job queue</w:t>
       </w:r>
@@ -11980,7 +11980,7 @@
       <w:pPr>
         <w:pStyle w:val="Heading1"/>
       </w:pPr>
-      <w:bookmarkStart w:id="55" w:name="_Toc244298318"/>
+      <w:bookmarkStart w:id="55" w:name="_Toc244300284"/>
       <w:r>
         <w:lastRenderedPageBreak/>
         <w:t>Settings and troubleshooting</w:t>
@@ -11991,7 +11991,7 @@
       <w:pPr>
         <w:pStyle w:val="Heading2"/>
       </w:pPr>
-      <w:bookmarkStart w:id="56" w:name="_Toc244298319"/>
+      <w:bookmarkStart w:id="56" w:name="_Toc244300285"/>
       <w:r>
         <w:t>Your settings</w:t>
       </w:r>
@@ -12355,7 +12355,7 @@
       <w:pPr>
         <w:pStyle w:val="Heading2"/>
       </w:pPr>
-      <w:bookmarkStart w:id="57" w:name="_Toc244298320"/>
+      <w:bookmarkStart w:id="57" w:name="_Toc244300286"/>
       <w:r>
         <w:t>Problems</w:t>
       </w:r>
@@ -12472,7 +12472,7 @@
       <w:pPr>
         <w:pStyle w:val="Heading2"/>
       </w:pPr>
-      <w:bookmarkStart w:id="58" w:name="_Toc244298321"/>
+      <w:bookmarkStart w:id="58" w:name="_Toc244300287"/>
       <w:r>
         <w:lastRenderedPageBreak/>
         <w:t>The command line</w:t>
@@ -12513,7 +12513,7 @@
       <w:pPr>
         <w:pStyle w:val="Heading1"/>
       </w:pPr>
-      <w:bookmarkStart w:id="59" w:name="_Toc244298322"/>
+      <w:bookmarkStart w:id="59" w:name="_Toc244300288"/>
       <w:r>
         <w:lastRenderedPageBreak/>
         <w:t>Quick reference</w:t>
@@ -13179,100 +13179,100 @@
       </w:rPr>
     </w:lvl>
   </w:abstractNum>
-  <w:num w:numId="1" w16cid:durableId="1830435962">
+  <w:num w:numId="1" w16cid:durableId="1594168970">
     <w:abstractNumId w:val="8"/>
   </w:num>
-  <w:num w:numId="2" w16cid:durableId="695159786">
+  <w:num w:numId="2" w16cid:durableId="220679916">
     <w:abstractNumId w:val="6"/>
   </w:num>
-  <w:num w:numId="3" w16cid:durableId="1923222570">
+  <w:num w:numId="3" w16cid:durableId="1130125650">
     <w:abstractNumId w:val="5"/>
   </w:num>
-  <w:num w:numId="4" w16cid:durableId="188839508">
+  <w:num w:numId="4" w16cid:durableId="838737134">
     <w:abstractNumId w:val="4"/>
   </w:num>
-  <w:num w:numId="5" w16cid:durableId="2084836599">
+  <w:num w:numId="5" w16cid:durableId="763654092">
     <w:abstractNumId w:val="7"/>
   </w:num>
-  <w:num w:numId="6" w16cid:durableId="540869314">
+  <w:num w:numId="6" w16cid:durableId="2098552125">
     <w:abstractNumId w:val="3"/>
   </w:num>
-  <w:num w:numId="7" w16cid:durableId="2030377038">
+  <w:num w:numId="7" w16cid:durableId="1192114324">
     <w:abstractNumId w:val="2"/>
   </w:num>
-  <w:num w:numId="8" w16cid:durableId="2055107471">
+  <w:num w:numId="8" w16cid:durableId="1472794080">
     <w:abstractNumId w:val="1"/>
   </w:num>
-  <w:num w:numId="9" w16cid:durableId="1573462261">
+  <w:num w:numId="9" w16cid:durableId="1178885741">
     <w:abstractNumId w:val="0"/>
   </w:num>
-  <w:num w:numId="10" w16cid:durableId="1473017938">
+  <w:num w:numId="10" w16cid:durableId="117840008">
     <w:abstractNumId w:val="7"/>
     <w:lvlOverride w:ilvl="0">
       <w:startOverride w:val="1"/>
     </w:lvlOverride>
   </w:num>
-  <w:num w:numId="11" w16cid:durableId="120541536">
+  <w:num w:numId="11" w16cid:durableId="469716679">
     <w:abstractNumId w:val="7"/>
     <w:lvlOverride w:ilvl="0">
       <w:startOverride w:val="1"/>
     </w:lvlOverride>
   </w:num>
-  <w:num w:numId="12" w16cid:durableId="358429532">
+  <w:num w:numId="12" w16cid:durableId="804935173">
     <w:abstractNumId w:val="7"/>
     <w:lvlOverride w:ilvl="0">
       <w:startOverride w:val="1"/>
     </w:lvlOverride>
   </w:num>
-  <w:num w:numId="13" w16cid:durableId="491214809">
+  <w:num w:numId="13" w16cid:durableId="492913076">
     <w:abstractNumId w:val="7"/>
     <w:lvlOverride w:ilvl="0">
       <w:startOverride w:val="1"/>
     </w:lvlOverride>
   </w:num>
-  <w:num w:numId="14" w16cid:durableId="756439023">
+  <w:num w:numId="14" w16cid:durableId="1511797190">
     <w:abstractNumId w:val="7"/>
     <w:lvlOverride w:ilvl="0">
       <w:startOverride w:val="1"/>
     </w:lvlOverride>
   </w:num>
-  <w:num w:numId="15" w16cid:durableId="1592666162">
+  <w:num w:numId="15" w16cid:durableId="204682068">
     <w:abstractNumId w:val="7"/>
     <w:lvlOverride w:ilvl="0">
       <w:startOverride w:val="1"/>
     </w:lvlOverride>
   </w:num>
-  <w:num w:numId="16" w16cid:durableId="205214450">
+  <w:num w:numId="16" w16cid:durableId="688062969">
     <w:abstractNumId w:val="7"/>
     <w:lvlOverride w:ilvl="0">
       <w:startOverride w:val="1"/>
     </w:lvlOverride>
   </w:num>
-  <w:num w:numId="17" w16cid:durableId="269435422">
+  <w:num w:numId="17" w16cid:durableId="892545796">
     <w:abstractNumId w:val="7"/>
     <w:lvlOverride w:ilvl="0">
       <w:startOverride w:val="1"/>
     </w:lvlOverride>
   </w:num>
-  <w:num w:numId="18" w16cid:durableId="1912080334">
+  <w:num w:numId="18" w16cid:durableId="475991103">
     <w:abstractNumId w:val="7"/>
     <w:lvlOverride w:ilvl="0">
       <w:startOverride w:val="1"/>
     </w:lvlOverride>
   </w:num>
-  <w:num w:numId="19" w16cid:durableId="1944342082">
+  <w:num w:numId="19" w16cid:durableId="2146854835">
     <w:abstractNumId w:val="7"/>
     <w:lvlOverride w:ilvl="0">
       <w:startOverride w:val="1"/>
     </w:lvlOverride>
   </w:num>
-  <w:num w:numId="20" w16cid:durableId="1175726775">
+  <w:num w:numId="20" w16cid:durableId="1440367629">
     <w:abstractNumId w:val="7"/>
     <w:lvlOverride w:ilvl="0">
       <w:startOverride w:val="1"/>
     </w:lvlOverride>
   </w:num>
-  <w:num w:numId="21" w16cid:durableId="623923980">
+  <w:num w:numId="21" w16cid:durableId="826625925">
     <w:abstractNumId w:val="7"/>
     <w:lvlOverride w:ilvl="0">
       <w:startOverride w:val="1"/>
@@ -24642,7 +24642,7 @@
     <w:autoRedefine/>
     <w:uiPriority w:val="39"/>
     <w:unhideWhenUsed/>
-    <w:rsid w:val="008706AA"/>
+    <w:rsid w:val="005867AE"/>
     <w:pPr>
       <w:spacing w:after="100"/>
     </w:pPr>
@@ -24654,7 +24654,7 @@
     <w:autoRedefine/>
     <w:uiPriority w:val="39"/>
     <w:unhideWhenUsed/>
-    <w:rsid w:val="008706AA"/>
+    <w:rsid w:val="005867AE"/>
     <w:pPr>
       <w:spacing w:after="100"/>
       <w:ind w:left="210"/>
@@ -24665,7 +24665,7 @@
     <w:basedOn w:val="DefaultParagraphFont"/>
     <w:uiPriority w:val="99"/>
     <w:unhideWhenUsed/>
-    <w:rsid w:val="008706AA"/>
+    <w:rsid w:val="005867AE"/>
     <w:rPr>
       <w:color w:val="0000FF" w:themeColor="hyperlink"/>
       <w:u w:val="single"/>

</xml_diff>